<commit_message>
feat(data): add feature engineering utilities
</commit_message>
<xml_diff>
--- a/docs/development_flow.docx
+++ b/docs/development_flow.docx
@@ -980,6 +980,1463 @@
           <w:szCs w:val="28"/>
         </w:rPr>
         <w:t xml:space="preserve"> Dashboard</w:t>
+      </w:r>
+    </w:p>
+    <w:p>
+      <w:pPr>
+        <w:spacing w:after="0" w:line="240" w:lineRule="auto"/>
+        <w:rPr>
+          <w:b/>
+          <w:bCs/>
+          <w:noProof/>
+          <w:sz w:val="40"/>
+          <w:szCs w:val="40"/>
+          <w:u w:val="single"/>
+        </w:rPr>
+      </w:pPr>
+      <w:r>
+        <w:rPr>
+          <w:b/>
+          <w:bCs/>
+          <w:noProof/>
+          <w:sz w:val="40"/>
+          <w:szCs w:val="40"/>
+          <w:u w:val="single"/>
+        </w:rPr>
+        <w:lastRenderedPageBreak/>
+        <w:t>File-Level Docstrings :</w:t>
+      </w:r>
+    </w:p>
+    <w:p>
+      <w:pPr>
+        <w:spacing w:after="0" w:line="240" w:lineRule="auto"/>
+        <w:rPr>
+          <w:noProof/>
+          <w:sz w:val="28"/>
+          <w:szCs w:val="28"/>
+        </w:rPr>
+      </w:pPr>
+    </w:p>
+    <w:p>
+      <w:pPr>
+        <w:spacing w:after="0" w:line="240" w:lineRule="auto"/>
+        <w:rPr>
+          <w:noProof/>
+          <w:sz w:val="28"/>
+          <w:szCs w:val="28"/>
+        </w:rPr>
+      </w:pPr>
+    </w:p>
+    <w:p>
+      <w:pPr>
+        <w:spacing w:after="0" w:line="240" w:lineRule="auto"/>
+        <w:rPr>
+          <w:noProof/>
+          <w:sz w:val="28"/>
+          <w:szCs w:val="28"/>
+        </w:rPr>
+      </w:pPr>
+      <w:r>
+        <w:rPr>
+          <w:noProof/>
+          <w:sz w:val="28"/>
+          <w:szCs w:val="28"/>
+        </w:rPr>
+        <w:t>"""</w:t>
+      </w:r>
+    </w:p>
+    <w:p>
+      <w:pPr>
+        <w:spacing w:after="0" w:line="240" w:lineRule="auto"/>
+        <w:rPr>
+          <w:noProof/>
+          <w:sz w:val="28"/>
+          <w:szCs w:val="28"/>
+        </w:rPr>
+      </w:pPr>
+      <w:r>
+        <w:rPr>
+          <w:noProof/>
+          <w:sz w:val="28"/>
+          <w:szCs w:val="28"/>
+        </w:rPr>
+        <w:t>Resampling utilities.</w:t>
+      </w:r>
+    </w:p>
+    <w:p>
+      <w:pPr>
+        <w:spacing w:after="0" w:line="240" w:lineRule="auto"/>
+        <w:rPr>
+          <w:noProof/>
+          <w:sz w:val="28"/>
+          <w:szCs w:val="28"/>
+        </w:rPr>
+      </w:pPr>
+    </w:p>
+    <w:p>
+      <w:pPr>
+        <w:spacing w:after="0" w:line="240" w:lineRule="auto"/>
+        <w:rPr>
+          <w:noProof/>
+          <w:sz w:val="28"/>
+          <w:szCs w:val="28"/>
+        </w:rPr>
+      </w:pPr>
+      <w:r>
+        <w:rPr>
+          <w:noProof/>
+          <w:sz w:val="28"/>
+          <w:szCs w:val="28"/>
+        </w:rPr>
+        <w:t>This module provides methods for converting battery measurements</w:t>
+      </w:r>
+    </w:p>
+    <w:p>
+      <w:pPr>
+        <w:spacing w:after="0" w:line="240" w:lineRule="auto"/>
+        <w:rPr>
+          <w:noProof/>
+          <w:sz w:val="28"/>
+          <w:szCs w:val="28"/>
+        </w:rPr>
+      </w:pPr>
+      <w:r>
+        <w:rPr>
+          <w:noProof/>
+          <w:sz w:val="28"/>
+          <w:szCs w:val="28"/>
+        </w:rPr>
+        <w:t>between different sampling frequencies while preserving temporal</w:t>
+      </w:r>
+    </w:p>
+    <w:p>
+      <w:pPr>
+        <w:spacing w:after="0" w:line="240" w:lineRule="auto"/>
+        <w:rPr>
+          <w:noProof/>
+          <w:sz w:val="28"/>
+          <w:szCs w:val="28"/>
+        </w:rPr>
+      </w:pPr>
+      <w:r>
+        <w:rPr>
+          <w:noProof/>
+          <w:sz w:val="28"/>
+          <w:szCs w:val="28"/>
+        </w:rPr>
+        <w:t>consistency.</w:t>
+      </w:r>
+    </w:p>
+    <w:p>
+      <w:pPr>
+        <w:spacing w:after="0" w:line="240" w:lineRule="auto"/>
+        <w:rPr>
+          <w:noProof/>
+          <w:sz w:val="28"/>
+          <w:szCs w:val="28"/>
+        </w:rPr>
+      </w:pPr>
+    </w:p>
+    <w:p>
+      <w:pPr>
+        <w:spacing w:after="0" w:line="240" w:lineRule="auto"/>
+        <w:rPr>
+          <w:noProof/>
+          <w:sz w:val="28"/>
+          <w:szCs w:val="28"/>
+        </w:rPr>
+      </w:pPr>
+      <w:r>
+        <w:rPr>
+          <w:noProof/>
+          <w:sz w:val="28"/>
+          <w:szCs w:val="28"/>
+        </w:rPr>
+        <w:t>These utilities are used during data preparation before statistical</w:t>
+      </w:r>
+    </w:p>
+    <w:p>
+      <w:pPr>
+        <w:spacing w:after="0" w:line="240" w:lineRule="auto"/>
+        <w:rPr>
+          <w:noProof/>
+          <w:sz w:val="28"/>
+          <w:szCs w:val="28"/>
+        </w:rPr>
+      </w:pPr>
+      <w:r>
+        <w:rPr>
+          <w:noProof/>
+          <w:sz w:val="28"/>
+          <w:szCs w:val="28"/>
+        </w:rPr>
+        <w:t>analysis and forecasting.</w:t>
+      </w:r>
+    </w:p>
+    <w:p>
+      <w:pPr>
+        <w:spacing w:after="0" w:line="240" w:lineRule="auto"/>
+        <w:rPr>
+          <w:noProof/>
+          <w:sz w:val="28"/>
+          <w:szCs w:val="28"/>
+        </w:rPr>
+      </w:pPr>
+      <w:r>
+        <w:rPr>
+          <w:noProof/>
+          <w:sz w:val="28"/>
+          <w:szCs w:val="28"/>
+        </w:rPr>
+        <w:t>"""</w:t>
+      </w:r>
+    </w:p>
+    <w:p>
+      <w:pPr>
+        <w:spacing w:after="0" w:line="240" w:lineRule="auto"/>
+        <w:rPr>
+          <w:noProof/>
+          <w:sz w:val="28"/>
+          <w:szCs w:val="28"/>
+        </w:rPr>
+      </w:pPr>
+    </w:p>
+    <w:p>
+      <w:pPr>
+        <w:spacing w:after="0" w:line="240" w:lineRule="auto"/>
+        <w:rPr>
+          <w:noProof/>
+          <w:sz w:val="28"/>
+          <w:szCs w:val="28"/>
+        </w:rPr>
+      </w:pPr>
+    </w:p>
+    <w:p>
+      <w:pPr>
+        <w:spacing w:after="0" w:line="240" w:lineRule="auto"/>
+        <w:rPr>
+          <w:noProof/>
+          <w:sz w:val="28"/>
+          <w:szCs w:val="28"/>
+        </w:rPr>
+      </w:pPr>
+      <w:r>
+        <w:rPr>
+          <w:noProof/>
+          <w:sz w:val="28"/>
+          <w:szCs w:val="28"/>
+        </w:rPr>
+        <w:t>"""</w:t>
+      </w:r>
+    </w:p>
+    <w:p>
+      <w:pPr>
+        <w:spacing w:after="0" w:line="240" w:lineRule="auto"/>
+        <w:rPr>
+          <w:noProof/>
+          <w:sz w:val="28"/>
+          <w:szCs w:val="28"/>
+        </w:rPr>
+      </w:pPr>
+      <w:r>
+        <w:rPr>
+          <w:noProof/>
+          <w:sz w:val="28"/>
+          <w:szCs w:val="28"/>
+        </w:rPr>
+        <w:t>Battery dataset abstraction.</w:t>
+      </w:r>
+    </w:p>
+    <w:p>
+      <w:pPr>
+        <w:spacing w:after="0" w:line="240" w:lineRule="auto"/>
+        <w:rPr>
+          <w:noProof/>
+          <w:sz w:val="28"/>
+          <w:szCs w:val="28"/>
+        </w:rPr>
+      </w:pPr>
+    </w:p>
+    <w:p>
+      <w:pPr>
+        <w:spacing w:after="0" w:line="240" w:lineRule="auto"/>
+        <w:rPr>
+          <w:noProof/>
+          <w:sz w:val="28"/>
+          <w:szCs w:val="28"/>
+        </w:rPr>
+      </w:pPr>
+      <w:r>
+        <w:rPr>
+          <w:noProof/>
+          <w:sz w:val="28"/>
+          <w:szCs w:val="28"/>
+        </w:rPr>
+        <w:t>This module defines the BatteryDataset class, which provides a unified</w:t>
+      </w:r>
+    </w:p>
+    <w:p>
+      <w:pPr>
+        <w:spacing w:after="0" w:line="240" w:lineRule="auto"/>
+        <w:rPr>
+          <w:noProof/>
+          <w:sz w:val="28"/>
+          <w:szCs w:val="28"/>
+        </w:rPr>
+      </w:pPr>
+      <w:r>
+        <w:rPr>
+          <w:noProof/>
+          <w:sz w:val="28"/>
+          <w:szCs w:val="28"/>
+        </w:rPr>
+        <w:t>interface for loading, validating, cleaning, resampling, interpolating,</w:t>
+      </w:r>
+    </w:p>
+    <w:p>
+      <w:pPr>
+        <w:spacing w:after="0" w:line="240" w:lineRule="auto"/>
+        <w:rPr>
+          <w:noProof/>
+          <w:sz w:val="28"/>
+          <w:szCs w:val="28"/>
+        </w:rPr>
+      </w:pPr>
+      <w:r>
+        <w:rPr>
+          <w:noProof/>
+          <w:sz w:val="28"/>
+          <w:szCs w:val="28"/>
+        </w:rPr>
+        <w:t>and analyzing battery degradation datasets.</w:t>
+      </w:r>
+    </w:p>
+    <w:p>
+      <w:pPr>
+        <w:spacing w:after="0" w:line="240" w:lineRule="auto"/>
+        <w:rPr>
+          <w:noProof/>
+          <w:sz w:val="28"/>
+          <w:szCs w:val="28"/>
+        </w:rPr>
+      </w:pPr>
+    </w:p>
+    <w:p>
+      <w:pPr>
+        <w:spacing w:after="0" w:line="240" w:lineRule="auto"/>
+        <w:rPr>
+          <w:noProof/>
+          <w:sz w:val="28"/>
+          <w:szCs w:val="28"/>
+        </w:rPr>
+      </w:pPr>
+      <w:r>
+        <w:rPr>
+          <w:noProof/>
+          <w:sz w:val="28"/>
+          <w:szCs w:val="28"/>
+        </w:rPr>
+        <w:t>All forecasting algorithms in ZenerEstimation operate on this class</w:t>
+      </w:r>
+    </w:p>
+    <w:p>
+      <w:pPr>
+        <w:spacing w:after="0" w:line="240" w:lineRule="auto"/>
+        <w:rPr>
+          <w:noProof/>
+          <w:sz w:val="28"/>
+          <w:szCs w:val="28"/>
+        </w:rPr>
+      </w:pPr>
+      <w:r>
+        <w:rPr>
+          <w:noProof/>
+          <w:sz w:val="28"/>
+          <w:szCs w:val="28"/>
+        </w:rPr>
+        <w:t>rather than directly manipulating pandas DataFrames.</w:t>
+      </w:r>
+    </w:p>
+    <w:p>
+      <w:pPr>
+        <w:spacing w:after="0" w:line="240" w:lineRule="auto"/>
+        <w:rPr>
+          <w:noProof/>
+          <w:sz w:val="28"/>
+          <w:szCs w:val="28"/>
+        </w:rPr>
+      </w:pPr>
+      <w:r>
+        <w:rPr>
+          <w:noProof/>
+          <w:sz w:val="28"/>
+          <w:szCs w:val="28"/>
+        </w:rPr>
+        <w:t>"""</w:t>
+      </w:r>
+    </w:p>
+    <w:p>
+      <w:pPr>
+        <w:spacing w:after="0" w:line="240" w:lineRule="auto"/>
+        <w:rPr>
+          <w:noProof/>
+          <w:sz w:val="28"/>
+          <w:szCs w:val="28"/>
+        </w:rPr>
+      </w:pPr>
+    </w:p>
+    <w:p>
+      <w:pPr>
+        <w:spacing w:after="0" w:line="240" w:lineRule="auto"/>
+        <w:rPr>
+          <w:noProof/>
+          <w:sz w:val="28"/>
+          <w:szCs w:val="28"/>
+        </w:rPr>
+      </w:pPr>
+    </w:p>
+    <w:p>
+      <w:pPr>
+        <w:spacing w:after="0" w:line="240" w:lineRule="auto"/>
+        <w:rPr>
+          <w:noProof/>
+          <w:sz w:val="28"/>
+          <w:szCs w:val="28"/>
+        </w:rPr>
+      </w:pPr>
+      <w:r>
+        <w:rPr>
+          <w:noProof/>
+          <w:sz w:val="28"/>
+          <w:szCs w:val="28"/>
+        </w:rPr>
+        <w:t>"""</w:t>
+      </w:r>
+    </w:p>
+    <w:p>
+      <w:pPr>
+        <w:spacing w:after="0" w:line="240" w:lineRule="auto"/>
+        <w:rPr>
+          <w:noProof/>
+          <w:sz w:val="28"/>
+          <w:szCs w:val="28"/>
+        </w:rPr>
+      </w:pPr>
+      <w:r>
+        <w:rPr>
+          <w:noProof/>
+          <w:sz w:val="28"/>
+          <w:szCs w:val="28"/>
+        </w:rPr>
+        <w:t>Feature engineering utilities.</w:t>
+      </w:r>
+    </w:p>
+    <w:p>
+      <w:pPr>
+        <w:spacing w:after="0" w:line="240" w:lineRule="auto"/>
+        <w:rPr>
+          <w:noProof/>
+          <w:sz w:val="28"/>
+          <w:szCs w:val="28"/>
+        </w:rPr>
+      </w:pPr>
+    </w:p>
+    <w:p>
+      <w:pPr>
+        <w:spacing w:after="0" w:line="240" w:lineRule="auto"/>
+        <w:rPr>
+          <w:noProof/>
+          <w:sz w:val="28"/>
+          <w:szCs w:val="28"/>
+        </w:rPr>
+      </w:pPr>
+      <w:r>
+        <w:rPr>
+          <w:noProof/>
+          <w:sz w:val="28"/>
+          <w:szCs w:val="28"/>
+        </w:rPr>
+        <w:t>This module provides common statistical features derived from battery</w:t>
+      </w:r>
+    </w:p>
+    <w:p>
+      <w:pPr>
+        <w:spacing w:after="0" w:line="240" w:lineRule="auto"/>
+        <w:rPr>
+          <w:noProof/>
+          <w:sz w:val="28"/>
+          <w:szCs w:val="28"/>
+        </w:rPr>
+      </w:pPr>
+      <w:r>
+        <w:rPr>
+          <w:noProof/>
+          <w:sz w:val="28"/>
+          <w:szCs w:val="28"/>
+        </w:rPr>
+        <w:t>voltage measurements, including first differences, percentage changes,</w:t>
+      </w:r>
+    </w:p>
+    <w:p>
+      <w:pPr>
+        <w:spacing w:after="0" w:line="240" w:lineRule="auto"/>
+        <w:rPr>
+          <w:noProof/>
+          <w:sz w:val="28"/>
+          <w:szCs w:val="28"/>
+        </w:rPr>
+      </w:pPr>
+      <w:r>
+        <w:rPr>
+          <w:noProof/>
+          <w:sz w:val="28"/>
+          <w:szCs w:val="28"/>
+        </w:rPr>
+        <w:t>rolling statistics, and other transformations used by forecasting</w:t>
+      </w:r>
+    </w:p>
+    <w:p>
+      <w:pPr>
+        <w:spacing w:after="0" w:line="240" w:lineRule="auto"/>
+        <w:rPr>
+          <w:noProof/>
+          <w:sz w:val="28"/>
+          <w:szCs w:val="28"/>
+        </w:rPr>
+      </w:pPr>
+      <w:r>
+        <w:rPr>
+          <w:noProof/>
+          <w:sz w:val="28"/>
+          <w:szCs w:val="28"/>
+        </w:rPr>
+        <w:t>algorithms.</w:t>
+      </w:r>
+    </w:p>
+    <w:p>
+      <w:pPr>
+        <w:spacing w:after="0" w:line="240" w:lineRule="auto"/>
+        <w:rPr>
+          <w:noProof/>
+          <w:sz w:val="28"/>
+          <w:szCs w:val="28"/>
+        </w:rPr>
+      </w:pPr>
+      <w:r>
+        <w:rPr>
+          <w:noProof/>
+          <w:sz w:val="28"/>
+          <w:szCs w:val="28"/>
+        </w:rPr>
+        <w:t>"""</w:t>
+      </w:r>
+    </w:p>
+    <w:p>
+      <w:pPr>
+        <w:spacing w:after="0" w:line="240" w:lineRule="auto"/>
+        <w:rPr>
+          <w:noProof/>
+          <w:sz w:val="28"/>
+          <w:szCs w:val="28"/>
+        </w:rPr>
+      </w:pPr>
+    </w:p>
+    <w:p>
+      <w:pPr>
+        <w:spacing w:after="0" w:line="240" w:lineRule="auto"/>
+        <w:rPr>
+          <w:noProof/>
+          <w:sz w:val="28"/>
+          <w:szCs w:val="28"/>
+        </w:rPr>
+      </w:pPr>
+    </w:p>
+    <w:p>
+      <w:pPr>
+        <w:spacing w:after="0" w:line="240" w:lineRule="auto"/>
+        <w:rPr>
+          <w:noProof/>
+          <w:sz w:val="28"/>
+          <w:szCs w:val="28"/>
+        </w:rPr>
+      </w:pPr>
+    </w:p>
+    <w:p>
+      <w:pPr>
+        <w:spacing w:after="0" w:line="240" w:lineRule="auto"/>
+        <w:rPr>
+          <w:noProof/>
+          <w:sz w:val="28"/>
+          <w:szCs w:val="28"/>
+        </w:rPr>
+      </w:pPr>
+    </w:p>
+    <w:p>
+      <w:pPr>
+        <w:spacing w:after="0" w:line="240" w:lineRule="auto"/>
+        <w:rPr>
+          <w:noProof/>
+          <w:sz w:val="28"/>
+          <w:szCs w:val="28"/>
+        </w:rPr>
+      </w:pPr>
+    </w:p>
+    <w:p>
+      <w:pPr>
+        <w:spacing w:after="0" w:line="240" w:lineRule="auto"/>
+        <w:rPr>
+          <w:noProof/>
+          <w:sz w:val="28"/>
+          <w:szCs w:val="28"/>
+        </w:rPr>
+      </w:pPr>
+      <w:r>
+        <w:rPr>
+          <w:noProof/>
+          <w:sz w:val="28"/>
+          <w:szCs w:val="28"/>
+        </w:rPr>
+        <w:lastRenderedPageBreak/>
+        <w:t>"""</w:t>
+      </w:r>
+    </w:p>
+    <w:p>
+      <w:pPr>
+        <w:spacing w:after="0" w:line="240" w:lineRule="auto"/>
+        <w:rPr>
+          <w:noProof/>
+          <w:sz w:val="28"/>
+          <w:szCs w:val="28"/>
+        </w:rPr>
+      </w:pPr>
+      <w:r>
+        <w:rPr>
+          <w:noProof/>
+          <w:sz w:val="28"/>
+          <w:szCs w:val="28"/>
+        </w:rPr>
+        <w:t>Missing-data interpolation utilities.</w:t>
+      </w:r>
+    </w:p>
+    <w:p>
+      <w:pPr>
+        <w:spacing w:after="0" w:line="240" w:lineRule="auto"/>
+        <w:rPr>
+          <w:noProof/>
+          <w:sz w:val="28"/>
+          <w:szCs w:val="28"/>
+        </w:rPr>
+      </w:pPr>
+    </w:p>
+    <w:p>
+      <w:pPr>
+        <w:spacing w:after="0" w:line="240" w:lineRule="auto"/>
+        <w:rPr>
+          <w:noProof/>
+          <w:sz w:val="28"/>
+          <w:szCs w:val="28"/>
+        </w:rPr>
+      </w:pPr>
+      <w:r>
+        <w:rPr>
+          <w:noProof/>
+          <w:sz w:val="28"/>
+          <w:szCs w:val="28"/>
+        </w:rPr>
+        <w:t>This module implements interpolation algorithms for restoring missing</w:t>
+      </w:r>
+    </w:p>
+    <w:p>
+      <w:pPr>
+        <w:spacing w:after="0" w:line="240" w:lineRule="auto"/>
+        <w:rPr>
+          <w:noProof/>
+          <w:sz w:val="28"/>
+          <w:szCs w:val="28"/>
+        </w:rPr>
+      </w:pPr>
+      <w:r>
+        <w:rPr>
+          <w:noProof/>
+          <w:sz w:val="28"/>
+          <w:szCs w:val="28"/>
+        </w:rPr>
+        <w:t>battery measurements while preserving temporal consistency.</w:t>
+      </w:r>
+    </w:p>
+    <w:p>
+      <w:pPr>
+        <w:spacing w:after="0" w:line="240" w:lineRule="auto"/>
+        <w:rPr>
+          <w:noProof/>
+          <w:sz w:val="28"/>
+          <w:szCs w:val="28"/>
+        </w:rPr>
+      </w:pPr>
+    </w:p>
+    <w:p>
+      <w:pPr>
+        <w:spacing w:after="0" w:line="240" w:lineRule="auto"/>
+        <w:rPr>
+          <w:noProof/>
+          <w:sz w:val="28"/>
+          <w:szCs w:val="28"/>
+        </w:rPr>
+      </w:pPr>
+      <w:r>
+        <w:rPr>
+          <w:noProof/>
+          <w:sz w:val="28"/>
+          <w:szCs w:val="28"/>
+        </w:rPr>
+        <w:t>Supported methods include linear interpolation, forward fill,</w:t>
+      </w:r>
+    </w:p>
+    <w:p>
+      <w:pPr>
+        <w:spacing w:after="0" w:line="240" w:lineRule="auto"/>
+        <w:rPr>
+          <w:noProof/>
+          <w:sz w:val="28"/>
+          <w:szCs w:val="28"/>
+        </w:rPr>
+      </w:pPr>
+      <w:r>
+        <w:rPr>
+          <w:noProof/>
+          <w:sz w:val="28"/>
+          <w:szCs w:val="28"/>
+        </w:rPr>
+        <w:t>backward fill, and future interpolation strategies.</w:t>
+      </w:r>
+    </w:p>
+    <w:p>
+      <w:pPr>
+        <w:spacing w:after="0" w:line="240" w:lineRule="auto"/>
+        <w:rPr>
+          <w:noProof/>
+          <w:sz w:val="28"/>
+          <w:szCs w:val="28"/>
+        </w:rPr>
+      </w:pPr>
+      <w:r>
+        <w:rPr>
+          <w:noProof/>
+          <w:sz w:val="28"/>
+          <w:szCs w:val="28"/>
+        </w:rPr>
+        <w:t>"""</w:t>
+      </w:r>
+    </w:p>
+    <w:p>
+      <w:pPr>
+        <w:spacing w:after="0" w:line="240" w:lineRule="auto"/>
+        <w:rPr>
+          <w:noProof/>
+          <w:sz w:val="28"/>
+          <w:szCs w:val="28"/>
+        </w:rPr>
+      </w:pPr>
+    </w:p>
+    <w:p>
+      <w:pPr>
+        <w:spacing w:after="0" w:line="240" w:lineRule="auto"/>
+        <w:rPr>
+          <w:noProof/>
+          <w:sz w:val="28"/>
+          <w:szCs w:val="28"/>
+        </w:rPr>
+      </w:pPr>
+    </w:p>
+    <w:p>
+      <w:pPr>
+        <w:spacing w:after="0" w:line="240" w:lineRule="auto"/>
+        <w:rPr>
+          <w:noProof/>
+          <w:sz w:val="28"/>
+          <w:szCs w:val="28"/>
+        </w:rPr>
+      </w:pPr>
+      <w:r>
+        <w:rPr>
+          <w:noProof/>
+          <w:sz w:val="28"/>
+          <w:szCs w:val="28"/>
+        </w:rPr>
+        <w:t>"""</w:t>
+      </w:r>
+    </w:p>
+    <w:p>
+      <w:pPr>
+        <w:spacing w:after="0" w:line="240" w:lineRule="auto"/>
+        <w:rPr>
+          <w:noProof/>
+          <w:sz w:val="28"/>
+          <w:szCs w:val="28"/>
+        </w:rPr>
+      </w:pPr>
+      <w:r>
+        <w:rPr>
+          <w:noProof/>
+          <w:sz w:val="28"/>
+          <w:szCs w:val="28"/>
+        </w:rPr>
+        <w:t>Dataset validation utilities.</w:t>
+      </w:r>
+    </w:p>
+    <w:p>
+      <w:pPr>
+        <w:spacing w:after="0" w:line="240" w:lineRule="auto"/>
+        <w:rPr>
+          <w:noProof/>
+          <w:sz w:val="28"/>
+          <w:szCs w:val="28"/>
+        </w:rPr>
+      </w:pPr>
+    </w:p>
+    <w:p>
+      <w:pPr>
+        <w:spacing w:after="0" w:line="240" w:lineRule="auto"/>
+        <w:rPr>
+          <w:noProof/>
+          <w:sz w:val="28"/>
+          <w:szCs w:val="28"/>
+        </w:rPr>
+      </w:pPr>
+      <w:r>
+        <w:rPr>
+          <w:noProof/>
+          <w:sz w:val="28"/>
+          <w:szCs w:val="28"/>
+        </w:rPr>
+        <w:t>This module provides validation routines that verify dataset integrity,</w:t>
+      </w:r>
+    </w:p>
+    <w:p>
+      <w:pPr>
+        <w:spacing w:after="0" w:line="240" w:lineRule="auto"/>
+        <w:rPr>
+          <w:noProof/>
+          <w:sz w:val="28"/>
+          <w:szCs w:val="28"/>
+        </w:rPr>
+      </w:pPr>
+      <w:r>
+        <w:rPr>
+          <w:noProof/>
+          <w:sz w:val="28"/>
+          <w:szCs w:val="28"/>
+        </w:rPr>
+        <w:t>required columns, datetime consistency, numeric measurements, and other</w:t>
+      </w:r>
+    </w:p>
+    <w:p>
+      <w:pPr>
+        <w:spacing w:after="0" w:line="240" w:lineRule="auto"/>
+        <w:rPr>
+          <w:noProof/>
+          <w:sz w:val="28"/>
+          <w:szCs w:val="28"/>
+        </w:rPr>
+      </w:pPr>
+      <w:r>
+        <w:rPr>
+          <w:noProof/>
+          <w:sz w:val="28"/>
+          <w:szCs w:val="28"/>
+        </w:rPr>
+        <w:t>quality checks before forecasting.</w:t>
+      </w:r>
+    </w:p>
+    <w:p>
+      <w:pPr>
+        <w:spacing w:after="0" w:line="240" w:lineRule="auto"/>
+        <w:rPr>
+          <w:noProof/>
+          <w:sz w:val="28"/>
+          <w:szCs w:val="28"/>
+        </w:rPr>
+      </w:pPr>
+      <w:r>
+        <w:rPr>
+          <w:noProof/>
+          <w:sz w:val="28"/>
+          <w:szCs w:val="28"/>
+        </w:rPr>
+        <w:t>"""</w:t>
+      </w:r>
+    </w:p>
+    <w:p>
+      <w:pPr>
+        <w:spacing w:after="0" w:line="240" w:lineRule="auto"/>
+        <w:rPr>
+          <w:noProof/>
+          <w:sz w:val="28"/>
+          <w:szCs w:val="28"/>
+        </w:rPr>
+      </w:pPr>
+    </w:p>
+    <w:p>
+      <w:pPr>
+        <w:spacing w:after="0" w:line="240" w:lineRule="auto"/>
+        <w:rPr>
+          <w:noProof/>
+          <w:sz w:val="28"/>
+          <w:szCs w:val="28"/>
+        </w:rPr>
+      </w:pPr>
+    </w:p>
+    <w:p>
+      <w:pPr>
+        <w:spacing w:after="0" w:line="240" w:lineRule="auto"/>
+        <w:rPr>
+          <w:noProof/>
+          <w:sz w:val="28"/>
+          <w:szCs w:val="28"/>
+        </w:rPr>
+      </w:pPr>
+      <w:r>
+        <w:rPr>
+          <w:noProof/>
+          <w:sz w:val="28"/>
+          <w:szCs w:val="28"/>
+        </w:rPr>
+        <w:t>"""</w:t>
+      </w:r>
+    </w:p>
+    <w:p>
+      <w:pPr>
+        <w:spacing w:after="0" w:line="240" w:lineRule="auto"/>
+        <w:rPr>
+          <w:noProof/>
+          <w:sz w:val="28"/>
+          <w:szCs w:val="28"/>
+        </w:rPr>
+      </w:pPr>
+      <w:r>
+        <w:rPr>
+          <w:noProof/>
+          <w:sz w:val="28"/>
+          <w:szCs w:val="28"/>
+        </w:rPr>
+        <w:t>ARIMA forecasting model.</w:t>
+      </w:r>
+    </w:p>
+    <w:p>
+      <w:pPr>
+        <w:spacing w:after="0" w:line="240" w:lineRule="auto"/>
+        <w:rPr>
+          <w:noProof/>
+          <w:sz w:val="28"/>
+          <w:szCs w:val="28"/>
+        </w:rPr>
+      </w:pPr>
+    </w:p>
+    <w:p>
+      <w:pPr>
+        <w:spacing w:after="0" w:line="240" w:lineRule="auto"/>
+        <w:rPr>
+          <w:noProof/>
+          <w:sz w:val="28"/>
+          <w:szCs w:val="28"/>
+        </w:rPr>
+      </w:pPr>
+      <w:r>
+        <w:rPr>
+          <w:noProof/>
+          <w:sz w:val="28"/>
+          <w:szCs w:val="28"/>
+        </w:rPr>
+        <w:t>This module implements statistical time-series forecasting using the</w:t>
+      </w:r>
+    </w:p>
+    <w:p>
+      <w:pPr>
+        <w:spacing w:after="0" w:line="240" w:lineRule="auto"/>
+        <w:rPr>
+          <w:noProof/>
+          <w:sz w:val="28"/>
+          <w:szCs w:val="28"/>
+        </w:rPr>
+      </w:pPr>
+      <w:r>
+        <w:rPr>
+          <w:noProof/>
+          <w:sz w:val="28"/>
+          <w:szCs w:val="28"/>
+        </w:rPr>
+        <w:t>Autoregressive Integrated Moving Average (ARIMA) methodology,</w:t>
+      </w:r>
+    </w:p>
+    <w:p>
+      <w:pPr>
+        <w:spacing w:after="0" w:line="240" w:lineRule="auto"/>
+        <w:rPr>
+          <w:noProof/>
+          <w:sz w:val="28"/>
+          <w:szCs w:val="28"/>
+        </w:rPr>
+      </w:pPr>
+      <w:r>
+        <w:rPr>
+          <w:noProof/>
+          <w:sz w:val="28"/>
+          <w:szCs w:val="28"/>
+        </w:rPr>
+        <w:t>including model fitting, diagnostics, and future prediction.</w:t>
+      </w:r>
+    </w:p>
+    <w:p>
+      <w:pPr>
+        <w:spacing w:after="0" w:line="240" w:lineRule="auto"/>
+        <w:rPr>
+          <w:noProof/>
+          <w:sz w:val="28"/>
+          <w:szCs w:val="28"/>
+        </w:rPr>
+      </w:pPr>
+      <w:r>
+        <w:rPr>
+          <w:noProof/>
+          <w:sz w:val="28"/>
+          <w:szCs w:val="28"/>
+        </w:rPr>
+        <w:t>"""</w:t>
+      </w:r>
+    </w:p>
+    <w:p>
+      <w:pPr>
+        <w:spacing w:after="0" w:line="240" w:lineRule="auto"/>
+        <w:rPr>
+          <w:noProof/>
+          <w:sz w:val="28"/>
+          <w:szCs w:val="28"/>
+        </w:rPr>
+      </w:pPr>
+    </w:p>
+    <w:p>
+      <w:pPr>
+        <w:spacing w:after="0" w:line="240" w:lineRule="auto"/>
+        <w:rPr>
+          <w:noProof/>
+          <w:sz w:val="28"/>
+          <w:szCs w:val="28"/>
+        </w:rPr>
+      </w:pPr>
+    </w:p>
+    <w:p>
+      <w:pPr>
+        <w:spacing w:after="0" w:line="240" w:lineRule="auto"/>
+        <w:rPr>
+          <w:noProof/>
+          <w:sz w:val="28"/>
+          <w:szCs w:val="28"/>
+        </w:rPr>
+      </w:pPr>
+      <w:r>
+        <w:rPr>
+          <w:noProof/>
+          <w:sz w:val="28"/>
+          <w:szCs w:val="28"/>
+        </w:rPr>
+        <w:t>"""</w:t>
+      </w:r>
+    </w:p>
+    <w:p>
+      <w:pPr>
+        <w:spacing w:after="0" w:line="240" w:lineRule="auto"/>
+        <w:rPr>
+          <w:noProof/>
+          <w:sz w:val="28"/>
+          <w:szCs w:val="28"/>
+        </w:rPr>
+      </w:pPr>
+      <w:r>
+        <w:rPr>
+          <w:noProof/>
+          <w:sz w:val="28"/>
+          <w:szCs w:val="28"/>
+        </w:rPr>
+        <w:t>Adaptive Kalman filter.</w:t>
+      </w:r>
+    </w:p>
+    <w:p>
+      <w:pPr>
+        <w:spacing w:after="0" w:line="240" w:lineRule="auto"/>
+        <w:rPr>
+          <w:noProof/>
+          <w:sz w:val="28"/>
+          <w:szCs w:val="28"/>
+        </w:rPr>
+      </w:pPr>
+    </w:p>
+    <w:p>
+      <w:pPr>
+        <w:spacing w:after="0" w:line="240" w:lineRule="auto"/>
+        <w:rPr>
+          <w:noProof/>
+          <w:sz w:val="28"/>
+          <w:szCs w:val="28"/>
+        </w:rPr>
+      </w:pPr>
+      <w:r>
+        <w:rPr>
+          <w:noProof/>
+          <w:sz w:val="28"/>
+          <w:szCs w:val="28"/>
+        </w:rPr>
+        <w:t>This module implements an adaptive Kalman filtering framework for</w:t>
+      </w:r>
+    </w:p>
+    <w:p>
+      <w:pPr>
+        <w:spacing w:after="0" w:line="240" w:lineRule="auto"/>
+        <w:rPr>
+          <w:noProof/>
+          <w:sz w:val="28"/>
+          <w:szCs w:val="28"/>
+        </w:rPr>
+      </w:pPr>
+      <w:r>
+        <w:rPr>
+          <w:noProof/>
+          <w:sz w:val="28"/>
+          <w:szCs w:val="28"/>
+        </w:rPr>
+        <w:t>battery voltage estimation, trend tracking, uncertainty estimation,</w:t>
+      </w:r>
+    </w:p>
+    <w:p>
+      <w:pPr>
+        <w:spacing w:after="0" w:line="240" w:lineRule="auto"/>
+        <w:rPr>
+          <w:noProof/>
+          <w:sz w:val="28"/>
+          <w:szCs w:val="28"/>
+        </w:rPr>
+      </w:pPr>
+      <w:r>
+        <w:rPr>
+          <w:noProof/>
+          <w:sz w:val="28"/>
+          <w:szCs w:val="28"/>
+        </w:rPr>
+        <w:t>and Remaining Useful Life prediction.</w:t>
+      </w:r>
+    </w:p>
+    <w:p>
+      <w:pPr>
+        <w:spacing w:after="0" w:line="240" w:lineRule="auto"/>
+        <w:rPr>
+          <w:noProof/>
+          <w:sz w:val="28"/>
+          <w:szCs w:val="28"/>
+        </w:rPr>
+      </w:pPr>
+      <w:r>
+        <w:rPr>
+          <w:noProof/>
+          <w:sz w:val="28"/>
+          <w:szCs w:val="28"/>
+        </w:rPr>
+        <w:t>"""</w:t>
+      </w:r>
+    </w:p>
+    <w:p>
+      <w:pPr>
+        <w:spacing w:after="0" w:line="240" w:lineRule="auto"/>
+        <w:rPr>
+          <w:noProof/>
+          <w:sz w:val="28"/>
+          <w:szCs w:val="28"/>
+        </w:rPr>
+      </w:pPr>
+    </w:p>
+    <w:p>
+      <w:pPr>
+        <w:spacing w:after="0" w:line="240" w:lineRule="auto"/>
+        <w:rPr>
+          <w:noProof/>
+          <w:sz w:val="28"/>
+          <w:szCs w:val="28"/>
+        </w:rPr>
+      </w:pPr>
+    </w:p>
+    <w:p>
+      <w:pPr>
+        <w:spacing w:after="0" w:line="240" w:lineRule="auto"/>
+        <w:rPr>
+          <w:noProof/>
+          <w:sz w:val="28"/>
+          <w:szCs w:val="28"/>
+        </w:rPr>
+      </w:pPr>
+    </w:p>
+    <w:p>
+      <w:pPr>
+        <w:spacing w:after="0" w:line="240" w:lineRule="auto"/>
+        <w:rPr>
+          <w:noProof/>
+          <w:sz w:val="28"/>
+          <w:szCs w:val="28"/>
+        </w:rPr>
+      </w:pPr>
+    </w:p>
+    <w:p>
+      <w:pPr>
+        <w:spacing w:after="0" w:line="240" w:lineRule="auto"/>
+        <w:rPr>
+          <w:noProof/>
+          <w:sz w:val="28"/>
+          <w:szCs w:val="28"/>
+        </w:rPr>
+      </w:pPr>
+      <w:r>
+        <w:rPr>
+          <w:noProof/>
+          <w:sz w:val="28"/>
+          <w:szCs w:val="28"/>
+        </w:rPr>
+        <w:lastRenderedPageBreak/>
+        <w:t>"""</w:t>
+      </w:r>
+    </w:p>
+    <w:p>
+      <w:pPr>
+        <w:spacing w:after="0" w:line="240" w:lineRule="auto"/>
+        <w:rPr>
+          <w:noProof/>
+          <w:sz w:val="28"/>
+          <w:szCs w:val="28"/>
+        </w:rPr>
+      </w:pPr>
+      <w:r>
+        <w:rPr>
+          <w:noProof/>
+          <w:sz w:val="28"/>
+          <w:szCs w:val="28"/>
+        </w:rPr>
+        <w:t>Remaining Useful Life estimation.</w:t>
+      </w:r>
+    </w:p>
+    <w:p>
+      <w:pPr>
+        <w:spacing w:after="0" w:line="240" w:lineRule="auto"/>
+        <w:rPr>
+          <w:noProof/>
+          <w:sz w:val="28"/>
+          <w:szCs w:val="28"/>
+        </w:rPr>
+      </w:pPr>
+    </w:p>
+    <w:p>
+      <w:pPr>
+        <w:spacing w:after="0" w:line="240" w:lineRule="auto"/>
+        <w:rPr>
+          <w:noProof/>
+          <w:sz w:val="28"/>
+          <w:szCs w:val="28"/>
+        </w:rPr>
+      </w:pPr>
+      <w:r>
+        <w:rPr>
+          <w:noProof/>
+          <w:sz w:val="28"/>
+          <w:szCs w:val="28"/>
+        </w:rPr>
+        <w:t>This module estimates battery Remaining Useful Life (RUL) using</w:t>
+      </w:r>
+    </w:p>
+    <w:p>
+      <w:pPr>
+        <w:spacing w:after="0" w:line="240" w:lineRule="auto"/>
+        <w:rPr>
+          <w:noProof/>
+          <w:sz w:val="28"/>
+          <w:szCs w:val="28"/>
+        </w:rPr>
+      </w:pPr>
+      <w:r>
+        <w:rPr>
+          <w:noProof/>
+          <w:sz w:val="28"/>
+          <w:szCs w:val="28"/>
+        </w:rPr>
+        <w:t>forecasting models, degradation trends, uncertainty propagation,</w:t>
+      </w:r>
+    </w:p>
+    <w:p>
+      <w:pPr>
+        <w:spacing w:after="0" w:line="240" w:lineRule="auto"/>
+        <w:rPr>
+          <w:noProof/>
+          <w:sz w:val="28"/>
+          <w:szCs w:val="28"/>
+        </w:rPr>
+      </w:pPr>
+      <w:r>
+        <w:rPr>
+          <w:noProof/>
+          <w:sz w:val="28"/>
+          <w:szCs w:val="28"/>
+        </w:rPr>
+        <w:t>and configurable end-of-life criteria.</w:t>
+      </w:r>
+    </w:p>
+    <w:p>
+      <w:pPr>
+        <w:spacing w:after="0" w:line="240" w:lineRule="auto"/>
+        <w:rPr>
+          <w:noProof/>
+          <w:sz w:val="28"/>
+          <w:szCs w:val="28"/>
+        </w:rPr>
+      </w:pPr>
+      <w:r>
+        <w:rPr>
+          <w:noProof/>
+          <w:sz w:val="28"/>
+          <w:szCs w:val="28"/>
+        </w:rPr>
+        <w:t>"""</w:t>
+      </w:r>
+    </w:p>
+    <w:p>
+      <w:pPr>
+        <w:spacing w:after="0" w:line="240" w:lineRule="auto"/>
+        <w:rPr>
+          <w:noProof/>
+          <w:sz w:val="28"/>
+          <w:szCs w:val="28"/>
+        </w:rPr>
+      </w:pPr>
+    </w:p>
+    <w:p>
+      <w:pPr>
+        <w:spacing w:after="0" w:line="240" w:lineRule="auto"/>
+        <w:rPr>
+          <w:noProof/>
+          <w:sz w:val="28"/>
+          <w:szCs w:val="28"/>
+        </w:rPr>
+      </w:pPr>
+    </w:p>
+    <w:p>
+      <w:pPr>
+        <w:spacing w:after="0" w:line="240" w:lineRule="auto"/>
+        <w:rPr>
+          <w:noProof/>
+          <w:sz w:val="28"/>
+          <w:szCs w:val="28"/>
+        </w:rPr>
+      </w:pPr>
+      <w:r>
+        <w:rPr>
+          <w:noProof/>
+          <w:sz w:val="28"/>
+          <w:szCs w:val="28"/>
+        </w:rPr>
+        <w:t>"""</w:t>
+      </w:r>
+    </w:p>
+    <w:p>
+      <w:pPr>
+        <w:spacing w:after="0" w:line="240" w:lineRule="auto"/>
+        <w:rPr>
+          <w:noProof/>
+          <w:sz w:val="28"/>
+          <w:szCs w:val="28"/>
+        </w:rPr>
+      </w:pPr>
+      <w:r>
+        <w:rPr>
+          <w:noProof/>
+          <w:sz w:val="28"/>
+          <w:szCs w:val="28"/>
+        </w:rPr>
+        <w:t>Forecasting pipeline.</w:t>
+      </w:r>
+    </w:p>
+    <w:p>
+      <w:pPr>
+        <w:spacing w:after="0" w:line="240" w:lineRule="auto"/>
+        <w:rPr>
+          <w:noProof/>
+          <w:sz w:val="28"/>
+          <w:szCs w:val="28"/>
+        </w:rPr>
+      </w:pPr>
+    </w:p>
+    <w:p>
+      <w:pPr>
+        <w:spacing w:after="0" w:line="240" w:lineRule="auto"/>
+        <w:rPr>
+          <w:noProof/>
+          <w:sz w:val="28"/>
+          <w:szCs w:val="28"/>
+        </w:rPr>
+      </w:pPr>
+      <w:r>
+        <w:rPr>
+          <w:noProof/>
+          <w:sz w:val="28"/>
+          <w:szCs w:val="28"/>
+        </w:rPr>
+        <w:t>This module coordinates the complete battery forecasting workflow,</w:t>
+      </w:r>
+    </w:p>
+    <w:p>
+      <w:pPr>
+        <w:spacing w:after="0" w:line="240" w:lineRule="auto"/>
+        <w:rPr>
+          <w:noProof/>
+          <w:sz w:val="28"/>
+          <w:szCs w:val="28"/>
+        </w:rPr>
+      </w:pPr>
+      <w:r>
+        <w:rPr>
+          <w:noProof/>
+          <w:sz w:val="28"/>
+          <w:szCs w:val="28"/>
+        </w:rPr>
+        <w:t>including data preparation, preprocessing, model training,</w:t>
+      </w:r>
+    </w:p>
+    <w:p>
+      <w:pPr>
+        <w:spacing w:after="0" w:line="240" w:lineRule="auto"/>
+        <w:rPr>
+          <w:noProof/>
+          <w:sz w:val="28"/>
+          <w:szCs w:val="28"/>
+        </w:rPr>
+      </w:pPr>
+      <w:r>
+        <w:rPr>
+          <w:noProof/>
+          <w:sz w:val="28"/>
+          <w:szCs w:val="28"/>
+        </w:rPr>
+        <w:t>forecast generation, evaluation, and reporting.</w:t>
+      </w:r>
+    </w:p>
+    <w:p>
+      <w:pPr>
+        <w:spacing w:after="0" w:line="240" w:lineRule="auto"/>
+        <w:rPr>
+          <w:noProof/>
+          <w:sz w:val="28"/>
+          <w:szCs w:val="28"/>
+        </w:rPr>
+      </w:pPr>
+      <w:r>
+        <w:rPr>
+          <w:noProof/>
+          <w:sz w:val="28"/>
+          <w:szCs w:val="28"/>
+        </w:rPr>
+        <w:t>"""</w:t>
       </w:r>
     </w:p>
     <w:sectPr>

</xml_diff>

<commit_message>
feat(data): add exploratory statistics
</commit_message>
<xml_diff>
--- a/docs/development_flow.docx
+++ b/docs/development_flow.docx
@@ -2437,6 +2437,330 @@
           <w:szCs w:val="28"/>
         </w:rPr>
         <w:t>"""</w:t>
+      </w:r>
+    </w:p>
+    <w:p>
+      <w:pPr>
+        <w:spacing w:after="0" w:line="240" w:lineRule="auto"/>
+        <w:rPr>
+          <w:noProof/>
+          <w:sz w:val="28"/>
+          <w:szCs w:val="28"/>
+        </w:rPr>
+      </w:pPr>
+    </w:p>
+    <w:p>
+      <w:pPr>
+        <w:spacing w:after="0" w:line="240" w:lineRule="auto"/>
+        <w:rPr>
+          <w:noProof/>
+          <w:sz w:val="28"/>
+          <w:szCs w:val="28"/>
+        </w:rPr>
+      </w:pPr>
+    </w:p>
+    <w:p>
+      <w:pPr>
+        <w:spacing w:after="0" w:line="240" w:lineRule="auto"/>
+        <w:rPr>
+          <w:b/>
+          <w:bCs/>
+          <w:noProof/>
+          <w:sz w:val="36"/>
+          <w:szCs w:val="36"/>
+          <w:u w:val="single"/>
+        </w:rPr>
+      </w:pPr>
+      <w:r>
+        <w:rPr>
+          <w:b/>
+          <w:bCs/>
+          <w:noProof/>
+          <w:sz w:val="36"/>
+          <w:szCs w:val="36"/>
+          <w:u w:val="single"/>
+        </w:rPr>
+        <w:t>Workflow:</w:t>
+      </w:r>
+    </w:p>
+    <w:p>
+      <w:pPr>
+        <w:spacing w:after="0" w:line="240" w:lineRule="auto"/>
+        <w:rPr>
+          <w:noProof/>
+          <w:sz w:val="28"/>
+          <w:szCs w:val="28"/>
+        </w:rPr>
+      </w:pPr>
+    </w:p>
+    <w:p>
+      <w:pPr>
+        <w:spacing w:after="0" w:line="240" w:lineRule="auto"/>
+        <w:rPr>
+          <w:noProof/>
+          <w:sz w:val="28"/>
+          <w:szCs w:val="28"/>
+        </w:rPr>
+      </w:pPr>
+      <w:r>
+        <w:rPr>
+          <w:noProof/>
+          <w:sz w:val="28"/>
+          <w:szCs w:val="28"/>
+        </w:rPr>
+        <w:t>Code</w:t>
+      </w:r>
+    </w:p>
+    <w:p>
+      <w:pPr>
+        <w:spacing w:after="0" w:line="240" w:lineRule="auto"/>
+        <w:rPr>
+          <w:noProof/>
+          <w:sz w:val="28"/>
+          <w:szCs w:val="28"/>
+        </w:rPr>
+      </w:pPr>
+      <w:r>
+        <w:rPr>
+          <w:noProof/>
+          <w:sz w:val="28"/>
+          <w:szCs w:val="28"/>
+        </w:rPr>
+        <w:t xml:space="preserve">   ↓</w:t>
+      </w:r>
+    </w:p>
+    <w:p>
+      <w:pPr>
+        <w:spacing w:after="0" w:line="240" w:lineRule="auto"/>
+        <w:rPr>
+          <w:noProof/>
+          <w:sz w:val="28"/>
+          <w:szCs w:val="28"/>
+        </w:rPr>
+      </w:pPr>
+      <w:r>
+        <w:rPr>
+          <w:noProof/>
+          <w:sz w:val="28"/>
+          <w:szCs w:val="28"/>
+        </w:rPr>
+        <w:t>pytest</w:t>
+      </w:r>
+    </w:p>
+    <w:p>
+      <w:pPr>
+        <w:spacing w:after="0" w:line="240" w:lineRule="auto"/>
+        <w:rPr>
+          <w:noProof/>
+          <w:sz w:val="28"/>
+          <w:szCs w:val="28"/>
+        </w:rPr>
+      </w:pPr>
+      <w:r>
+        <w:rPr>
+          <w:noProof/>
+          <w:sz w:val="28"/>
+          <w:szCs w:val="28"/>
+        </w:rPr>
+        <w:t xml:space="preserve">   ↓</w:t>
+      </w:r>
+    </w:p>
+    <w:p>
+      <w:pPr>
+        <w:spacing w:after="0" w:line="240" w:lineRule="auto"/>
+        <w:rPr>
+          <w:noProof/>
+          <w:sz w:val="28"/>
+          <w:szCs w:val="28"/>
+        </w:rPr>
+      </w:pPr>
+      <w:r>
+        <w:rPr>
+          <w:noProof/>
+          <w:sz w:val="28"/>
+          <w:szCs w:val="28"/>
+        </w:rPr>
+        <w:t>git status</w:t>
+      </w:r>
+    </w:p>
+    <w:p>
+      <w:pPr>
+        <w:spacing w:after="0" w:line="240" w:lineRule="auto"/>
+        <w:rPr>
+          <w:noProof/>
+          <w:sz w:val="28"/>
+          <w:szCs w:val="28"/>
+        </w:rPr>
+      </w:pPr>
+      <w:r>
+        <w:rPr>
+          <w:noProof/>
+          <w:sz w:val="28"/>
+          <w:szCs w:val="28"/>
+        </w:rPr>
+        <w:t xml:space="preserve">   ↓</w:t>
+      </w:r>
+    </w:p>
+    <w:p>
+      <w:pPr>
+        <w:spacing w:after="0" w:line="240" w:lineRule="auto"/>
+        <w:rPr>
+          <w:noProof/>
+          <w:sz w:val="28"/>
+          <w:szCs w:val="28"/>
+        </w:rPr>
+      </w:pPr>
+      <w:r>
+        <w:rPr>
+          <w:noProof/>
+          <w:sz w:val="28"/>
+          <w:szCs w:val="28"/>
+        </w:rPr>
+        <w:t>git add .</w:t>
+      </w:r>
+    </w:p>
+    <w:p>
+      <w:pPr>
+        <w:spacing w:after="0" w:line="240" w:lineRule="auto"/>
+        <w:rPr>
+          <w:noProof/>
+          <w:sz w:val="28"/>
+          <w:szCs w:val="28"/>
+        </w:rPr>
+      </w:pPr>
+      <w:r>
+        <w:rPr>
+          <w:noProof/>
+          <w:sz w:val="28"/>
+          <w:szCs w:val="28"/>
+        </w:rPr>
+        <w:t xml:space="preserve">   ↓</w:t>
+      </w:r>
+    </w:p>
+    <w:p>
+      <w:pPr>
+        <w:spacing w:after="0" w:line="240" w:lineRule="auto"/>
+        <w:rPr>
+          <w:noProof/>
+          <w:sz w:val="28"/>
+          <w:szCs w:val="28"/>
+        </w:rPr>
+      </w:pPr>
+      <w:r>
+        <w:rPr>
+          <w:noProof/>
+          <w:sz w:val="28"/>
+          <w:szCs w:val="28"/>
+        </w:rPr>
+        <w:t>git commit</w:t>
+      </w:r>
+    </w:p>
+    <w:p>
+      <w:pPr>
+        <w:spacing w:after="0" w:line="240" w:lineRule="auto"/>
+        <w:rPr>
+          <w:noProof/>
+          <w:sz w:val="28"/>
+          <w:szCs w:val="28"/>
+        </w:rPr>
+      </w:pPr>
+      <w:r>
+        <w:rPr>
+          <w:noProof/>
+          <w:sz w:val="28"/>
+          <w:szCs w:val="28"/>
+        </w:rPr>
+        <w:t xml:space="preserve">   ↓</w:t>
+      </w:r>
+    </w:p>
+    <w:p>
+      <w:pPr>
+        <w:spacing w:after="0" w:line="240" w:lineRule="auto"/>
+        <w:rPr>
+          <w:noProof/>
+          <w:sz w:val="28"/>
+          <w:szCs w:val="28"/>
+        </w:rPr>
+      </w:pPr>
+      <w:r>
+        <w:rPr>
+          <w:noProof/>
+          <w:sz w:val="28"/>
+          <w:szCs w:val="28"/>
+        </w:rPr>
+        <w:t>git push</w:t>
+      </w:r>
+    </w:p>
+    <w:p>
+      <w:pPr>
+        <w:spacing w:after="0" w:line="240" w:lineRule="auto"/>
+        <w:rPr>
+          <w:noProof/>
+          <w:sz w:val="28"/>
+          <w:szCs w:val="28"/>
+        </w:rPr>
+      </w:pPr>
+      <w:r>
+        <w:rPr>
+          <w:noProof/>
+          <w:sz w:val="28"/>
+          <w:szCs w:val="28"/>
+        </w:rPr>
+        <w:t xml:space="preserve">   ↓</w:t>
+      </w:r>
+    </w:p>
+    <w:p>
+      <w:pPr>
+        <w:spacing w:after="0" w:line="240" w:lineRule="auto"/>
+        <w:rPr>
+          <w:noProof/>
+          <w:sz w:val="28"/>
+          <w:szCs w:val="28"/>
+        </w:rPr>
+      </w:pPr>
+      <w:r>
+        <w:rPr>
+          <w:noProof/>
+          <w:sz w:val="28"/>
+          <w:szCs w:val="28"/>
+        </w:rPr>
+        <w:t>git log --oneline -5</w:t>
+      </w:r>
+    </w:p>
+    <w:p>
+      <w:pPr>
+        <w:spacing w:after="0" w:line="240" w:lineRule="auto"/>
+        <w:rPr>
+          <w:noProof/>
+          <w:sz w:val="28"/>
+          <w:szCs w:val="28"/>
+        </w:rPr>
+      </w:pPr>
+      <w:r>
+        <w:rPr>
+          <w:noProof/>
+          <w:sz w:val="28"/>
+          <w:szCs w:val="28"/>
+        </w:rPr>
+        <w:t xml:space="preserve">   ↓</w:t>
+      </w:r>
+    </w:p>
+    <w:p>
+      <w:pPr>
+        <w:spacing w:after="0" w:line="240" w:lineRule="auto"/>
+        <w:rPr>
+          <w:noProof/>
+          <w:sz w:val="28"/>
+          <w:szCs w:val="28"/>
+        </w:rPr>
+      </w:pPr>
+      <w:r>
+        <w:rPr>
+          <w:noProof/>
+          <w:sz w:val="28"/>
+          <w:szCs w:val="28"/>
+        </w:rPr>
+        <w:t>GitHub verification</w:t>
       </w:r>
     </w:p>
     <w:sectPr>

</xml_diff>

<commit_message>
feat(visualization): add dataset plotting
</commit_message>
<xml_diff>
--- a/docs/development_flow.docx
+++ b/docs/development_flow.docx
@@ -2762,6 +2762,589 @@
         </w:rPr>
         <w:t>GitHub verification</w:t>
       </w:r>
+    </w:p>
+    <w:p>
+      <w:pPr>
+        <w:spacing w:after="0" w:line="240" w:lineRule="auto"/>
+        <w:rPr>
+          <w:noProof/>
+          <w:sz w:val="28"/>
+          <w:szCs w:val="28"/>
+        </w:rPr>
+      </w:pPr>
+    </w:p>
+    <w:p>
+      <w:pPr>
+        <w:rPr>
+          <w:noProof/>
+          <w:sz w:val="28"/>
+          <w:szCs w:val="28"/>
+        </w:rPr>
+      </w:pPr>
+      <w:r>
+        <w:rPr>
+          <w:noProof/>
+          <w:sz w:val="28"/>
+          <w:szCs w:val="28"/>
+        </w:rPr>
+        <w:br w:type="page"/>
+      </w:r>
+    </w:p>
+    <w:p>
+      <w:pPr>
+        <w:spacing w:after="0" w:line="240" w:lineRule="auto"/>
+        <w:rPr>
+          <w:noProof/>
+          <w:sz w:val="28"/>
+          <w:szCs w:val="28"/>
+          <w:u w:val="single"/>
+          <w:lang w:val="tr-TR"/>
+        </w:rPr>
+      </w:pPr>
+      <w:r>
+        <w:rPr>
+          <w:noProof/>
+          <w:sz w:val="28"/>
+          <w:szCs w:val="28"/>
+          <w:u w:val="single"/>
+          <w:lang w:val="tr-TR"/>
+        </w:rPr>
+        <w:lastRenderedPageBreak/>
+        <w:t>This is a common design in scientific Python libraries:</w:t>
+      </w:r>
+    </w:p>
+    <w:p>
+      <w:pPr>
+        <w:spacing w:after="0" w:line="240" w:lineRule="auto"/>
+        <w:rPr>
+          <w:noProof/>
+          <w:sz w:val="28"/>
+          <w:szCs w:val="28"/>
+          <w:u w:val="single"/>
+          <w:lang w:val="tr-TR"/>
+        </w:rPr>
+      </w:pPr>
+    </w:p>
+    <w:p>
+      <w:pPr>
+        <w:numPr>
+          <w:ilvl w:val="0"/>
+          <w:numId w:val="1"/>
+        </w:numPr>
+        <w:spacing w:after="0" w:line="240" w:lineRule="auto"/>
+        <w:rPr>
+          <w:noProof/>
+          <w:sz w:val="28"/>
+          <w:szCs w:val="28"/>
+          <w:lang w:val="tr-TR"/>
+        </w:rPr>
+      </w:pPr>
+      <w:r>
+        <w:rPr>
+          <w:b/>
+          <w:bCs/>
+          <w:noProof/>
+          <w:sz w:val="28"/>
+          <w:szCs w:val="28"/>
+          <w:lang w:val="tr-TR"/>
+        </w:rPr>
+        <w:t>pandas</w:t>
+      </w:r>
+      <w:r>
+        <w:rPr>
+          <w:noProof/>
+          <w:sz w:val="28"/>
+          <w:szCs w:val="28"/>
+          <w:lang w:val="tr-TR"/>
+        </w:rPr>
+        <w:t xml:space="preserve"> → stores data </w:t>
+      </w:r>
+    </w:p>
+    <w:p>
+      <w:pPr>
+        <w:numPr>
+          <w:ilvl w:val="0"/>
+          <w:numId w:val="1"/>
+        </w:numPr>
+        <w:spacing w:after="0" w:line="240" w:lineRule="auto"/>
+        <w:rPr>
+          <w:noProof/>
+          <w:sz w:val="28"/>
+          <w:szCs w:val="28"/>
+          <w:lang w:val="tr-TR"/>
+        </w:rPr>
+      </w:pPr>
+      <w:r>
+        <w:rPr>
+          <w:b/>
+          <w:bCs/>
+          <w:noProof/>
+          <w:sz w:val="28"/>
+          <w:szCs w:val="28"/>
+          <w:lang w:val="tr-TR"/>
+        </w:rPr>
+        <w:t>matplotlib</w:t>
+      </w:r>
+      <w:r>
+        <w:rPr>
+          <w:noProof/>
+          <w:sz w:val="28"/>
+          <w:szCs w:val="28"/>
+          <w:lang w:val="tr-TR"/>
+        </w:rPr>
+        <w:t xml:space="preserve"> → plots data </w:t>
+      </w:r>
+    </w:p>
+    <w:p>
+      <w:pPr>
+        <w:numPr>
+          <w:ilvl w:val="0"/>
+          <w:numId w:val="1"/>
+        </w:numPr>
+        <w:spacing w:after="0" w:line="240" w:lineRule="auto"/>
+        <w:rPr>
+          <w:noProof/>
+          <w:sz w:val="28"/>
+          <w:szCs w:val="28"/>
+          <w:lang w:val="tr-TR"/>
+        </w:rPr>
+      </w:pPr>
+      <w:r>
+        <w:rPr>
+          <w:b/>
+          <w:bCs/>
+          <w:noProof/>
+          <w:sz w:val="28"/>
+          <w:szCs w:val="28"/>
+          <w:lang w:val="tr-TR"/>
+        </w:rPr>
+        <w:t>scikit-learn</w:t>
+      </w:r>
+      <w:r>
+        <w:rPr>
+          <w:noProof/>
+          <w:sz w:val="28"/>
+          <w:szCs w:val="28"/>
+          <w:lang w:val="tr-TR"/>
+        </w:rPr>
+        <w:t xml:space="preserve"> → models data </w:t>
+      </w:r>
+    </w:p>
+    <w:p>
+      <w:pPr>
+        <w:spacing w:after="0" w:line="240" w:lineRule="auto"/>
+        <w:rPr>
+          <w:noProof/>
+          <w:sz w:val="28"/>
+          <w:szCs w:val="28"/>
+          <w:lang w:val="tr-TR"/>
+        </w:rPr>
+      </w:pPr>
+    </w:p>
+    <w:p>
+      <w:pPr>
+        <w:spacing w:after="0" w:line="240" w:lineRule="auto"/>
+        <w:rPr>
+          <w:noProof/>
+          <w:sz w:val="28"/>
+          <w:szCs w:val="28"/>
+          <w:lang w:val="tr-TR"/>
+        </w:rPr>
+      </w:pPr>
+      <w:r>
+        <w:rPr>
+          <w:noProof/>
+          <w:sz w:val="28"/>
+          <w:szCs w:val="28"/>
+          <w:lang w:val="tr-TR"/>
+        </w:rPr>
+        <w:t>The same separation will make ZenerEstimation easier to maintain.</w:t>
+      </w:r>
+    </w:p>
+    <w:p>
+      <w:pPr>
+        <w:spacing w:after="0" w:line="240" w:lineRule="auto"/>
+        <w:rPr>
+          <w:noProof/>
+          <w:sz w:val="28"/>
+          <w:szCs w:val="28"/>
+          <w:lang w:val="tr-TR"/>
+        </w:rPr>
+      </w:pPr>
+    </w:p>
+    <w:p>
+      <w:pPr>
+        <w:spacing w:after="0" w:line="240" w:lineRule="auto"/>
+        <w:rPr>
+          <w:b/>
+          <w:bCs/>
+          <w:noProof/>
+          <w:sz w:val="28"/>
+          <w:szCs w:val="28"/>
+          <w:lang w:val="tr-TR"/>
+        </w:rPr>
+      </w:pPr>
+      <w:r>
+        <w:rPr>
+          <w:b/>
+          <w:bCs/>
+          <w:noProof/>
+          <w:sz w:val="28"/>
+          <w:szCs w:val="28"/>
+          <w:lang w:val="tr-TR"/>
+        </w:rPr>
+        <w:t>BatteryDataset</w:t>
+      </w:r>
+    </w:p>
+    <w:p>
+      <w:pPr>
+        <w:spacing w:after="0" w:line="240" w:lineRule="auto"/>
+        <w:rPr>
+          <w:noProof/>
+          <w:sz w:val="28"/>
+          <w:szCs w:val="28"/>
+          <w:lang w:val="tr-TR"/>
+        </w:rPr>
+      </w:pPr>
+      <w:r>
+        <w:rPr>
+          <w:noProof/>
+          <w:sz w:val="28"/>
+          <w:szCs w:val="28"/>
+          <w:lang w:val="tr-TR"/>
+        </w:rPr>
+        <w:t xml:space="preserve">        │</w:t>
+      </w:r>
+    </w:p>
+    <w:p>
+      <w:pPr>
+        <w:spacing w:after="0" w:line="240" w:lineRule="auto"/>
+        <w:rPr>
+          <w:noProof/>
+          <w:sz w:val="28"/>
+          <w:szCs w:val="28"/>
+          <w:lang w:val="tr-TR"/>
+        </w:rPr>
+      </w:pPr>
+      <w:r>
+        <w:rPr>
+          <w:noProof/>
+          <w:sz w:val="28"/>
+          <w:szCs w:val="28"/>
+          <w:lang w:val="tr-TR"/>
+        </w:rPr>
+        <w:t xml:space="preserve">        │</w:t>
+      </w:r>
+    </w:p>
+    <w:p>
+      <w:pPr>
+        <w:spacing w:after="0" w:line="240" w:lineRule="auto"/>
+        <w:rPr>
+          <w:noProof/>
+          <w:sz w:val="28"/>
+          <w:szCs w:val="28"/>
+          <w:lang w:val="tr-TR"/>
+        </w:rPr>
+      </w:pPr>
+      <w:r>
+        <w:rPr>
+          <w:noProof/>
+          <w:sz w:val="28"/>
+          <w:szCs w:val="28"/>
+          <w:lang w:val="tr-TR"/>
+        </w:rPr>
+        <w:t xml:space="preserve">        </w:t>
+      </w:r>
+      <w:r>
+        <w:rPr>
+          <w:rFonts w:ascii="Arial" w:hAnsi="Arial" w:cs="Arial"/>
+          <w:noProof/>
+          <w:sz w:val="28"/>
+          <w:szCs w:val="28"/>
+          <w:lang w:val="tr-TR"/>
+        </w:rPr>
+        <w:t>▼</w:t>
+      </w:r>
+    </w:p>
+    <w:p>
+      <w:pPr>
+        <w:spacing w:after="0" w:line="240" w:lineRule="auto"/>
+        <w:rPr>
+          <w:b/>
+          <w:bCs/>
+          <w:noProof/>
+          <w:sz w:val="28"/>
+          <w:szCs w:val="28"/>
+          <w:lang w:val="tr-TR"/>
+        </w:rPr>
+      </w:pPr>
+      <w:r>
+        <w:rPr>
+          <w:b/>
+          <w:bCs/>
+          <w:noProof/>
+          <w:sz w:val="28"/>
+          <w:szCs w:val="28"/>
+          <w:lang w:val="tr-TR"/>
+        </w:rPr>
+        <w:t>DatasetPlotter</w:t>
+      </w:r>
+    </w:p>
+    <w:p>
+      <w:pPr>
+        <w:spacing w:after="0" w:line="240" w:lineRule="auto"/>
+        <w:rPr>
+          <w:noProof/>
+          <w:sz w:val="28"/>
+          <w:szCs w:val="28"/>
+          <w:lang w:val="tr-TR"/>
+        </w:rPr>
+      </w:pPr>
+      <w:r>
+        <w:rPr>
+          <w:noProof/>
+          <w:sz w:val="28"/>
+          <w:szCs w:val="28"/>
+          <w:lang w:val="tr-TR"/>
+        </w:rPr>
+        <w:t xml:space="preserve">        │</w:t>
+      </w:r>
+    </w:p>
+    <w:p>
+      <w:pPr>
+        <w:spacing w:after="0" w:line="240" w:lineRule="auto"/>
+        <w:rPr>
+          <w:noProof/>
+          <w:sz w:val="28"/>
+          <w:szCs w:val="28"/>
+          <w:lang w:val="tr-TR"/>
+        </w:rPr>
+      </w:pPr>
+      <w:r>
+        <w:rPr>
+          <w:noProof/>
+          <w:sz w:val="28"/>
+          <w:szCs w:val="28"/>
+          <w:lang w:val="tr-TR"/>
+        </w:rPr>
+        <w:t xml:space="preserve">        </w:t>
+      </w:r>
+      <w:r>
+        <w:rPr>
+          <w:rFonts w:ascii="MS Gothic" w:eastAsia="MS Gothic" w:hAnsi="MS Gothic" w:cs="MS Gothic" w:hint="eastAsia"/>
+          <w:noProof/>
+          <w:sz w:val="28"/>
+          <w:szCs w:val="28"/>
+          <w:lang w:val="tr-TR"/>
+        </w:rPr>
+        <w:t>├</w:t>
+      </w:r>
+      <w:r>
+        <w:rPr>
+          <w:rFonts w:ascii="Calibri" w:hAnsi="Calibri" w:cs="Calibri"/>
+          <w:noProof/>
+          <w:sz w:val="28"/>
+          <w:szCs w:val="28"/>
+          <w:lang w:val="tr-TR"/>
+        </w:rPr>
+        <w:t>──</w:t>
+      </w:r>
+      <w:r>
+        <w:rPr>
+          <w:noProof/>
+          <w:sz w:val="28"/>
+          <w:szCs w:val="28"/>
+          <w:lang w:val="tr-TR"/>
+        </w:rPr>
+        <w:t xml:space="preserve"> plot_series()</w:t>
+      </w:r>
+    </w:p>
+    <w:p>
+      <w:pPr>
+        <w:spacing w:after="0" w:line="240" w:lineRule="auto"/>
+        <w:rPr>
+          <w:noProof/>
+          <w:sz w:val="28"/>
+          <w:szCs w:val="28"/>
+          <w:lang w:val="tr-TR"/>
+        </w:rPr>
+      </w:pPr>
+      <w:r>
+        <w:rPr>
+          <w:noProof/>
+          <w:sz w:val="28"/>
+          <w:szCs w:val="28"/>
+          <w:lang w:val="tr-TR"/>
+        </w:rPr>
+        <w:t xml:space="preserve">        </w:t>
+      </w:r>
+      <w:r>
+        <w:rPr>
+          <w:rFonts w:ascii="MS Gothic" w:eastAsia="MS Gothic" w:hAnsi="MS Gothic" w:cs="MS Gothic" w:hint="eastAsia"/>
+          <w:noProof/>
+          <w:sz w:val="28"/>
+          <w:szCs w:val="28"/>
+          <w:lang w:val="tr-TR"/>
+        </w:rPr>
+        <w:t>├</w:t>
+      </w:r>
+      <w:r>
+        <w:rPr>
+          <w:rFonts w:ascii="Calibri" w:hAnsi="Calibri" w:cs="Calibri"/>
+          <w:noProof/>
+          <w:sz w:val="28"/>
+          <w:szCs w:val="28"/>
+          <w:lang w:val="tr-TR"/>
+        </w:rPr>
+        <w:t>──</w:t>
+      </w:r>
+      <w:r>
+        <w:rPr>
+          <w:noProof/>
+          <w:sz w:val="28"/>
+          <w:szCs w:val="28"/>
+          <w:lang w:val="tr-TR"/>
+        </w:rPr>
+        <w:t xml:space="preserve"> plot_missing()</w:t>
+      </w:r>
+    </w:p>
+    <w:p>
+      <w:pPr>
+        <w:spacing w:after="0" w:line="240" w:lineRule="auto"/>
+        <w:rPr>
+          <w:noProof/>
+          <w:sz w:val="28"/>
+          <w:szCs w:val="28"/>
+          <w:lang w:val="tr-TR"/>
+        </w:rPr>
+      </w:pPr>
+      <w:r>
+        <w:rPr>
+          <w:noProof/>
+          <w:sz w:val="28"/>
+          <w:szCs w:val="28"/>
+          <w:lang w:val="tr-TR"/>
+        </w:rPr>
+        <w:t xml:space="preserve">        </w:t>
+      </w:r>
+      <w:r>
+        <w:rPr>
+          <w:rFonts w:ascii="MS Gothic" w:eastAsia="MS Gothic" w:hAnsi="MS Gothic" w:cs="MS Gothic" w:hint="eastAsia"/>
+          <w:noProof/>
+          <w:sz w:val="28"/>
+          <w:szCs w:val="28"/>
+          <w:lang w:val="tr-TR"/>
+        </w:rPr>
+        <w:t>├</w:t>
+      </w:r>
+      <w:r>
+        <w:rPr>
+          <w:rFonts w:ascii="Calibri" w:hAnsi="Calibri" w:cs="Calibri"/>
+          <w:noProof/>
+          <w:sz w:val="28"/>
+          <w:szCs w:val="28"/>
+          <w:lang w:val="tr-TR"/>
+        </w:rPr>
+        <w:t>──</w:t>
+      </w:r>
+      <w:r>
+        <w:rPr>
+          <w:noProof/>
+          <w:sz w:val="28"/>
+          <w:szCs w:val="28"/>
+          <w:lang w:val="tr-TR"/>
+        </w:rPr>
+        <w:t xml:space="preserve"> plot_histogram()</w:t>
+      </w:r>
+    </w:p>
+    <w:p>
+      <w:pPr>
+        <w:spacing w:after="0" w:line="240" w:lineRule="auto"/>
+        <w:rPr>
+          <w:noProof/>
+          <w:sz w:val="28"/>
+          <w:szCs w:val="28"/>
+          <w:lang w:val="tr-TR"/>
+        </w:rPr>
+      </w:pPr>
+      <w:r>
+        <w:rPr>
+          <w:noProof/>
+          <w:sz w:val="28"/>
+          <w:szCs w:val="28"/>
+          <w:lang w:val="tr-TR"/>
+        </w:rPr>
+        <w:t xml:space="preserve">        </w:t>
+      </w:r>
+      <w:r>
+        <w:rPr>
+          <w:rFonts w:ascii="MS Gothic" w:eastAsia="MS Gothic" w:hAnsi="MS Gothic" w:cs="MS Gothic" w:hint="eastAsia"/>
+          <w:noProof/>
+          <w:sz w:val="28"/>
+          <w:szCs w:val="28"/>
+          <w:lang w:val="tr-TR"/>
+        </w:rPr>
+        <w:t>├</w:t>
+      </w:r>
+      <w:r>
+        <w:rPr>
+          <w:rFonts w:ascii="Calibri" w:hAnsi="Calibri" w:cs="Calibri"/>
+          <w:noProof/>
+          <w:sz w:val="28"/>
+          <w:szCs w:val="28"/>
+          <w:lang w:val="tr-TR"/>
+        </w:rPr>
+        <w:t>──</w:t>
+      </w:r>
+      <w:r>
+        <w:rPr>
+          <w:noProof/>
+          <w:sz w:val="28"/>
+          <w:szCs w:val="28"/>
+          <w:lang w:val="tr-TR"/>
+        </w:rPr>
+        <w:t xml:space="preserve"> plot_boxplot()</w:t>
+      </w:r>
+    </w:p>
+    <w:p>
+      <w:pPr>
+        <w:spacing w:after="0" w:line="240" w:lineRule="auto"/>
+        <w:rPr>
+          <w:noProof/>
+          <w:sz w:val="28"/>
+          <w:szCs w:val="28"/>
+          <w:lang w:val="tr-TR"/>
+        </w:rPr>
+      </w:pPr>
+      <w:r>
+        <w:rPr>
+          <w:noProof/>
+          <w:sz w:val="28"/>
+          <w:szCs w:val="28"/>
+          <w:lang w:val="tr-TR"/>
+        </w:rPr>
+        <w:t xml:space="preserve">        └── plot_trend()</w:t>
+      </w:r>
+    </w:p>
+    <w:p>
+      <w:pPr>
+        <w:spacing w:after="0" w:line="240" w:lineRule="auto"/>
+        <w:rPr>
+          <w:noProof/>
+          <w:sz w:val="28"/>
+          <w:szCs w:val="28"/>
+        </w:rPr>
+      </w:pPr>
+    </w:p>
+    <w:p>
+      <w:pPr>
+        <w:spacing w:after="0" w:line="240" w:lineRule="auto"/>
+        <w:rPr>
+          <w:noProof/>
+          <w:sz w:val="28"/>
+          <w:szCs w:val="28"/>
+        </w:rPr>
+      </w:pPr>
     </w:p>
     <w:sectPr>
       <w:pgSz w:w="11906" w:h="16838"/>
@@ -2771,6 +3354,163 @@
     </w:sectPr>
   </w:body>
 </w:document>
+</file>
+
+<file path=word/numbering.xml><?xml version="1.0" encoding="utf-8"?>
+<w:numbering xmlns:wpc="http://schemas.microsoft.com/office/word/2010/wordprocessingCanvas" xmlns:cx="http://schemas.microsoft.com/office/drawing/2014/chartex" xmlns:cx1="http://schemas.microsoft.com/office/drawing/2015/9/8/chartex" xmlns:cx2="http://schemas.microsoft.com/office/drawing/2015/10/21/chartex" xmlns:cx3="http://schemas.microsoft.com/office/drawing/2016/5/9/chartex" xmlns:cx4="http://schemas.microsoft.com/office/drawing/2016/5/10/chartex" xmlns:cx5="http://schemas.microsoft.com/office/drawing/2016/5/11/chartex" xmlns:cx6="http://schemas.microsoft.com/office/drawing/2016/5/12/chartex" xmlns:cx7="http://schemas.microsoft.com/office/drawing/2016/5/13/chartex" xmlns:cx8="http://schemas.microsoft.com/office/drawing/2016/5/14/chartex" xmlns:mc="http://schemas.openxmlformats.org/markup-compatibility/2006" xmlns:aink="http://schemas.microsoft.com/office/drawing/2016/ink" xmlns:am3d="http://schemas.microsoft.com/office/drawing/2017/model3d" xmlns:o="urn:schemas-microsoft-com:office:office" xmlns:oel="http://schemas.microsoft.com/office/2019/extlst" xmlns:r="http://schemas.openxmlformats.org/officeDocument/2006/relationships" xmlns:m="http://schemas.openxmlformats.org/officeDocument/2006/math" xmlns:v="urn:schemas-microsoft-com:vml" xmlns:wp14="http://schemas.microsoft.com/office/word/2010/wordprocessingDrawing" xmlns:wp="http://schemas.openxmlformats.org/drawingml/2006/wordprocessingDrawing" xmlns:w10="urn:schemas-microsoft-com:office:word" xmlns:w="http://schemas.openxmlformats.org/wordprocessingml/2006/main" xmlns:w14="http://schemas.microsoft.com/office/word/2010/wordml" xmlns:w15="http://schemas.microsoft.com/office/word/2012/wordml" xmlns:w16cex="http://schemas.microsoft.com/office/word/2018/wordml/cex" xmlns:w16cid="http://schemas.microsoft.com/office/word/2016/wordml/cid" xmlns:w16="http://schemas.microsoft.com/office/word/2018/wordml" xmlns:w16du="http://schemas.microsoft.com/office/word/2023/wordml/word16du" xmlns:w16sdtdh="http://schemas.microsoft.com/office/word/2020/wordml/sdtdatahash" xmlns:w16sdtfl="http://schemas.microsoft.com/office/word/2024/wordml/sdtformatlock" xmlns:w16se="http://schemas.microsoft.com/office/word/2015/wordml/symex" xmlns:wpg="http://schemas.microsoft.com/office/word/2010/wordprocessingGroup" xmlns:wpi="http://schemas.microsoft.com/office/word/2010/wordprocessingInk" xmlns:wne="http://schemas.microsoft.com/office/word/2006/wordml" xmlns:wps="http://schemas.microsoft.com/office/word/2010/wordprocessingShape" mc:Ignorable="w14 w15 w16se w16cid w16 w16cex w16sdtdh w16sdtfl w16du wp14">
+  <w:abstractNum w:abstractNumId="0" w15:restartNumberingAfterBreak="0">
+    <w:nsid w:val="18C72CDA"/>
+    <w:multiLevelType w:val="multilevel"/>
+    <w:tmpl w:val="B7EE9C34"/>
+    <w:lvl w:ilvl="0">
+      <w:start w:val="1"/>
+      <w:numFmt w:val="bullet"/>
+      <w:lvlText w:val=""/>
+      <w:lvlJc w:val="left"/>
+      <w:pPr>
+        <w:tabs>
+          <w:tab w:val="num" w:pos="720"/>
+        </w:tabs>
+        <w:ind w:left="720" w:hanging="360"/>
+      </w:pPr>
+      <w:rPr>
+        <w:rFonts w:ascii="Symbol" w:hAnsi="Symbol" w:hint="default"/>
+        <w:sz w:val="20"/>
+      </w:rPr>
+    </w:lvl>
+    <w:lvl w:ilvl="1" w:tentative="1">
+      <w:start w:val="1"/>
+      <w:numFmt w:val="bullet"/>
+      <w:lvlText w:val="o"/>
+      <w:lvlJc w:val="left"/>
+      <w:pPr>
+        <w:tabs>
+          <w:tab w:val="num" w:pos="1440"/>
+        </w:tabs>
+        <w:ind w:left="1440" w:hanging="360"/>
+      </w:pPr>
+      <w:rPr>
+        <w:rFonts w:ascii="Courier New" w:hAnsi="Courier New" w:hint="default"/>
+        <w:sz w:val="20"/>
+      </w:rPr>
+    </w:lvl>
+    <w:lvl w:ilvl="2" w:tentative="1">
+      <w:start w:val="1"/>
+      <w:numFmt w:val="bullet"/>
+      <w:lvlText w:val=""/>
+      <w:lvlJc w:val="left"/>
+      <w:pPr>
+        <w:tabs>
+          <w:tab w:val="num" w:pos="2160"/>
+        </w:tabs>
+        <w:ind w:left="2160" w:hanging="360"/>
+      </w:pPr>
+      <w:rPr>
+        <w:rFonts w:ascii="Wingdings" w:hAnsi="Wingdings" w:hint="default"/>
+        <w:sz w:val="20"/>
+      </w:rPr>
+    </w:lvl>
+    <w:lvl w:ilvl="3" w:tentative="1">
+      <w:start w:val="1"/>
+      <w:numFmt w:val="bullet"/>
+      <w:lvlText w:val=""/>
+      <w:lvlJc w:val="left"/>
+      <w:pPr>
+        <w:tabs>
+          <w:tab w:val="num" w:pos="2880"/>
+        </w:tabs>
+        <w:ind w:left="2880" w:hanging="360"/>
+      </w:pPr>
+      <w:rPr>
+        <w:rFonts w:ascii="Wingdings" w:hAnsi="Wingdings" w:hint="default"/>
+        <w:sz w:val="20"/>
+      </w:rPr>
+    </w:lvl>
+    <w:lvl w:ilvl="4" w:tentative="1">
+      <w:start w:val="1"/>
+      <w:numFmt w:val="bullet"/>
+      <w:lvlText w:val=""/>
+      <w:lvlJc w:val="left"/>
+      <w:pPr>
+        <w:tabs>
+          <w:tab w:val="num" w:pos="3600"/>
+        </w:tabs>
+        <w:ind w:left="3600" w:hanging="360"/>
+      </w:pPr>
+      <w:rPr>
+        <w:rFonts w:ascii="Wingdings" w:hAnsi="Wingdings" w:hint="default"/>
+        <w:sz w:val="20"/>
+      </w:rPr>
+    </w:lvl>
+    <w:lvl w:ilvl="5" w:tentative="1">
+      <w:start w:val="1"/>
+      <w:numFmt w:val="bullet"/>
+      <w:lvlText w:val=""/>
+      <w:lvlJc w:val="left"/>
+      <w:pPr>
+        <w:tabs>
+          <w:tab w:val="num" w:pos="4320"/>
+        </w:tabs>
+        <w:ind w:left="4320" w:hanging="360"/>
+      </w:pPr>
+      <w:rPr>
+        <w:rFonts w:ascii="Wingdings" w:hAnsi="Wingdings" w:hint="default"/>
+        <w:sz w:val="20"/>
+      </w:rPr>
+    </w:lvl>
+    <w:lvl w:ilvl="6" w:tentative="1">
+      <w:start w:val="1"/>
+      <w:numFmt w:val="bullet"/>
+      <w:lvlText w:val=""/>
+      <w:lvlJc w:val="left"/>
+      <w:pPr>
+        <w:tabs>
+          <w:tab w:val="num" w:pos="5040"/>
+        </w:tabs>
+        <w:ind w:left="5040" w:hanging="360"/>
+      </w:pPr>
+      <w:rPr>
+        <w:rFonts w:ascii="Wingdings" w:hAnsi="Wingdings" w:hint="default"/>
+        <w:sz w:val="20"/>
+      </w:rPr>
+    </w:lvl>
+    <w:lvl w:ilvl="7" w:tentative="1">
+      <w:start w:val="1"/>
+      <w:numFmt w:val="bullet"/>
+      <w:lvlText w:val=""/>
+      <w:lvlJc w:val="left"/>
+      <w:pPr>
+        <w:tabs>
+          <w:tab w:val="num" w:pos="5760"/>
+        </w:tabs>
+        <w:ind w:left="5760" w:hanging="360"/>
+      </w:pPr>
+      <w:rPr>
+        <w:rFonts w:ascii="Wingdings" w:hAnsi="Wingdings" w:hint="default"/>
+        <w:sz w:val="20"/>
+      </w:rPr>
+    </w:lvl>
+    <w:lvl w:ilvl="8" w:tentative="1">
+      <w:start w:val="1"/>
+      <w:numFmt w:val="bullet"/>
+      <w:lvlText w:val=""/>
+      <w:lvlJc w:val="left"/>
+      <w:pPr>
+        <w:tabs>
+          <w:tab w:val="num" w:pos="6480"/>
+        </w:tabs>
+        <w:ind w:left="6480" w:hanging="360"/>
+      </w:pPr>
+      <w:rPr>
+        <w:rFonts w:ascii="Wingdings" w:hAnsi="Wingdings" w:hint="default"/>
+        <w:sz w:val="20"/>
+      </w:rPr>
+    </w:lvl>
+  </w:abstractNum>
+  <w:num w:numId="1" w16cid:durableId="320813693">
+    <w:abstractNumId w:val="0"/>
+  </w:num>
+</w:numbering>
 </file>
 
 <file path=word/styles.xml><?xml version="1.0" encoding="utf-8"?>
@@ -3377,7 +4117,6 @@
   <w:style w:type="character" w:default="1" w:styleId="VarsaylanParagrafYazTipi">
     <w:name w:val="Default Paragraph Font"/>
     <w:uiPriority w:val="1"/>
-    <w:semiHidden/>
     <w:unhideWhenUsed/>
   </w:style>
   <w:style w:type="table" w:default="1" w:styleId="NormalTablo">

</xml_diff>

<commit_message>
feat(data): add smart dataset loader
</commit_message>
<xml_diff>
--- a/docs/development_flow.docx
+++ b/docs/development_flow.docx
@@ -3325,6 +3325,782 @@
         </w:rPr>
         <w:t xml:space="preserve">        └── plot_trend()</w:t>
       </w:r>
+    </w:p>
+    <w:p>
+      <w:pPr>
+        <w:spacing w:after="0" w:line="240" w:lineRule="auto"/>
+        <w:rPr>
+          <w:noProof/>
+          <w:sz w:val="28"/>
+          <w:szCs w:val="28"/>
+        </w:rPr>
+      </w:pPr>
+    </w:p>
+    <w:p>
+      <w:pPr>
+        <w:spacing w:after="0" w:line="240" w:lineRule="auto"/>
+        <w:rPr>
+          <w:noProof/>
+          <w:sz w:val="28"/>
+          <w:szCs w:val="28"/>
+        </w:rPr>
+      </w:pPr>
+    </w:p>
+    <w:p>
+      <w:pPr>
+        <w:spacing w:after="0" w:line="240" w:lineRule="auto"/>
+        <w:rPr>
+          <w:b/>
+          <w:bCs/>
+          <w:noProof/>
+          <w:sz w:val="36"/>
+          <w:szCs w:val="36"/>
+          <w:u w:val="single"/>
+        </w:rPr>
+      </w:pPr>
+      <w:r>
+        <w:rPr>
+          <w:b/>
+          <w:bCs/>
+          <w:noProof/>
+          <w:sz w:val="36"/>
+          <w:szCs w:val="36"/>
+          <w:u w:val="single"/>
+        </w:rPr>
+        <w:t>Forecast Architecture:</w:t>
+      </w:r>
+    </w:p>
+    <w:p>
+      <w:pPr>
+        <w:spacing w:after="0" w:line="240" w:lineRule="auto"/>
+        <w:rPr>
+          <w:noProof/>
+          <w:sz w:val="28"/>
+          <w:szCs w:val="28"/>
+        </w:rPr>
+      </w:pPr>
+      <w:r>
+        <w:rPr>
+          <w:noProof/>
+          <w:sz w:val="28"/>
+          <w:szCs w:val="28"/>
+        </w:rPr>
+        <w:t>BatteryDataset</w:t>
+      </w:r>
+    </w:p>
+    <w:p>
+      <w:pPr>
+        <w:spacing w:after="0" w:line="240" w:lineRule="auto"/>
+        <w:rPr>
+          <w:noProof/>
+          <w:sz w:val="28"/>
+          <w:szCs w:val="28"/>
+        </w:rPr>
+      </w:pPr>
+      <w:r>
+        <w:rPr>
+          <w:noProof/>
+          <w:sz w:val="28"/>
+          <w:szCs w:val="28"/>
+        </w:rPr>
+        <w:t xml:space="preserve">        │</w:t>
+      </w:r>
+    </w:p>
+    <w:p>
+      <w:pPr>
+        <w:spacing w:after="0" w:line="240" w:lineRule="auto"/>
+        <w:rPr>
+          <w:noProof/>
+          <w:sz w:val="28"/>
+          <w:szCs w:val="28"/>
+        </w:rPr>
+      </w:pPr>
+      <w:r>
+        <w:rPr>
+          <w:noProof/>
+          <w:sz w:val="28"/>
+          <w:szCs w:val="28"/>
+        </w:rPr>
+        <w:t xml:space="preserve">        </w:t>
+      </w:r>
+      <w:r>
+        <w:rPr>
+          <w:rFonts w:ascii="Arial" w:hAnsi="Arial" w:cs="Arial"/>
+          <w:noProof/>
+          <w:sz w:val="28"/>
+          <w:szCs w:val="28"/>
+        </w:rPr>
+        <w:t>▼</w:t>
+      </w:r>
+    </w:p>
+    <w:p>
+      <w:pPr>
+        <w:spacing w:after="0" w:line="240" w:lineRule="auto"/>
+        <w:rPr>
+          <w:noProof/>
+          <w:sz w:val="28"/>
+          <w:szCs w:val="28"/>
+        </w:rPr>
+      </w:pPr>
+      <w:r>
+        <w:rPr>
+          <w:noProof/>
+          <w:sz w:val="28"/>
+          <w:szCs w:val="28"/>
+        </w:rPr>
+        <w:t xml:space="preserve"> ForecastPipeline</w:t>
+      </w:r>
+    </w:p>
+    <w:p>
+      <w:pPr>
+        <w:spacing w:after="0" w:line="240" w:lineRule="auto"/>
+        <w:rPr>
+          <w:noProof/>
+          <w:sz w:val="28"/>
+          <w:szCs w:val="28"/>
+        </w:rPr>
+      </w:pPr>
+      <w:r>
+        <w:rPr>
+          <w:noProof/>
+          <w:sz w:val="28"/>
+          <w:szCs w:val="28"/>
+        </w:rPr>
+        <w:t xml:space="preserve">        │</w:t>
+      </w:r>
+    </w:p>
+    <w:p>
+      <w:pPr>
+        <w:spacing w:after="0" w:line="240" w:lineRule="auto"/>
+        <w:rPr>
+          <w:noProof/>
+          <w:sz w:val="28"/>
+          <w:szCs w:val="28"/>
+        </w:rPr>
+      </w:pPr>
+      <w:r>
+        <w:rPr>
+          <w:noProof/>
+          <w:sz w:val="28"/>
+          <w:szCs w:val="28"/>
+        </w:rPr>
+        <w:t xml:space="preserve">        </w:t>
+      </w:r>
+      <w:r>
+        <w:rPr>
+          <w:rFonts w:ascii="MS Gothic" w:eastAsia="MS Gothic" w:hAnsi="MS Gothic" w:cs="MS Gothic" w:hint="eastAsia"/>
+          <w:noProof/>
+          <w:sz w:val="28"/>
+          <w:szCs w:val="28"/>
+        </w:rPr>
+        <w:t>├</w:t>
+      </w:r>
+      <w:r>
+        <w:rPr>
+          <w:rFonts w:ascii="Calibri" w:hAnsi="Calibri" w:cs="Calibri"/>
+          <w:noProof/>
+          <w:sz w:val="28"/>
+          <w:szCs w:val="28"/>
+        </w:rPr>
+        <w:t>──────────────┐</w:t>
+      </w:r>
+    </w:p>
+    <w:p>
+      <w:pPr>
+        <w:spacing w:after="0" w:line="240" w:lineRule="auto"/>
+        <w:rPr>
+          <w:noProof/>
+          <w:sz w:val="28"/>
+          <w:szCs w:val="28"/>
+        </w:rPr>
+      </w:pPr>
+      <w:r>
+        <w:rPr>
+          <w:noProof/>
+          <w:sz w:val="28"/>
+          <w:szCs w:val="28"/>
+        </w:rPr>
+        <w:t xml:space="preserve">        │              </w:t>
+      </w:r>
+      <w:r>
+        <w:rPr>
+          <w:noProof/>
+          <w:sz w:val="28"/>
+          <w:szCs w:val="28"/>
+        </w:rPr>
+        <w:t xml:space="preserve">                   </w:t>
+      </w:r>
+      <w:r>
+        <w:rPr>
+          <w:noProof/>
+          <w:sz w:val="28"/>
+          <w:szCs w:val="28"/>
+        </w:rPr>
+        <w:t>│</w:t>
+      </w:r>
+    </w:p>
+    <w:p>
+      <w:pPr>
+        <w:spacing w:after="0" w:line="240" w:lineRule="auto"/>
+        <w:rPr>
+          <w:noProof/>
+          <w:sz w:val="28"/>
+          <w:szCs w:val="28"/>
+        </w:rPr>
+      </w:pPr>
+      <w:r>
+        <w:rPr>
+          <w:noProof/>
+          <w:sz w:val="28"/>
+          <w:szCs w:val="28"/>
+        </w:rPr>
+        <w:t xml:space="preserve">     ARIMA        </w:t>
+      </w:r>
+      <w:r>
+        <w:rPr>
+          <w:noProof/>
+          <w:sz w:val="28"/>
+          <w:szCs w:val="28"/>
+        </w:rPr>
+        <w:t xml:space="preserve">         </w:t>
+      </w:r>
+      <w:r>
+        <w:rPr>
+          <w:noProof/>
+          <w:sz w:val="28"/>
+          <w:szCs w:val="28"/>
+        </w:rPr>
+        <w:t xml:space="preserve"> Kalman</w:t>
+      </w:r>
+    </w:p>
+    <w:p>
+      <w:pPr>
+        <w:spacing w:after="0" w:line="240" w:lineRule="auto"/>
+        <w:rPr>
+          <w:noProof/>
+          <w:sz w:val="28"/>
+          <w:szCs w:val="28"/>
+        </w:rPr>
+      </w:pPr>
+      <w:r>
+        <w:rPr>
+          <w:noProof/>
+          <w:sz w:val="28"/>
+          <w:szCs w:val="28"/>
+        </w:rPr>
+        <w:t xml:space="preserve">        │             </w:t>
+      </w:r>
+      <w:r>
+        <w:rPr>
+          <w:noProof/>
+          <w:sz w:val="28"/>
+          <w:szCs w:val="28"/>
+        </w:rPr>
+        <w:t xml:space="preserve">                   </w:t>
+      </w:r>
+      <w:r>
+        <w:rPr>
+          <w:noProof/>
+          <w:sz w:val="28"/>
+          <w:szCs w:val="28"/>
+        </w:rPr>
+        <w:t xml:space="preserve"> │</w:t>
+      </w:r>
+    </w:p>
+    <w:p>
+      <w:pPr>
+        <w:spacing w:after="0" w:line="240" w:lineRule="auto"/>
+        <w:rPr>
+          <w:noProof/>
+          <w:sz w:val="28"/>
+          <w:szCs w:val="28"/>
+        </w:rPr>
+      </w:pPr>
+      <w:r>
+        <w:rPr>
+          <w:noProof/>
+          <w:sz w:val="28"/>
+          <w:szCs w:val="28"/>
+        </w:rPr>
+        <w:t xml:space="preserve">        └──────</w:t>
+      </w:r>
+      <w:r>
+        <w:rPr>
+          <w:rFonts w:ascii="MS Gothic" w:eastAsia="MS Gothic" w:hAnsi="MS Gothic" w:cs="MS Gothic" w:hint="eastAsia"/>
+          <w:noProof/>
+          <w:sz w:val="28"/>
+          <w:szCs w:val="28"/>
+        </w:rPr>
+        <w:t>┬</w:t>
+      </w:r>
+      <w:r>
+        <w:rPr>
+          <w:rFonts w:ascii="Calibri" w:hAnsi="Calibri" w:cs="Calibri"/>
+          <w:noProof/>
+          <w:sz w:val="28"/>
+          <w:szCs w:val="28"/>
+        </w:rPr>
+        <w:t>───────┘</w:t>
+      </w:r>
+    </w:p>
+    <w:p>
+      <w:pPr>
+        <w:spacing w:after="0" w:line="240" w:lineRule="auto"/>
+        <w:rPr>
+          <w:noProof/>
+          <w:sz w:val="28"/>
+          <w:szCs w:val="28"/>
+        </w:rPr>
+      </w:pPr>
+      <w:r>
+        <w:rPr>
+          <w:noProof/>
+          <w:sz w:val="28"/>
+          <w:szCs w:val="28"/>
+        </w:rPr>
+        <w:t xml:space="preserve">               │</w:t>
+      </w:r>
+    </w:p>
+    <w:p>
+      <w:pPr>
+        <w:spacing w:after="0" w:line="240" w:lineRule="auto"/>
+        <w:rPr>
+          <w:noProof/>
+          <w:sz w:val="28"/>
+          <w:szCs w:val="28"/>
+        </w:rPr>
+      </w:pPr>
+      <w:r>
+        <w:rPr>
+          <w:noProof/>
+          <w:sz w:val="28"/>
+          <w:szCs w:val="28"/>
+        </w:rPr>
+        <w:t xml:space="preserve">         ForecastResult</w:t>
+      </w:r>
+    </w:p>
+    <w:p>
+      <w:pPr>
+        <w:spacing w:after="0" w:line="240" w:lineRule="auto"/>
+        <w:rPr>
+          <w:noProof/>
+          <w:sz w:val="28"/>
+          <w:szCs w:val="28"/>
+        </w:rPr>
+      </w:pPr>
+      <w:r>
+        <w:rPr>
+          <w:noProof/>
+          <w:sz w:val="28"/>
+          <w:szCs w:val="28"/>
+        </w:rPr>
+        <w:t xml:space="preserve">               │</w:t>
+      </w:r>
+    </w:p>
+    <w:p>
+      <w:pPr>
+        <w:spacing w:after="0" w:line="240" w:lineRule="auto"/>
+        <w:rPr>
+          <w:noProof/>
+          <w:sz w:val="28"/>
+          <w:szCs w:val="28"/>
+        </w:rPr>
+      </w:pPr>
+      <w:r>
+        <w:rPr>
+          <w:noProof/>
+          <w:sz w:val="28"/>
+          <w:szCs w:val="28"/>
+        </w:rPr>
+        <w:t xml:space="preserve">               </w:t>
+      </w:r>
+      <w:r>
+        <w:rPr>
+          <w:rFonts w:ascii="Arial" w:hAnsi="Arial" w:cs="Arial"/>
+          <w:noProof/>
+          <w:sz w:val="28"/>
+          <w:szCs w:val="28"/>
+        </w:rPr>
+        <w:t>▼</w:t>
+      </w:r>
+    </w:p>
+    <w:p>
+      <w:pPr>
+        <w:spacing w:after="0" w:line="240" w:lineRule="auto"/>
+        <w:rPr>
+          <w:noProof/>
+          <w:sz w:val="28"/>
+          <w:szCs w:val="28"/>
+        </w:rPr>
+      </w:pPr>
+      <w:r>
+        <w:rPr>
+          <w:noProof/>
+          <w:sz w:val="28"/>
+          <w:szCs w:val="28"/>
+        </w:rPr>
+        <w:t xml:space="preserve">      Evaluation Engine</w:t>
+      </w:r>
+    </w:p>
+    <w:p>
+      <w:pPr>
+        <w:spacing w:after="0" w:line="240" w:lineRule="auto"/>
+        <w:rPr>
+          <w:noProof/>
+          <w:sz w:val="28"/>
+          <w:szCs w:val="28"/>
+        </w:rPr>
+      </w:pPr>
+      <w:r>
+        <w:rPr>
+          <w:noProof/>
+          <w:sz w:val="28"/>
+          <w:szCs w:val="28"/>
+        </w:rPr>
+        <w:t xml:space="preserve">               │</w:t>
+      </w:r>
+    </w:p>
+    <w:p>
+      <w:pPr>
+        <w:spacing w:after="0" w:line="240" w:lineRule="auto"/>
+        <w:rPr>
+          <w:noProof/>
+          <w:sz w:val="28"/>
+          <w:szCs w:val="28"/>
+        </w:rPr>
+      </w:pPr>
+      <w:r>
+        <w:rPr>
+          <w:noProof/>
+          <w:sz w:val="28"/>
+          <w:szCs w:val="28"/>
+        </w:rPr>
+        <w:t xml:space="preserve">               </w:t>
+      </w:r>
+      <w:r>
+        <w:rPr>
+          <w:rFonts w:ascii="Arial" w:hAnsi="Arial" w:cs="Arial"/>
+          <w:noProof/>
+          <w:sz w:val="28"/>
+          <w:szCs w:val="28"/>
+        </w:rPr>
+        <w:t>▼</w:t>
+      </w:r>
+    </w:p>
+    <w:p>
+      <w:pPr>
+        <w:spacing w:after="0" w:line="240" w:lineRule="auto"/>
+        <w:rPr>
+          <w:noProof/>
+          <w:sz w:val="28"/>
+          <w:szCs w:val="28"/>
+        </w:rPr>
+      </w:pPr>
+      <w:r>
+        <w:rPr>
+          <w:noProof/>
+          <w:sz w:val="28"/>
+          <w:szCs w:val="28"/>
+        </w:rPr>
+        <w:t xml:space="preserve">        Visualization</w:t>
+      </w:r>
+    </w:p>
+    <w:p>
+      <w:pPr>
+        <w:spacing w:after="0" w:line="240" w:lineRule="auto"/>
+        <w:rPr>
+          <w:b/>
+          <w:bCs/>
+          <w:noProof/>
+          <w:sz w:val="40"/>
+          <w:szCs w:val="40"/>
+          <w:u w:val="single"/>
+        </w:rPr>
+      </w:pPr>
+      <w:r>
+        <w:rPr>
+          <w:b/>
+          <w:bCs/>
+          <w:noProof/>
+          <w:sz w:val="40"/>
+          <w:szCs w:val="40"/>
+          <w:u w:val="single"/>
+        </w:rPr>
+        <w:lastRenderedPageBreak/>
+        <w:t>Sprint Acceptance Test (SAT)</w:t>
+      </w:r>
+      <w:r>
+        <w:rPr>
+          <w:b/>
+          <w:bCs/>
+          <w:noProof/>
+          <w:sz w:val="40"/>
+          <w:szCs w:val="40"/>
+          <w:u w:val="single"/>
+        </w:rPr>
+        <w:t>:</w:t>
+      </w:r>
+    </w:p>
+    <w:p>
+      <w:pPr>
+        <w:spacing w:after="0" w:line="240" w:lineRule="auto"/>
+        <w:rPr>
+          <w:noProof/>
+          <w:sz w:val="28"/>
+          <w:szCs w:val="28"/>
+        </w:rPr>
+      </w:pPr>
+    </w:p>
+    <w:p>
+      <w:pPr>
+        <w:pStyle w:val="ListeParagraf"/>
+        <w:numPr>
+          <w:ilvl w:val="0"/>
+          <w:numId w:val="2"/>
+        </w:numPr>
+        <w:spacing w:after="0" w:line="240" w:lineRule="auto"/>
+        <w:rPr>
+          <w:noProof/>
+          <w:sz w:val="36"/>
+          <w:szCs w:val="36"/>
+        </w:rPr>
+      </w:pPr>
+      <w:r>
+        <w:rPr>
+          <w:noProof/>
+          <w:sz w:val="36"/>
+          <w:szCs w:val="36"/>
+        </w:rPr>
+        <w:t>Load dataset</w:t>
+      </w:r>
+    </w:p>
+    <w:p>
+      <w:pPr>
+        <w:pStyle w:val="ListeParagraf"/>
+        <w:numPr>
+          <w:ilvl w:val="0"/>
+          <w:numId w:val="2"/>
+        </w:numPr>
+        <w:spacing w:after="0" w:line="240" w:lineRule="auto"/>
+        <w:rPr>
+          <w:noProof/>
+          <w:sz w:val="36"/>
+          <w:szCs w:val="36"/>
+        </w:rPr>
+      </w:pPr>
+      <w:r>
+        <w:rPr>
+          <w:noProof/>
+          <w:sz w:val="36"/>
+          <w:szCs w:val="36"/>
+        </w:rPr>
+        <w:t>Validation</w:t>
+      </w:r>
+    </w:p>
+    <w:p>
+      <w:pPr>
+        <w:pStyle w:val="ListeParagraf"/>
+        <w:numPr>
+          <w:ilvl w:val="0"/>
+          <w:numId w:val="2"/>
+        </w:numPr>
+        <w:spacing w:after="0" w:line="240" w:lineRule="auto"/>
+        <w:rPr>
+          <w:noProof/>
+          <w:sz w:val="36"/>
+          <w:szCs w:val="36"/>
+        </w:rPr>
+      </w:pPr>
+      <w:r>
+        <w:rPr>
+          <w:noProof/>
+          <w:sz w:val="36"/>
+          <w:szCs w:val="36"/>
+        </w:rPr>
+        <w:t>Preparation</w:t>
+      </w:r>
+    </w:p>
+    <w:p>
+      <w:pPr>
+        <w:pStyle w:val="ListeParagraf"/>
+        <w:numPr>
+          <w:ilvl w:val="0"/>
+          <w:numId w:val="2"/>
+        </w:numPr>
+        <w:spacing w:after="0" w:line="240" w:lineRule="auto"/>
+        <w:rPr>
+          <w:noProof/>
+          <w:sz w:val="36"/>
+          <w:szCs w:val="36"/>
+        </w:rPr>
+      </w:pPr>
+      <w:r>
+        <w:rPr>
+          <w:noProof/>
+          <w:sz w:val="36"/>
+          <w:szCs w:val="36"/>
+        </w:rPr>
+        <w:t>Summary</w:t>
+      </w:r>
+    </w:p>
+    <w:p>
+      <w:pPr>
+        <w:pStyle w:val="ListeParagraf"/>
+        <w:numPr>
+          <w:ilvl w:val="0"/>
+          <w:numId w:val="2"/>
+        </w:numPr>
+        <w:spacing w:after="0" w:line="240" w:lineRule="auto"/>
+        <w:rPr>
+          <w:noProof/>
+          <w:sz w:val="36"/>
+          <w:szCs w:val="36"/>
+        </w:rPr>
+      </w:pPr>
+      <w:r>
+        <w:rPr>
+          <w:noProof/>
+          <w:sz w:val="36"/>
+          <w:szCs w:val="36"/>
+        </w:rPr>
+        <w:t>Battery Analysis Report</w:t>
+      </w:r>
+    </w:p>
+    <w:p>
+      <w:pPr>
+        <w:pStyle w:val="ListeParagraf"/>
+        <w:numPr>
+          <w:ilvl w:val="0"/>
+          <w:numId w:val="2"/>
+        </w:numPr>
+        <w:spacing w:after="0" w:line="240" w:lineRule="auto"/>
+        <w:rPr>
+          <w:noProof/>
+          <w:sz w:val="36"/>
+          <w:szCs w:val="36"/>
+        </w:rPr>
+      </w:pPr>
+      <w:r>
+        <w:rPr>
+          <w:noProof/>
+          <w:sz w:val="36"/>
+          <w:szCs w:val="36"/>
+        </w:rPr>
+        <w:t>Frequency detection</w:t>
+      </w:r>
+    </w:p>
+    <w:p>
+      <w:pPr>
+        <w:pStyle w:val="ListeParagraf"/>
+        <w:numPr>
+          <w:ilvl w:val="0"/>
+          <w:numId w:val="2"/>
+        </w:numPr>
+        <w:spacing w:after="0" w:line="240" w:lineRule="auto"/>
+        <w:rPr>
+          <w:noProof/>
+          <w:sz w:val="36"/>
+          <w:szCs w:val="36"/>
+        </w:rPr>
+      </w:pPr>
+      <w:r>
+        <w:rPr>
+          <w:noProof/>
+          <w:sz w:val="36"/>
+          <w:szCs w:val="36"/>
+        </w:rPr>
+        <w:t>Missing-period detection</w:t>
+      </w:r>
+    </w:p>
+    <w:p>
+      <w:pPr>
+        <w:pStyle w:val="ListeParagraf"/>
+        <w:numPr>
+          <w:ilvl w:val="0"/>
+          <w:numId w:val="2"/>
+        </w:numPr>
+        <w:spacing w:after="0" w:line="240" w:lineRule="auto"/>
+        <w:rPr>
+          <w:noProof/>
+          <w:sz w:val="36"/>
+          <w:szCs w:val="36"/>
+        </w:rPr>
+      </w:pPr>
+      <w:r>
+        <w:rPr>
+          <w:noProof/>
+          <w:sz w:val="36"/>
+          <w:szCs w:val="36"/>
+        </w:rPr>
+        <w:t>Resampling</w:t>
+      </w:r>
+    </w:p>
+    <w:p>
+      <w:pPr>
+        <w:pStyle w:val="ListeParagraf"/>
+        <w:numPr>
+          <w:ilvl w:val="0"/>
+          <w:numId w:val="2"/>
+        </w:numPr>
+        <w:spacing w:after="0" w:line="240" w:lineRule="auto"/>
+        <w:rPr>
+          <w:noProof/>
+          <w:sz w:val="36"/>
+          <w:szCs w:val="36"/>
+        </w:rPr>
+      </w:pPr>
+      <w:r>
+        <w:rPr>
+          <w:noProof/>
+          <w:sz w:val="36"/>
+          <w:szCs w:val="36"/>
+        </w:rPr>
+        <w:t>Rolling windows</w:t>
+      </w:r>
+    </w:p>
+    <w:p>
+      <w:pPr>
+        <w:pStyle w:val="ListeParagraf"/>
+        <w:numPr>
+          <w:ilvl w:val="0"/>
+          <w:numId w:val="2"/>
+        </w:numPr>
+        <w:spacing w:after="0" w:line="240" w:lineRule="auto"/>
+        <w:ind w:left="357" w:hanging="357"/>
+        <w:rPr>
+          <w:noProof/>
+          <w:sz w:val="36"/>
+          <w:szCs w:val="36"/>
+        </w:rPr>
+      </w:pPr>
+      <w:r>
+        <w:rPr>
+          <w:noProof/>
+          <w:sz w:val="36"/>
+          <w:szCs w:val="36"/>
+        </w:rPr>
+        <w:t>Visualization</w:t>
+      </w:r>
+    </w:p>
+    <w:p>
+      <w:pPr>
+        <w:spacing w:after="0" w:line="240" w:lineRule="auto"/>
+        <w:rPr>
+          <w:noProof/>
+          <w:sz w:val="36"/>
+          <w:szCs w:val="36"/>
+        </w:rPr>
+      </w:pPr>
+    </w:p>
+    <w:p>
+      <w:pPr>
+        <w:spacing w:after="0" w:line="240" w:lineRule="auto"/>
+        <w:rPr>
+          <w:noProof/>
+          <w:sz w:val="36"/>
+          <w:szCs w:val="36"/>
+        </w:rPr>
+      </w:pPr>
     </w:p>
     <w:p>
       <w:pPr>
@@ -3507,8 +4283,100 @@
       </w:rPr>
     </w:lvl>
   </w:abstractNum>
+  <w:abstractNum w:abstractNumId="1" w15:restartNumberingAfterBreak="0">
+    <w:nsid w:val="321D4140"/>
+    <w:multiLevelType w:val="hybridMultilevel"/>
+    <w:tmpl w:val="3E7CA19E"/>
+    <w:lvl w:ilvl="0" w:tplc="041F000F">
+      <w:start w:val="1"/>
+      <w:numFmt w:val="decimal"/>
+      <w:lvlText w:val="%1."/>
+      <w:lvlJc w:val="left"/>
+      <w:pPr>
+        <w:ind w:left="720" w:hanging="360"/>
+      </w:pPr>
+      <w:rPr>
+        <w:rFonts w:hint="default"/>
+      </w:rPr>
+    </w:lvl>
+    <w:lvl w:ilvl="1" w:tplc="041F0019" w:tentative="1">
+      <w:start w:val="1"/>
+      <w:numFmt w:val="lowerLetter"/>
+      <w:lvlText w:val="%2."/>
+      <w:lvlJc w:val="left"/>
+      <w:pPr>
+        <w:ind w:left="1440" w:hanging="360"/>
+      </w:pPr>
+    </w:lvl>
+    <w:lvl w:ilvl="2" w:tplc="041F001B" w:tentative="1">
+      <w:start w:val="1"/>
+      <w:numFmt w:val="lowerRoman"/>
+      <w:lvlText w:val="%3."/>
+      <w:lvlJc w:val="right"/>
+      <w:pPr>
+        <w:ind w:left="2160" w:hanging="180"/>
+      </w:pPr>
+    </w:lvl>
+    <w:lvl w:ilvl="3" w:tplc="041F000F" w:tentative="1">
+      <w:start w:val="1"/>
+      <w:numFmt w:val="decimal"/>
+      <w:lvlText w:val="%4."/>
+      <w:lvlJc w:val="left"/>
+      <w:pPr>
+        <w:ind w:left="2880" w:hanging="360"/>
+      </w:pPr>
+    </w:lvl>
+    <w:lvl w:ilvl="4" w:tplc="041F0019" w:tentative="1">
+      <w:start w:val="1"/>
+      <w:numFmt w:val="lowerLetter"/>
+      <w:lvlText w:val="%5."/>
+      <w:lvlJc w:val="left"/>
+      <w:pPr>
+        <w:ind w:left="3600" w:hanging="360"/>
+      </w:pPr>
+    </w:lvl>
+    <w:lvl w:ilvl="5" w:tplc="041F001B" w:tentative="1">
+      <w:start w:val="1"/>
+      <w:numFmt w:val="lowerRoman"/>
+      <w:lvlText w:val="%6."/>
+      <w:lvlJc w:val="right"/>
+      <w:pPr>
+        <w:ind w:left="4320" w:hanging="180"/>
+      </w:pPr>
+    </w:lvl>
+    <w:lvl w:ilvl="6" w:tplc="041F000F" w:tentative="1">
+      <w:start w:val="1"/>
+      <w:numFmt w:val="decimal"/>
+      <w:lvlText w:val="%7."/>
+      <w:lvlJc w:val="left"/>
+      <w:pPr>
+        <w:ind w:left="5040" w:hanging="360"/>
+      </w:pPr>
+    </w:lvl>
+    <w:lvl w:ilvl="7" w:tplc="041F0019" w:tentative="1">
+      <w:start w:val="1"/>
+      <w:numFmt w:val="lowerLetter"/>
+      <w:lvlText w:val="%8."/>
+      <w:lvlJc w:val="left"/>
+      <w:pPr>
+        <w:ind w:left="5760" w:hanging="360"/>
+      </w:pPr>
+    </w:lvl>
+    <w:lvl w:ilvl="8" w:tplc="041F001B" w:tentative="1">
+      <w:start w:val="1"/>
+      <w:numFmt w:val="lowerRoman"/>
+      <w:lvlText w:val="%9."/>
+      <w:lvlJc w:val="right"/>
+      <w:pPr>
+        <w:ind w:left="6480" w:hanging="180"/>
+      </w:pPr>
+    </w:lvl>
+  </w:abstractNum>
   <w:num w:numId="1" w16cid:durableId="320813693">
     <w:abstractNumId w:val="0"/>
+  </w:num>
+  <w:num w:numId="2" w16cid:durableId="680281116">
+    <w:abstractNumId w:val="1"/>
   </w:num>
 </w:numbering>
 </file>

</xml_diff>

<commit_message>
docs: add project architecture documentation
</commit_message>
<xml_diff>
--- a/docs/development_flow.docx
+++ b/docs/development_flow.docx
@@ -3827,18 +3827,7 @@
           <w:u w:val="single"/>
         </w:rPr>
         <w:lastRenderedPageBreak/>
-        <w:t>Sprint Acceptance Test (SAT)</w:t>
-      </w:r>
-      <w:r>
-        <w:rPr>
-          <w:b/>
-          <w:bCs/>
-          <w:noProof/>
-          <w:sz w:val="40"/>
-          <w:szCs w:val="40"/>
-          <w:u w:val="single"/>
-        </w:rPr>
-        <w:t>:</w:t>
+        <w:t>Sprint Acceptance Test (SAT):</w:t>
       </w:r>
     </w:p>
     <w:p>
@@ -4091,6 +4080,944 @@
           <w:szCs w:val="36"/>
         </w:rPr>
       </w:pPr>
+    </w:p>
+    <w:p>
+      <w:pPr>
+        <w:spacing w:after="0" w:line="240" w:lineRule="auto"/>
+        <w:rPr>
+          <w:noProof/>
+          <w:sz w:val="36"/>
+          <w:szCs w:val="36"/>
+        </w:rPr>
+      </w:pPr>
+    </w:p>
+    <w:p>
+      <w:pPr>
+        <w:rPr>
+          <w:noProof/>
+          <w:sz w:val="36"/>
+          <w:szCs w:val="36"/>
+        </w:rPr>
+      </w:pPr>
+      <w:r>
+        <w:rPr>
+          <w:noProof/>
+          <w:sz w:val="36"/>
+          <w:szCs w:val="36"/>
+        </w:rPr>
+        <w:br w:type="page"/>
+      </w:r>
+    </w:p>
+    <w:p>
+      <w:pPr>
+        <w:spacing w:after="0" w:line="240" w:lineRule="auto"/>
+        <w:rPr>
+          <w:noProof/>
+          <w:sz w:val="36"/>
+          <w:szCs w:val="36"/>
+        </w:rPr>
+      </w:pPr>
+      <w:r>
+        <w:rPr>
+          <w:noProof/>
+          <w:sz w:val="36"/>
+          <w:szCs w:val="36"/>
+        </w:rPr>
+        <w:lastRenderedPageBreak/>
+        <w:t>┌──────────────────────────────────────────────┐</w:t>
+      </w:r>
+    </w:p>
+    <w:p>
+      <w:pPr>
+        <w:spacing w:after="0" w:line="240" w:lineRule="auto"/>
+        <w:rPr>
+          <w:noProof/>
+          <w:sz w:val="36"/>
+          <w:szCs w:val="36"/>
+        </w:rPr>
+      </w:pPr>
+      <w:r>
+        <w:rPr>
+          <w:noProof/>
+          <w:sz w:val="36"/>
+          <w:szCs w:val="36"/>
+        </w:rPr>
+        <w:t xml:space="preserve">│                Applications                  </w:t>
+      </w:r>
+      <w:r>
+        <w:rPr>
+          <w:noProof/>
+          <w:sz w:val="36"/>
+          <w:szCs w:val="36"/>
+        </w:rPr>
+        <w:t xml:space="preserve">                                              </w:t>
+      </w:r>
+      <w:r>
+        <w:rPr>
+          <w:noProof/>
+          <w:sz w:val="36"/>
+          <w:szCs w:val="36"/>
+        </w:rPr>
+        <w:t>│</w:t>
+      </w:r>
+    </w:p>
+    <w:p>
+      <w:pPr>
+        <w:spacing w:after="0" w:line="240" w:lineRule="auto"/>
+        <w:rPr>
+          <w:noProof/>
+          <w:sz w:val="36"/>
+          <w:szCs w:val="36"/>
+        </w:rPr>
+      </w:pPr>
+      <w:r>
+        <w:rPr>
+          <w:noProof/>
+          <w:sz w:val="36"/>
+          <w:szCs w:val="36"/>
+        </w:rPr>
+        <w:t xml:space="preserve">│  CLI • Demo Scripts • Notebooks • Examples   </w:t>
+      </w:r>
+      <w:r>
+        <w:rPr>
+          <w:noProof/>
+          <w:sz w:val="36"/>
+          <w:szCs w:val="36"/>
+        </w:rPr>
+        <w:t xml:space="preserve">                   </w:t>
+      </w:r>
+      <w:r>
+        <w:rPr>
+          <w:noProof/>
+          <w:sz w:val="36"/>
+          <w:szCs w:val="36"/>
+        </w:rPr>
+        <w:t>│</w:t>
+      </w:r>
+    </w:p>
+    <w:p>
+      <w:pPr>
+        <w:spacing w:after="0" w:line="240" w:lineRule="auto"/>
+        <w:rPr>
+          <w:noProof/>
+          <w:sz w:val="36"/>
+          <w:szCs w:val="36"/>
+        </w:rPr>
+      </w:pPr>
+      <w:r>
+        <w:rPr>
+          <w:noProof/>
+          <w:sz w:val="36"/>
+          <w:szCs w:val="36"/>
+        </w:rPr>
+        <w:t>└──────────────────────────────────────────────┘</w:t>
+      </w:r>
+    </w:p>
+    <w:p>
+      <w:pPr>
+        <w:spacing w:after="0" w:line="240" w:lineRule="auto"/>
+        <w:rPr>
+          <w:noProof/>
+          <w:sz w:val="36"/>
+          <w:szCs w:val="36"/>
+        </w:rPr>
+      </w:pPr>
+      <w:r>
+        <w:rPr>
+          <w:noProof/>
+          <w:sz w:val="36"/>
+          <w:szCs w:val="36"/>
+        </w:rPr>
+        <w:t xml:space="preserve">                    │</w:t>
+      </w:r>
+    </w:p>
+    <w:p>
+      <w:pPr>
+        <w:spacing w:after="0" w:line="240" w:lineRule="auto"/>
+        <w:rPr>
+          <w:noProof/>
+          <w:sz w:val="36"/>
+          <w:szCs w:val="36"/>
+        </w:rPr>
+      </w:pPr>
+      <w:r>
+        <w:rPr>
+          <w:noProof/>
+          <w:sz w:val="36"/>
+          <w:szCs w:val="36"/>
+        </w:rPr>
+        <w:t xml:space="preserve">                    </w:t>
+      </w:r>
+      <w:r>
+        <w:rPr>
+          <w:rFonts w:ascii="Arial" w:hAnsi="Arial" w:cs="Arial"/>
+          <w:noProof/>
+          <w:sz w:val="36"/>
+          <w:szCs w:val="36"/>
+        </w:rPr>
+        <w:t>▼</w:t>
+      </w:r>
+    </w:p>
+    <w:p>
+      <w:pPr>
+        <w:spacing w:after="0" w:line="240" w:lineRule="auto"/>
+        <w:rPr>
+          <w:noProof/>
+          <w:sz w:val="36"/>
+          <w:szCs w:val="36"/>
+        </w:rPr>
+      </w:pPr>
+      <w:r>
+        <w:rPr>
+          <w:noProof/>
+          <w:sz w:val="36"/>
+          <w:szCs w:val="36"/>
+        </w:rPr>
+        <w:t>┌──────────────────────────────────────────────┐</w:t>
+      </w:r>
+    </w:p>
+    <w:p>
+      <w:pPr>
+        <w:spacing w:after="0" w:line="240" w:lineRule="auto"/>
+        <w:rPr>
+          <w:noProof/>
+          <w:sz w:val="36"/>
+          <w:szCs w:val="36"/>
+        </w:rPr>
+      </w:pPr>
+      <w:r>
+        <w:rPr>
+          <w:noProof/>
+          <w:sz w:val="36"/>
+          <w:szCs w:val="36"/>
+        </w:rPr>
+        <w:t xml:space="preserve">│            Forecast Pipeline Layer           </w:t>
+      </w:r>
+      <w:r>
+        <w:rPr>
+          <w:noProof/>
+          <w:sz w:val="36"/>
+          <w:szCs w:val="36"/>
+        </w:rPr>
+        <w:t xml:space="preserve">                                      </w:t>
+      </w:r>
+      <w:r>
+        <w:rPr>
+          <w:noProof/>
+          <w:sz w:val="36"/>
+          <w:szCs w:val="36"/>
+        </w:rPr>
+        <w:t>│</w:t>
+      </w:r>
+    </w:p>
+    <w:p>
+      <w:pPr>
+        <w:spacing w:after="0" w:line="240" w:lineRule="auto"/>
+        <w:rPr>
+          <w:noProof/>
+          <w:sz w:val="36"/>
+          <w:szCs w:val="36"/>
+        </w:rPr>
+      </w:pPr>
+      <w:r>
+        <w:rPr>
+          <w:noProof/>
+          <w:sz w:val="36"/>
+          <w:szCs w:val="36"/>
+        </w:rPr>
+        <w:t xml:space="preserve">│      ForecastPipeline • Evaluation • RUL    </w:t>
+      </w:r>
+      <w:r>
+        <w:rPr>
+          <w:noProof/>
+          <w:sz w:val="36"/>
+          <w:szCs w:val="36"/>
+        </w:rPr>
+        <w:t xml:space="preserve">                           </w:t>
+      </w:r>
+      <w:r>
+        <w:rPr>
+          <w:noProof/>
+          <w:sz w:val="36"/>
+          <w:szCs w:val="36"/>
+        </w:rPr>
+        <w:t xml:space="preserve"> │</w:t>
+      </w:r>
+    </w:p>
+    <w:p>
+      <w:pPr>
+        <w:spacing w:after="0" w:line="240" w:lineRule="auto"/>
+        <w:rPr>
+          <w:noProof/>
+          <w:sz w:val="36"/>
+          <w:szCs w:val="36"/>
+        </w:rPr>
+      </w:pPr>
+      <w:r>
+        <w:rPr>
+          <w:noProof/>
+          <w:sz w:val="36"/>
+          <w:szCs w:val="36"/>
+        </w:rPr>
+        <w:t>└──────────────────────────────────────────────┘</w:t>
+      </w:r>
+    </w:p>
+    <w:p>
+      <w:pPr>
+        <w:spacing w:after="0" w:line="240" w:lineRule="auto"/>
+        <w:rPr>
+          <w:noProof/>
+          <w:sz w:val="36"/>
+          <w:szCs w:val="36"/>
+        </w:rPr>
+      </w:pPr>
+      <w:r>
+        <w:rPr>
+          <w:noProof/>
+          <w:sz w:val="36"/>
+          <w:szCs w:val="36"/>
+        </w:rPr>
+        <w:t xml:space="preserve">                    │</w:t>
+      </w:r>
+    </w:p>
+    <w:p>
+      <w:pPr>
+        <w:spacing w:after="0" w:line="240" w:lineRule="auto"/>
+        <w:rPr>
+          <w:noProof/>
+          <w:sz w:val="36"/>
+          <w:szCs w:val="36"/>
+        </w:rPr>
+      </w:pPr>
+      <w:r>
+        <w:rPr>
+          <w:noProof/>
+          <w:sz w:val="36"/>
+          <w:szCs w:val="36"/>
+        </w:rPr>
+        <w:t xml:space="preserve">                    </w:t>
+      </w:r>
+      <w:r>
+        <w:rPr>
+          <w:rFonts w:ascii="Arial" w:hAnsi="Arial" w:cs="Arial"/>
+          <w:noProof/>
+          <w:sz w:val="36"/>
+          <w:szCs w:val="36"/>
+        </w:rPr>
+        <w:t>▼</w:t>
+      </w:r>
+    </w:p>
+    <w:p>
+      <w:pPr>
+        <w:spacing w:after="0" w:line="240" w:lineRule="auto"/>
+        <w:rPr>
+          <w:noProof/>
+          <w:sz w:val="36"/>
+          <w:szCs w:val="36"/>
+        </w:rPr>
+      </w:pPr>
+      <w:r>
+        <w:rPr>
+          <w:noProof/>
+          <w:sz w:val="36"/>
+          <w:szCs w:val="36"/>
+        </w:rPr>
+        <w:t>┌──────────────────────────────────────────────┐</w:t>
+      </w:r>
+    </w:p>
+    <w:p>
+      <w:pPr>
+        <w:spacing w:after="0" w:line="240" w:lineRule="auto"/>
+        <w:rPr>
+          <w:noProof/>
+          <w:sz w:val="36"/>
+          <w:szCs w:val="36"/>
+        </w:rPr>
+      </w:pPr>
+      <w:r>
+        <w:rPr>
+          <w:noProof/>
+          <w:sz w:val="36"/>
+          <w:szCs w:val="36"/>
+        </w:rPr>
+        <w:t xml:space="preserve">│              Forecast Model Layer            </w:t>
+      </w:r>
+      <w:r>
+        <w:rPr>
+          <w:noProof/>
+          <w:sz w:val="36"/>
+          <w:szCs w:val="36"/>
+        </w:rPr>
+        <w:tab/>
+      </w:r>
+      <w:r>
+        <w:rPr>
+          <w:noProof/>
+          <w:sz w:val="36"/>
+          <w:szCs w:val="36"/>
+        </w:rPr>
+        <w:tab/>
+      </w:r>
+      <w:r>
+        <w:rPr>
+          <w:noProof/>
+          <w:sz w:val="36"/>
+          <w:szCs w:val="36"/>
+        </w:rPr>
+        <w:tab/>
+      </w:r>
+      <w:r>
+        <w:rPr>
+          <w:noProof/>
+          <w:sz w:val="36"/>
+          <w:szCs w:val="36"/>
+        </w:rPr>
+        <w:tab/>
+      </w:r>
+      <w:r>
+        <w:rPr>
+          <w:noProof/>
+          <w:sz w:val="36"/>
+          <w:szCs w:val="36"/>
+        </w:rPr>
+        <w:tab/>
+      </w:r>
+      <w:r>
+        <w:rPr>
+          <w:noProof/>
+          <w:sz w:val="36"/>
+          <w:szCs w:val="36"/>
+        </w:rPr>
+        <w:t>│</w:t>
+      </w:r>
+    </w:p>
+    <w:p>
+      <w:pPr>
+        <w:spacing w:after="0" w:line="240" w:lineRule="auto"/>
+        <w:rPr>
+          <w:noProof/>
+          <w:sz w:val="36"/>
+          <w:szCs w:val="36"/>
+        </w:rPr>
+      </w:pPr>
+      <w:r>
+        <w:rPr>
+          <w:noProof/>
+          <w:sz w:val="36"/>
+          <w:szCs w:val="36"/>
+        </w:rPr>
+        <w:t xml:space="preserve">│   ARIMA • Kalman • LSTM • GRU • Hybrid       </w:t>
+      </w:r>
+      <w:r>
+        <w:rPr>
+          <w:noProof/>
+          <w:sz w:val="36"/>
+          <w:szCs w:val="36"/>
+        </w:rPr>
+        <w:tab/>
+      </w:r>
+      <w:r>
+        <w:rPr>
+          <w:noProof/>
+          <w:sz w:val="36"/>
+          <w:szCs w:val="36"/>
+        </w:rPr>
+        <w:tab/>
+      </w:r>
+      <w:r>
+        <w:rPr>
+          <w:noProof/>
+          <w:sz w:val="36"/>
+          <w:szCs w:val="36"/>
+        </w:rPr>
+        <w:tab/>
+      </w:r>
+      <w:r>
+        <w:rPr>
+          <w:noProof/>
+          <w:sz w:val="36"/>
+          <w:szCs w:val="36"/>
+        </w:rPr>
+        <w:t>│</w:t>
+      </w:r>
+    </w:p>
+    <w:p>
+      <w:pPr>
+        <w:spacing w:after="0" w:line="240" w:lineRule="auto"/>
+        <w:rPr>
+          <w:noProof/>
+          <w:sz w:val="36"/>
+          <w:szCs w:val="36"/>
+        </w:rPr>
+      </w:pPr>
+      <w:r>
+        <w:rPr>
+          <w:noProof/>
+          <w:sz w:val="36"/>
+          <w:szCs w:val="36"/>
+        </w:rPr>
+        <w:t>└──────────────────────────────────────────────┘</w:t>
+      </w:r>
+    </w:p>
+    <w:p>
+      <w:pPr>
+        <w:spacing w:after="0" w:line="240" w:lineRule="auto"/>
+        <w:rPr>
+          <w:noProof/>
+          <w:sz w:val="36"/>
+          <w:szCs w:val="36"/>
+        </w:rPr>
+      </w:pPr>
+      <w:r>
+        <w:rPr>
+          <w:noProof/>
+          <w:sz w:val="36"/>
+          <w:szCs w:val="36"/>
+        </w:rPr>
+        <w:t xml:space="preserve">                    │</w:t>
+      </w:r>
+    </w:p>
+    <w:p>
+      <w:pPr>
+        <w:spacing w:after="0" w:line="240" w:lineRule="auto"/>
+        <w:rPr>
+          <w:noProof/>
+          <w:sz w:val="36"/>
+          <w:szCs w:val="36"/>
+        </w:rPr>
+      </w:pPr>
+      <w:r>
+        <w:rPr>
+          <w:noProof/>
+          <w:sz w:val="36"/>
+          <w:szCs w:val="36"/>
+        </w:rPr>
+        <w:t xml:space="preserve">                    </w:t>
+      </w:r>
+      <w:r>
+        <w:rPr>
+          <w:rFonts w:ascii="Arial" w:hAnsi="Arial" w:cs="Arial"/>
+          <w:noProof/>
+          <w:sz w:val="36"/>
+          <w:szCs w:val="36"/>
+        </w:rPr>
+        <w:t>▼</w:t>
+      </w:r>
+    </w:p>
+    <w:p>
+      <w:pPr>
+        <w:spacing w:after="0" w:line="240" w:lineRule="auto"/>
+        <w:rPr>
+          <w:noProof/>
+          <w:sz w:val="36"/>
+          <w:szCs w:val="36"/>
+        </w:rPr>
+      </w:pPr>
+      <w:r>
+        <w:rPr>
+          <w:noProof/>
+          <w:sz w:val="36"/>
+          <w:szCs w:val="36"/>
+        </w:rPr>
+        <w:t>┌──────────────────────────────────────────────┐</w:t>
+      </w:r>
+    </w:p>
+    <w:p>
+      <w:pPr>
+        <w:spacing w:after="0" w:line="240" w:lineRule="auto"/>
+        <w:rPr>
+          <w:noProof/>
+          <w:sz w:val="36"/>
+          <w:szCs w:val="36"/>
+        </w:rPr>
+      </w:pPr>
+      <w:r>
+        <w:rPr>
+          <w:noProof/>
+          <w:sz w:val="36"/>
+          <w:szCs w:val="36"/>
+        </w:rPr>
+        <w:t xml:space="preserve">│              Data Processing Layer           </w:t>
+      </w:r>
+      <w:r>
+        <w:rPr>
+          <w:noProof/>
+          <w:sz w:val="36"/>
+          <w:szCs w:val="36"/>
+        </w:rPr>
+        <w:tab/>
+      </w:r>
+      <w:r>
+        <w:rPr>
+          <w:noProof/>
+          <w:sz w:val="36"/>
+          <w:szCs w:val="36"/>
+        </w:rPr>
+        <w:tab/>
+      </w:r>
+      <w:r>
+        <w:rPr>
+          <w:noProof/>
+          <w:sz w:val="36"/>
+          <w:szCs w:val="36"/>
+        </w:rPr>
+        <w:tab/>
+      </w:r>
+      <w:r>
+        <w:rPr>
+          <w:noProof/>
+          <w:sz w:val="36"/>
+          <w:szCs w:val="36"/>
+        </w:rPr>
+        <w:tab/>
+      </w:r>
+      <w:r>
+        <w:rPr>
+          <w:noProof/>
+          <w:sz w:val="36"/>
+          <w:szCs w:val="36"/>
+        </w:rPr>
+        <w:tab/>
+      </w:r>
+      <w:r>
+        <w:rPr>
+          <w:noProof/>
+          <w:sz w:val="36"/>
+          <w:szCs w:val="36"/>
+        </w:rPr>
+        <w:t>│</w:t>
+      </w:r>
+    </w:p>
+    <w:p>
+      <w:pPr>
+        <w:spacing w:after="0" w:line="240" w:lineRule="auto"/>
+        <w:rPr>
+          <w:noProof/>
+          <w:sz w:val="36"/>
+          <w:szCs w:val="36"/>
+        </w:rPr>
+      </w:pPr>
+      <w:r>
+        <w:rPr>
+          <w:noProof/>
+          <w:sz w:val="36"/>
+          <w:szCs w:val="36"/>
+        </w:rPr>
+        <w:t xml:space="preserve">│ Validation • Resampling • Rolling Windows    </w:t>
+      </w:r>
+      <w:r>
+        <w:rPr>
+          <w:noProof/>
+          <w:sz w:val="36"/>
+          <w:szCs w:val="36"/>
+        </w:rPr>
+        <w:tab/>
+      </w:r>
+      <w:r>
+        <w:rPr>
+          <w:noProof/>
+          <w:sz w:val="36"/>
+          <w:szCs w:val="36"/>
+        </w:rPr>
+        <w:tab/>
+      </w:r>
+      <w:r>
+        <w:rPr>
+          <w:noProof/>
+          <w:sz w:val="36"/>
+          <w:szCs w:val="36"/>
+        </w:rPr>
+        <w:tab/>
+      </w:r>
+      <w:r>
+        <w:rPr>
+          <w:noProof/>
+          <w:sz w:val="36"/>
+          <w:szCs w:val="36"/>
+        </w:rPr>
+        <w:t>│</w:t>
+      </w:r>
+    </w:p>
+    <w:p>
+      <w:pPr>
+        <w:spacing w:after="0" w:line="240" w:lineRule="auto"/>
+        <w:rPr>
+          <w:noProof/>
+          <w:sz w:val="36"/>
+          <w:szCs w:val="36"/>
+        </w:rPr>
+      </w:pPr>
+      <w:r>
+        <w:rPr>
+          <w:noProof/>
+          <w:sz w:val="36"/>
+          <w:szCs w:val="36"/>
+        </w:rPr>
+        <w:t xml:space="preserve">│ Interpolation • Statistics • Visualization   </w:t>
+      </w:r>
+      <w:r>
+        <w:rPr>
+          <w:noProof/>
+          <w:sz w:val="36"/>
+          <w:szCs w:val="36"/>
+        </w:rPr>
+        <w:tab/>
+      </w:r>
+      <w:r>
+        <w:rPr>
+          <w:noProof/>
+          <w:sz w:val="36"/>
+          <w:szCs w:val="36"/>
+        </w:rPr>
+        <w:tab/>
+      </w:r>
+      <w:r>
+        <w:rPr>
+          <w:noProof/>
+          <w:sz w:val="36"/>
+          <w:szCs w:val="36"/>
+        </w:rPr>
+        <w:tab/>
+      </w:r>
+      <w:r>
+        <w:rPr>
+          <w:noProof/>
+          <w:sz w:val="36"/>
+          <w:szCs w:val="36"/>
+        </w:rPr>
+        <w:tab/>
+      </w:r>
+      <w:r>
+        <w:rPr>
+          <w:noProof/>
+          <w:sz w:val="36"/>
+          <w:szCs w:val="36"/>
+        </w:rPr>
+        <w:t>│</w:t>
+      </w:r>
+    </w:p>
+    <w:p>
+      <w:pPr>
+        <w:spacing w:after="0" w:line="240" w:lineRule="auto"/>
+        <w:rPr>
+          <w:noProof/>
+          <w:sz w:val="36"/>
+          <w:szCs w:val="36"/>
+        </w:rPr>
+      </w:pPr>
+      <w:r>
+        <w:rPr>
+          <w:noProof/>
+          <w:sz w:val="36"/>
+          <w:szCs w:val="36"/>
+        </w:rPr>
+        <w:t>└──────────────────────────────────────────────┘</w:t>
+      </w:r>
+    </w:p>
+    <w:p>
+      <w:pPr>
+        <w:spacing w:after="0" w:line="240" w:lineRule="auto"/>
+        <w:rPr>
+          <w:noProof/>
+          <w:sz w:val="36"/>
+          <w:szCs w:val="36"/>
+        </w:rPr>
+      </w:pPr>
+      <w:r>
+        <w:rPr>
+          <w:noProof/>
+          <w:sz w:val="36"/>
+          <w:szCs w:val="36"/>
+        </w:rPr>
+        <w:t xml:space="preserve">                    │</w:t>
+      </w:r>
+    </w:p>
+    <w:p>
+      <w:pPr>
+        <w:spacing w:after="0" w:line="240" w:lineRule="auto"/>
+        <w:rPr>
+          <w:noProof/>
+          <w:sz w:val="36"/>
+          <w:szCs w:val="36"/>
+        </w:rPr>
+      </w:pPr>
+      <w:r>
+        <w:rPr>
+          <w:noProof/>
+          <w:sz w:val="36"/>
+          <w:szCs w:val="36"/>
+        </w:rPr>
+        <w:t xml:space="preserve">                    </w:t>
+      </w:r>
+      <w:r>
+        <w:rPr>
+          <w:rFonts w:ascii="Arial" w:hAnsi="Arial" w:cs="Arial"/>
+          <w:noProof/>
+          <w:sz w:val="36"/>
+          <w:szCs w:val="36"/>
+        </w:rPr>
+        <w:t>▼</w:t>
+      </w:r>
+    </w:p>
+    <w:p>
+      <w:pPr>
+        <w:spacing w:after="0" w:line="240" w:lineRule="auto"/>
+        <w:rPr>
+          <w:noProof/>
+          <w:sz w:val="36"/>
+          <w:szCs w:val="36"/>
+        </w:rPr>
+      </w:pPr>
+      <w:r>
+        <w:rPr>
+          <w:noProof/>
+          <w:sz w:val="36"/>
+          <w:szCs w:val="36"/>
+        </w:rPr>
+        <w:t>┌──────────────────────────────────────────────┐</w:t>
+      </w:r>
+    </w:p>
+    <w:p>
+      <w:pPr>
+        <w:spacing w:after="0" w:line="240" w:lineRule="auto"/>
+        <w:rPr>
+          <w:noProof/>
+          <w:sz w:val="36"/>
+          <w:szCs w:val="36"/>
+        </w:rPr>
+      </w:pPr>
+      <w:r>
+        <w:rPr>
+          <w:noProof/>
+          <w:sz w:val="36"/>
+          <w:szCs w:val="36"/>
+        </w:rPr>
+        <w:t xml:space="preserve">│                Dataset Layer                 </w:t>
+      </w:r>
+      <w:r>
+        <w:rPr>
+          <w:noProof/>
+          <w:sz w:val="36"/>
+          <w:szCs w:val="36"/>
+        </w:rPr>
+        <w:tab/>
+      </w:r>
+      <w:r>
+        <w:rPr>
+          <w:noProof/>
+          <w:sz w:val="36"/>
+          <w:szCs w:val="36"/>
+        </w:rPr>
+        <w:tab/>
+      </w:r>
+      <w:r>
+        <w:rPr>
+          <w:noProof/>
+          <w:sz w:val="36"/>
+          <w:szCs w:val="36"/>
+        </w:rPr>
+        <w:tab/>
+      </w:r>
+      <w:r>
+        <w:rPr>
+          <w:noProof/>
+          <w:sz w:val="36"/>
+          <w:szCs w:val="36"/>
+        </w:rPr>
+        <w:tab/>
+      </w:r>
+      <w:r>
+        <w:rPr>
+          <w:noProof/>
+          <w:sz w:val="36"/>
+          <w:szCs w:val="36"/>
+        </w:rPr>
+        <w:tab/>
+      </w:r>
+      <w:r>
+        <w:rPr>
+          <w:noProof/>
+          <w:sz w:val="36"/>
+          <w:szCs w:val="36"/>
+        </w:rPr>
+        <w:tab/>
+      </w:r>
+      <w:r>
+        <w:rPr>
+          <w:noProof/>
+          <w:sz w:val="36"/>
+          <w:szCs w:val="36"/>
+        </w:rPr>
+        <w:t>│</w:t>
+      </w:r>
+    </w:p>
+    <w:p>
+      <w:pPr>
+        <w:spacing w:after="0" w:line="240" w:lineRule="auto"/>
+        <w:rPr>
+          <w:noProof/>
+          <w:sz w:val="36"/>
+          <w:szCs w:val="36"/>
+        </w:rPr>
+      </w:pPr>
+      <w:r>
+        <w:rPr>
+          <w:noProof/>
+          <w:sz w:val="36"/>
+          <w:szCs w:val="36"/>
+        </w:rPr>
+        <w:t xml:space="preserve">│ Smart Loader • BatteryDataset • CSV Reader   </w:t>
+      </w:r>
+      <w:r>
+        <w:rPr>
+          <w:noProof/>
+          <w:sz w:val="36"/>
+          <w:szCs w:val="36"/>
+        </w:rPr>
+        <w:tab/>
+      </w:r>
+      <w:r>
+        <w:rPr>
+          <w:noProof/>
+          <w:sz w:val="36"/>
+          <w:szCs w:val="36"/>
+        </w:rPr>
+        <w:tab/>
+      </w:r>
+      <w:r>
+        <w:rPr>
+          <w:noProof/>
+          <w:sz w:val="36"/>
+          <w:szCs w:val="36"/>
+        </w:rPr>
+        <w:tab/>
+      </w:r>
+      <w:r>
+        <w:rPr>
+          <w:noProof/>
+          <w:sz w:val="36"/>
+          <w:szCs w:val="36"/>
+        </w:rPr>
+        <w:t>│</w:t>
+      </w:r>
+    </w:p>
+    <w:p>
+      <w:pPr>
+        <w:spacing w:after="0" w:line="240" w:lineRule="auto"/>
+        <w:rPr>
+          <w:noProof/>
+          <w:sz w:val="36"/>
+          <w:szCs w:val="36"/>
+        </w:rPr>
+      </w:pPr>
+      <w:r>
+        <w:rPr>
+          <w:noProof/>
+          <w:sz w:val="36"/>
+          <w:szCs w:val="36"/>
+        </w:rPr>
+        <w:t>└──────────────────────────────────────────────┘</w:t>
+      </w:r>
     </w:p>
     <w:p>
       <w:pPr>
@@ -4985,6 +5912,7 @@
   <w:style w:type="character" w:default="1" w:styleId="VarsaylanParagrafYazTipi">
     <w:name w:val="Default Paragraph Font"/>
     <w:uiPriority w:val="1"/>
+    <w:semiHidden/>
     <w:unhideWhenUsed/>
   </w:style>
   <w:style w:type="table" w:default="1" w:styleId="NormalTablo">

</xml_diff>

<commit_message>
Sprint 4: Add forecasting framework and base model
</commit_message>
<xml_diff>
--- a/docs/development_flow.docx
+++ b/docs/development_flow.docx
@@ -3824,21 +3824,627 @@
           <w:noProof/>
           <w:sz w:val="40"/>
           <w:szCs w:val="40"/>
+          <w:highlight w:val="yellow"/>
           <w:u w:val="single"/>
         </w:rPr>
         <w:lastRenderedPageBreak/>
+        <w:t>F</w:t>
+      </w:r>
+      <w:r>
+        <w:rPr>
+          <w:b/>
+          <w:bCs/>
+          <w:noProof/>
+          <w:sz w:val="40"/>
+          <w:szCs w:val="40"/>
+          <w:highlight w:val="yellow"/>
+          <w:u w:val="single"/>
+        </w:rPr>
+        <w:t>inal</w:t>
+      </w:r>
+      <w:r>
+        <w:rPr>
+          <w:b/>
+          <w:bCs/>
+          <w:noProof/>
+          <w:sz w:val="40"/>
+          <w:szCs w:val="40"/>
+          <w:highlight w:val="yellow"/>
+          <w:u w:val="single"/>
+        </w:rPr>
+        <w:t xml:space="preserve"> Architecture:</w:t>
+      </w:r>
+    </w:p>
+    <w:p>
+      <w:pPr>
+        <w:spacing w:after="0" w:line="240" w:lineRule="auto"/>
+        <w:rPr>
+          <w:b/>
+          <w:bCs/>
+          <w:noProof/>
+          <w:sz w:val="40"/>
+          <w:szCs w:val="40"/>
+          <w:u w:val="single"/>
+        </w:rPr>
+      </w:pPr>
+      <w:r>
+        <w:rPr>
+          <w:b/>
+          <w:bCs/>
+          <w:noProof/>
+          <w:sz w:val="40"/>
+          <w:szCs w:val="40"/>
+          <w:u w:val="single"/>
+        </w:rPr>
+        <w:t>BatteryDataset</w:t>
+      </w:r>
+    </w:p>
+    <w:p>
+      <w:pPr>
+        <w:spacing w:after="0" w:line="240" w:lineRule="auto"/>
+        <w:rPr>
+          <w:b/>
+          <w:bCs/>
+          <w:noProof/>
+          <w:sz w:val="40"/>
+          <w:szCs w:val="40"/>
+          <w:u w:val="single"/>
+        </w:rPr>
+      </w:pPr>
+      <w:r>
+        <w:rPr>
+          <w:b/>
+          <w:bCs/>
+          <w:noProof/>
+          <w:sz w:val="40"/>
+          <w:szCs w:val="40"/>
+          <w:u w:val="single"/>
+        </w:rPr>
+        <w:t xml:space="preserve">       │</w:t>
+      </w:r>
+    </w:p>
+    <w:p>
+      <w:pPr>
+        <w:spacing w:after="0" w:line="240" w:lineRule="auto"/>
+        <w:rPr>
+          <w:b/>
+          <w:bCs/>
+          <w:noProof/>
+          <w:sz w:val="40"/>
+          <w:szCs w:val="40"/>
+          <w:u w:val="single"/>
+        </w:rPr>
+      </w:pPr>
+      <w:r>
+        <w:rPr>
+          <w:b/>
+          <w:bCs/>
+          <w:noProof/>
+          <w:sz w:val="40"/>
+          <w:szCs w:val="40"/>
+          <w:u w:val="single"/>
+        </w:rPr>
+        <w:t xml:space="preserve">       </w:t>
+      </w:r>
+      <w:r>
+        <w:rPr>
+          <w:rFonts w:ascii="Arial" w:hAnsi="Arial" w:cs="Arial"/>
+          <w:b/>
+          <w:bCs/>
+          <w:noProof/>
+          <w:sz w:val="40"/>
+          <w:szCs w:val="40"/>
+          <w:u w:val="single"/>
+        </w:rPr>
+        <w:t>▼</w:t>
+      </w:r>
+    </w:p>
+    <w:p>
+      <w:pPr>
+        <w:spacing w:after="0" w:line="240" w:lineRule="auto"/>
+        <w:rPr>
+          <w:b/>
+          <w:bCs/>
+          <w:noProof/>
+          <w:sz w:val="40"/>
+          <w:szCs w:val="40"/>
+          <w:u w:val="single"/>
+        </w:rPr>
+      </w:pPr>
+      <w:r>
+        <w:rPr>
+          <w:b/>
+          <w:bCs/>
+          <w:noProof/>
+          <w:sz w:val="40"/>
+          <w:szCs w:val="40"/>
+          <w:u w:val="single"/>
+        </w:rPr>
+        <w:t>ForecastPipeline</w:t>
+      </w:r>
+    </w:p>
+    <w:p>
+      <w:pPr>
+        <w:spacing w:after="0" w:line="240" w:lineRule="auto"/>
+        <w:rPr>
+          <w:b/>
+          <w:bCs/>
+          <w:noProof/>
+          <w:sz w:val="40"/>
+          <w:szCs w:val="40"/>
+          <w:u w:val="single"/>
+        </w:rPr>
+      </w:pPr>
+      <w:r>
+        <w:rPr>
+          <w:b/>
+          <w:bCs/>
+          <w:noProof/>
+          <w:sz w:val="40"/>
+          <w:szCs w:val="40"/>
+          <w:u w:val="single"/>
+        </w:rPr>
+        <w:t xml:space="preserve">       │</w:t>
+      </w:r>
+    </w:p>
+    <w:p>
+      <w:pPr>
+        <w:spacing w:after="0" w:line="240" w:lineRule="auto"/>
+        <w:rPr>
+          <w:b/>
+          <w:bCs/>
+          <w:noProof/>
+          <w:sz w:val="40"/>
+          <w:szCs w:val="40"/>
+          <w:u w:val="single"/>
+        </w:rPr>
+      </w:pPr>
+      <w:r>
+        <w:rPr>
+          <w:b/>
+          <w:bCs/>
+          <w:noProof/>
+          <w:sz w:val="40"/>
+          <w:szCs w:val="40"/>
+          <w:u w:val="single"/>
+        </w:rPr>
+        <w:t xml:space="preserve">       </w:t>
+      </w:r>
+      <w:r>
+        <w:rPr>
+          <w:rFonts w:ascii="MS Gothic" w:eastAsia="MS Gothic" w:hAnsi="MS Gothic" w:cs="MS Gothic" w:hint="eastAsia"/>
+          <w:b/>
+          <w:bCs/>
+          <w:noProof/>
+          <w:sz w:val="40"/>
+          <w:szCs w:val="40"/>
+          <w:u w:val="single"/>
+        </w:rPr>
+        <w:t>├</w:t>
+      </w:r>
+      <w:r>
+        <w:rPr>
+          <w:rFonts w:ascii="Calibri" w:hAnsi="Calibri" w:cs="Calibri"/>
+          <w:b/>
+          <w:bCs/>
+          <w:noProof/>
+          <w:sz w:val="40"/>
+          <w:szCs w:val="40"/>
+          <w:u w:val="single"/>
+        </w:rPr>
+        <w:t>────────</w:t>
+      </w:r>
+      <w:r>
+        <w:rPr>
+          <w:b/>
+          <w:bCs/>
+          <w:noProof/>
+          <w:sz w:val="40"/>
+          <w:szCs w:val="40"/>
+          <w:u w:val="single"/>
+        </w:rPr>
+        <w:t xml:space="preserve"> ARIMA</w:t>
+      </w:r>
+    </w:p>
+    <w:p>
+      <w:pPr>
+        <w:spacing w:after="0" w:line="240" w:lineRule="auto"/>
+        <w:rPr>
+          <w:b/>
+          <w:bCs/>
+          <w:noProof/>
+          <w:sz w:val="40"/>
+          <w:szCs w:val="40"/>
+          <w:u w:val="single"/>
+        </w:rPr>
+      </w:pPr>
+      <w:r>
+        <w:rPr>
+          <w:b/>
+          <w:bCs/>
+          <w:noProof/>
+          <w:sz w:val="40"/>
+          <w:szCs w:val="40"/>
+          <w:u w:val="single"/>
+        </w:rPr>
+        <w:t xml:space="preserve">       </w:t>
+      </w:r>
+      <w:r>
+        <w:rPr>
+          <w:rFonts w:ascii="MS Gothic" w:eastAsia="MS Gothic" w:hAnsi="MS Gothic" w:cs="MS Gothic" w:hint="eastAsia"/>
+          <w:b/>
+          <w:bCs/>
+          <w:noProof/>
+          <w:sz w:val="40"/>
+          <w:szCs w:val="40"/>
+          <w:u w:val="single"/>
+        </w:rPr>
+        <w:t>├</w:t>
+      </w:r>
+      <w:r>
+        <w:rPr>
+          <w:rFonts w:ascii="Calibri" w:hAnsi="Calibri" w:cs="Calibri"/>
+          <w:b/>
+          <w:bCs/>
+          <w:noProof/>
+          <w:sz w:val="40"/>
+          <w:szCs w:val="40"/>
+          <w:u w:val="single"/>
+        </w:rPr>
+        <w:t>────────</w:t>
+      </w:r>
+      <w:r>
+        <w:rPr>
+          <w:b/>
+          <w:bCs/>
+          <w:noProof/>
+          <w:sz w:val="40"/>
+          <w:szCs w:val="40"/>
+          <w:u w:val="single"/>
+        </w:rPr>
+        <w:t xml:space="preserve"> Kalman</w:t>
+      </w:r>
+    </w:p>
+    <w:p>
+      <w:pPr>
+        <w:spacing w:after="0" w:line="240" w:lineRule="auto"/>
+        <w:rPr>
+          <w:b/>
+          <w:bCs/>
+          <w:noProof/>
+          <w:sz w:val="40"/>
+          <w:szCs w:val="40"/>
+          <w:u w:val="single"/>
+        </w:rPr>
+      </w:pPr>
+      <w:r>
+        <w:rPr>
+          <w:b/>
+          <w:bCs/>
+          <w:noProof/>
+          <w:sz w:val="40"/>
+          <w:szCs w:val="40"/>
+          <w:u w:val="single"/>
+        </w:rPr>
+        <w:t xml:space="preserve">       </w:t>
+      </w:r>
+      <w:r>
+        <w:rPr>
+          <w:rFonts w:ascii="MS Gothic" w:eastAsia="MS Gothic" w:hAnsi="MS Gothic" w:cs="MS Gothic" w:hint="eastAsia"/>
+          <w:b/>
+          <w:bCs/>
+          <w:noProof/>
+          <w:sz w:val="40"/>
+          <w:szCs w:val="40"/>
+          <w:u w:val="single"/>
+        </w:rPr>
+        <w:t>├</w:t>
+      </w:r>
+      <w:r>
+        <w:rPr>
+          <w:rFonts w:ascii="Calibri" w:hAnsi="Calibri" w:cs="Calibri"/>
+          <w:b/>
+          <w:bCs/>
+          <w:noProof/>
+          <w:sz w:val="40"/>
+          <w:szCs w:val="40"/>
+          <w:u w:val="single"/>
+        </w:rPr>
+        <w:t>────────</w:t>
+      </w:r>
+      <w:r>
+        <w:rPr>
+          <w:b/>
+          <w:bCs/>
+          <w:noProof/>
+          <w:sz w:val="40"/>
+          <w:szCs w:val="40"/>
+          <w:u w:val="single"/>
+        </w:rPr>
+        <w:t xml:space="preserve"> LSTM</w:t>
+      </w:r>
+    </w:p>
+    <w:p>
+      <w:pPr>
+        <w:spacing w:after="0" w:line="240" w:lineRule="auto"/>
+        <w:rPr>
+          <w:b/>
+          <w:bCs/>
+          <w:noProof/>
+          <w:sz w:val="40"/>
+          <w:szCs w:val="40"/>
+          <w:u w:val="single"/>
+        </w:rPr>
+      </w:pPr>
+      <w:r>
+        <w:rPr>
+          <w:b/>
+          <w:bCs/>
+          <w:noProof/>
+          <w:sz w:val="40"/>
+          <w:szCs w:val="40"/>
+          <w:u w:val="single"/>
+        </w:rPr>
+        <w:t xml:space="preserve">       </w:t>
+      </w:r>
+      <w:r>
+        <w:rPr>
+          <w:rFonts w:ascii="MS Gothic" w:eastAsia="MS Gothic" w:hAnsi="MS Gothic" w:cs="MS Gothic" w:hint="eastAsia"/>
+          <w:b/>
+          <w:bCs/>
+          <w:noProof/>
+          <w:sz w:val="40"/>
+          <w:szCs w:val="40"/>
+          <w:u w:val="single"/>
+        </w:rPr>
+        <w:t>├</w:t>
+      </w:r>
+      <w:r>
+        <w:rPr>
+          <w:rFonts w:ascii="Calibri" w:hAnsi="Calibri" w:cs="Calibri"/>
+          <w:b/>
+          <w:bCs/>
+          <w:noProof/>
+          <w:sz w:val="40"/>
+          <w:szCs w:val="40"/>
+          <w:u w:val="single"/>
+        </w:rPr>
+        <w:t>────────</w:t>
+      </w:r>
+      <w:r>
+        <w:rPr>
+          <w:b/>
+          <w:bCs/>
+          <w:noProof/>
+          <w:sz w:val="40"/>
+          <w:szCs w:val="40"/>
+          <w:u w:val="single"/>
+        </w:rPr>
+        <w:t xml:space="preserve"> GRU</w:t>
+      </w:r>
+    </w:p>
+    <w:p>
+      <w:pPr>
+        <w:spacing w:after="0" w:line="240" w:lineRule="auto"/>
+        <w:rPr>
+          <w:b/>
+          <w:bCs/>
+          <w:noProof/>
+          <w:sz w:val="40"/>
+          <w:szCs w:val="40"/>
+          <w:u w:val="single"/>
+        </w:rPr>
+      </w:pPr>
+      <w:r>
+        <w:rPr>
+          <w:b/>
+          <w:bCs/>
+          <w:noProof/>
+          <w:sz w:val="40"/>
+          <w:szCs w:val="40"/>
+          <w:u w:val="single"/>
+        </w:rPr>
+        <w:t xml:space="preserve">       └──────── Hybrid</w:t>
+      </w:r>
+    </w:p>
+    <w:p>
+      <w:pPr>
+        <w:spacing w:after="0" w:line="240" w:lineRule="auto"/>
+        <w:rPr>
+          <w:noProof/>
+          <w:sz w:val="28"/>
+          <w:szCs w:val="28"/>
+        </w:rPr>
+      </w:pPr>
+      <w:r>
+        <w:rPr>
+          <w:noProof/>
+          <w:sz w:val="28"/>
+          <w:szCs w:val="28"/>
+        </w:rPr>
+        <w:t xml:space="preserve">               │</w:t>
+      </w:r>
+    </w:p>
+    <w:p>
+      <w:pPr>
+        <w:spacing w:after="0" w:line="240" w:lineRule="auto"/>
+        <w:rPr>
+          <w:noProof/>
+          <w:sz w:val="28"/>
+          <w:szCs w:val="28"/>
+        </w:rPr>
+      </w:pPr>
+      <w:r>
+        <w:rPr>
+          <w:noProof/>
+          <w:sz w:val="28"/>
+          <w:szCs w:val="28"/>
+        </w:rPr>
+        <w:t xml:space="preserve">         ForecastResult</w:t>
+      </w:r>
+    </w:p>
+    <w:p>
+      <w:pPr>
+        <w:spacing w:after="0" w:line="240" w:lineRule="auto"/>
+        <w:rPr>
+          <w:noProof/>
+          <w:sz w:val="28"/>
+          <w:szCs w:val="28"/>
+        </w:rPr>
+      </w:pPr>
+      <w:r>
+        <w:rPr>
+          <w:noProof/>
+          <w:sz w:val="28"/>
+          <w:szCs w:val="28"/>
+        </w:rPr>
+        <w:t xml:space="preserve">               │</w:t>
+      </w:r>
+    </w:p>
+    <w:p>
+      <w:pPr>
+        <w:spacing w:after="0" w:line="240" w:lineRule="auto"/>
+        <w:rPr>
+          <w:noProof/>
+          <w:sz w:val="28"/>
+          <w:szCs w:val="28"/>
+        </w:rPr>
+      </w:pPr>
+      <w:r>
+        <w:rPr>
+          <w:noProof/>
+          <w:sz w:val="28"/>
+          <w:szCs w:val="28"/>
+        </w:rPr>
+        <w:t xml:space="preserve">               </w:t>
+      </w:r>
+      <w:r>
+        <w:rPr>
+          <w:rFonts w:ascii="Arial" w:hAnsi="Arial" w:cs="Arial"/>
+          <w:noProof/>
+          <w:sz w:val="28"/>
+          <w:szCs w:val="28"/>
+        </w:rPr>
+        <w:t>▼</w:t>
+      </w:r>
+    </w:p>
+    <w:p>
+      <w:pPr>
+        <w:spacing w:after="0" w:line="240" w:lineRule="auto"/>
+        <w:rPr>
+          <w:noProof/>
+          <w:sz w:val="28"/>
+          <w:szCs w:val="28"/>
+        </w:rPr>
+      </w:pPr>
+      <w:r>
+        <w:rPr>
+          <w:noProof/>
+          <w:sz w:val="28"/>
+          <w:szCs w:val="28"/>
+        </w:rPr>
+        <w:t xml:space="preserve">      Evaluation Engine</w:t>
+      </w:r>
+    </w:p>
+    <w:p>
+      <w:pPr>
+        <w:spacing w:after="0" w:line="240" w:lineRule="auto"/>
+        <w:rPr>
+          <w:noProof/>
+          <w:sz w:val="28"/>
+          <w:szCs w:val="28"/>
+        </w:rPr>
+      </w:pPr>
+      <w:r>
+        <w:rPr>
+          <w:noProof/>
+          <w:sz w:val="28"/>
+          <w:szCs w:val="28"/>
+        </w:rPr>
+        <w:t xml:space="preserve">               │</w:t>
+      </w:r>
+    </w:p>
+    <w:p>
+      <w:pPr>
+        <w:spacing w:after="0" w:line="240" w:lineRule="auto"/>
+        <w:rPr>
+          <w:noProof/>
+          <w:sz w:val="28"/>
+          <w:szCs w:val="28"/>
+        </w:rPr>
+      </w:pPr>
+      <w:r>
+        <w:rPr>
+          <w:noProof/>
+          <w:sz w:val="28"/>
+          <w:szCs w:val="28"/>
+        </w:rPr>
+        <w:t xml:space="preserve">               </w:t>
+      </w:r>
+      <w:r>
+        <w:rPr>
+          <w:rFonts w:ascii="Arial" w:hAnsi="Arial" w:cs="Arial"/>
+          <w:noProof/>
+          <w:sz w:val="28"/>
+          <w:szCs w:val="28"/>
+        </w:rPr>
+        <w:t>▼</w:t>
+      </w:r>
+    </w:p>
+    <w:p>
+      <w:pPr>
+        <w:spacing w:after="0" w:line="240" w:lineRule="auto"/>
+        <w:rPr>
+          <w:noProof/>
+          <w:sz w:val="28"/>
+          <w:szCs w:val="28"/>
+        </w:rPr>
+      </w:pPr>
+      <w:r>
+        <w:rPr>
+          <w:noProof/>
+          <w:sz w:val="28"/>
+          <w:szCs w:val="28"/>
+        </w:rPr>
+        <w:t xml:space="preserve">        Visualization</w:t>
+      </w:r>
+    </w:p>
+    <w:p>
+      <w:pPr>
+        <w:spacing w:after="0" w:line="240" w:lineRule="auto"/>
+        <w:rPr>
+          <w:b/>
+          <w:bCs/>
+          <w:noProof/>
+          <w:sz w:val="40"/>
+          <w:szCs w:val="40"/>
+          <w:u w:val="single"/>
+        </w:rPr>
+      </w:pPr>
+    </w:p>
+    <w:p>
+      <w:pPr>
+        <w:spacing w:after="0" w:line="240" w:lineRule="auto"/>
+        <w:rPr>
+          <w:b/>
+          <w:bCs/>
+          <w:noProof/>
+          <w:sz w:val="40"/>
+          <w:szCs w:val="40"/>
+          <w:u w:val="single"/>
+        </w:rPr>
+      </w:pPr>
+      <w:r>
+        <w:rPr>
+          <w:b/>
+          <w:bCs/>
+          <w:noProof/>
+          <w:sz w:val="40"/>
+          <w:szCs w:val="40"/>
+          <w:u w:val="single"/>
+        </w:rPr>
         <w:t>Sprint Acceptance Test (SAT):</w:t>
       </w:r>
-    </w:p>
-    <w:p>
-      <w:pPr>
-        <w:spacing w:after="0" w:line="240" w:lineRule="auto"/>
-        <w:rPr>
-          <w:noProof/>
-          <w:sz w:val="28"/>
-          <w:szCs w:val="28"/>
-        </w:rPr>
-      </w:pPr>
     </w:p>
     <w:p>
       <w:pPr>
@@ -4070,47 +4676,17 @@
         </w:rPr>
         <w:t>Visualization</w:t>
       </w:r>
-    </w:p>
-    <w:p>
-      <w:pPr>
-        <w:spacing w:after="0" w:line="240" w:lineRule="auto"/>
-        <w:rPr>
-          <w:noProof/>
-          <w:sz w:val="36"/>
-          <w:szCs w:val="36"/>
-        </w:rPr>
-      </w:pPr>
-    </w:p>
-    <w:p>
-      <w:pPr>
-        <w:spacing w:after="0" w:line="240" w:lineRule="auto"/>
-        <w:rPr>
-          <w:noProof/>
-          <w:sz w:val="36"/>
-          <w:szCs w:val="36"/>
-        </w:rPr>
-      </w:pPr>
-    </w:p>
-    <w:p>
-      <w:pPr>
-        <w:rPr>
-          <w:noProof/>
-          <w:sz w:val="36"/>
-          <w:szCs w:val="36"/>
-        </w:rPr>
-      </w:pPr>
-      <w:r>
-        <w:rPr>
-          <w:noProof/>
-          <w:sz w:val="36"/>
-          <w:szCs w:val="36"/>
-        </w:rPr>
-        <w:br w:type="page"/>
-      </w:r>
-    </w:p>
-    <w:p>
-      <w:pPr>
-        <w:spacing w:after="0" w:line="240" w:lineRule="auto"/>
+      <w:r>
+        <w:rPr>
+          <w:noProof/>
+          <w:sz w:val="36"/>
+          <w:szCs w:val="36"/>
+        </w:rPr>
+        <w:br/>
+      </w:r>
+    </w:p>
+    <w:p>
+      <w:pPr>
         <w:rPr>
           <w:noProof/>
           <w:sz w:val="36"/>
@@ -4228,28 +4804,77 @@
           <w:sz w:val="36"/>
           <w:szCs w:val="36"/>
         </w:rPr>
-        <w:t xml:space="preserve">                    │</w:t>
-      </w:r>
-    </w:p>
-    <w:p>
-      <w:pPr>
-        <w:spacing w:after="0" w:line="240" w:lineRule="auto"/>
-        <w:rPr>
-          <w:noProof/>
-          <w:sz w:val="36"/>
-          <w:szCs w:val="36"/>
-        </w:rPr>
-      </w:pPr>
-      <w:r>
-        <w:rPr>
-          <w:noProof/>
-          <w:sz w:val="36"/>
-          <w:szCs w:val="36"/>
-        </w:rPr>
         <w:t xml:space="preserve">                    </w:t>
       </w:r>
       <w:r>
         <w:rPr>
+          <w:noProof/>
+          <w:sz w:val="36"/>
+          <w:szCs w:val="36"/>
+        </w:rPr>
+        <w:tab/>
+      </w:r>
+      <w:r>
+        <w:rPr>
+          <w:noProof/>
+          <w:sz w:val="36"/>
+          <w:szCs w:val="36"/>
+        </w:rPr>
+        <w:tab/>
+      </w:r>
+      <w:r>
+        <w:rPr>
+          <w:noProof/>
+          <w:sz w:val="36"/>
+          <w:szCs w:val="36"/>
+        </w:rPr>
+        <w:tab/>
+      </w:r>
+      <w:r>
+        <w:rPr>
+          <w:noProof/>
+          <w:sz w:val="36"/>
+          <w:szCs w:val="36"/>
+        </w:rPr>
+        <w:t>│</w:t>
+      </w:r>
+    </w:p>
+    <w:p>
+      <w:pPr>
+        <w:spacing w:after="0" w:line="240" w:lineRule="auto"/>
+        <w:rPr>
+          <w:noProof/>
+          <w:sz w:val="36"/>
+          <w:szCs w:val="36"/>
+        </w:rPr>
+      </w:pPr>
+      <w:r>
+        <w:rPr>
+          <w:noProof/>
+          <w:sz w:val="36"/>
+          <w:szCs w:val="36"/>
+        </w:rPr>
+        <w:t xml:space="preserve">                    </w:t>
+      </w:r>
+      <w:r>
+        <w:rPr>
+          <w:noProof/>
+          <w:sz w:val="36"/>
+          <w:szCs w:val="36"/>
+        </w:rPr>
+        <w:tab/>
+      </w:r>
+      <w:r>
+        <w:rPr>
+          <w:noProof/>
+          <w:sz w:val="36"/>
+          <w:szCs w:val="36"/>
+        </w:rPr>
+        <w:tab/>
+        <w:t xml:space="preserve">        </w:t>
+      </w:r>
+      <w:r>
+        <w:rPr>
           <w:rFonts w:ascii="Arial" w:hAnsi="Arial" w:cs="Arial"/>
           <w:noProof/>
           <w:sz w:val="36"/>
@@ -4377,28 +5002,77 @@
           <w:sz w:val="36"/>
           <w:szCs w:val="36"/>
         </w:rPr>
-        <w:t xml:space="preserve">                    │</w:t>
-      </w:r>
-    </w:p>
-    <w:p>
-      <w:pPr>
-        <w:spacing w:after="0" w:line="240" w:lineRule="auto"/>
-        <w:rPr>
-          <w:noProof/>
-          <w:sz w:val="36"/>
-          <w:szCs w:val="36"/>
-        </w:rPr>
-      </w:pPr>
-      <w:r>
-        <w:rPr>
-          <w:noProof/>
-          <w:sz w:val="36"/>
-          <w:szCs w:val="36"/>
-        </w:rPr>
         <w:t xml:space="preserve">                    </w:t>
       </w:r>
       <w:r>
         <w:rPr>
+          <w:noProof/>
+          <w:sz w:val="36"/>
+          <w:szCs w:val="36"/>
+        </w:rPr>
+        <w:tab/>
+      </w:r>
+      <w:r>
+        <w:rPr>
+          <w:noProof/>
+          <w:sz w:val="36"/>
+          <w:szCs w:val="36"/>
+        </w:rPr>
+        <w:tab/>
+      </w:r>
+      <w:r>
+        <w:rPr>
+          <w:noProof/>
+          <w:sz w:val="36"/>
+          <w:szCs w:val="36"/>
+        </w:rPr>
+        <w:tab/>
+      </w:r>
+      <w:r>
+        <w:rPr>
+          <w:noProof/>
+          <w:sz w:val="36"/>
+          <w:szCs w:val="36"/>
+        </w:rPr>
+        <w:t>│</w:t>
+      </w:r>
+    </w:p>
+    <w:p>
+      <w:pPr>
+        <w:spacing w:after="0" w:line="240" w:lineRule="auto"/>
+        <w:rPr>
+          <w:noProof/>
+          <w:sz w:val="36"/>
+          <w:szCs w:val="36"/>
+        </w:rPr>
+      </w:pPr>
+      <w:r>
+        <w:rPr>
+          <w:noProof/>
+          <w:sz w:val="36"/>
+          <w:szCs w:val="36"/>
+        </w:rPr>
+        <w:t xml:space="preserve">                    </w:t>
+      </w:r>
+      <w:r>
+        <w:rPr>
+          <w:noProof/>
+          <w:sz w:val="36"/>
+          <w:szCs w:val="36"/>
+        </w:rPr>
+        <w:tab/>
+      </w:r>
+      <w:r>
+        <w:rPr>
+          <w:noProof/>
+          <w:sz w:val="36"/>
+          <w:szCs w:val="36"/>
+        </w:rPr>
+        <w:tab/>
+        <w:t xml:space="preserve">        </w:t>
+      </w:r>
+      <w:r>
+        <w:rPr>
           <w:rFonts w:ascii="Arial" w:hAnsi="Arial" w:cs="Arial"/>
           <w:noProof/>
           <w:sz w:val="36"/>
@@ -4574,28 +5248,77 @@
           <w:sz w:val="36"/>
           <w:szCs w:val="36"/>
         </w:rPr>
-        <w:t xml:space="preserve">                    │</w:t>
-      </w:r>
-    </w:p>
-    <w:p>
-      <w:pPr>
-        <w:spacing w:after="0" w:line="240" w:lineRule="auto"/>
-        <w:rPr>
-          <w:noProof/>
-          <w:sz w:val="36"/>
-          <w:szCs w:val="36"/>
-        </w:rPr>
-      </w:pPr>
-      <w:r>
-        <w:rPr>
-          <w:noProof/>
-          <w:sz w:val="36"/>
-          <w:szCs w:val="36"/>
-        </w:rPr>
         <w:t xml:space="preserve">                    </w:t>
       </w:r>
       <w:r>
         <w:rPr>
+          <w:noProof/>
+          <w:sz w:val="36"/>
+          <w:szCs w:val="36"/>
+        </w:rPr>
+        <w:tab/>
+      </w:r>
+      <w:r>
+        <w:rPr>
+          <w:noProof/>
+          <w:sz w:val="36"/>
+          <w:szCs w:val="36"/>
+        </w:rPr>
+        <w:tab/>
+      </w:r>
+      <w:r>
+        <w:rPr>
+          <w:noProof/>
+          <w:sz w:val="36"/>
+          <w:szCs w:val="36"/>
+        </w:rPr>
+        <w:tab/>
+      </w:r>
+      <w:r>
+        <w:rPr>
+          <w:noProof/>
+          <w:sz w:val="36"/>
+          <w:szCs w:val="36"/>
+        </w:rPr>
+        <w:t>│</w:t>
+      </w:r>
+    </w:p>
+    <w:p>
+      <w:pPr>
+        <w:spacing w:after="0" w:line="240" w:lineRule="auto"/>
+        <w:rPr>
+          <w:noProof/>
+          <w:sz w:val="36"/>
+          <w:szCs w:val="36"/>
+        </w:rPr>
+      </w:pPr>
+      <w:r>
+        <w:rPr>
+          <w:noProof/>
+          <w:sz w:val="36"/>
+          <w:szCs w:val="36"/>
+        </w:rPr>
+        <w:t xml:space="preserve">                    </w:t>
+      </w:r>
+      <w:r>
+        <w:rPr>
+          <w:noProof/>
+          <w:sz w:val="36"/>
+          <w:szCs w:val="36"/>
+        </w:rPr>
+        <w:tab/>
+      </w:r>
+      <w:r>
+        <w:rPr>
+          <w:noProof/>
+          <w:sz w:val="36"/>
+          <w:szCs w:val="36"/>
+        </w:rPr>
+        <w:tab/>
+        <w:t xml:space="preserve">        </w:t>
+      </w:r>
+      <w:r>
+        <w:rPr>
           <w:rFonts w:ascii="Arial" w:hAnsi="Arial" w:cs="Arial"/>
           <w:noProof/>
           <w:sz w:val="36"/>
@@ -4829,28 +5552,77 @@
           <w:sz w:val="36"/>
           <w:szCs w:val="36"/>
         </w:rPr>
-        <w:t xml:space="preserve">                    │</w:t>
-      </w:r>
-    </w:p>
-    <w:p>
-      <w:pPr>
-        <w:spacing w:after="0" w:line="240" w:lineRule="auto"/>
-        <w:rPr>
-          <w:noProof/>
-          <w:sz w:val="36"/>
-          <w:szCs w:val="36"/>
-        </w:rPr>
-      </w:pPr>
-      <w:r>
-        <w:rPr>
-          <w:noProof/>
-          <w:sz w:val="36"/>
-          <w:szCs w:val="36"/>
-        </w:rPr>
         <w:t xml:space="preserve">                    </w:t>
       </w:r>
       <w:r>
         <w:rPr>
+          <w:noProof/>
+          <w:sz w:val="36"/>
+          <w:szCs w:val="36"/>
+        </w:rPr>
+        <w:tab/>
+      </w:r>
+      <w:r>
+        <w:rPr>
+          <w:noProof/>
+          <w:sz w:val="36"/>
+          <w:szCs w:val="36"/>
+        </w:rPr>
+        <w:tab/>
+      </w:r>
+      <w:r>
+        <w:rPr>
+          <w:noProof/>
+          <w:sz w:val="36"/>
+          <w:szCs w:val="36"/>
+        </w:rPr>
+        <w:tab/>
+      </w:r>
+      <w:r>
+        <w:rPr>
+          <w:noProof/>
+          <w:sz w:val="36"/>
+          <w:szCs w:val="36"/>
+        </w:rPr>
+        <w:t>│</w:t>
+      </w:r>
+    </w:p>
+    <w:p>
+      <w:pPr>
+        <w:spacing w:after="0" w:line="240" w:lineRule="auto"/>
+        <w:rPr>
+          <w:noProof/>
+          <w:sz w:val="36"/>
+          <w:szCs w:val="36"/>
+        </w:rPr>
+      </w:pPr>
+      <w:r>
+        <w:rPr>
+          <w:noProof/>
+          <w:sz w:val="36"/>
+          <w:szCs w:val="36"/>
+        </w:rPr>
+        <w:t xml:space="preserve">                    </w:t>
+      </w:r>
+      <w:r>
+        <w:rPr>
+          <w:noProof/>
+          <w:sz w:val="36"/>
+          <w:szCs w:val="36"/>
+        </w:rPr>
+        <w:tab/>
+      </w:r>
+      <w:r>
+        <w:rPr>
+          <w:noProof/>
+          <w:sz w:val="36"/>
+          <w:szCs w:val="36"/>
+        </w:rPr>
+        <w:tab/>
+        <w:t xml:space="preserve">        </w:t>
+      </w:r>
+      <w:r>
+        <w:rPr>
           <w:rFonts w:ascii="Arial" w:hAnsi="Arial" w:cs="Arial"/>
           <w:noProof/>
           <w:sz w:val="36"/>
@@ -5034,10 +5806,449 @@
         <w:spacing w:after="0" w:line="240" w:lineRule="auto"/>
         <w:rPr>
           <w:noProof/>
-          <w:sz w:val="28"/>
-          <w:szCs w:val="28"/>
-        </w:rPr>
-      </w:pPr>
+          <w:sz w:val="36"/>
+          <w:szCs w:val="36"/>
+        </w:rPr>
+      </w:pPr>
+    </w:p>
+    <w:p>
+      <w:pPr>
+        <w:spacing w:after="0" w:line="240" w:lineRule="auto"/>
+        <w:rPr>
+          <w:b/>
+          <w:bCs/>
+          <w:noProof/>
+          <w:sz w:val="28"/>
+          <w:szCs w:val="28"/>
+          <w:u w:val="single"/>
+        </w:rPr>
+      </w:pPr>
+      <w:r>
+        <w:rPr>
+          <w:b/>
+          <w:bCs/>
+          <w:noProof/>
+          <w:sz w:val="28"/>
+          <w:szCs w:val="28"/>
+          <w:u w:val="single"/>
+        </w:rPr>
+        <w:lastRenderedPageBreak/>
+        <w:t>Sprint 4 – Commit #2:</w:t>
+      </w:r>
+    </w:p>
+    <w:p>
+      <w:pPr>
+        <w:spacing w:after="0" w:line="240" w:lineRule="auto"/>
+        <w:rPr>
+          <w:noProof/>
+          <w:sz w:val="28"/>
+          <w:szCs w:val="28"/>
+        </w:rPr>
+      </w:pPr>
+    </w:p>
+    <w:p>
+      <w:pPr>
+        <w:spacing w:after="0" w:line="240" w:lineRule="auto"/>
+        <w:rPr>
+          <w:noProof/>
+          <w:sz w:val="28"/>
+          <w:szCs w:val="28"/>
+        </w:rPr>
+      </w:pPr>
+      <w:r>
+        <w:rPr>
+          <w:noProof/>
+          <w:sz w:val="28"/>
+          <w:szCs w:val="28"/>
+        </w:rPr>
+        <w:t xml:space="preserve">                 BaseForecastModel</w:t>
+      </w:r>
+    </w:p>
+    <w:p>
+      <w:pPr>
+        <w:spacing w:after="0" w:line="240" w:lineRule="auto"/>
+        <w:rPr>
+          <w:noProof/>
+          <w:sz w:val="28"/>
+          <w:szCs w:val="28"/>
+        </w:rPr>
+      </w:pPr>
+      <w:r>
+        <w:rPr>
+          <w:noProof/>
+          <w:sz w:val="28"/>
+          <w:szCs w:val="28"/>
+        </w:rPr>
+        <w:t xml:space="preserve">                        </w:t>
+      </w:r>
+      <w:r>
+        <w:rPr>
+          <w:rFonts w:ascii="Arial" w:hAnsi="Arial" w:cs="Arial"/>
+          <w:noProof/>
+          <w:sz w:val="28"/>
+          <w:szCs w:val="28"/>
+        </w:rPr>
+        <w:t>▲</w:t>
+      </w:r>
+    </w:p>
+    <w:p>
+      <w:pPr>
+        <w:spacing w:after="0" w:line="240" w:lineRule="auto"/>
+        <w:rPr>
+          <w:noProof/>
+          <w:sz w:val="28"/>
+          <w:szCs w:val="28"/>
+        </w:rPr>
+      </w:pPr>
+      <w:r>
+        <w:rPr>
+          <w:noProof/>
+          <w:sz w:val="28"/>
+          <w:szCs w:val="28"/>
+        </w:rPr>
+        <w:t xml:space="preserve">                        │</w:t>
+      </w:r>
+    </w:p>
+    <w:p>
+      <w:pPr>
+        <w:spacing w:after="0" w:line="240" w:lineRule="auto"/>
+        <w:rPr>
+          <w:noProof/>
+          <w:sz w:val="28"/>
+          <w:szCs w:val="28"/>
+        </w:rPr>
+      </w:pPr>
+      <w:r>
+        <w:rPr>
+          <w:noProof/>
+          <w:sz w:val="28"/>
+          <w:szCs w:val="28"/>
+        </w:rPr>
+        <w:t xml:space="preserve">        ┌───────────────</w:t>
+      </w:r>
+      <w:r>
+        <w:rPr>
+          <w:rFonts w:ascii="MS Gothic" w:eastAsia="MS Gothic" w:hAnsi="MS Gothic" w:cs="MS Gothic" w:hint="eastAsia"/>
+          <w:noProof/>
+          <w:sz w:val="28"/>
+          <w:szCs w:val="28"/>
+        </w:rPr>
+        <w:t>┼</w:t>
+      </w:r>
+      <w:r>
+        <w:rPr>
+          <w:rFonts w:ascii="Calibri" w:hAnsi="Calibri" w:cs="Calibri"/>
+          <w:noProof/>
+          <w:sz w:val="28"/>
+          <w:szCs w:val="28"/>
+        </w:rPr>
+        <w:t>────────────────┐</w:t>
+      </w:r>
+    </w:p>
+    <w:p>
+      <w:pPr>
+        <w:spacing w:after="0" w:line="240" w:lineRule="auto"/>
+        <w:rPr>
+          <w:noProof/>
+          <w:sz w:val="28"/>
+          <w:szCs w:val="28"/>
+        </w:rPr>
+      </w:pPr>
+      <w:r>
+        <w:rPr>
+          <w:noProof/>
+          <w:sz w:val="28"/>
+          <w:szCs w:val="28"/>
+        </w:rPr>
+        <w:t xml:space="preserve">        │               </w:t>
+      </w:r>
+      <w:r>
+        <w:rPr>
+          <w:noProof/>
+          <w:sz w:val="28"/>
+          <w:szCs w:val="28"/>
+        </w:rPr>
+        <w:tab/>
+      </w:r>
+      <w:r>
+        <w:rPr>
+          <w:noProof/>
+          <w:sz w:val="28"/>
+          <w:szCs w:val="28"/>
+        </w:rPr>
+        <w:tab/>
+      </w:r>
+      <w:r>
+        <w:rPr>
+          <w:noProof/>
+          <w:sz w:val="28"/>
+          <w:szCs w:val="28"/>
+        </w:rPr>
+        <w:t xml:space="preserve">│                </w:t>
+      </w:r>
+      <w:r>
+        <w:rPr>
+          <w:noProof/>
+          <w:sz w:val="28"/>
+          <w:szCs w:val="28"/>
+        </w:rPr>
+        <w:tab/>
+      </w:r>
+      <w:r>
+        <w:rPr>
+          <w:noProof/>
+          <w:sz w:val="28"/>
+          <w:szCs w:val="28"/>
+        </w:rPr>
+        <w:tab/>
+        <w:t xml:space="preserve">     </w:t>
+      </w:r>
+      <w:r>
+        <w:rPr>
+          <w:noProof/>
+          <w:sz w:val="28"/>
+          <w:szCs w:val="28"/>
+        </w:rPr>
+        <w:t>│</w:t>
+      </w:r>
+    </w:p>
+    <w:p>
+      <w:pPr>
+        <w:spacing w:after="0" w:line="240" w:lineRule="auto"/>
+        <w:rPr>
+          <w:noProof/>
+          <w:sz w:val="28"/>
+          <w:szCs w:val="28"/>
+        </w:rPr>
+      </w:pPr>
+      <w:r>
+        <w:rPr>
+          <w:noProof/>
+          <w:sz w:val="28"/>
+          <w:szCs w:val="28"/>
+        </w:rPr>
+        <w:t xml:space="preserve">        </w:t>
+      </w:r>
+      <w:r>
+        <w:rPr>
+          <w:rFonts w:ascii="Arial" w:hAnsi="Arial" w:cs="Arial"/>
+          <w:noProof/>
+          <w:sz w:val="28"/>
+          <w:szCs w:val="28"/>
+        </w:rPr>
+        <w:t>▼</w:t>
+      </w:r>
+      <w:r>
+        <w:rPr>
+          <w:noProof/>
+          <w:sz w:val="28"/>
+          <w:szCs w:val="28"/>
+        </w:rPr>
+        <w:t xml:space="preserve">               </w:t>
+      </w:r>
+      <w:r>
+        <w:rPr>
+          <w:noProof/>
+          <w:sz w:val="28"/>
+          <w:szCs w:val="28"/>
+        </w:rPr>
+        <w:tab/>
+      </w:r>
+      <w:r>
+        <w:rPr>
+          <w:noProof/>
+          <w:sz w:val="28"/>
+          <w:szCs w:val="28"/>
+        </w:rPr>
+        <w:tab/>
+      </w:r>
+      <w:r>
+        <w:rPr>
+          <w:rFonts w:ascii="Arial" w:hAnsi="Arial" w:cs="Arial"/>
+          <w:noProof/>
+          <w:sz w:val="28"/>
+          <w:szCs w:val="28"/>
+        </w:rPr>
+        <w:t>▼</w:t>
+      </w:r>
+      <w:r>
+        <w:rPr>
+          <w:noProof/>
+          <w:sz w:val="28"/>
+          <w:szCs w:val="28"/>
+        </w:rPr>
+        <w:t xml:space="preserve">                </w:t>
+      </w:r>
+      <w:r>
+        <w:rPr>
+          <w:noProof/>
+          <w:sz w:val="28"/>
+          <w:szCs w:val="28"/>
+        </w:rPr>
+        <w:tab/>
+      </w:r>
+      <w:r>
+        <w:rPr>
+          <w:noProof/>
+          <w:sz w:val="28"/>
+          <w:szCs w:val="28"/>
+        </w:rPr>
+        <w:tab/>
+        <w:t xml:space="preserve">    </w:t>
+      </w:r>
+      <w:r>
+        <w:rPr>
+          <w:rFonts w:ascii="Arial" w:hAnsi="Arial" w:cs="Arial"/>
+          <w:noProof/>
+          <w:sz w:val="28"/>
+          <w:szCs w:val="28"/>
+        </w:rPr>
+        <w:t>▼</w:t>
+      </w:r>
+    </w:p>
+    <w:p>
+      <w:pPr>
+        <w:spacing w:after="0" w:line="240" w:lineRule="auto"/>
+        <w:rPr>
+          <w:noProof/>
+          <w:sz w:val="28"/>
+          <w:szCs w:val="28"/>
+        </w:rPr>
+      </w:pPr>
+      <w:r>
+        <w:rPr>
+          <w:noProof/>
+          <w:sz w:val="28"/>
+          <w:szCs w:val="28"/>
+        </w:rPr>
+        <w:t xml:space="preserve">   ARIMAModel     KalmanModel      LSTMModel</w:t>
+      </w:r>
+    </w:p>
+    <w:p>
+      <w:pPr>
+        <w:spacing w:after="0" w:line="240" w:lineRule="auto"/>
+        <w:rPr>
+          <w:noProof/>
+          <w:sz w:val="28"/>
+          <w:szCs w:val="28"/>
+        </w:rPr>
+      </w:pPr>
+      <w:r>
+        <w:rPr>
+          <w:noProof/>
+          <w:sz w:val="28"/>
+          <w:szCs w:val="28"/>
+        </w:rPr>
+        <w:t xml:space="preserve">        │</w:t>
+      </w:r>
+    </w:p>
+    <w:p>
+      <w:pPr>
+        <w:spacing w:after="0" w:line="240" w:lineRule="auto"/>
+        <w:rPr>
+          <w:noProof/>
+          <w:sz w:val="28"/>
+          <w:szCs w:val="28"/>
+        </w:rPr>
+      </w:pPr>
+      <w:r>
+        <w:rPr>
+          <w:noProof/>
+          <w:sz w:val="28"/>
+          <w:szCs w:val="28"/>
+        </w:rPr>
+        <w:t xml:space="preserve">        </w:t>
+      </w:r>
+      <w:r>
+        <w:rPr>
+          <w:rFonts w:ascii="Arial" w:hAnsi="Arial" w:cs="Arial"/>
+          <w:noProof/>
+          <w:sz w:val="28"/>
+          <w:szCs w:val="28"/>
+        </w:rPr>
+        <w:t>▼</w:t>
+      </w:r>
+    </w:p>
+    <w:p>
+      <w:pPr>
+        <w:spacing w:after="0" w:line="240" w:lineRule="auto"/>
+        <w:rPr>
+          <w:noProof/>
+          <w:sz w:val="28"/>
+          <w:szCs w:val="28"/>
+        </w:rPr>
+      </w:pPr>
+      <w:r>
+        <w:rPr>
+          <w:noProof/>
+          <w:sz w:val="28"/>
+          <w:szCs w:val="28"/>
+        </w:rPr>
+        <w:t xml:space="preserve"> ForecastPipeline</w:t>
+      </w:r>
+    </w:p>
+    <w:p>
+      <w:pPr>
+        <w:spacing w:after="0" w:line="240" w:lineRule="auto"/>
+        <w:rPr>
+          <w:noProof/>
+          <w:sz w:val="28"/>
+          <w:szCs w:val="28"/>
+        </w:rPr>
+      </w:pPr>
+      <w:r>
+        <w:rPr>
+          <w:noProof/>
+          <w:sz w:val="28"/>
+          <w:szCs w:val="28"/>
+        </w:rPr>
+        <w:t xml:space="preserve">        │</w:t>
+      </w:r>
+    </w:p>
+    <w:p>
+      <w:pPr>
+        <w:spacing w:after="0" w:line="240" w:lineRule="auto"/>
+        <w:rPr>
+          <w:noProof/>
+          <w:sz w:val="28"/>
+          <w:szCs w:val="28"/>
+        </w:rPr>
+      </w:pPr>
+      <w:r>
+        <w:rPr>
+          <w:noProof/>
+          <w:sz w:val="28"/>
+          <w:szCs w:val="28"/>
+        </w:rPr>
+        <w:t xml:space="preserve">        </w:t>
+      </w:r>
+      <w:r>
+        <w:rPr>
+          <w:rFonts w:ascii="Arial" w:hAnsi="Arial" w:cs="Arial"/>
+          <w:noProof/>
+          <w:sz w:val="28"/>
+          <w:szCs w:val="28"/>
+        </w:rPr>
+        <w:t>▼</w:t>
+      </w:r>
+    </w:p>
+    <w:p>
+      <w:pPr>
+        <w:spacing w:after="0" w:line="240" w:lineRule="auto"/>
+        <w:rPr>
+          <w:noProof/>
+          <w:sz w:val="28"/>
+          <w:szCs w:val="28"/>
+        </w:rPr>
+      </w:pPr>
+      <w:r>
+        <w:rPr>
+          <w:noProof/>
+          <w:sz w:val="28"/>
+          <w:szCs w:val="28"/>
+        </w:rPr>
+        <w:t xml:space="preserve"> Forecast Result</w:t>
+      </w:r>
     </w:p>
     <w:p>
       <w:pPr>

</xml_diff>

<commit_message>
Add ARIMA forecasting model
</commit_message>
<xml_diff>
--- a/docs/development_flow.docx
+++ b/docs/development_flow.docx
@@ -3828,31 +3828,7 @@
           <w:u w:val="single"/>
         </w:rPr>
         <w:lastRenderedPageBreak/>
-        <w:t>F</w:t>
-      </w:r>
-      <w:r>
-        <w:rPr>
-          <w:b/>
-          <w:bCs/>
-          <w:noProof/>
-          <w:sz w:val="40"/>
-          <w:szCs w:val="40"/>
-          <w:highlight w:val="yellow"/>
-          <w:u w:val="single"/>
-        </w:rPr>
-        <w:t>inal</w:t>
-      </w:r>
-      <w:r>
-        <w:rPr>
-          <w:b/>
-          <w:bCs/>
-          <w:noProof/>
-          <w:sz w:val="40"/>
-          <w:szCs w:val="40"/>
-          <w:highlight w:val="yellow"/>
-          <w:u w:val="single"/>
-        </w:rPr>
-        <w:t xml:space="preserve"> Architecture:</w:t>
+        <w:t>Final Architecture:</w:t>
       </w:r>
     </w:p>
     <w:p>
@@ -7358,375 +7334,1079 @@
           <w:u w:val="single"/>
         </w:rPr>
         <w:lastRenderedPageBreak/>
-        <w:t>ARIMA</w:t>
-      </w:r>
-      <w:r>
+        <w:t>ARIMA:</w:t>
+      </w:r>
+    </w:p>
+    <w:p>
+      <w:pPr>
+        <w:spacing w:after="0" w:line="240" w:lineRule="auto"/>
+        <w:rPr>
+          <w:noProof/>
+          <w:sz w:val="24"/>
+          <w:szCs w:val="24"/>
+        </w:rPr>
+      </w:pPr>
+    </w:p>
+    <w:p>
+      <w:pPr>
+        <w:spacing w:after="0" w:line="240" w:lineRule="auto"/>
+        <w:rPr>
+          <w:noProof/>
+          <w:sz w:val="32"/>
+          <w:szCs w:val="32"/>
+        </w:rPr>
+      </w:pPr>
+      <w:r>
+        <w:rPr>
+          <w:noProof/>
+          <w:sz w:val="32"/>
+          <w:szCs w:val="32"/>
+        </w:rPr>
+        <w:t>BatteryDataset</w:t>
+      </w:r>
+    </w:p>
+    <w:p>
+      <w:pPr>
+        <w:spacing w:after="0" w:line="240" w:lineRule="auto"/>
+        <w:rPr>
+          <w:noProof/>
+          <w:sz w:val="32"/>
+          <w:szCs w:val="32"/>
+        </w:rPr>
+      </w:pPr>
+    </w:p>
+    <w:p>
+      <w:pPr>
+        <w:spacing w:after="0" w:line="240" w:lineRule="auto"/>
+        <w:rPr>
+          <w:noProof/>
+          <w:sz w:val="32"/>
+          <w:szCs w:val="32"/>
+        </w:rPr>
+      </w:pPr>
+      <w:r>
+        <w:rPr>
+          <w:noProof/>
+          <w:sz w:val="32"/>
+          <w:szCs w:val="32"/>
+        </w:rPr>
+        <w:t>↓</w:t>
+      </w:r>
+    </w:p>
+    <w:p>
+      <w:pPr>
+        <w:spacing w:after="0" w:line="240" w:lineRule="auto"/>
+        <w:rPr>
+          <w:noProof/>
+          <w:sz w:val="32"/>
+          <w:szCs w:val="32"/>
+        </w:rPr>
+      </w:pPr>
+    </w:p>
+    <w:p>
+      <w:pPr>
+        <w:spacing w:after="0" w:line="240" w:lineRule="auto"/>
+        <w:rPr>
+          <w:noProof/>
+          <w:sz w:val="32"/>
+          <w:szCs w:val="32"/>
+        </w:rPr>
+      </w:pPr>
+      <w:r>
+        <w:rPr>
+          <w:noProof/>
+          <w:sz w:val="32"/>
+          <w:szCs w:val="32"/>
+        </w:rPr>
+        <w:t>ForecastPipeline</w:t>
+      </w:r>
+    </w:p>
+    <w:p>
+      <w:pPr>
+        <w:spacing w:after="0" w:line="240" w:lineRule="auto"/>
+        <w:rPr>
+          <w:noProof/>
+          <w:sz w:val="32"/>
+          <w:szCs w:val="32"/>
+        </w:rPr>
+      </w:pPr>
+    </w:p>
+    <w:p>
+      <w:pPr>
+        <w:spacing w:after="0" w:line="240" w:lineRule="auto"/>
+        <w:rPr>
+          <w:noProof/>
+          <w:sz w:val="32"/>
+          <w:szCs w:val="32"/>
+        </w:rPr>
+      </w:pPr>
+      <w:r>
+        <w:rPr>
+          <w:noProof/>
+          <w:sz w:val="32"/>
+          <w:szCs w:val="32"/>
+        </w:rPr>
+        <w:t>↓</w:t>
+      </w:r>
+    </w:p>
+    <w:p>
+      <w:pPr>
+        <w:spacing w:after="0" w:line="240" w:lineRule="auto"/>
+        <w:rPr>
+          <w:noProof/>
+          <w:sz w:val="32"/>
+          <w:szCs w:val="32"/>
+        </w:rPr>
+      </w:pPr>
+    </w:p>
+    <w:p>
+      <w:pPr>
+        <w:spacing w:after="0" w:line="240" w:lineRule="auto"/>
+        <w:rPr>
+          <w:noProof/>
+          <w:sz w:val="32"/>
+          <w:szCs w:val="32"/>
+        </w:rPr>
+      </w:pPr>
+      <w:r>
+        <w:rPr>
+          <w:noProof/>
+          <w:sz w:val="32"/>
+          <w:szCs w:val="32"/>
+        </w:rPr>
+        <w:t>ARIMAForecaster</w:t>
+      </w:r>
+    </w:p>
+    <w:p>
+      <w:pPr>
+        <w:spacing w:after="0" w:line="240" w:lineRule="auto"/>
+        <w:rPr>
+          <w:noProof/>
+          <w:sz w:val="32"/>
+          <w:szCs w:val="32"/>
+        </w:rPr>
+      </w:pPr>
+    </w:p>
+    <w:p>
+      <w:pPr>
+        <w:spacing w:after="0" w:line="240" w:lineRule="auto"/>
+        <w:rPr>
+          <w:noProof/>
+          <w:sz w:val="32"/>
+          <w:szCs w:val="32"/>
+        </w:rPr>
+      </w:pPr>
+      <w:r>
+        <w:rPr>
+          <w:noProof/>
+          <w:sz w:val="32"/>
+          <w:szCs w:val="32"/>
+        </w:rPr>
+        <w:t>↓</w:t>
+      </w:r>
+    </w:p>
+    <w:p>
+      <w:pPr>
+        <w:spacing w:after="0" w:line="240" w:lineRule="auto"/>
+        <w:rPr>
+          <w:noProof/>
+          <w:sz w:val="32"/>
+          <w:szCs w:val="32"/>
+        </w:rPr>
+      </w:pPr>
+    </w:p>
+    <w:p>
+      <w:pPr>
+        <w:spacing w:after="0" w:line="240" w:lineRule="auto"/>
+        <w:rPr>
+          <w:noProof/>
+          <w:sz w:val="32"/>
+          <w:szCs w:val="32"/>
+        </w:rPr>
+      </w:pPr>
+      <w:r>
+        <w:rPr>
+          <w:noProof/>
+          <w:sz w:val="32"/>
+          <w:szCs w:val="32"/>
+        </w:rPr>
+        <w:t>ForecastResult</w:t>
+      </w:r>
+    </w:p>
+    <w:p>
+      <w:pPr>
+        <w:spacing w:after="0" w:line="240" w:lineRule="auto"/>
+        <w:rPr>
+          <w:noProof/>
+          <w:sz w:val="32"/>
+          <w:szCs w:val="32"/>
+        </w:rPr>
+      </w:pPr>
+    </w:p>
+    <w:p>
+      <w:pPr>
+        <w:spacing w:after="0" w:line="240" w:lineRule="auto"/>
+        <w:rPr>
+          <w:noProof/>
+          <w:sz w:val="32"/>
+          <w:szCs w:val="32"/>
+        </w:rPr>
+      </w:pPr>
+    </w:p>
+    <w:p>
+      <w:pPr>
+        <w:spacing w:after="0" w:line="240" w:lineRule="auto"/>
+        <w:rPr>
+          <w:noProof/>
+          <w:sz w:val="32"/>
+          <w:szCs w:val="32"/>
+        </w:rPr>
+      </w:pPr>
+      <w:r>
+        <w:rPr>
+          <w:noProof/>
+          <w:sz w:val="32"/>
+          <w:szCs w:val="32"/>
+        </w:rPr>
+        <w:t>ARIMA RMSE</w:t>
+      </w:r>
+    </w:p>
+    <w:p>
+      <w:pPr>
+        <w:spacing w:after="0" w:line="240" w:lineRule="auto"/>
+        <w:rPr>
+          <w:noProof/>
+          <w:sz w:val="32"/>
+          <w:szCs w:val="32"/>
+        </w:rPr>
+      </w:pPr>
+      <w:r>
+        <w:rPr>
+          <w:noProof/>
+          <w:sz w:val="32"/>
+          <w:szCs w:val="32"/>
+        </w:rPr>
+        <w:t>Kalman RMSE</w:t>
+      </w:r>
+    </w:p>
+    <w:p>
+      <w:pPr>
+        <w:spacing w:after="0" w:line="240" w:lineRule="auto"/>
+        <w:rPr>
+          <w:noProof/>
+          <w:sz w:val="32"/>
+          <w:szCs w:val="32"/>
+        </w:rPr>
+      </w:pPr>
+      <w:r>
+        <w:rPr>
+          <w:noProof/>
+          <w:sz w:val="32"/>
+          <w:szCs w:val="32"/>
+        </w:rPr>
+        <w:t>GRU RMSE</w:t>
+      </w:r>
+    </w:p>
+    <w:p>
+      <w:pPr>
+        <w:spacing w:after="0" w:line="240" w:lineRule="auto"/>
+        <w:rPr>
+          <w:noProof/>
+          <w:sz w:val="32"/>
+          <w:szCs w:val="32"/>
+        </w:rPr>
+      </w:pPr>
+      <w:r>
+        <w:rPr>
+          <w:noProof/>
+          <w:sz w:val="32"/>
+          <w:szCs w:val="32"/>
+        </w:rPr>
+        <w:t>LSTM RMSE</w:t>
+      </w:r>
+    </w:p>
+    <w:p>
+      <w:pPr>
+        <w:spacing w:after="0" w:line="240" w:lineRule="auto"/>
+        <w:rPr>
+          <w:noProof/>
+          <w:sz w:val="32"/>
+          <w:szCs w:val="32"/>
+        </w:rPr>
+      </w:pPr>
+      <w:r>
+        <w:rPr>
+          <w:noProof/>
+          <w:sz w:val="32"/>
+          <w:szCs w:val="32"/>
+        </w:rPr>
+        <w:t>Hybrid RMSE</w:t>
+      </w:r>
+    </w:p>
+    <w:p>
+      <w:pPr>
+        <w:spacing w:after="0" w:line="240" w:lineRule="auto"/>
+        <w:rPr>
+          <w:noProof/>
+          <w:sz w:val="32"/>
+          <w:szCs w:val="32"/>
+        </w:rPr>
+      </w:pPr>
+    </w:p>
+    <w:p>
+      <w:pPr>
+        <w:spacing w:after="0" w:line="240" w:lineRule="auto"/>
+        <w:rPr>
+          <w:noProof/>
+          <w:sz w:val="32"/>
+          <w:szCs w:val="32"/>
+        </w:rPr>
+      </w:pPr>
+    </w:p>
+    <w:p>
+      <w:pPr>
+        <w:spacing w:after="0" w:line="240" w:lineRule="auto"/>
         <w:rPr>
           <w:b/>
           <w:bCs/>
           <w:noProof/>
-          <w:sz w:val="40"/>
-          <w:szCs w:val="40"/>
-          <w:u w:val="single"/>
-        </w:rPr>
-        <w:t>:</w:t>
-      </w:r>
-    </w:p>
-    <w:p>
-      <w:pPr>
-        <w:spacing w:after="0" w:line="240" w:lineRule="auto"/>
-        <w:rPr>
-          <w:noProof/>
-          <w:sz w:val="24"/>
-          <w:szCs w:val="24"/>
-        </w:rPr>
-      </w:pPr>
-    </w:p>
-    <w:p>
-      <w:pPr>
-        <w:spacing w:after="0" w:line="240" w:lineRule="auto"/>
-        <w:rPr>
-          <w:noProof/>
-          <w:sz w:val="32"/>
-          <w:szCs w:val="32"/>
-        </w:rPr>
-      </w:pPr>
-      <w:r>
-        <w:rPr>
-          <w:noProof/>
-          <w:sz w:val="32"/>
-          <w:szCs w:val="32"/>
-        </w:rPr>
-        <w:t>BatteryDataset</w:t>
-      </w:r>
-    </w:p>
-    <w:p>
-      <w:pPr>
-        <w:spacing w:after="0" w:line="240" w:lineRule="auto"/>
-        <w:rPr>
-          <w:noProof/>
-          <w:sz w:val="32"/>
-          <w:szCs w:val="32"/>
-        </w:rPr>
-      </w:pPr>
-    </w:p>
-    <w:p>
-      <w:pPr>
-        <w:spacing w:after="0" w:line="240" w:lineRule="auto"/>
-        <w:rPr>
-          <w:noProof/>
-          <w:sz w:val="32"/>
-          <w:szCs w:val="32"/>
-        </w:rPr>
-      </w:pPr>
-      <w:r>
-        <w:rPr>
-          <w:noProof/>
-          <w:sz w:val="32"/>
-          <w:szCs w:val="32"/>
-        </w:rPr>
-        <w:t>↓</w:t>
-      </w:r>
-    </w:p>
-    <w:p>
-      <w:pPr>
-        <w:spacing w:after="0" w:line="240" w:lineRule="auto"/>
-        <w:rPr>
-          <w:noProof/>
-          <w:sz w:val="32"/>
-          <w:szCs w:val="32"/>
-        </w:rPr>
-      </w:pPr>
-    </w:p>
-    <w:p>
-      <w:pPr>
-        <w:spacing w:after="0" w:line="240" w:lineRule="auto"/>
-        <w:rPr>
-          <w:noProof/>
-          <w:sz w:val="32"/>
-          <w:szCs w:val="32"/>
-        </w:rPr>
-      </w:pPr>
-      <w:r>
-        <w:rPr>
-          <w:noProof/>
-          <w:sz w:val="32"/>
-          <w:szCs w:val="32"/>
-        </w:rPr>
-        <w:t>ForecastPipeline</w:t>
-      </w:r>
-    </w:p>
-    <w:p>
-      <w:pPr>
-        <w:spacing w:after="0" w:line="240" w:lineRule="auto"/>
-        <w:rPr>
-          <w:noProof/>
-          <w:sz w:val="32"/>
-          <w:szCs w:val="32"/>
-        </w:rPr>
-      </w:pPr>
-    </w:p>
-    <w:p>
-      <w:pPr>
-        <w:spacing w:after="0" w:line="240" w:lineRule="auto"/>
-        <w:rPr>
-          <w:noProof/>
-          <w:sz w:val="32"/>
-          <w:szCs w:val="32"/>
-        </w:rPr>
-      </w:pPr>
-      <w:r>
-        <w:rPr>
-          <w:noProof/>
-          <w:sz w:val="32"/>
-          <w:szCs w:val="32"/>
-        </w:rPr>
-        <w:t>↓</w:t>
-      </w:r>
-    </w:p>
-    <w:p>
-      <w:pPr>
-        <w:spacing w:after="0" w:line="240" w:lineRule="auto"/>
-        <w:rPr>
-          <w:noProof/>
-          <w:sz w:val="32"/>
-          <w:szCs w:val="32"/>
-        </w:rPr>
-      </w:pPr>
-    </w:p>
-    <w:p>
-      <w:pPr>
-        <w:spacing w:after="0" w:line="240" w:lineRule="auto"/>
-        <w:rPr>
-          <w:noProof/>
-          <w:sz w:val="32"/>
-          <w:szCs w:val="32"/>
-        </w:rPr>
-      </w:pPr>
-      <w:r>
-        <w:rPr>
-          <w:noProof/>
-          <w:sz w:val="32"/>
-          <w:szCs w:val="32"/>
-        </w:rPr>
-        <w:t>ARIMAForecaster</w:t>
-      </w:r>
-    </w:p>
-    <w:p>
-      <w:pPr>
-        <w:spacing w:after="0" w:line="240" w:lineRule="auto"/>
-        <w:rPr>
-          <w:noProof/>
-          <w:sz w:val="32"/>
-          <w:szCs w:val="32"/>
-        </w:rPr>
-      </w:pPr>
-    </w:p>
-    <w:p>
-      <w:pPr>
-        <w:spacing w:after="0" w:line="240" w:lineRule="auto"/>
-        <w:rPr>
-          <w:noProof/>
-          <w:sz w:val="32"/>
-          <w:szCs w:val="32"/>
-        </w:rPr>
-      </w:pPr>
-      <w:r>
-        <w:rPr>
-          <w:noProof/>
-          <w:sz w:val="32"/>
-          <w:szCs w:val="32"/>
-        </w:rPr>
-        <w:t>↓</w:t>
-      </w:r>
-    </w:p>
-    <w:p>
-      <w:pPr>
-        <w:spacing w:after="0" w:line="240" w:lineRule="auto"/>
-        <w:rPr>
-          <w:noProof/>
-          <w:sz w:val="32"/>
-          <w:szCs w:val="32"/>
-        </w:rPr>
-      </w:pPr>
-    </w:p>
-    <w:p>
-      <w:pPr>
-        <w:spacing w:after="0" w:line="240" w:lineRule="auto"/>
-        <w:rPr>
-          <w:noProof/>
-          <w:sz w:val="32"/>
-          <w:szCs w:val="32"/>
-        </w:rPr>
-      </w:pPr>
-      <w:r>
-        <w:rPr>
-          <w:noProof/>
-          <w:sz w:val="32"/>
-          <w:szCs w:val="32"/>
-        </w:rPr>
-        <w:t>ForecastResult</w:t>
-      </w:r>
-    </w:p>
-    <w:p>
-      <w:pPr>
-        <w:spacing w:after="0" w:line="240" w:lineRule="auto"/>
-        <w:rPr>
-          <w:noProof/>
-          <w:sz w:val="32"/>
-          <w:szCs w:val="32"/>
-        </w:rPr>
-      </w:pPr>
-    </w:p>
-    <w:p>
-      <w:pPr>
-        <w:spacing w:after="0" w:line="240" w:lineRule="auto"/>
-        <w:rPr>
-          <w:noProof/>
-          <w:sz w:val="32"/>
-          <w:szCs w:val="32"/>
-        </w:rPr>
-      </w:pPr>
-    </w:p>
-    <w:p>
-      <w:pPr>
-        <w:spacing w:after="0" w:line="240" w:lineRule="auto"/>
-        <w:rPr>
-          <w:noProof/>
-          <w:sz w:val="32"/>
-          <w:szCs w:val="32"/>
-        </w:rPr>
-      </w:pPr>
-      <w:r>
-        <w:rPr>
-          <w:noProof/>
-          <w:sz w:val="32"/>
-          <w:szCs w:val="32"/>
-        </w:rPr>
-        <w:t>ARIMA RMSE</w:t>
-      </w:r>
-    </w:p>
-    <w:p>
-      <w:pPr>
-        <w:spacing w:after="0" w:line="240" w:lineRule="auto"/>
-        <w:rPr>
-          <w:noProof/>
-          <w:sz w:val="32"/>
-          <w:szCs w:val="32"/>
-        </w:rPr>
-      </w:pPr>
-    </w:p>
-    <w:p>
-      <w:pPr>
-        <w:spacing w:after="0" w:line="240" w:lineRule="auto"/>
-        <w:rPr>
-          <w:noProof/>
-          <w:sz w:val="32"/>
-          <w:szCs w:val="32"/>
-        </w:rPr>
-      </w:pPr>
-      <w:r>
-        <w:rPr>
-          <w:noProof/>
-          <w:sz w:val="32"/>
-          <w:szCs w:val="32"/>
-        </w:rPr>
-        <w:t>Kalman RMSE</w:t>
-      </w:r>
-    </w:p>
-    <w:p>
-      <w:pPr>
-        <w:spacing w:after="0" w:line="240" w:lineRule="auto"/>
-        <w:rPr>
-          <w:noProof/>
-          <w:sz w:val="32"/>
-          <w:szCs w:val="32"/>
-        </w:rPr>
-      </w:pPr>
-    </w:p>
-    <w:p>
-      <w:pPr>
-        <w:spacing w:after="0" w:line="240" w:lineRule="auto"/>
-        <w:rPr>
-          <w:noProof/>
-          <w:sz w:val="32"/>
-          <w:szCs w:val="32"/>
-        </w:rPr>
-      </w:pPr>
-      <w:r>
-        <w:rPr>
-          <w:noProof/>
-          <w:sz w:val="32"/>
-          <w:szCs w:val="32"/>
-        </w:rPr>
-        <w:t>GRU RMSE</w:t>
-      </w:r>
-    </w:p>
-    <w:p>
-      <w:pPr>
-        <w:spacing w:after="0" w:line="240" w:lineRule="auto"/>
-        <w:rPr>
-          <w:noProof/>
-          <w:sz w:val="32"/>
-          <w:szCs w:val="32"/>
-        </w:rPr>
-      </w:pPr>
-    </w:p>
-    <w:p>
-      <w:pPr>
-        <w:spacing w:after="0" w:line="240" w:lineRule="auto"/>
-        <w:rPr>
-          <w:noProof/>
-          <w:sz w:val="32"/>
-          <w:szCs w:val="32"/>
-        </w:rPr>
-      </w:pPr>
-      <w:r>
-        <w:rPr>
-          <w:noProof/>
-          <w:sz w:val="32"/>
-          <w:szCs w:val="32"/>
-        </w:rPr>
-        <w:t>LSTM RMSE</w:t>
-      </w:r>
-    </w:p>
-    <w:p>
-      <w:pPr>
-        <w:spacing w:after="0" w:line="240" w:lineRule="auto"/>
-        <w:rPr>
-          <w:noProof/>
-          <w:sz w:val="32"/>
-          <w:szCs w:val="32"/>
-        </w:rPr>
-      </w:pPr>
-    </w:p>
-    <w:p>
-      <w:pPr>
-        <w:spacing w:after="0" w:line="240" w:lineRule="auto"/>
-        <w:rPr>
-          <w:noProof/>
-          <w:sz w:val="32"/>
-          <w:szCs w:val="32"/>
-        </w:rPr>
-      </w:pPr>
-      <w:r>
-        <w:rPr>
-          <w:noProof/>
-          <w:sz w:val="32"/>
-          <w:szCs w:val="32"/>
-        </w:rPr>
-        <w:t>Hybrid RMSE</w:t>
-      </w:r>
-    </w:p>
-    <w:p>
-      <w:pPr>
-        <w:spacing w:after="0" w:line="240" w:lineRule="auto"/>
-        <w:rPr>
-          <w:noProof/>
-          <w:sz w:val="32"/>
-          <w:szCs w:val="32"/>
-        </w:rPr>
-      </w:pPr>
+          <w:sz w:val="32"/>
+          <w:szCs w:val="32"/>
+        </w:rPr>
+      </w:pPr>
+      <w:r>
+        <w:rPr>
+          <w:b/>
+          <w:bCs/>
+          <w:noProof/>
+          <w:sz w:val="32"/>
+          <w:szCs w:val="32"/>
+        </w:rPr>
+        <w:t>Forecast Model Contract</w:t>
+      </w:r>
+    </w:p>
+    <w:p>
+      <w:pPr>
+        <w:spacing w:after="0" w:line="240" w:lineRule="auto"/>
+        <w:rPr>
+          <w:noProof/>
+          <w:sz w:val="32"/>
+          <w:szCs w:val="32"/>
+        </w:rPr>
+      </w:pPr>
+      <w:r>
+        <w:rPr>
+          <w:noProof/>
+          <w:sz w:val="32"/>
+          <w:szCs w:val="32"/>
+        </w:rPr>
+        <w:t>───────────────────────</w:t>
+      </w:r>
+    </w:p>
+    <w:p>
+      <w:pPr>
+        <w:spacing w:after="0" w:line="240" w:lineRule="auto"/>
+        <w:rPr>
+          <w:noProof/>
+          <w:sz w:val="32"/>
+          <w:szCs w:val="32"/>
+        </w:rPr>
+      </w:pPr>
+      <w:r>
+        <w:rPr>
+          <w:rFonts w:ascii="Segoe UI Symbol" w:hAnsi="Segoe UI Symbol" w:cs="Segoe UI Symbol"/>
+          <w:noProof/>
+          <w:sz w:val="32"/>
+          <w:szCs w:val="32"/>
+        </w:rPr>
+        <w:t>✓</w:t>
+      </w:r>
+      <w:r>
+        <w:rPr>
+          <w:noProof/>
+          <w:sz w:val="32"/>
+          <w:szCs w:val="32"/>
+        </w:rPr>
+        <w:t xml:space="preserve"> fit(dataset)</w:t>
+      </w:r>
+    </w:p>
+    <w:p>
+      <w:pPr>
+        <w:spacing w:after="0" w:line="240" w:lineRule="auto"/>
+        <w:rPr>
+          <w:noProof/>
+          <w:sz w:val="32"/>
+          <w:szCs w:val="32"/>
+        </w:rPr>
+      </w:pPr>
+      <w:r>
+        <w:rPr>
+          <w:rFonts w:ascii="Segoe UI Symbol" w:hAnsi="Segoe UI Symbol" w:cs="Segoe UI Symbol"/>
+          <w:noProof/>
+          <w:sz w:val="32"/>
+          <w:szCs w:val="32"/>
+        </w:rPr>
+        <w:t>✓</w:t>
+      </w:r>
+      <w:r>
+        <w:rPr>
+          <w:noProof/>
+          <w:sz w:val="32"/>
+          <w:szCs w:val="32"/>
+        </w:rPr>
+        <w:t xml:space="preserve"> predict(steps)</w:t>
+      </w:r>
+    </w:p>
+    <w:p>
+      <w:pPr>
+        <w:spacing w:after="0" w:line="240" w:lineRule="auto"/>
+        <w:rPr>
+          <w:noProof/>
+          <w:sz w:val="32"/>
+          <w:szCs w:val="32"/>
+        </w:rPr>
+      </w:pPr>
+      <w:r>
+        <w:rPr>
+          <w:rFonts w:ascii="Segoe UI Symbol" w:hAnsi="Segoe UI Symbol" w:cs="Segoe UI Symbol"/>
+          <w:noProof/>
+          <w:sz w:val="32"/>
+          <w:szCs w:val="32"/>
+        </w:rPr>
+        <w:t>✓</w:t>
+      </w:r>
+      <w:r>
+        <w:rPr>
+          <w:noProof/>
+          <w:sz w:val="32"/>
+          <w:szCs w:val="32"/>
+        </w:rPr>
+        <w:t xml:space="preserve"> fit_predict(dataset, steps)</w:t>
+      </w:r>
+    </w:p>
+    <w:p>
+      <w:pPr>
+        <w:spacing w:after="0" w:line="240" w:lineRule="auto"/>
+        <w:rPr>
+          <w:noProof/>
+          <w:sz w:val="32"/>
+          <w:szCs w:val="32"/>
+        </w:rPr>
+      </w:pPr>
+      <w:r>
+        <w:rPr>
+          <w:rFonts w:ascii="Segoe UI Symbol" w:hAnsi="Segoe UI Symbol" w:cs="Segoe UI Symbol"/>
+          <w:noProof/>
+          <w:sz w:val="32"/>
+          <w:szCs w:val="32"/>
+        </w:rPr>
+        <w:t>✓</w:t>
+      </w:r>
+      <w:r>
+        <w:rPr>
+          <w:noProof/>
+          <w:sz w:val="32"/>
+          <w:szCs w:val="32"/>
+        </w:rPr>
+        <w:t xml:space="preserve"> returns ForecastResult</w:t>
+      </w:r>
+    </w:p>
+    <w:p>
+      <w:pPr>
+        <w:spacing w:after="0" w:line="240" w:lineRule="auto"/>
+        <w:rPr>
+          <w:noProof/>
+          <w:sz w:val="32"/>
+          <w:szCs w:val="32"/>
+        </w:rPr>
+      </w:pPr>
+      <w:r>
+        <w:rPr>
+          <w:rFonts w:ascii="Segoe UI Symbol" w:hAnsi="Segoe UI Symbol" w:cs="Segoe UI Symbol"/>
+          <w:noProof/>
+          <w:sz w:val="32"/>
+          <w:szCs w:val="32"/>
+        </w:rPr>
+        <w:t>✓</w:t>
+      </w:r>
+      <w:r>
+        <w:rPr>
+          <w:noProof/>
+          <w:sz w:val="32"/>
+          <w:szCs w:val="32"/>
+        </w:rPr>
+        <w:t xml:space="preserve"> correct horizon</w:t>
+      </w:r>
+    </w:p>
+    <w:p>
+      <w:pPr>
+        <w:spacing w:after="0" w:line="240" w:lineRule="auto"/>
+        <w:rPr>
+          <w:noProof/>
+          <w:sz w:val="32"/>
+          <w:szCs w:val="32"/>
+        </w:rPr>
+      </w:pPr>
+      <w:r>
+        <w:rPr>
+          <w:rFonts w:ascii="Segoe UI Symbol" w:hAnsi="Segoe UI Symbol" w:cs="Segoe UI Symbol"/>
+          <w:noProof/>
+          <w:sz w:val="32"/>
+          <w:szCs w:val="32"/>
+        </w:rPr>
+        <w:t>✓</w:t>
+      </w:r>
+      <w:r>
+        <w:rPr>
+          <w:noProof/>
+          <w:sz w:val="32"/>
+          <w:szCs w:val="32"/>
+        </w:rPr>
+        <w:t xml:space="preserve"> metadata exists</w:t>
+      </w:r>
+    </w:p>
+    <w:p>
+      <w:pPr>
+        <w:rPr>
+          <w:noProof/>
+          <w:sz w:val="32"/>
+          <w:szCs w:val="32"/>
+        </w:rPr>
+      </w:pPr>
+      <w:r>
+        <w:rPr>
+          <w:noProof/>
+          <w:sz w:val="32"/>
+          <w:szCs w:val="32"/>
+        </w:rPr>
+        <w:br w:type="page"/>
+      </w:r>
+    </w:p>
+    <w:p>
+      <w:pPr>
+        <w:spacing w:after="0" w:line="240" w:lineRule="auto"/>
+        <w:rPr>
+          <w:b/>
+          <w:bCs/>
+          <w:noProof/>
+          <w:sz w:val="32"/>
+          <w:szCs w:val="32"/>
+          <w:lang w:val="tr-TR"/>
+        </w:rPr>
+      </w:pPr>
+      <w:r>
+        <w:rPr>
+          <w:b/>
+          <w:bCs/>
+          <w:noProof/>
+          <w:sz w:val="32"/>
+          <w:szCs w:val="32"/>
+          <w:lang w:val="tr-TR"/>
+        </w:rPr>
+        <w:lastRenderedPageBreak/>
+        <w:t>Sprint 1</w:t>
+      </w:r>
+    </w:p>
+    <w:p>
+      <w:pPr>
+        <w:numPr>
+          <w:ilvl w:val="0"/>
+          <w:numId w:val="3"/>
+        </w:numPr>
+        <w:spacing w:after="0" w:line="240" w:lineRule="auto"/>
+        <w:rPr>
+          <w:noProof/>
+          <w:sz w:val="32"/>
+          <w:szCs w:val="32"/>
+          <w:lang w:val="tr-TR"/>
+        </w:rPr>
+      </w:pPr>
+      <w:r>
+        <w:rPr>
+          <w:noProof/>
+          <w:sz w:val="32"/>
+          <w:szCs w:val="32"/>
+          <w:lang w:val="tr-TR"/>
+        </w:rPr>
+        <w:t xml:space="preserve">Package structure </w:t>
+      </w:r>
+    </w:p>
+    <w:p>
+      <w:pPr>
+        <w:numPr>
+          <w:ilvl w:val="0"/>
+          <w:numId w:val="3"/>
+        </w:numPr>
+        <w:spacing w:after="0" w:line="240" w:lineRule="auto"/>
+        <w:rPr>
+          <w:noProof/>
+          <w:sz w:val="32"/>
+          <w:szCs w:val="32"/>
+          <w:lang w:val="tr-TR"/>
+        </w:rPr>
+      </w:pPr>
+      <w:r>
+        <w:rPr>
+          <w:noProof/>
+          <w:sz w:val="32"/>
+          <w:szCs w:val="32"/>
+          <w:lang w:val="tr-TR"/>
+        </w:rPr>
+        <w:t xml:space="preserve">CI-ready project layout </w:t>
+      </w:r>
+    </w:p>
+    <w:p>
+      <w:pPr>
+        <w:numPr>
+          <w:ilvl w:val="0"/>
+          <w:numId w:val="3"/>
+        </w:numPr>
+        <w:spacing w:after="0" w:line="240" w:lineRule="auto"/>
+        <w:rPr>
+          <w:noProof/>
+          <w:sz w:val="32"/>
+          <w:szCs w:val="32"/>
+          <w:lang w:val="tr-TR"/>
+        </w:rPr>
+      </w:pPr>
+      <w:r>
+        <w:rPr>
+          <w:noProof/>
+          <w:sz w:val="32"/>
+          <w:szCs w:val="32"/>
+          <w:lang w:val="tr-TR"/>
+        </w:rPr>
+        <w:t xml:space="preserve">Base classes </w:t>
+      </w:r>
+    </w:p>
+    <w:p>
+      <w:pPr>
+        <w:spacing w:after="0" w:line="240" w:lineRule="auto"/>
+        <w:rPr>
+          <w:b/>
+          <w:bCs/>
+          <w:noProof/>
+          <w:sz w:val="32"/>
+          <w:szCs w:val="32"/>
+          <w:lang w:val="tr-TR"/>
+        </w:rPr>
+      </w:pPr>
+      <w:r>
+        <w:rPr>
+          <w:b/>
+          <w:bCs/>
+          <w:noProof/>
+          <w:sz w:val="32"/>
+          <w:szCs w:val="32"/>
+          <w:lang w:val="tr-TR"/>
+        </w:rPr>
+        <w:t>Sprint 2</w:t>
+      </w:r>
+    </w:p>
+    <w:p>
+      <w:pPr>
+        <w:numPr>
+          <w:ilvl w:val="0"/>
+          <w:numId w:val="4"/>
+        </w:numPr>
+        <w:spacing w:after="0" w:line="240" w:lineRule="auto"/>
+        <w:rPr>
+          <w:noProof/>
+          <w:sz w:val="32"/>
+          <w:szCs w:val="32"/>
+          <w:lang w:val="tr-TR"/>
+        </w:rPr>
+      </w:pPr>
+      <w:r>
+        <w:rPr>
+          <w:noProof/>
+          <w:sz w:val="32"/>
+          <w:szCs w:val="32"/>
+          <w:lang w:val="tr-TR"/>
+        </w:rPr>
+        <w:t xml:space="preserve">Dataset handling </w:t>
+      </w:r>
+    </w:p>
+    <w:p>
+      <w:pPr>
+        <w:numPr>
+          <w:ilvl w:val="0"/>
+          <w:numId w:val="4"/>
+        </w:numPr>
+        <w:spacing w:after="0" w:line="240" w:lineRule="auto"/>
+        <w:rPr>
+          <w:noProof/>
+          <w:sz w:val="32"/>
+          <w:szCs w:val="32"/>
+          <w:lang w:val="tr-TR"/>
+        </w:rPr>
+      </w:pPr>
+      <w:r>
+        <w:rPr>
+          <w:noProof/>
+          <w:sz w:val="32"/>
+          <w:szCs w:val="32"/>
+          <w:lang w:val="tr-TR"/>
+        </w:rPr>
+        <w:t xml:space="preserve">Validation </w:t>
+      </w:r>
+    </w:p>
+    <w:p>
+      <w:pPr>
+        <w:numPr>
+          <w:ilvl w:val="0"/>
+          <w:numId w:val="4"/>
+        </w:numPr>
+        <w:spacing w:after="0" w:line="240" w:lineRule="auto"/>
+        <w:rPr>
+          <w:noProof/>
+          <w:sz w:val="32"/>
+          <w:szCs w:val="32"/>
+          <w:lang w:val="tr-TR"/>
+        </w:rPr>
+      </w:pPr>
+      <w:r>
+        <w:rPr>
+          <w:noProof/>
+          <w:sz w:val="32"/>
+          <w:szCs w:val="32"/>
+          <w:lang w:val="tr-TR"/>
+        </w:rPr>
+        <w:t xml:space="preserve">Missing-value support </w:t>
+      </w:r>
+    </w:p>
+    <w:p>
+      <w:pPr>
+        <w:numPr>
+          <w:ilvl w:val="0"/>
+          <w:numId w:val="4"/>
+        </w:numPr>
+        <w:spacing w:after="0" w:line="240" w:lineRule="auto"/>
+        <w:rPr>
+          <w:noProof/>
+          <w:sz w:val="32"/>
+          <w:szCs w:val="32"/>
+          <w:lang w:val="tr-TR"/>
+        </w:rPr>
+      </w:pPr>
+      <w:r>
+        <w:rPr>
+          <w:noProof/>
+          <w:sz w:val="32"/>
+          <w:szCs w:val="32"/>
+          <w:lang w:val="tr-TR"/>
+        </w:rPr>
+        <w:t xml:space="preserve">Diagnostics </w:t>
+      </w:r>
+    </w:p>
+    <w:p>
+      <w:pPr>
+        <w:numPr>
+          <w:ilvl w:val="0"/>
+          <w:numId w:val="4"/>
+        </w:numPr>
+        <w:spacing w:after="0" w:line="240" w:lineRule="auto"/>
+        <w:rPr>
+          <w:noProof/>
+          <w:sz w:val="32"/>
+          <w:szCs w:val="32"/>
+          <w:lang w:val="tr-TR"/>
+        </w:rPr>
+      </w:pPr>
+      <w:r>
+        <w:rPr>
+          <w:noProof/>
+          <w:sz w:val="32"/>
+          <w:szCs w:val="32"/>
+          <w:lang w:val="tr-TR"/>
+        </w:rPr>
+        <w:t xml:space="preserve">Reporting </w:t>
+      </w:r>
+    </w:p>
+    <w:p>
+      <w:pPr>
+        <w:spacing w:after="0" w:line="240" w:lineRule="auto"/>
+        <w:rPr>
+          <w:b/>
+          <w:bCs/>
+          <w:noProof/>
+          <w:sz w:val="32"/>
+          <w:szCs w:val="32"/>
+          <w:lang w:val="tr-TR"/>
+        </w:rPr>
+      </w:pPr>
+      <w:r>
+        <w:rPr>
+          <w:b/>
+          <w:bCs/>
+          <w:noProof/>
+          <w:sz w:val="32"/>
+          <w:szCs w:val="32"/>
+          <w:lang w:val="tr-TR"/>
+        </w:rPr>
+        <w:t>Sprint 3</w:t>
+      </w:r>
+    </w:p>
+    <w:p>
+      <w:pPr>
+        <w:numPr>
+          <w:ilvl w:val="0"/>
+          <w:numId w:val="5"/>
+        </w:numPr>
+        <w:spacing w:after="0" w:line="240" w:lineRule="auto"/>
+        <w:rPr>
+          <w:noProof/>
+          <w:sz w:val="32"/>
+          <w:szCs w:val="32"/>
+          <w:lang w:val="tr-TR"/>
+        </w:rPr>
+      </w:pPr>
+      <w:r>
+        <w:rPr>
+          <w:noProof/>
+          <w:sz w:val="32"/>
+          <w:szCs w:val="32"/>
+          <w:lang w:val="tr-TR"/>
+        </w:rPr>
+        <w:t xml:space="preserve">Resampling </w:t>
+      </w:r>
+    </w:p>
+    <w:p>
+      <w:pPr>
+        <w:numPr>
+          <w:ilvl w:val="0"/>
+          <w:numId w:val="5"/>
+        </w:numPr>
+        <w:spacing w:after="0" w:line="240" w:lineRule="auto"/>
+        <w:rPr>
+          <w:noProof/>
+          <w:sz w:val="32"/>
+          <w:szCs w:val="32"/>
+          <w:lang w:val="tr-TR"/>
+        </w:rPr>
+      </w:pPr>
+      <w:r>
+        <w:rPr>
+          <w:noProof/>
+          <w:sz w:val="32"/>
+          <w:szCs w:val="32"/>
+          <w:lang w:val="tr-TR"/>
+        </w:rPr>
+        <w:t xml:space="preserve">Statistics </w:t>
+      </w:r>
+    </w:p>
+    <w:p>
+      <w:pPr>
+        <w:numPr>
+          <w:ilvl w:val="0"/>
+          <w:numId w:val="5"/>
+        </w:numPr>
+        <w:spacing w:after="0" w:line="240" w:lineRule="auto"/>
+        <w:rPr>
+          <w:noProof/>
+          <w:sz w:val="32"/>
+          <w:szCs w:val="32"/>
+          <w:lang w:val="tr-TR"/>
+        </w:rPr>
+      </w:pPr>
+      <w:r>
+        <w:rPr>
+          <w:noProof/>
+          <w:sz w:val="32"/>
+          <w:szCs w:val="32"/>
+          <w:lang w:val="tr-TR"/>
+        </w:rPr>
+        <w:t xml:space="preserve">Feature engineering </w:t>
+      </w:r>
+    </w:p>
+    <w:p>
+      <w:pPr>
+        <w:numPr>
+          <w:ilvl w:val="0"/>
+          <w:numId w:val="5"/>
+        </w:numPr>
+        <w:spacing w:after="0" w:line="240" w:lineRule="auto"/>
+        <w:rPr>
+          <w:noProof/>
+          <w:sz w:val="32"/>
+          <w:szCs w:val="32"/>
+          <w:lang w:val="tr-TR"/>
+        </w:rPr>
+      </w:pPr>
+      <w:r>
+        <w:rPr>
+          <w:noProof/>
+          <w:sz w:val="32"/>
+          <w:szCs w:val="32"/>
+          <w:lang w:val="tr-TR"/>
+        </w:rPr>
+        <w:t xml:space="preserve">Visualization </w:t>
+      </w:r>
+    </w:p>
+    <w:p>
+      <w:pPr>
+        <w:numPr>
+          <w:ilvl w:val="0"/>
+          <w:numId w:val="5"/>
+        </w:numPr>
+        <w:spacing w:after="0" w:line="240" w:lineRule="auto"/>
+        <w:rPr>
+          <w:noProof/>
+          <w:sz w:val="32"/>
+          <w:szCs w:val="32"/>
+          <w:lang w:val="tr-TR"/>
+        </w:rPr>
+      </w:pPr>
+      <w:r>
+        <w:rPr>
+          <w:noProof/>
+          <w:sz w:val="32"/>
+          <w:szCs w:val="32"/>
+          <w:lang w:val="tr-TR"/>
+        </w:rPr>
+        <w:t xml:space="preserve">Rolling windows </w:t>
+      </w:r>
+    </w:p>
+    <w:p>
+      <w:pPr>
+        <w:spacing w:after="0" w:line="240" w:lineRule="auto"/>
+        <w:rPr>
+          <w:b/>
+          <w:bCs/>
+          <w:noProof/>
+          <w:sz w:val="32"/>
+          <w:szCs w:val="32"/>
+          <w:lang w:val="tr-TR"/>
+        </w:rPr>
+      </w:pPr>
+      <w:r>
+        <w:rPr>
+          <w:b/>
+          <w:bCs/>
+          <w:noProof/>
+          <w:sz w:val="32"/>
+          <w:szCs w:val="32"/>
+          <w:lang w:val="tr-TR"/>
+        </w:rPr>
+        <w:t>Sprint 4 (so far)</w:t>
+      </w:r>
+    </w:p>
+    <w:p>
+      <w:pPr>
+        <w:numPr>
+          <w:ilvl w:val="0"/>
+          <w:numId w:val="6"/>
+        </w:numPr>
+        <w:spacing w:after="0" w:line="240" w:lineRule="auto"/>
+        <w:rPr>
+          <w:noProof/>
+          <w:sz w:val="32"/>
+          <w:szCs w:val="32"/>
+          <w:lang w:val="tr-TR"/>
+        </w:rPr>
+      </w:pPr>
+      <w:r>
+        <w:rPr>
+          <w:noProof/>
+          <w:sz w:val="32"/>
+          <w:szCs w:val="32"/>
+          <w:lang w:val="tr-TR"/>
+        </w:rPr>
+        <w:t xml:space="preserve">Smart Loader </w:t>
+      </w:r>
+    </w:p>
+    <w:p>
+      <w:pPr>
+        <w:numPr>
+          <w:ilvl w:val="0"/>
+          <w:numId w:val="6"/>
+        </w:numPr>
+        <w:spacing w:after="0" w:line="240" w:lineRule="auto"/>
+        <w:rPr>
+          <w:noProof/>
+          <w:sz w:val="32"/>
+          <w:szCs w:val="32"/>
+          <w:lang w:val="tr-TR"/>
+        </w:rPr>
+      </w:pPr>
+      <w:r>
+        <w:rPr>
+          <w:noProof/>
+          <w:sz w:val="32"/>
+          <w:szCs w:val="32"/>
+          <w:lang w:val="tr-TR"/>
+        </w:rPr>
+        <w:t xml:space="preserve">ForecastPipeline </w:t>
+      </w:r>
+    </w:p>
+    <w:p>
+      <w:pPr>
+        <w:numPr>
+          <w:ilvl w:val="0"/>
+          <w:numId w:val="6"/>
+        </w:numPr>
+        <w:spacing w:after="0" w:line="240" w:lineRule="auto"/>
+        <w:rPr>
+          <w:noProof/>
+          <w:sz w:val="32"/>
+          <w:szCs w:val="32"/>
+          <w:lang w:val="tr-TR"/>
+        </w:rPr>
+      </w:pPr>
+      <w:r>
+        <w:rPr>
+          <w:noProof/>
+          <w:sz w:val="32"/>
+          <w:szCs w:val="32"/>
+          <w:lang w:val="tr-TR"/>
+        </w:rPr>
+        <w:t xml:space="preserve">ForecastResult </w:t>
+      </w:r>
+    </w:p>
+    <w:p>
+      <w:pPr>
+        <w:numPr>
+          <w:ilvl w:val="0"/>
+          <w:numId w:val="6"/>
+        </w:numPr>
+        <w:spacing w:after="0" w:line="240" w:lineRule="auto"/>
+        <w:rPr>
+          <w:noProof/>
+          <w:sz w:val="32"/>
+          <w:szCs w:val="32"/>
+          <w:lang w:val="tr-TR"/>
+        </w:rPr>
+      </w:pPr>
+      <w:r>
+        <w:rPr>
+          <w:b/>
+          <w:bCs/>
+          <w:noProof/>
+          <w:sz w:val="32"/>
+          <w:szCs w:val="32"/>
+          <w:lang w:val="tr-TR"/>
+        </w:rPr>
+        <w:t>ARIMA forecasting model</w:t>
+      </w:r>
+      <w:r>
+        <w:rPr>
+          <w:noProof/>
+          <w:sz w:val="32"/>
+          <w:szCs w:val="32"/>
+          <w:lang w:val="tr-TR"/>
+        </w:rPr>
+        <w:t xml:space="preserve"> </w:t>
+      </w:r>
+      <w:r>
+        <w:rPr>
+          <w:rFonts w:ascii="Segoe UI Symbol" w:hAnsi="Segoe UI Symbol" w:cs="Segoe UI Symbol"/>
+          <w:noProof/>
+          <w:sz w:val="32"/>
+          <w:szCs w:val="32"/>
+          <w:lang w:val="tr-TR"/>
+        </w:rPr>
+        <w:t>✔</w:t>
+      </w:r>
     </w:p>
     <w:p>
       <w:pPr>
@@ -7988,11 +8668,619 @@
       </w:pPr>
     </w:lvl>
   </w:abstractNum>
+  <w:abstractNum w:abstractNumId="2" w15:restartNumberingAfterBreak="0">
+    <w:nsid w:val="36354E43"/>
+    <w:multiLevelType w:val="multilevel"/>
+    <w:tmpl w:val="3AF2AC0C"/>
+    <w:lvl w:ilvl="0">
+      <w:start w:val="1"/>
+      <w:numFmt w:val="bullet"/>
+      <w:lvlText w:val=""/>
+      <w:lvlJc w:val="left"/>
+      <w:pPr>
+        <w:tabs>
+          <w:tab w:val="num" w:pos="720"/>
+        </w:tabs>
+        <w:ind w:left="720" w:hanging="360"/>
+      </w:pPr>
+      <w:rPr>
+        <w:rFonts w:ascii="Symbol" w:hAnsi="Symbol" w:hint="default"/>
+        <w:sz w:val="20"/>
+      </w:rPr>
+    </w:lvl>
+    <w:lvl w:ilvl="1" w:tentative="1">
+      <w:start w:val="1"/>
+      <w:numFmt w:val="bullet"/>
+      <w:lvlText w:val="o"/>
+      <w:lvlJc w:val="left"/>
+      <w:pPr>
+        <w:tabs>
+          <w:tab w:val="num" w:pos="1440"/>
+        </w:tabs>
+        <w:ind w:left="1440" w:hanging="360"/>
+      </w:pPr>
+      <w:rPr>
+        <w:rFonts w:ascii="Courier New" w:hAnsi="Courier New" w:hint="default"/>
+        <w:sz w:val="20"/>
+      </w:rPr>
+    </w:lvl>
+    <w:lvl w:ilvl="2" w:tentative="1">
+      <w:start w:val="1"/>
+      <w:numFmt w:val="bullet"/>
+      <w:lvlText w:val=""/>
+      <w:lvlJc w:val="left"/>
+      <w:pPr>
+        <w:tabs>
+          <w:tab w:val="num" w:pos="2160"/>
+        </w:tabs>
+        <w:ind w:left="2160" w:hanging="360"/>
+      </w:pPr>
+      <w:rPr>
+        <w:rFonts w:ascii="Wingdings" w:hAnsi="Wingdings" w:hint="default"/>
+        <w:sz w:val="20"/>
+      </w:rPr>
+    </w:lvl>
+    <w:lvl w:ilvl="3" w:tentative="1">
+      <w:start w:val="1"/>
+      <w:numFmt w:val="bullet"/>
+      <w:lvlText w:val=""/>
+      <w:lvlJc w:val="left"/>
+      <w:pPr>
+        <w:tabs>
+          <w:tab w:val="num" w:pos="2880"/>
+        </w:tabs>
+        <w:ind w:left="2880" w:hanging="360"/>
+      </w:pPr>
+      <w:rPr>
+        <w:rFonts w:ascii="Wingdings" w:hAnsi="Wingdings" w:hint="default"/>
+        <w:sz w:val="20"/>
+      </w:rPr>
+    </w:lvl>
+    <w:lvl w:ilvl="4" w:tentative="1">
+      <w:start w:val="1"/>
+      <w:numFmt w:val="bullet"/>
+      <w:lvlText w:val=""/>
+      <w:lvlJc w:val="left"/>
+      <w:pPr>
+        <w:tabs>
+          <w:tab w:val="num" w:pos="3600"/>
+        </w:tabs>
+        <w:ind w:left="3600" w:hanging="360"/>
+      </w:pPr>
+      <w:rPr>
+        <w:rFonts w:ascii="Wingdings" w:hAnsi="Wingdings" w:hint="default"/>
+        <w:sz w:val="20"/>
+      </w:rPr>
+    </w:lvl>
+    <w:lvl w:ilvl="5" w:tentative="1">
+      <w:start w:val="1"/>
+      <w:numFmt w:val="bullet"/>
+      <w:lvlText w:val=""/>
+      <w:lvlJc w:val="left"/>
+      <w:pPr>
+        <w:tabs>
+          <w:tab w:val="num" w:pos="4320"/>
+        </w:tabs>
+        <w:ind w:left="4320" w:hanging="360"/>
+      </w:pPr>
+      <w:rPr>
+        <w:rFonts w:ascii="Wingdings" w:hAnsi="Wingdings" w:hint="default"/>
+        <w:sz w:val="20"/>
+      </w:rPr>
+    </w:lvl>
+    <w:lvl w:ilvl="6" w:tentative="1">
+      <w:start w:val="1"/>
+      <w:numFmt w:val="bullet"/>
+      <w:lvlText w:val=""/>
+      <w:lvlJc w:val="left"/>
+      <w:pPr>
+        <w:tabs>
+          <w:tab w:val="num" w:pos="5040"/>
+        </w:tabs>
+        <w:ind w:left="5040" w:hanging="360"/>
+      </w:pPr>
+      <w:rPr>
+        <w:rFonts w:ascii="Wingdings" w:hAnsi="Wingdings" w:hint="default"/>
+        <w:sz w:val="20"/>
+      </w:rPr>
+    </w:lvl>
+    <w:lvl w:ilvl="7" w:tentative="1">
+      <w:start w:val="1"/>
+      <w:numFmt w:val="bullet"/>
+      <w:lvlText w:val=""/>
+      <w:lvlJc w:val="left"/>
+      <w:pPr>
+        <w:tabs>
+          <w:tab w:val="num" w:pos="5760"/>
+        </w:tabs>
+        <w:ind w:left="5760" w:hanging="360"/>
+      </w:pPr>
+      <w:rPr>
+        <w:rFonts w:ascii="Wingdings" w:hAnsi="Wingdings" w:hint="default"/>
+        <w:sz w:val="20"/>
+      </w:rPr>
+    </w:lvl>
+    <w:lvl w:ilvl="8" w:tentative="1">
+      <w:start w:val="1"/>
+      <w:numFmt w:val="bullet"/>
+      <w:lvlText w:val=""/>
+      <w:lvlJc w:val="left"/>
+      <w:pPr>
+        <w:tabs>
+          <w:tab w:val="num" w:pos="6480"/>
+        </w:tabs>
+        <w:ind w:left="6480" w:hanging="360"/>
+      </w:pPr>
+      <w:rPr>
+        <w:rFonts w:ascii="Wingdings" w:hAnsi="Wingdings" w:hint="default"/>
+        <w:sz w:val="20"/>
+      </w:rPr>
+    </w:lvl>
+  </w:abstractNum>
+  <w:abstractNum w:abstractNumId="3" w15:restartNumberingAfterBreak="0">
+    <w:nsid w:val="44D72C93"/>
+    <w:multiLevelType w:val="multilevel"/>
+    <w:tmpl w:val="64604668"/>
+    <w:lvl w:ilvl="0">
+      <w:start w:val="1"/>
+      <w:numFmt w:val="bullet"/>
+      <w:lvlText w:val=""/>
+      <w:lvlJc w:val="left"/>
+      <w:pPr>
+        <w:tabs>
+          <w:tab w:val="num" w:pos="720"/>
+        </w:tabs>
+        <w:ind w:left="720" w:hanging="360"/>
+      </w:pPr>
+      <w:rPr>
+        <w:rFonts w:ascii="Symbol" w:hAnsi="Symbol" w:hint="default"/>
+        <w:sz w:val="20"/>
+      </w:rPr>
+    </w:lvl>
+    <w:lvl w:ilvl="1" w:tentative="1">
+      <w:start w:val="1"/>
+      <w:numFmt w:val="bullet"/>
+      <w:lvlText w:val="o"/>
+      <w:lvlJc w:val="left"/>
+      <w:pPr>
+        <w:tabs>
+          <w:tab w:val="num" w:pos="1440"/>
+        </w:tabs>
+        <w:ind w:left="1440" w:hanging="360"/>
+      </w:pPr>
+      <w:rPr>
+        <w:rFonts w:ascii="Courier New" w:hAnsi="Courier New" w:hint="default"/>
+        <w:sz w:val="20"/>
+      </w:rPr>
+    </w:lvl>
+    <w:lvl w:ilvl="2" w:tentative="1">
+      <w:start w:val="1"/>
+      <w:numFmt w:val="bullet"/>
+      <w:lvlText w:val=""/>
+      <w:lvlJc w:val="left"/>
+      <w:pPr>
+        <w:tabs>
+          <w:tab w:val="num" w:pos="2160"/>
+        </w:tabs>
+        <w:ind w:left="2160" w:hanging="360"/>
+      </w:pPr>
+      <w:rPr>
+        <w:rFonts w:ascii="Wingdings" w:hAnsi="Wingdings" w:hint="default"/>
+        <w:sz w:val="20"/>
+      </w:rPr>
+    </w:lvl>
+    <w:lvl w:ilvl="3" w:tentative="1">
+      <w:start w:val="1"/>
+      <w:numFmt w:val="bullet"/>
+      <w:lvlText w:val=""/>
+      <w:lvlJc w:val="left"/>
+      <w:pPr>
+        <w:tabs>
+          <w:tab w:val="num" w:pos="2880"/>
+        </w:tabs>
+        <w:ind w:left="2880" w:hanging="360"/>
+      </w:pPr>
+      <w:rPr>
+        <w:rFonts w:ascii="Wingdings" w:hAnsi="Wingdings" w:hint="default"/>
+        <w:sz w:val="20"/>
+      </w:rPr>
+    </w:lvl>
+    <w:lvl w:ilvl="4" w:tentative="1">
+      <w:start w:val="1"/>
+      <w:numFmt w:val="bullet"/>
+      <w:lvlText w:val=""/>
+      <w:lvlJc w:val="left"/>
+      <w:pPr>
+        <w:tabs>
+          <w:tab w:val="num" w:pos="3600"/>
+        </w:tabs>
+        <w:ind w:left="3600" w:hanging="360"/>
+      </w:pPr>
+      <w:rPr>
+        <w:rFonts w:ascii="Wingdings" w:hAnsi="Wingdings" w:hint="default"/>
+        <w:sz w:val="20"/>
+      </w:rPr>
+    </w:lvl>
+    <w:lvl w:ilvl="5" w:tentative="1">
+      <w:start w:val="1"/>
+      <w:numFmt w:val="bullet"/>
+      <w:lvlText w:val=""/>
+      <w:lvlJc w:val="left"/>
+      <w:pPr>
+        <w:tabs>
+          <w:tab w:val="num" w:pos="4320"/>
+        </w:tabs>
+        <w:ind w:left="4320" w:hanging="360"/>
+      </w:pPr>
+      <w:rPr>
+        <w:rFonts w:ascii="Wingdings" w:hAnsi="Wingdings" w:hint="default"/>
+        <w:sz w:val="20"/>
+      </w:rPr>
+    </w:lvl>
+    <w:lvl w:ilvl="6" w:tentative="1">
+      <w:start w:val="1"/>
+      <w:numFmt w:val="bullet"/>
+      <w:lvlText w:val=""/>
+      <w:lvlJc w:val="left"/>
+      <w:pPr>
+        <w:tabs>
+          <w:tab w:val="num" w:pos="5040"/>
+        </w:tabs>
+        <w:ind w:left="5040" w:hanging="360"/>
+      </w:pPr>
+      <w:rPr>
+        <w:rFonts w:ascii="Wingdings" w:hAnsi="Wingdings" w:hint="default"/>
+        <w:sz w:val="20"/>
+      </w:rPr>
+    </w:lvl>
+    <w:lvl w:ilvl="7" w:tentative="1">
+      <w:start w:val="1"/>
+      <w:numFmt w:val="bullet"/>
+      <w:lvlText w:val=""/>
+      <w:lvlJc w:val="left"/>
+      <w:pPr>
+        <w:tabs>
+          <w:tab w:val="num" w:pos="5760"/>
+        </w:tabs>
+        <w:ind w:left="5760" w:hanging="360"/>
+      </w:pPr>
+      <w:rPr>
+        <w:rFonts w:ascii="Wingdings" w:hAnsi="Wingdings" w:hint="default"/>
+        <w:sz w:val="20"/>
+      </w:rPr>
+    </w:lvl>
+    <w:lvl w:ilvl="8" w:tentative="1">
+      <w:start w:val="1"/>
+      <w:numFmt w:val="bullet"/>
+      <w:lvlText w:val=""/>
+      <w:lvlJc w:val="left"/>
+      <w:pPr>
+        <w:tabs>
+          <w:tab w:val="num" w:pos="6480"/>
+        </w:tabs>
+        <w:ind w:left="6480" w:hanging="360"/>
+      </w:pPr>
+      <w:rPr>
+        <w:rFonts w:ascii="Wingdings" w:hAnsi="Wingdings" w:hint="default"/>
+        <w:sz w:val="20"/>
+      </w:rPr>
+    </w:lvl>
+  </w:abstractNum>
+  <w:abstractNum w:abstractNumId="4" w15:restartNumberingAfterBreak="0">
+    <w:nsid w:val="63050202"/>
+    <w:multiLevelType w:val="multilevel"/>
+    <w:tmpl w:val="8D1E2ABC"/>
+    <w:lvl w:ilvl="0">
+      <w:start w:val="1"/>
+      <w:numFmt w:val="bullet"/>
+      <w:lvlText w:val=""/>
+      <w:lvlJc w:val="left"/>
+      <w:pPr>
+        <w:tabs>
+          <w:tab w:val="num" w:pos="720"/>
+        </w:tabs>
+        <w:ind w:left="720" w:hanging="360"/>
+      </w:pPr>
+      <w:rPr>
+        <w:rFonts w:ascii="Symbol" w:hAnsi="Symbol" w:hint="default"/>
+        <w:sz w:val="20"/>
+      </w:rPr>
+    </w:lvl>
+    <w:lvl w:ilvl="1" w:tentative="1">
+      <w:start w:val="1"/>
+      <w:numFmt w:val="bullet"/>
+      <w:lvlText w:val="o"/>
+      <w:lvlJc w:val="left"/>
+      <w:pPr>
+        <w:tabs>
+          <w:tab w:val="num" w:pos="1440"/>
+        </w:tabs>
+        <w:ind w:left="1440" w:hanging="360"/>
+      </w:pPr>
+      <w:rPr>
+        <w:rFonts w:ascii="Courier New" w:hAnsi="Courier New" w:hint="default"/>
+        <w:sz w:val="20"/>
+      </w:rPr>
+    </w:lvl>
+    <w:lvl w:ilvl="2" w:tentative="1">
+      <w:start w:val="1"/>
+      <w:numFmt w:val="bullet"/>
+      <w:lvlText w:val=""/>
+      <w:lvlJc w:val="left"/>
+      <w:pPr>
+        <w:tabs>
+          <w:tab w:val="num" w:pos="2160"/>
+        </w:tabs>
+        <w:ind w:left="2160" w:hanging="360"/>
+      </w:pPr>
+      <w:rPr>
+        <w:rFonts w:ascii="Wingdings" w:hAnsi="Wingdings" w:hint="default"/>
+        <w:sz w:val="20"/>
+      </w:rPr>
+    </w:lvl>
+    <w:lvl w:ilvl="3" w:tentative="1">
+      <w:start w:val="1"/>
+      <w:numFmt w:val="bullet"/>
+      <w:lvlText w:val=""/>
+      <w:lvlJc w:val="left"/>
+      <w:pPr>
+        <w:tabs>
+          <w:tab w:val="num" w:pos="2880"/>
+        </w:tabs>
+        <w:ind w:left="2880" w:hanging="360"/>
+      </w:pPr>
+      <w:rPr>
+        <w:rFonts w:ascii="Wingdings" w:hAnsi="Wingdings" w:hint="default"/>
+        <w:sz w:val="20"/>
+      </w:rPr>
+    </w:lvl>
+    <w:lvl w:ilvl="4" w:tentative="1">
+      <w:start w:val="1"/>
+      <w:numFmt w:val="bullet"/>
+      <w:lvlText w:val=""/>
+      <w:lvlJc w:val="left"/>
+      <w:pPr>
+        <w:tabs>
+          <w:tab w:val="num" w:pos="3600"/>
+        </w:tabs>
+        <w:ind w:left="3600" w:hanging="360"/>
+      </w:pPr>
+      <w:rPr>
+        <w:rFonts w:ascii="Wingdings" w:hAnsi="Wingdings" w:hint="default"/>
+        <w:sz w:val="20"/>
+      </w:rPr>
+    </w:lvl>
+    <w:lvl w:ilvl="5" w:tentative="1">
+      <w:start w:val="1"/>
+      <w:numFmt w:val="bullet"/>
+      <w:lvlText w:val=""/>
+      <w:lvlJc w:val="left"/>
+      <w:pPr>
+        <w:tabs>
+          <w:tab w:val="num" w:pos="4320"/>
+        </w:tabs>
+        <w:ind w:left="4320" w:hanging="360"/>
+      </w:pPr>
+      <w:rPr>
+        <w:rFonts w:ascii="Wingdings" w:hAnsi="Wingdings" w:hint="default"/>
+        <w:sz w:val="20"/>
+      </w:rPr>
+    </w:lvl>
+    <w:lvl w:ilvl="6" w:tentative="1">
+      <w:start w:val="1"/>
+      <w:numFmt w:val="bullet"/>
+      <w:lvlText w:val=""/>
+      <w:lvlJc w:val="left"/>
+      <w:pPr>
+        <w:tabs>
+          <w:tab w:val="num" w:pos="5040"/>
+        </w:tabs>
+        <w:ind w:left="5040" w:hanging="360"/>
+      </w:pPr>
+      <w:rPr>
+        <w:rFonts w:ascii="Wingdings" w:hAnsi="Wingdings" w:hint="default"/>
+        <w:sz w:val="20"/>
+      </w:rPr>
+    </w:lvl>
+    <w:lvl w:ilvl="7" w:tentative="1">
+      <w:start w:val="1"/>
+      <w:numFmt w:val="bullet"/>
+      <w:lvlText w:val=""/>
+      <w:lvlJc w:val="left"/>
+      <w:pPr>
+        <w:tabs>
+          <w:tab w:val="num" w:pos="5760"/>
+        </w:tabs>
+        <w:ind w:left="5760" w:hanging="360"/>
+      </w:pPr>
+      <w:rPr>
+        <w:rFonts w:ascii="Wingdings" w:hAnsi="Wingdings" w:hint="default"/>
+        <w:sz w:val="20"/>
+      </w:rPr>
+    </w:lvl>
+    <w:lvl w:ilvl="8" w:tentative="1">
+      <w:start w:val="1"/>
+      <w:numFmt w:val="bullet"/>
+      <w:lvlText w:val=""/>
+      <w:lvlJc w:val="left"/>
+      <w:pPr>
+        <w:tabs>
+          <w:tab w:val="num" w:pos="6480"/>
+        </w:tabs>
+        <w:ind w:left="6480" w:hanging="360"/>
+      </w:pPr>
+      <w:rPr>
+        <w:rFonts w:ascii="Wingdings" w:hAnsi="Wingdings" w:hint="default"/>
+        <w:sz w:val="20"/>
+      </w:rPr>
+    </w:lvl>
+  </w:abstractNum>
+  <w:abstractNum w:abstractNumId="5" w15:restartNumberingAfterBreak="0">
+    <w:nsid w:val="6B0579E7"/>
+    <w:multiLevelType w:val="multilevel"/>
+    <w:tmpl w:val="A8DA2166"/>
+    <w:lvl w:ilvl="0">
+      <w:start w:val="1"/>
+      <w:numFmt w:val="bullet"/>
+      <w:lvlText w:val=""/>
+      <w:lvlJc w:val="left"/>
+      <w:pPr>
+        <w:tabs>
+          <w:tab w:val="num" w:pos="720"/>
+        </w:tabs>
+        <w:ind w:left="720" w:hanging="360"/>
+      </w:pPr>
+      <w:rPr>
+        <w:rFonts w:ascii="Symbol" w:hAnsi="Symbol" w:hint="default"/>
+        <w:sz w:val="20"/>
+      </w:rPr>
+    </w:lvl>
+    <w:lvl w:ilvl="1" w:tentative="1">
+      <w:start w:val="1"/>
+      <w:numFmt w:val="bullet"/>
+      <w:lvlText w:val="o"/>
+      <w:lvlJc w:val="left"/>
+      <w:pPr>
+        <w:tabs>
+          <w:tab w:val="num" w:pos="1440"/>
+        </w:tabs>
+        <w:ind w:left="1440" w:hanging="360"/>
+      </w:pPr>
+      <w:rPr>
+        <w:rFonts w:ascii="Courier New" w:hAnsi="Courier New" w:hint="default"/>
+        <w:sz w:val="20"/>
+      </w:rPr>
+    </w:lvl>
+    <w:lvl w:ilvl="2" w:tentative="1">
+      <w:start w:val="1"/>
+      <w:numFmt w:val="bullet"/>
+      <w:lvlText w:val=""/>
+      <w:lvlJc w:val="left"/>
+      <w:pPr>
+        <w:tabs>
+          <w:tab w:val="num" w:pos="2160"/>
+        </w:tabs>
+        <w:ind w:left="2160" w:hanging="360"/>
+      </w:pPr>
+      <w:rPr>
+        <w:rFonts w:ascii="Wingdings" w:hAnsi="Wingdings" w:hint="default"/>
+        <w:sz w:val="20"/>
+      </w:rPr>
+    </w:lvl>
+    <w:lvl w:ilvl="3" w:tentative="1">
+      <w:start w:val="1"/>
+      <w:numFmt w:val="bullet"/>
+      <w:lvlText w:val=""/>
+      <w:lvlJc w:val="left"/>
+      <w:pPr>
+        <w:tabs>
+          <w:tab w:val="num" w:pos="2880"/>
+        </w:tabs>
+        <w:ind w:left="2880" w:hanging="360"/>
+      </w:pPr>
+      <w:rPr>
+        <w:rFonts w:ascii="Wingdings" w:hAnsi="Wingdings" w:hint="default"/>
+        <w:sz w:val="20"/>
+      </w:rPr>
+    </w:lvl>
+    <w:lvl w:ilvl="4" w:tentative="1">
+      <w:start w:val="1"/>
+      <w:numFmt w:val="bullet"/>
+      <w:lvlText w:val=""/>
+      <w:lvlJc w:val="left"/>
+      <w:pPr>
+        <w:tabs>
+          <w:tab w:val="num" w:pos="3600"/>
+        </w:tabs>
+        <w:ind w:left="3600" w:hanging="360"/>
+      </w:pPr>
+      <w:rPr>
+        <w:rFonts w:ascii="Wingdings" w:hAnsi="Wingdings" w:hint="default"/>
+        <w:sz w:val="20"/>
+      </w:rPr>
+    </w:lvl>
+    <w:lvl w:ilvl="5" w:tentative="1">
+      <w:start w:val="1"/>
+      <w:numFmt w:val="bullet"/>
+      <w:lvlText w:val=""/>
+      <w:lvlJc w:val="left"/>
+      <w:pPr>
+        <w:tabs>
+          <w:tab w:val="num" w:pos="4320"/>
+        </w:tabs>
+        <w:ind w:left="4320" w:hanging="360"/>
+      </w:pPr>
+      <w:rPr>
+        <w:rFonts w:ascii="Wingdings" w:hAnsi="Wingdings" w:hint="default"/>
+        <w:sz w:val="20"/>
+      </w:rPr>
+    </w:lvl>
+    <w:lvl w:ilvl="6" w:tentative="1">
+      <w:start w:val="1"/>
+      <w:numFmt w:val="bullet"/>
+      <w:lvlText w:val=""/>
+      <w:lvlJc w:val="left"/>
+      <w:pPr>
+        <w:tabs>
+          <w:tab w:val="num" w:pos="5040"/>
+        </w:tabs>
+        <w:ind w:left="5040" w:hanging="360"/>
+      </w:pPr>
+      <w:rPr>
+        <w:rFonts w:ascii="Wingdings" w:hAnsi="Wingdings" w:hint="default"/>
+        <w:sz w:val="20"/>
+      </w:rPr>
+    </w:lvl>
+    <w:lvl w:ilvl="7" w:tentative="1">
+      <w:start w:val="1"/>
+      <w:numFmt w:val="bullet"/>
+      <w:lvlText w:val=""/>
+      <w:lvlJc w:val="left"/>
+      <w:pPr>
+        <w:tabs>
+          <w:tab w:val="num" w:pos="5760"/>
+        </w:tabs>
+        <w:ind w:left="5760" w:hanging="360"/>
+      </w:pPr>
+      <w:rPr>
+        <w:rFonts w:ascii="Wingdings" w:hAnsi="Wingdings" w:hint="default"/>
+        <w:sz w:val="20"/>
+      </w:rPr>
+    </w:lvl>
+    <w:lvl w:ilvl="8" w:tentative="1">
+      <w:start w:val="1"/>
+      <w:numFmt w:val="bullet"/>
+      <w:lvlText w:val=""/>
+      <w:lvlJc w:val="left"/>
+      <w:pPr>
+        <w:tabs>
+          <w:tab w:val="num" w:pos="6480"/>
+        </w:tabs>
+        <w:ind w:left="6480" w:hanging="360"/>
+      </w:pPr>
+      <w:rPr>
+        <w:rFonts w:ascii="Wingdings" w:hAnsi="Wingdings" w:hint="default"/>
+        <w:sz w:val="20"/>
+      </w:rPr>
+    </w:lvl>
+  </w:abstractNum>
   <w:num w:numId="1" w16cid:durableId="320813693">
     <w:abstractNumId w:val="0"/>
   </w:num>
   <w:num w:numId="2" w16cid:durableId="680281116">
     <w:abstractNumId w:val="1"/>
+  </w:num>
+  <w:num w:numId="3" w16cid:durableId="1288438365">
+    <w:abstractNumId w:val="3"/>
+  </w:num>
+  <w:num w:numId="4" w16cid:durableId="1155562159">
+    <w:abstractNumId w:val="5"/>
+  </w:num>
+  <w:num w:numId="5" w16cid:durableId="1958020517">
+    <w:abstractNumId w:val="4"/>
+  </w:num>
+  <w:num w:numId="6" w16cid:durableId="1596940668">
+    <w:abstractNumId w:val="2"/>
   </w:num>
 </w:numbering>
 </file>
@@ -8601,7 +9889,6 @@
   <w:style w:type="character" w:default="1" w:styleId="VarsaylanParagrafYazTipi">
     <w:name w:val="Default Paragraph Font"/>
     <w:uiPriority w:val="1"/>
-    <w:semiHidden/>
     <w:unhideWhenUsed/>
   </w:style>
   <w:style w:type="table" w:default="1" w:styleId="NormalTablo">

</xml_diff>

<commit_message>
Add ForecastPlot visualization engine
</commit_message>
<xml_diff>
--- a/docs/development_flow.docx
+++ b/docs/development_flow.docx
@@ -8407,6 +8407,1841 @@
         </w:rPr>
         <w:t>✔</w:t>
       </w:r>
+    </w:p>
+    <w:p>
+      <w:pPr>
+        <w:spacing w:after="0" w:line="240" w:lineRule="auto"/>
+        <w:rPr>
+          <w:noProof/>
+          <w:sz w:val="32"/>
+          <w:szCs w:val="32"/>
+        </w:rPr>
+      </w:pPr>
+    </w:p>
+    <w:p>
+      <w:pPr>
+        <w:spacing w:after="0" w:line="240" w:lineRule="auto"/>
+        <w:rPr>
+          <w:b/>
+          <w:bCs/>
+          <w:noProof/>
+          <w:sz w:val="32"/>
+          <w:szCs w:val="32"/>
+          <w:lang w:val="tr-TR"/>
+        </w:rPr>
+      </w:pPr>
+      <w:r>
+        <w:rPr>
+          <w:b/>
+          <w:bCs/>
+          <w:noProof/>
+          <w:sz w:val="32"/>
+          <w:szCs w:val="32"/>
+          <w:lang w:val="tr-TR"/>
+        </w:rPr>
+        <w:t xml:space="preserve">Sprint </w:t>
+      </w:r>
+      <w:r>
+        <w:rPr>
+          <w:b/>
+          <w:bCs/>
+          <w:noProof/>
+          <w:sz w:val="32"/>
+          <w:szCs w:val="32"/>
+          <w:lang w:val="tr-TR"/>
+        </w:rPr>
+        <w:t>5</w:t>
+      </w:r>
+    </w:p>
+    <w:p>
+      <w:pPr>
+        <w:numPr>
+          <w:ilvl w:val="0"/>
+          <w:numId w:val="6"/>
+        </w:numPr>
+        <w:spacing w:after="0" w:line="240" w:lineRule="auto"/>
+        <w:rPr>
+          <w:noProof/>
+          <w:sz w:val="32"/>
+          <w:szCs w:val="32"/>
+          <w:lang w:val="tr-TR"/>
+        </w:rPr>
+      </w:pPr>
+      <w:r>
+        <w:rPr>
+          <w:noProof/>
+          <w:sz w:val="32"/>
+          <w:szCs w:val="32"/>
+          <w:lang w:val="tr-TR"/>
+        </w:rPr>
+        <w:t>Add ForecastPlot visualization engine</w:t>
+      </w:r>
+    </w:p>
+    <w:p>
+      <w:pPr>
+        <w:numPr>
+          <w:ilvl w:val="0"/>
+          <w:numId w:val="6"/>
+        </w:numPr>
+        <w:spacing w:after="0" w:line="240" w:lineRule="auto"/>
+        <w:rPr>
+          <w:noProof/>
+          <w:sz w:val="32"/>
+          <w:szCs w:val="32"/>
+          <w:lang w:val="tr-TR"/>
+        </w:rPr>
+      </w:pPr>
+    </w:p>
+    <w:p>
+      <w:pPr>
+        <w:spacing w:after="0" w:line="240" w:lineRule="auto"/>
+        <w:rPr>
+          <w:b/>
+          <w:bCs/>
+          <w:noProof/>
+          <w:sz w:val="32"/>
+          <w:szCs w:val="32"/>
+          <w:lang w:val="tr-TR"/>
+        </w:rPr>
+      </w:pPr>
+    </w:p>
+    <w:p>
+      <w:pPr>
+        <w:spacing w:after="0" w:line="240" w:lineRule="auto"/>
+        <w:rPr>
+          <w:b/>
+          <w:bCs/>
+          <w:noProof/>
+          <w:sz w:val="32"/>
+          <w:szCs w:val="32"/>
+          <w:lang w:val="tr-TR"/>
+        </w:rPr>
+      </w:pPr>
+    </w:p>
+    <w:p>
+      <w:pPr>
+        <w:spacing w:after="0" w:line="240" w:lineRule="auto"/>
+        <w:rPr>
+          <w:noProof/>
+          <w:sz w:val="32"/>
+          <w:szCs w:val="32"/>
+        </w:rPr>
+      </w:pPr>
+    </w:p>
+    <w:p>
+      <w:pPr>
+        <w:spacing w:after="0" w:line="240" w:lineRule="auto"/>
+        <w:rPr>
+          <w:noProof/>
+          <w:sz w:val="32"/>
+          <w:szCs w:val="32"/>
+        </w:rPr>
+      </w:pPr>
+    </w:p>
+    <w:p>
+      <w:pPr>
+        <w:rPr>
+          <w:noProof/>
+          <w:sz w:val="32"/>
+          <w:szCs w:val="32"/>
+        </w:rPr>
+      </w:pPr>
+      <w:r>
+        <w:rPr>
+          <w:noProof/>
+          <w:sz w:val="32"/>
+          <w:szCs w:val="32"/>
+        </w:rPr>
+        <w:br w:type="page"/>
+      </w:r>
+    </w:p>
+    <w:p>
+      <w:pPr>
+        <w:spacing w:after="0" w:line="240" w:lineRule="auto"/>
+        <w:rPr>
+          <w:b/>
+          <w:bCs/>
+          <w:noProof/>
+          <w:sz w:val="48"/>
+          <w:szCs w:val="48"/>
+          <w:u w:val="single"/>
+        </w:rPr>
+      </w:pPr>
+      <w:r>
+        <w:rPr>
+          <w:b/>
+          <w:bCs/>
+          <w:noProof/>
+          <w:sz w:val="48"/>
+          <w:szCs w:val="48"/>
+          <w:u w:val="single"/>
+        </w:rPr>
+        <w:lastRenderedPageBreak/>
+        <w:t>Demo:</w:t>
+      </w:r>
+    </w:p>
+    <w:p>
+      <w:pPr>
+        <w:spacing w:after="0" w:line="240" w:lineRule="auto"/>
+        <w:rPr>
+          <w:noProof/>
+          <w:sz w:val="32"/>
+          <w:szCs w:val="32"/>
+        </w:rPr>
+      </w:pPr>
+    </w:p>
+    <w:p>
+      <w:pPr>
+        <w:spacing w:after="0" w:line="240" w:lineRule="auto"/>
+        <w:rPr>
+          <w:noProof/>
+          <w:sz w:val="32"/>
+          <w:szCs w:val="32"/>
+        </w:rPr>
+      </w:pPr>
+      <w:r>
+        <w:rPr>
+          <w:noProof/>
+          <w:sz w:val="32"/>
+          <w:szCs w:val="32"/>
+        </w:rPr>
+        <w:t>Raw Battery CSV</w:t>
+      </w:r>
+    </w:p>
+    <w:p>
+      <w:pPr>
+        <w:spacing w:after="0" w:line="240" w:lineRule="auto"/>
+        <w:rPr>
+          <w:noProof/>
+          <w:sz w:val="32"/>
+          <w:szCs w:val="32"/>
+        </w:rPr>
+      </w:pPr>
+      <w:r>
+        <w:rPr>
+          <w:noProof/>
+          <w:sz w:val="32"/>
+          <w:szCs w:val="32"/>
+        </w:rPr>
+        <w:t xml:space="preserve">        │</w:t>
+      </w:r>
+    </w:p>
+    <w:p>
+      <w:pPr>
+        <w:spacing w:after="0" w:line="240" w:lineRule="auto"/>
+        <w:rPr>
+          <w:noProof/>
+          <w:sz w:val="32"/>
+          <w:szCs w:val="32"/>
+        </w:rPr>
+      </w:pPr>
+      <w:r>
+        <w:rPr>
+          <w:noProof/>
+          <w:sz w:val="32"/>
+          <w:szCs w:val="32"/>
+        </w:rPr>
+        <w:t xml:space="preserve">        </w:t>
+      </w:r>
+      <w:r>
+        <w:rPr>
+          <w:rFonts w:ascii="Arial" w:hAnsi="Arial" w:cs="Arial"/>
+          <w:noProof/>
+          <w:sz w:val="32"/>
+          <w:szCs w:val="32"/>
+        </w:rPr>
+        <w:t>▼</w:t>
+      </w:r>
+    </w:p>
+    <w:p>
+      <w:pPr>
+        <w:spacing w:after="0" w:line="240" w:lineRule="auto"/>
+        <w:rPr>
+          <w:noProof/>
+          <w:sz w:val="32"/>
+          <w:szCs w:val="32"/>
+        </w:rPr>
+      </w:pPr>
+      <w:r>
+        <w:rPr>
+          <w:noProof/>
+          <w:sz w:val="32"/>
+          <w:szCs w:val="32"/>
+        </w:rPr>
+        <w:t>Smart Dataset Loader</w:t>
+      </w:r>
+    </w:p>
+    <w:p>
+      <w:pPr>
+        <w:spacing w:after="0" w:line="240" w:lineRule="auto"/>
+        <w:rPr>
+          <w:noProof/>
+          <w:sz w:val="32"/>
+          <w:szCs w:val="32"/>
+        </w:rPr>
+      </w:pPr>
+      <w:r>
+        <w:rPr>
+          <w:noProof/>
+          <w:sz w:val="32"/>
+          <w:szCs w:val="32"/>
+        </w:rPr>
+        <w:t xml:space="preserve">        │</w:t>
+      </w:r>
+    </w:p>
+    <w:p>
+      <w:pPr>
+        <w:spacing w:after="0" w:line="240" w:lineRule="auto"/>
+        <w:rPr>
+          <w:noProof/>
+          <w:sz w:val="32"/>
+          <w:szCs w:val="32"/>
+        </w:rPr>
+      </w:pPr>
+      <w:r>
+        <w:rPr>
+          <w:noProof/>
+          <w:sz w:val="32"/>
+          <w:szCs w:val="32"/>
+        </w:rPr>
+        <w:t xml:space="preserve">        </w:t>
+      </w:r>
+      <w:r>
+        <w:rPr>
+          <w:rFonts w:ascii="Arial" w:hAnsi="Arial" w:cs="Arial"/>
+          <w:noProof/>
+          <w:sz w:val="32"/>
+          <w:szCs w:val="32"/>
+        </w:rPr>
+        <w:t>▼</w:t>
+      </w:r>
+    </w:p>
+    <w:p>
+      <w:pPr>
+        <w:spacing w:after="0" w:line="240" w:lineRule="auto"/>
+        <w:rPr>
+          <w:noProof/>
+          <w:sz w:val="32"/>
+          <w:szCs w:val="32"/>
+        </w:rPr>
+      </w:pPr>
+      <w:r>
+        <w:rPr>
+          <w:noProof/>
+          <w:sz w:val="32"/>
+          <w:szCs w:val="32"/>
+        </w:rPr>
+        <w:t>BatteryDataset</w:t>
+      </w:r>
+    </w:p>
+    <w:p>
+      <w:pPr>
+        <w:spacing w:after="0" w:line="240" w:lineRule="auto"/>
+        <w:rPr>
+          <w:noProof/>
+          <w:sz w:val="32"/>
+          <w:szCs w:val="32"/>
+        </w:rPr>
+      </w:pPr>
+      <w:r>
+        <w:rPr>
+          <w:noProof/>
+          <w:sz w:val="32"/>
+          <w:szCs w:val="32"/>
+        </w:rPr>
+        <w:t xml:space="preserve">        │</w:t>
+      </w:r>
+    </w:p>
+    <w:p>
+      <w:pPr>
+        <w:spacing w:after="0" w:line="240" w:lineRule="auto"/>
+        <w:rPr>
+          <w:noProof/>
+          <w:sz w:val="32"/>
+          <w:szCs w:val="32"/>
+        </w:rPr>
+      </w:pPr>
+      <w:r>
+        <w:rPr>
+          <w:noProof/>
+          <w:sz w:val="32"/>
+          <w:szCs w:val="32"/>
+        </w:rPr>
+        <w:t xml:space="preserve">        </w:t>
+      </w:r>
+      <w:r>
+        <w:rPr>
+          <w:rFonts w:ascii="Arial" w:hAnsi="Arial" w:cs="Arial"/>
+          <w:noProof/>
+          <w:sz w:val="32"/>
+          <w:szCs w:val="32"/>
+        </w:rPr>
+        <w:t>▼</w:t>
+      </w:r>
+    </w:p>
+    <w:p>
+      <w:pPr>
+        <w:spacing w:after="0" w:line="240" w:lineRule="auto"/>
+        <w:rPr>
+          <w:noProof/>
+          <w:sz w:val="32"/>
+          <w:szCs w:val="32"/>
+        </w:rPr>
+      </w:pPr>
+      <w:r>
+        <w:rPr>
+          <w:noProof/>
+          <w:sz w:val="32"/>
+          <w:szCs w:val="32"/>
+        </w:rPr>
+        <w:t>Validation</w:t>
+      </w:r>
+    </w:p>
+    <w:p>
+      <w:pPr>
+        <w:spacing w:after="0" w:line="240" w:lineRule="auto"/>
+        <w:rPr>
+          <w:noProof/>
+          <w:sz w:val="32"/>
+          <w:szCs w:val="32"/>
+        </w:rPr>
+      </w:pPr>
+      <w:r>
+        <w:rPr>
+          <w:noProof/>
+          <w:sz w:val="32"/>
+          <w:szCs w:val="32"/>
+        </w:rPr>
+        <w:t xml:space="preserve">        │</w:t>
+      </w:r>
+    </w:p>
+    <w:p>
+      <w:pPr>
+        <w:spacing w:after="0" w:line="240" w:lineRule="auto"/>
+        <w:rPr>
+          <w:noProof/>
+          <w:sz w:val="32"/>
+          <w:szCs w:val="32"/>
+        </w:rPr>
+      </w:pPr>
+      <w:r>
+        <w:rPr>
+          <w:noProof/>
+          <w:sz w:val="32"/>
+          <w:szCs w:val="32"/>
+        </w:rPr>
+        <w:t xml:space="preserve">        </w:t>
+      </w:r>
+      <w:r>
+        <w:rPr>
+          <w:rFonts w:ascii="Arial" w:hAnsi="Arial" w:cs="Arial"/>
+          <w:noProof/>
+          <w:sz w:val="32"/>
+          <w:szCs w:val="32"/>
+        </w:rPr>
+        <w:t>▼</w:t>
+      </w:r>
+    </w:p>
+    <w:p>
+      <w:pPr>
+        <w:spacing w:after="0" w:line="240" w:lineRule="auto"/>
+        <w:rPr>
+          <w:noProof/>
+          <w:sz w:val="32"/>
+          <w:szCs w:val="32"/>
+        </w:rPr>
+      </w:pPr>
+      <w:r>
+        <w:rPr>
+          <w:noProof/>
+          <w:sz w:val="32"/>
+          <w:szCs w:val="32"/>
+        </w:rPr>
+        <w:t>ForecastPipeline</w:t>
+      </w:r>
+    </w:p>
+    <w:p>
+      <w:pPr>
+        <w:spacing w:after="0" w:line="240" w:lineRule="auto"/>
+        <w:rPr>
+          <w:noProof/>
+          <w:sz w:val="32"/>
+          <w:szCs w:val="32"/>
+        </w:rPr>
+      </w:pPr>
+      <w:r>
+        <w:rPr>
+          <w:noProof/>
+          <w:sz w:val="32"/>
+          <w:szCs w:val="32"/>
+        </w:rPr>
+        <w:t xml:space="preserve">        │</w:t>
+      </w:r>
+    </w:p>
+    <w:p>
+      <w:pPr>
+        <w:spacing w:after="0" w:line="240" w:lineRule="auto"/>
+        <w:rPr>
+          <w:noProof/>
+          <w:sz w:val="32"/>
+          <w:szCs w:val="32"/>
+        </w:rPr>
+      </w:pPr>
+      <w:r>
+        <w:rPr>
+          <w:noProof/>
+          <w:sz w:val="32"/>
+          <w:szCs w:val="32"/>
+        </w:rPr>
+        <w:t xml:space="preserve">        </w:t>
+      </w:r>
+      <w:r>
+        <w:rPr>
+          <w:rFonts w:ascii="Arial" w:hAnsi="Arial" w:cs="Arial"/>
+          <w:noProof/>
+          <w:sz w:val="32"/>
+          <w:szCs w:val="32"/>
+        </w:rPr>
+        <w:t>▼</w:t>
+      </w:r>
+    </w:p>
+    <w:p>
+      <w:pPr>
+        <w:spacing w:after="0" w:line="240" w:lineRule="auto"/>
+        <w:rPr>
+          <w:noProof/>
+          <w:sz w:val="32"/>
+          <w:szCs w:val="32"/>
+        </w:rPr>
+      </w:pPr>
+      <w:r>
+        <w:rPr>
+          <w:noProof/>
+          <w:sz w:val="32"/>
+          <w:szCs w:val="32"/>
+        </w:rPr>
+        <w:t>ARIMAForecaster</w:t>
+      </w:r>
+    </w:p>
+    <w:p>
+      <w:pPr>
+        <w:spacing w:after="0" w:line="240" w:lineRule="auto"/>
+        <w:rPr>
+          <w:noProof/>
+          <w:sz w:val="32"/>
+          <w:szCs w:val="32"/>
+        </w:rPr>
+      </w:pPr>
+      <w:r>
+        <w:rPr>
+          <w:noProof/>
+          <w:sz w:val="32"/>
+          <w:szCs w:val="32"/>
+        </w:rPr>
+        <w:t xml:space="preserve">        │</w:t>
+      </w:r>
+    </w:p>
+    <w:p>
+      <w:pPr>
+        <w:spacing w:after="0" w:line="240" w:lineRule="auto"/>
+        <w:rPr>
+          <w:noProof/>
+          <w:sz w:val="32"/>
+          <w:szCs w:val="32"/>
+        </w:rPr>
+      </w:pPr>
+      <w:r>
+        <w:rPr>
+          <w:noProof/>
+          <w:sz w:val="32"/>
+          <w:szCs w:val="32"/>
+        </w:rPr>
+        <w:t xml:space="preserve">        </w:t>
+      </w:r>
+      <w:r>
+        <w:rPr>
+          <w:rFonts w:ascii="Arial" w:hAnsi="Arial" w:cs="Arial"/>
+          <w:noProof/>
+          <w:sz w:val="32"/>
+          <w:szCs w:val="32"/>
+        </w:rPr>
+        <w:t>▼</w:t>
+      </w:r>
+    </w:p>
+    <w:p>
+      <w:pPr>
+        <w:spacing w:after="0" w:line="240" w:lineRule="auto"/>
+        <w:rPr>
+          <w:noProof/>
+          <w:sz w:val="32"/>
+          <w:szCs w:val="32"/>
+        </w:rPr>
+      </w:pPr>
+      <w:r>
+        <w:rPr>
+          <w:noProof/>
+          <w:sz w:val="32"/>
+          <w:szCs w:val="32"/>
+        </w:rPr>
+        <w:t>ForecastResult</w:t>
+      </w:r>
+    </w:p>
+    <w:p>
+      <w:pPr>
+        <w:spacing w:after="0" w:line="240" w:lineRule="auto"/>
+        <w:rPr>
+          <w:noProof/>
+          <w:sz w:val="32"/>
+          <w:szCs w:val="32"/>
+        </w:rPr>
+      </w:pPr>
+      <w:r>
+        <w:rPr>
+          <w:noProof/>
+          <w:sz w:val="32"/>
+          <w:szCs w:val="32"/>
+        </w:rPr>
+        <w:t xml:space="preserve">        │</w:t>
+      </w:r>
+    </w:p>
+    <w:p>
+      <w:pPr>
+        <w:spacing w:after="0" w:line="240" w:lineRule="auto"/>
+        <w:rPr>
+          <w:noProof/>
+          <w:sz w:val="32"/>
+          <w:szCs w:val="32"/>
+        </w:rPr>
+      </w:pPr>
+      <w:r>
+        <w:rPr>
+          <w:noProof/>
+          <w:sz w:val="32"/>
+          <w:szCs w:val="32"/>
+        </w:rPr>
+        <w:t xml:space="preserve">        </w:t>
+      </w:r>
+      <w:r>
+        <w:rPr>
+          <w:rFonts w:ascii="Arial" w:hAnsi="Arial" w:cs="Arial"/>
+          <w:noProof/>
+          <w:sz w:val="32"/>
+          <w:szCs w:val="32"/>
+        </w:rPr>
+        <w:t>▼</w:t>
+      </w:r>
+    </w:p>
+    <w:p>
+      <w:pPr>
+        <w:spacing w:after="0" w:line="240" w:lineRule="auto"/>
+        <w:rPr>
+          <w:noProof/>
+          <w:sz w:val="32"/>
+          <w:szCs w:val="32"/>
+        </w:rPr>
+      </w:pPr>
+      <w:r>
+        <w:rPr>
+          <w:noProof/>
+          <w:sz w:val="32"/>
+          <w:szCs w:val="32"/>
+        </w:rPr>
+        <w:t>Forecast Plot</w:t>
+      </w:r>
+    </w:p>
+    <w:p>
+      <w:pPr>
+        <w:spacing w:after="0" w:line="240" w:lineRule="auto"/>
+        <w:ind w:firstLine="708"/>
+        <w:rPr>
+          <w:noProof/>
+          <w:sz w:val="32"/>
+          <w:szCs w:val="32"/>
+        </w:rPr>
+      </w:pPr>
+      <w:r>
+        <w:rPr>
+          <w:noProof/>
+          <w:sz w:val="32"/>
+          <w:szCs w:val="32"/>
+        </w:rPr>
+        <w:t>│</w:t>
+      </w:r>
+    </w:p>
+    <w:p>
+      <w:pPr>
+        <w:spacing w:after="0" w:line="240" w:lineRule="auto"/>
+        <w:rPr>
+          <w:noProof/>
+          <w:sz w:val="32"/>
+          <w:szCs w:val="32"/>
+        </w:rPr>
+      </w:pPr>
+      <w:r>
+        <w:rPr>
+          <w:noProof/>
+          <w:sz w:val="32"/>
+          <w:szCs w:val="32"/>
+        </w:rPr>
+        <w:t xml:space="preserve">        </w:t>
+      </w:r>
+      <w:r>
+        <w:rPr>
+          <w:rFonts w:ascii="Arial" w:hAnsi="Arial" w:cs="Arial"/>
+          <w:noProof/>
+          <w:sz w:val="32"/>
+          <w:szCs w:val="32"/>
+        </w:rPr>
+        <w:t>▼</w:t>
+      </w:r>
+    </w:p>
+    <w:p>
+      <w:pPr>
+        <w:spacing w:after="0" w:line="240" w:lineRule="auto"/>
+        <w:rPr>
+          <w:noProof/>
+          <w:sz w:val="32"/>
+          <w:szCs w:val="32"/>
+        </w:rPr>
+      </w:pPr>
+      <w:r>
+        <w:rPr>
+          <w:noProof/>
+          <w:sz w:val="32"/>
+          <w:szCs w:val="32"/>
+        </w:rPr>
+        <w:t>ExperimentResult</w:t>
+      </w:r>
+    </w:p>
+    <w:tbl>
+      <w:tblPr>
+        <w:tblStyle w:val="TabloKlavuzu"/>
+        <w:tblW w:w="0" w:type="auto"/>
+        <w:tblInd w:w="799" w:type="dxa"/>
+        <w:tblCellMar>
+          <w:left w:w="70" w:type="dxa"/>
+          <w:right w:w="70" w:type="dxa"/>
+        </w:tblCellMar>
+        <w:tblLook w:val="0000" w:firstRow="0" w:lastRow="0" w:firstColumn="0" w:lastColumn="0" w:noHBand="0" w:noVBand="0"/>
+      </w:tblPr>
+      <w:tblGrid>
+        <w:gridCol w:w="146"/>
+      </w:tblGrid>
+      <w:tr>
+        <w:tblPrEx>
+          <w:tblCellMar>
+            <w:top w:w="0" w:type="dxa"/>
+            <w:bottom w:w="0" w:type="dxa"/>
+          </w:tblCellMar>
+        </w:tblPrEx>
+        <w:tc>
+          <w:tcPr>
+            <w:tcW w:w="0" w:type="auto"/>
+          </w:tcPr>
+          <w:p>
+            <w:pPr>
+              <w:rPr>
+                <w:rFonts w:ascii="Calibri" w:hAnsi="Calibri" w:cs="Calibri"/>
+                <w:noProof/>
+                <w:sz w:val="32"/>
+                <w:szCs w:val="32"/>
+              </w:rPr>
+            </w:pPr>
+          </w:p>
+        </w:tc>
+      </w:tr>
+    </w:tbl>
+    <w:p>
+      <w:pPr>
+        <w:spacing w:after="0" w:line="240" w:lineRule="auto"/>
+        <w:ind w:firstLine="708"/>
+        <w:rPr>
+          <w:rFonts w:ascii="MS Gothic" w:eastAsia="MS Gothic" w:hAnsi="MS Gothic" w:cs="MS Gothic"/>
+          <w:noProof/>
+          <w:sz w:val="32"/>
+          <w:szCs w:val="32"/>
+        </w:rPr>
+      </w:pPr>
+      <w:r>
+        <w:rPr>
+          <w:rFonts w:ascii="Calibri" w:hAnsi="Calibri" w:cs="Calibri"/>
+          <w:noProof/>
+          <w:sz w:val="32"/>
+          <w:szCs w:val="32"/>
+        </w:rPr>
+        <w:t>──</w:t>
+      </w:r>
+      <w:r>
+        <w:rPr>
+          <w:noProof/>
+          <w:sz w:val="32"/>
+          <w:szCs w:val="32"/>
+        </w:rPr>
+        <w:t xml:space="preserve"> PNG </w:t>
+      </w:r>
+    </w:p>
+    <w:p>
+      <w:pPr>
+        <w:spacing w:after="0" w:line="240" w:lineRule="auto"/>
+        <w:ind w:firstLine="708"/>
+        <w:rPr>
+          <w:noProof/>
+          <w:sz w:val="32"/>
+          <w:szCs w:val="32"/>
+        </w:rPr>
+      </w:pPr>
+      <w:r>
+        <w:rPr>
+          <w:rFonts w:ascii="Calibri" w:hAnsi="Calibri" w:cs="Calibri"/>
+          <w:noProof/>
+          <w:sz w:val="32"/>
+          <w:szCs w:val="32"/>
+        </w:rPr>
+        <w:t>──</w:t>
+      </w:r>
+      <w:r>
+        <w:rPr>
+          <w:noProof/>
+          <w:sz w:val="32"/>
+          <w:szCs w:val="32"/>
+        </w:rPr>
+        <w:t xml:space="preserve"> JSON </w:t>
+      </w:r>
+    </w:p>
+    <w:p>
+      <w:pPr>
+        <w:spacing w:after="0" w:line="240" w:lineRule="auto"/>
+        <w:ind w:firstLine="708"/>
+        <w:rPr>
+          <w:noProof/>
+          <w:sz w:val="32"/>
+          <w:szCs w:val="32"/>
+        </w:rPr>
+      </w:pPr>
+      <w:r>
+        <w:rPr>
+          <w:rFonts w:ascii="Calibri" w:hAnsi="Calibri" w:cs="Calibri"/>
+          <w:noProof/>
+          <w:sz w:val="32"/>
+          <w:szCs w:val="32"/>
+        </w:rPr>
+        <w:t>└──</w:t>
+      </w:r>
+      <w:r>
+        <w:rPr>
+          <w:noProof/>
+          <w:sz w:val="32"/>
+          <w:szCs w:val="32"/>
+        </w:rPr>
+        <w:t xml:space="preserve"> TXT</w:t>
+      </w:r>
+    </w:p>
+    <w:p>
+      <w:pPr>
+        <w:spacing w:after="0" w:line="240" w:lineRule="auto"/>
+        <w:rPr>
+          <w:noProof/>
+          <w:sz w:val="32"/>
+          <w:szCs w:val="32"/>
+        </w:rPr>
+      </w:pPr>
+    </w:p>
+    <w:p>
+      <w:pPr>
+        <w:spacing w:after="0" w:line="240" w:lineRule="auto"/>
+        <w:rPr>
+          <w:noProof/>
+          <w:sz w:val="32"/>
+          <w:szCs w:val="32"/>
+        </w:rPr>
+      </w:pPr>
+    </w:p>
+    <w:p>
+      <w:pPr>
+        <w:rPr>
+          <w:noProof/>
+          <w:sz w:val="32"/>
+          <w:szCs w:val="32"/>
+        </w:rPr>
+      </w:pPr>
+      <w:r>
+        <w:rPr>
+          <w:noProof/>
+          <w:sz w:val="32"/>
+          <w:szCs w:val="32"/>
+        </w:rPr>
+        <w:br w:type="page"/>
+      </w:r>
+    </w:p>
+    <w:p>
+      <w:pPr>
+        <w:rPr>
+          <w:b/>
+          <w:bCs/>
+          <w:noProof/>
+          <w:sz w:val="40"/>
+          <w:szCs w:val="40"/>
+          <w:u w:val="single"/>
+        </w:rPr>
+      </w:pPr>
+      <w:r>
+        <w:rPr>
+          <w:b/>
+          <w:bCs/>
+          <w:noProof/>
+          <w:sz w:val="40"/>
+          <w:szCs w:val="40"/>
+          <w:u w:val="single"/>
+        </w:rPr>
+        <w:lastRenderedPageBreak/>
+        <w:t>Current project status:</w:t>
+      </w:r>
+    </w:p>
+    <w:p>
+      <w:pPr>
+        <w:spacing w:after="0" w:line="240" w:lineRule="auto"/>
+        <w:rPr>
+          <w:noProof/>
+          <w:sz w:val="32"/>
+          <w:szCs w:val="32"/>
+        </w:rPr>
+      </w:pPr>
+    </w:p>
+    <w:p>
+      <w:pPr>
+        <w:spacing w:after="0" w:line="240" w:lineRule="auto"/>
+        <w:rPr>
+          <w:noProof/>
+          <w:sz w:val="32"/>
+          <w:szCs w:val="32"/>
+        </w:rPr>
+      </w:pPr>
+      <w:r>
+        <w:rPr>
+          <w:rFonts w:ascii="Segoe UI Symbol" w:hAnsi="Segoe UI Symbol" w:cs="Segoe UI Symbol"/>
+          <w:noProof/>
+          <w:sz w:val="32"/>
+          <w:szCs w:val="32"/>
+        </w:rPr>
+        <w:t>✓</w:t>
+      </w:r>
+      <w:r>
+        <w:rPr>
+          <w:noProof/>
+          <w:sz w:val="32"/>
+          <w:szCs w:val="32"/>
+        </w:rPr>
+        <w:t xml:space="preserve"> Smart Dataset Loader</w:t>
+      </w:r>
+    </w:p>
+    <w:p>
+      <w:pPr>
+        <w:spacing w:after="0" w:line="240" w:lineRule="auto"/>
+        <w:rPr>
+          <w:noProof/>
+          <w:sz w:val="32"/>
+          <w:szCs w:val="32"/>
+        </w:rPr>
+      </w:pPr>
+      <w:r>
+        <w:rPr>
+          <w:rFonts w:ascii="Segoe UI Symbol" w:hAnsi="Segoe UI Symbol" w:cs="Segoe UI Symbol"/>
+          <w:noProof/>
+          <w:sz w:val="32"/>
+          <w:szCs w:val="32"/>
+        </w:rPr>
+        <w:t>✓</w:t>
+      </w:r>
+      <w:r>
+        <w:rPr>
+          <w:noProof/>
+          <w:sz w:val="32"/>
+          <w:szCs w:val="32"/>
+        </w:rPr>
+        <w:t xml:space="preserve"> BatteryDataset</w:t>
+      </w:r>
+    </w:p>
+    <w:p>
+      <w:pPr>
+        <w:spacing w:after="0" w:line="240" w:lineRule="auto"/>
+        <w:rPr>
+          <w:noProof/>
+          <w:sz w:val="32"/>
+          <w:szCs w:val="32"/>
+        </w:rPr>
+      </w:pPr>
+      <w:r>
+        <w:rPr>
+          <w:rFonts w:ascii="Segoe UI Symbol" w:hAnsi="Segoe UI Symbol" w:cs="Segoe UI Symbol"/>
+          <w:noProof/>
+          <w:sz w:val="32"/>
+          <w:szCs w:val="32"/>
+        </w:rPr>
+        <w:t>✓</w:t>
+      </w:r>
+      <w:r>
+        <w:rPr>
+          <w:noProof/>
+          <w:sz w:val="32"/>
+          <w:szCs w:val="32"/>
+        </w:rPr>
+        <w:t xml:space="preserve"> Validation</w:t>
+      </w:r>
+    </w:p>
+    <w:p>
+      <w:pPr>
+        <w:spacing w:after="0" w:line="240" w:lineRule="auto"/>
+        <w:rPr>
+          <w:noProof/>
+          <w:sz w:val="32"/>
+          <w:szCs w:val="32"/>
+        </w:rPr>
+      </w:pPr>
+      <w:r>
+        <w:rPr>
+          <w:rFonts w:ascii="Segoe UI Symbol" w:hAnsi="Segoe UI Symbol" w:cs="Segoe UI Symbol"/>
+          <w:noProof/>
+          <w:sz w:val="32"/>
+          <w:szCs w:val="32"/>
+        </w:rPr>
+        <w:t>✓</w:t>
+      </w:r>
+      <w:r>
+        <w:rPr>
+          <w:noProof/>
+          <w:sz w:val="32"/>
+          <w:szCs w:val="32"/>
+        </w:rPr>
+        <w:t xml:space="preserve"> Resampling</w:t>
+      </w:r>
+    </w:p>
+    <w:p>
+      <w:pPr>
+        <w:spacing w:after="0" w:line="240" w:lineRule="auto"/>
+        <w:rPr>
+          <w:noProof/>
+          <w:sz w:val="32"/>
+          <w:szCs w:val="32"/>
+        </w:rPr>
+      </w:pPr>
+      <w:r>
+        <w:rPr>
+          <w:rFonts w:ascii="Segoe UI Symbol" w:hAnsi="Segoe UI Symbol" w:cs="Segoe UI Symbol"/>
+          <w:noProof/>
+          <w:sz w:val="32"/>
+          <w:szCs w:val="32"/>
+        </w:rPr>
+        <w:t>✓</w:t>
+      </w:r>
+      <w:r>
+        <w:rPr>
+          <w:noProof/>
+          <w:sz w:val="32"/>
+          <w:szCs w:val="32"/>
+        </w:rPr>
+        <w:t xml:space="preserve"> Missing-data detection</w:t>
+      </w:r>
+    </w:p>
+    <w:p>
+      <w:pPr>
+        <w:spacing w:after="0" w:line="240" w:lineRule="auto"/>
+        <w:rPr>
+          <w:noProof/>
+          <w:sz w:val="32"/>
+          <w:szCs w:val="32"/>
+        </w:rPr>
+      </w:pPr>
+      <w:r>
+        <w:rPr>
+          <w:rFonts w:ascii="Segoe UI Symbol" w:hAnsi="Segoe UI Symbol" w:cs="Segoe UI Symbol"/>
+          <w:noProof/>
+          <w:sz w:val="32"/>
+          <w:szCs w:val="32"/>
+        </w:rPr>
+        <w:t>✓</w:t>
+      </w:r>
+      <w:r>
+        <w:rPr>
+          <w:noProof/>
+          <w:sz w:val="32"/>
+          <w:szCs w:val="32"/>
+        </w:rPr>
+        <w:t xml:space="preserve"> Feature engineering</w:t>
+      </w:r>
+    </w:p>
+    <w:p>
+      <w:pPr>
+        <w:spacing w:after="0" w:line="240" w:lineRule="auto"/>
+        <w:rPr>
+          <w:noProof/>
+          <w:sz w:val="32"/>
+          <w:szCs w:val="32"/>
+        </w:rPr>
+      </w:pPr>
+      <w:r>
+        <w:rPr>
+          <w:rFonts w:ascii="Segoe UI Symbol" w:hAnsi="Segoe UI Symbol" w:cs="Segoe UI Symbol"/>
+          <w:noProof/>
+          <w:sz w:val="32"/>
+          <w:szCs w:val="32"/>
+        </w:rPr>
+        <w:t>✓</w:t>
+      </w:r>
+      <w:r>
+        <w:rPr>
+          <w:noProof/>
+          <w:sz w:val="32"/>
+          <w:szCs w:val="32"/>
+        </w:rPr>
+        <w:t xml:space="preserve"> Rolling windows</w:t>
+      </w:r>
+    </w:p>
+    <w:p>
+      <w:pPr>
+        <w:spacing w:after="0" w:line="240" w:lineRule="auto"/>
+        <w:rPr>
+          <w:noProof/>
+          <w:sz w:val="32"/>
+          <w:szCs w:val="32"/>
+        </w:rPr>
+      </w:pPr>
+      <w:r>
+        <w:rPr>
+          <w:rFonts w:ascii="Segoe UI Symbol" w:hAnsi="Segoe UI Symbol" w:cs="Segoe UI Symbol"/>
+          <w:noProof/>
+          <w:sz w:val="32"/>
+          <w:szCs w:val="32"/>
+        </w:rPr>
+        <w:t>✓</w:t>
+      </w:r>
+      <w:r>
+        <w:rPr>
+          <w:noProof/>
+          <w:sz w:val="32"/>
+          <w:szCs w:val="32"/>
+        </w:rPr>
+        <w:t xml:space="preserve"> Visualization</w:t>
+      </w:r>
+    </w:p>
+    <w:p>
+      <w:pPr>
+        <w:spacing w:after="0" w:line="240" w:lineRule="auto"/>
+        <w:rPr>
+          <w:noProof/>
+          <w:sz w:val="32"/>
+          <w:szCs w:val="32"/>
+        </w:rPr>
+      </w:pPr>
+      <w:r>
+        <w:rPr>
+          <w:rFonts w:ascii="Segoe UI Symbol" w:hAnsi="Segoe UI Symbol" w:cs="Segoe UI Symbol"/>
+          <w:noProof/>
+          <w:sz w:val="32"/>
+          <w:szCs w:val="32"/>
+        </w:rPr>
+        <w:t>✓</w:t>
+      </w:r>
+      <w:r>
+        <w:rPr>
+          <w:noProof/>
+          <w:sz w:val="32"/>
+          <w:szCs w:val="32"/>
+        </w:rPr>
+        <w:t xml:space="preserve"> Dataset reports</w:t>
+      </w:r>
+    </w:p>
+    <w:p>
+      <w:pPr>
+        <w:spacing w:after="0" w:line="240" w:lineRule="auto"/>
+        <w:rPr>
+          <w:noProof/>
+          <w:sz w:val="32"/>
+          <w:szCs w:val="32"/>
+        </w:rPr>
+      </w:pPr>
+      <w:r>
+        <w:rPr>
+          <w:rFonts w:ascii="Segoe UI Symbol" w:hAnsi="Segoe UI Symbol" w:cs="Segoe UI Symbol"/>
+          <w:noProof/>
+          <w:sz w:val="32"/>
+          <w:szCs w:val="32"/>
+        </w:rPr>
+        <w:t>✓</w:t>
+      </w:r>
+      <w:r>
+        <w:rPr>
+          <w:noProof/>
+          <w:sz w:val="32"/>
+          <w:szCs w:val="32"/>
+        </w:rPr>
+        <w:t xml:space="preserve"> ForecastPipeline</w:t>
+      </w:r>
+    </w:p>
+    <w:p>
+      <w:pPr>
+        <w:spacing w:after="0" w:line="240" w:lineRule="auto"/>
+        <w:rPr>
+          <w:noProof/>
+          <w:sz w:val="32"/>
+          <w:szCs w:val="32"/>
+        </w:rPr>
+      </w:pPr>
+      <w:r>
+        <w:rPr>
+          <w:rFonts w:ascii="Segoe UI Symbol" w:hAnsi="Segoe UI Symbol" w:cs="Segoe UI Symbol"/>
+          <w:noProof/>
+          <w:sz w:val="32"/>
+          <w:szCs w:val="32"/>
+        </w:rPr>
+        <w:t>✓</w:t>
+      </w:r>
+      <w:r>
+        <w:rPr>
+          <w:noProof/>
+          <w:sz w:val="32"/>
+          <w:szCs w:val="32"/>
+        </w:rPr>
+        <w:t xml:space="preserve"> BaseForecastModel</w:t>
+      </w:r>
+    </w:p>
+    <w:p>
+      <w:pPr>
+        <w:spacing w:after="0" w:line="240" w:lineRule="auto"/>
+        <w:rPr>
+          <w:noProof/>
+          <w:sz w:val="32"/>
+          <w:szCs w:val="32"/>
+        </w:rPr>
+      </w:pPr>
+      <w:r>
+        <w:rPr>
+          <w:rFonts w:ascii="Segoe UI Symbol" w:hAnsi="Segoe UI Symbol" w:cs="Segoe UI Symbol"/>
+          <w:noProof/>
+          <w:sz w:val="32"/>
+          <w:szCs w:val="32"/>
+        </w:rPr>
+        <w:t>✓</w:t>
+      </w:r>
+      <w:r>
+        <w:rPr>
+          <w:noProof/>
+          <w:sz w:val="32"/>
+          <w:szCs w:val="32"/>
+        </w:rPr>
+        <w:t xml:space="preserve"> ForecastResult</w:t>
+      </w:r>
+    </w:p>
+    <w:p>
+      <w:pPr>
+        <w:spacing w:after="0" w:line="240" w:lineRule="auto"/>
+        <w:rPr>
+          <w:noProof/>
+          <w:sz w:val="32"/>
+          <w:szCs w:val="32"/>
+        </w:rPr>
+      </w:pPr>
+      <w:r>
+        <w:rPr>
+          <w:rFonts w:ascii="Segoe UI Symbol" w:hAnsi="Segoe UI Symbol" w:cs="Segoe UI Symbol"/>
+          <w:noProof/>
+          <w:sz w:val="32"/>
+          <w:szCs w:val="32"/>
+        </w:rPr>
+        <w:t>✓</w:t>
+      </w:r>
+      <w:r>
+        <w:rPr>
+          <w:noProof/>
+          <w:sz w:val="32"/>
+          <w:szCs w:val="32"/>
+        </w:rPr>
+        <w:t xml:space="preserve"> ARIMA model</w:t>
+      </w:r>
+    </w:p>
+    <w:p>
+      <w:pPr>
+        <w:spacing w:after="0" w:line="240" w:lineRule="auto"/>
+        <w:rPr>
+          <w:noProof/>
+          <w:sz w:val="32"/>
+          <w:szCs w:val="32"/>
+        </w:rPr>
+      </w:pPr>
+      <w:r>
+        <w:rPr>
+          <w:rFonts w:ascii="Segoe UI Symbol" w:hAnsi="Segoe UI Symbol" w:cs="Segoe UI Symbol"/>
+          <w:noProof/>
+          <w:sz w:val="32"/>
+          <w:szCs w:val="32"/>
+        </w:rPr>
+        <w:t>✓</w:t>
+      </w:r>
+      <w:r>
+        <w:rPr>
+          <w:noProof/>
+          <w:sz w:val="32"/>
+          <w:szCs w:val="32"/>
+        </w:rPr>
+        <w:t xml:space="preserve"> ExperimentResult</w:t>
+      </w:r>
+    </w:p>
+    <w:p>
+      <w:pPr>
+        <w:spacing w:after="0" w:line="240" w:lineRule="auto"/>
+        <w:rPr>
+          <w:noProof/>
+          <w:sz w:val="32"/>
+          <w:szCs w:val="32"/>
+        </w:rPr>
+      </w:pPr>
+      <w:r>
+        <w:rPr>
+          <w:rFonts w:ascii="Segoe UI Symbol" w:hAnsi="Segoe UI Symbol" w:cs="Segoe UI Symbol"/>
+          <w:noProof/>
+          <w:sz w:val="32"/>
+          <w:szCs w:val="32"/>
+        </w:rPr>
+        <w:t>✓</w:t>
+      </w:r>
+      <w:r>
+        <w:rPr>
+          <w:noProof/>
+          <w:sz w:val="32"/>
+          <w:szCs w:val="32"/>
+        </w:rPr>
+        <w:t xml:space="preserve"> Timestamped result management</w:t>
+      </w:r>
+    </w:p>
+    <w:p>
+      <w:pPr>
+        <w:spacing w:after="0" w:line="240" w:lineRule="auto"/>
+        <w:rPr>
+          <w:noProof/>
+          <w:sz w:val="32"/>
+          <w:szCs w:val="32"/>
+        </w:rPr>
+      </w:pPr>
+      <w:r>
+        <w:rPr>
+          <w:rFonts w:ascii="Segoe UI Symbol" w:hAnsi="Segoe UI Symbol" w:cs="Segoe UI Symbol"/>
+          <w:noProof/>
+          <w:sz w:val="32"/>
+          <w:szCs w:val="32"/>
+        </w:rPr>
+        <w:t>✓</w:t>
+      </w:r>
+      <w:r>
+        <w:rPr>
+          <w:noProof/>
+          <w:sz w:val="32"/>
+          <w:szCs w:val="32"/>
+        </w:rPr>
+        <w:t xml:space="preserve"> JSON metadata support</w:t>
+      </w:r>
+    </w:p>
+    <w:p>
+      <w:pPr>
+        <w:spacing w:after="0" w:line="240" w:lineRule="auto"/>
+        <w:rPr>
+          <w:noProof/>
+          <w:sz w:val="32"/>
+          <w:szCs w:val="32"/>
+        </w:rPr>
+      </w:pPr>
+      <w:r>
+        <w:rPr>
+          <w:rFonts w:ascii="Segoe UI Symbol" w:hAnsi="Segoe UI Symbol" w:cs="Segoe UI Symbol"/>
+          <w:noProof/>
+          <w:sz w:val="32"/>
+          <w:szCs w:val="32"/>
+        </w:rPr>
+        <w:t>✓</w:t>
+      </w:r>
+      <w:r>
+        <w:rPr>
+          <w:noProof/>
+          <w:sz w:val="32"/>
+          <w:szCs w:val="32"/>
+        </w:rPr>
+        <w:t xml:space="preserve"> ~45 automated tests</w:t>
+      </w:r>
+    </w:p>
+    <w:p>
+      <w:pPr>
+        <w:rPr>
+          <w:noProof/>
+          <w:sz w:val="32"/>
+          <w:szCs w:val="32"/>
+        </w:rPr>
+      </w:pPr>
+      <w:r>
+        <w:rPr>
+          <w:noProof/>
+          <w:sz w:val="32"/>
+          <w:szCs w:val="32"/>
+        </w:rPr>
+        <w:br w:type="page"/>
+      </w:r>
+    </w:p>
+    <w:tbl>
+      <w:tblPr>
+        <w:tblW w:w="0" w:type="auto"/>
+        <w:tblCellSpacing w:w="15" w:type="dxa"/>
+        <w:tblBorders>
+          <w:top w:val="single" w:sz="4" w:space="0" w:color="auto"/>
+          <w:left w:val="single" w:sz="4" w:space="0" w:color="auto"/>
+          <w:bottom w:val="single" w:sz="4" w:space="0" w:color="auto"/>
+          <w:right w:val="single" w:sz="4" w:space="0" w:color="auto"/>
+          <w:insideH w:val="single" w:sz="4" w:space="0" w:color="auto"/>
+          <w:insideV w:val="single" w:sz="4" w:space="0" w:color="auto"/>
+        </w:tblBorders>
+        <w:tblCellMar>
+          <w:top w:w="15" w:type="dxa"/>
+          <w:left w:w="15" w:type="dxa"/>
+          <w:bottom w:w="15" w:type="dxa"/>
+          <w:right w:w="15" w:type="dxa"/>
+        </w:tblCellMar>
+        <w:tblLook w:val="04A0" w:firstRow="1" w:lastRow="0" w:firstColumn="1" w:lastColumn="0" w:noHBand="0" w:noVBand="1"/>
+      </w:tblPr>
+      <w:tblGrid>
+        <w:gridCol w:w="3402"/>
+        <w:gridCol w:w="3544"/>
+      </w:tblGrid>
+      <w:tr>
+        <w:trPr>
+          <w:tblHeader/>
+          <w:tblCellSpacing w:w="15" w:type="dxa"/>
+        </w:trPr>
+        <w:tc>
+          <w:tcPr>
+            <w:tcW w:w="3357" w:type="dxa"/>
+            <w:vAlign w:val="center"/>
+            <w:hideMark/>
+          </w:tcPr>
+          <w:p>
+            <w:pPr>
+              <w:spacing w:after="0" w:line="240" w:lineRule="auto"/>
+              <w:rPr>
+                <w:b/>
+                <w:bCs/>
+                <w:noProof/>
+                <w:sz w:val="32"/>
+                <w:szCs w:val="32"/>
+                <w:lang w:val="tr-TR"/>
+              </w:rPr>
+            </w:pPr>
+            <w:r>
+              <w:rPr>
+                <w:b/>
+                <w:bCs/>
+                <w:noProof/>
+                <w:sz w:val="32"/>
+                <w:szCs w:val="32"/>
+                <w:lang w:val="tr-TR"/>
+              </w:rPr>
+              <w:lastRenderedPageBreak/>
+              <w:t>Component</w:t>
+            </w:r>
+          </w:p>
+        </w:tc>
+        <w:tc>
+          <w:tcPr>
+            <w:tcW w:w="3499" w:type="dxa"/>
+            <w:vAlign w:val="center"/>
+            <w:hideMark/>
+          </w:tcPr>
+          <w:p>
+            <w:pPr>
+              <w:spacing w:after="0" w:line="240" w:lineRule="auto"/>
+              <w:rPr>
+                <w:b/>
+                <w:bCs/>
+                <w:noProof/>
+                <w:sz w:val="32"/>
+                <w:szCs w:val="32"/>
+                <w:lang w:val="tr-TR"/>
+              </w:rPr>
+            </w:pPr>
+            <w:r>
+              <w:rPr>
+                <w:b/>
+                <w:bCs/>
+                <w:noProof/>
+                <w:sz w:val="32"/>
+                <w:szCs w:val="32"/>
+                <w:lang w:val="tr-TR"/>
+              </w:rPr>
+              <w:t>Responsibility</w:t>
+            </w:r>
+          </w:p>
+        </w:tc>
+      </w:tr>
+      <w:tr>
+        <w:trPr>
+          <w:tblCellSpacing w:w="15" w:type="dxa"/>
+        </w:trPr>
+        <w:tc>
+          <w:tcPr>
+            <w:tcW w:w="3357" w:type="dxa"/>
+            <w:vAlign w:val="center"/>
+            <w:hideMark/>
+          </w:tcPr>
+          <w:p>
+            <w:pPr>
+              <w:spacing w:after="0" w:line="240" w:lineRule="auto"/>
+              <w:rPr>
+                <w:noProof/>
+                <w:sz w:val="32"/>
+                <w:szCs w:val="32"/>
+                <w:lang w:val="tr-TR"/>
+              </w:rPr>
+            </w:pPr>
+            <w:r>
+              <w:rPr>
+                <w:noProof/>
+                <w:sz w:val="32"/>
+                <w:szCs w:val="32"/>
+                <w:lang w:val="tr-TR"/>
+              </w:rPr>
+              <w:t>BatteryDataset</w:t>
+            </w:r>
+          </w:p>
+        </w:tc>
+        <w:tc>
+          <w:tcPr>
+            <w:tcW w:w="3499" w:type="dxa"/>
+            <w:vAlign w:val="center"/>
+            <w:hideMark/>
+          </w:tcPr>
+          <w:p>
+            <w:pPr>
+              <w:spacing w:after="0" w:line="240" w:lineRule="auto"/>
+              <w:rPr>
+                <w:noProof/>
+                <w:sz w:val="32"/>
+                <w:szCs w:val="32"/>
+                <w:lang w:val="tr-TR"/>
+              </w:rPr>
+            </w:pPr>
+            <w:r>
+              <w:rPr>
+                <w:noProof/>
+                <w:sz w:val="32"/>
+                <w:szCs w:val="32"/>
+                <w:lang w:val="tr-TR"/>
+              </w:rPr>
+              <w:t>Data</w:t>
+            </w:r>
+          </w:p>
+        </w:tc>
+      </w:tr>
+      <w:tr>
+        <w:trPr>
+          <w:tblCellSpacing w:w="15" w:type="dxa"/>
+        </w:trPr>
+        <w:tc>
+          <w:tcPr>
+            <w:tcW w:w="3357" w:type="dxa"/>
+            <w:vAlign w:val="center"/>
+            <w:hideMark/>
+          </w:tcPr>
+          <w:p>
+            <w:pPr>
+              <w:spacing w:after="0" w:line="240" w:lineRule="auto"/>
+              <w:rPr>
+                <w:noProof/>
+                <w:sz w:val="32"/>
+                <w:szCs w:val="32"/>
+                <w:lang w:val="tr-TR"/>
+              </w:rPr>
+            </w:pPr>
+            <w:r>
+              <w:rPr>
+                <w:noProof/>
+                <w:sz w:val="32"/>
+                <w:szCs w:val="32"/>
+                <w:lang w:val="tr-TR"/>
+              </w:rPr>
+              <w:t>ForecastPipeline</w:t>
+            </w:r>
+          </w:p>
+        </w:tc>
+        <w:tc>
+          <w:tcPr>
+            <w:tcW w:w="3499" w:type="dxa"/>
+            <w:vAlign w:val="center"/>
+            <w:hideMark/>
+          </w:tcPr>
+          <w:p>
+            <w:pPr>
+              <w:spacing w:after="0" w:line="240" w:lineRule="auto"/>
+              <w:rPr>
+                <w:noProof/>
+                <w:sz w:val="32"/>
+                <w:szCs w:val="32"/>
+                <w:lang w:val="tr-TR"/>
+              </w:rPr>
+            </w:pPr>
+            <w:r>
+              <w:rPr>
+                <w:noProof/>
+                <w:sz w:val="32"/>
+                <w:szCs w:val="32"/>
+                <w:lang w:val="tr-TR"/>
+              </w:rPr>
+              <w:t>Workflow</w:t>
+            </w:r>
+          </w:p>
+        </w:tc>
+      </w:tr>
+      <w:tr>
+        <w:trPr>
+          <w:tblCellSpacing w:w="15" w:type="dxa"/>
+        </w:trPr>
+        <w:tc>
+          <w:tcPr>
+            <w:tcW w:w="3357" w:type="dxa"/>
+            <w:vAlign w:val="center"/>
+            <w:hideMark/>
+          </w:tcPr>
+          <w:p>
+            <w:pPr>
+              <w:spacing w:after="0" w:line="240" w:lineRule="auto"/>
+              <w:rPr>
+                <w:noProof/>
+                <w:sz w:val="32"/>
+                <w:szCs w:val="32"/>
+                <w:lang w:val="tr-TR"/>
+              </w:rPr>
+            </w:pPr>
+            <w:r>
+              <w:rPr>
+                <w:noProof/>
+                <w:sz w:val="32"/>
+                <w:szCs w:val="32"/>
+                <w:lang w:val="tr-TR"/>
+              </w:rPr>
+              <w:t>BaseForecastModel</w:t>
+            </w:r>
+          </w:p>
+        </w:tc>
+        <w:tc>
+          <w:tcPr>
+            <w:tcW w:w="3499" w:type="dxa"/>
+            <w:vAlign w:val="center"/>
+            <w:hideMark/>
+          </w:tcPr>
+          <w:p>
+            <w:pPr>
+              <w:spacing w:after="0" w:line="240" w:lineRule="auto"/>
+              <w:rPr>
+                <w:noProof/>
+                <w:sz w:val="32"/>
+                <w:szCs w:val="32"/>
+                <w:lang w:val="tr-TR"/>
+              </w:rPr>
+            </w:pPr>
+            <w:r>
+              <w:rPr>
+                <w:noProof/>
+                <w:sz w:val="32"/>
+                <w:szCs w:val="32"/>
+                <w:lang w:val="tr-TR"/>
+              </w:rPr>
+              <w:t>Forecast interface</w:t>
+            </w:r>
+          </w:p>
+        </w:tc>
+      </w:tr>
+      <w:tr>
+        <w:trPr>
+          <w:tblCellSpacing w:w="15" w:type="dxa"/>
+        </w:trPr>
+        <w:tc>
+          <w:tcPr>
+            <w:tcW w:w="3357" w:type="dxa"/>
+            <w:vAlign w:val="center"/>
+            <w:hideMark/>
+          </w:tcPr>
+          <w:p>
+            <w:pPr>
+              <w:spacing w:after="0" w:line="240" w:lineRule="auto"/>
+              <w:rPr>
+                <w:noProof/>
+                <w:sz w:val="32"/>
+                <w:szCs w:val="32"/>
+                <w:lang w:val="tr-TR"/>
+              </w:rPr>
+            </w:pPr>
+            <w:r>
+              <w:rPr>
+                <w:noProof/>
+                <w:sz w:val="32"/>
+                <w:szCs w:val="32"/>
+                <w:lang w:val="tr-TR"/>
+              </w:rPr>
+              <w:t>ForecastResult</w:t>
+            </w:r>
+          </w:p>
+        </w:tc>
+        <w:tc>
+          <w:tcPr>
+            <w:tcW w:w="3499" w:type="dxa"/>
+            <w:vAlign w:val="center"/>
+            <w:hideMark/>
+          </w:tcPr>
+          <w:p>
+            <w:pPr>
+              <w:spacing w:after="0" w:line="240" w:lineRule="auto"/>
+              <w:rPr>
+                <w:noProof/>
+                <w:sz w:val="32"/>
+                <w:szCs w:val="32"/>
+                <w:lang w:val="tr-TR"/>
+              </w:rPr>
+            </w:pPr>
+            <w:r>
+              <w:rPr>
+                <w:noProof/>
+                <w:sz w:val="32"/>
+                <w:szCs w:val="32"/>
+                <w:lang w:val="tr-TR"/>
+              </w:rPr>
+              <w:t>Forecast output</w:t>
+            </w:r>
+          </w:p>
+        </w:tc>
+      </w:tr>
+      <w:tr>
+        <w:trPr>
+          <w:tblCellSpacing w:w="15" w:type="dxa"/>
+        </w:trPr>
+        <w:tc>
+          <w:tcPr>
+            <w:tcW w:w="3357" w:type="dxa"/>
+            <w:vAlign w:val="center"/>
+            <w:hideMark/>
+          </w:tcPr>
+          <w:p>
+            <w:pPr>
+              <w:spacing w:after="0" w:line="240" w:lineRule="auto"/>
+              <w:rPr>
+                <w:noProof/>
+                <w:sz w:val="32"/>
+                <w:szCs w:val="32"/>
+                <w:lang w:val="tr-TR"/>
+              </w:rPr>
+            </w:pPr>
+            <w:r>
+              <w:rPr>
+                <w:noProof/>
+                <w:sz w:val="32"/>
+                <w:szCs w:val="32"/>
+                <w:lang w:val="tr-TR"/>
+              </w:rPr>
+              <w:t>ExperimentResult</w:t>
+            </w:r>
+          </w:p>
+        </w:tc>
+        <w:tc>
+          <w:tcPr>
+            <w:tcW w:w="3499" w:type="dxa"/>
+            <w:vAlign w:val="center"/>
+            <w:hideMark/>
+          </w:tcPr>
+          <w:p>
+            <w:pPr>
+              <w:spacing w:after="0" w:line="240" w:lineRule="auto"/>
+              <w:rPr>
+                <w:noProof/>
+                <w:sz w:val="32"/>
+                <w:szCs w:val="32"/>
+                <w:lang w:val="tr-TR"/>
+              </w:rPr>
+            </w:pPr>
+            <w:r>
+              <w:rPr>
+                <w:noProof/>
+                <w:sz w:val="32"/>
+                <w:szCs w:val="32"/>
+                <w:lang w:val="tr-TR"/>
+              </w:rPr>
+              <w:t>Experiment artifacts</w:t>
+            </w:r>
+          </w:p>
+        </w:tc>
+      </w:tr>
+      <w:tr>
+        <w:trPr>
+          <w:tblCellSpacing w:w="15" w:type="dxa"/>
+        </w:trPr>
+        <w:tc>
+          <w:tcPr>
+            <w:tcW w:w="3357" w:type="dxa"/>
+            <w:vAlign w:val="center"/>
+            <w:hideMark/>
+          </w:tcPr>
+          <w:p>
+            <w:pPr>
+              <w:spacing w:after="0" w:line="240" w:lineRule="auto"/>
+              <w:rPr>
+                <w:noProof/>
+                <w:sz w:val="32"/>
+                <w:szCs w:val="32"/>
+                <w:lang w:val="tr-TR"/>
+              </w:rPr>
+            </w:pPr>
+            <w:r>
+              <w:rPr>
+                <w:b/>
+                <w:bCs/>
+                <w:noProof/>
+                <w:sz w:val="32"/>
+                <w:szCs w:val="32"/>
+                <w:lang w:val="tr-TR"/>
+              </w:rPr>
+              <w:t>ForecastPlot</w:t>
+            </w:r>
+          </w:p>
+        </w:tc>
+        <w:tc>
+          <w:tcPr>
+            <w:tcW w:w="3499" w:type="dxa"/>
+            <w:vAlign w:val="center"/>
+            <w:hideMark/>
+          </w:tcPr>
+          <w:p>
+            <w:pPr>
+              <w:spacing w:after="0" w:line="240" w:lineRule="auto"/>
+              <w:rPr>
+                <w:noProof/>
+                <w:sz w:val="32"/>
+                <w:szCs w:val="32"/>
+                <w:lang w:val="tr-TR"/>
+              </w:rPr>
+            </w:pPr>
+            <w:r>
+              <w:rPr>
+                <w:noProof/>
+                <w:sz w:val="32"/>
+                <w:szCs w:val="32"/>
+                <w:lang w:val="tr-TR"/>
+              </w:rPr>
+              <w:t>Visualization</w:t>
+            </w:r>
+          </w:p>
+        </w:tc>
+      </w:tr>
+    </w:tbl>
+    <w:p>
+      <w:pPr>
+        <w:spacing w:after="0" w:line="240" w:lineRule="auto"/>
+        <w:rPr>
+          <w:noProof/>
+          <w:sz w:val="32"/>
+          <w:szCs w:val="32"/>
+        </w:rPr>
+      </w:pPr>
     </w:p>
     <w:p>
       <w:pPr>

</xml_diff>

<commit_message>
Add ExperimentRegistry for experiment tracking
</commit_message>
<xml_diff>
--- a/docs/development_flow.docx
+++ b/docs/development_flow.docx
@@ -10314,609 +10314,934 @@
           <w:szCs w:val="36"/>
           <w:u w:val="single"/>
         </w:rPr>
-        <w:t>The framework now has a complete chain</w:t>
-      </w:r>
-      <w:r>
-        <w:rPr>
-          <w:noProof/>
-          <w:sz w:val="36"/>
-          <w:szCs w:val="36"/>
+        <w:t>The framework now has a complete chain:</w:t>
+      </w:r>
+    </w:p>
+    <w:p>
+      <w:pPr>
+        <w:spacing w:after="0" w:line="240" w:lineRule="auto"/>
+        <w:rPr>
+          <w:noProof/>
+          <w:sz w:val="32"/>
+          <w:szCs w:val="32"/>
+        </w:rPr>
+      </w:pPr>
+    </w:p>
+    <w:p>
+      <w:pPr>
+        <w:spacing w:after="0" w:line="240" w:lineRule="auto"/>
+        <w:rPr>
+          <w:noProof/>
+          <w:sz w:val="32"/>
+          <w:szCs w:val="32"/>
+        </w:rPr>
+      </w:pPr>
+      <w:r>
+        <w:rPr>
+          <w:noProof/>
+          <w:sz w:val="32"/>
+          <w:szCs w:val="32"/>
+        </w:rPr>
+        <w:t>Raw Dataset</w:t>
+      </w:r>
+    </w:p>
+    <w:p>
+      <w:pPr>
+        <w:spacing w:after="0" w:line="240" w:lineRule="auto"/>
+        <w:rPr>
+          <w:noProof/>
+          <w:sz w:val="32"/>
+          <w:szCs w:val="32"/>
+        </w:rPr>
+      </w:pPr>
+      <w:r>
+        <w:rPr>
+          <w:noProof/>
+          <w:sz w:val="32"/>
+          <w:szCs w:val="32"/>
+        </w:rPr>
+        <w:t xml:space="preserve">     │</w:t>
+      </w:r>
+    </w:p>
+    <w:p>
+      <w:pPr>
+        <w:spacing w:after="0" w:line="240" w:lineRule="auto"/>
+        <w:rPr>
+          <w:noProof/>
+          <w:sz w:val="32"/>
+          <w:szCs w:val="32"/>
+        </w:rPr>
+      </w:pPr>
+      <w:r>
+        <w:rPr>
+          <w:noProof/>
+          <w:sz w:val="32"/>
+          <w:szCs w:val="32"/>
+        </w:rPr>
+        <w:t xml:space="preserve">     </w:t>
+      </w:r>
+      <w:r>
+        <w:rPr>
+          <w:rFonts w:ascii="Arial" w:hAnsi="Arial" w:cs="Arial"/>
+          <w:noProof/>
+          <w:sz w:val="32"/>
+          <w:szCs w:val="32"/>
+        </w:rPr>
+        <w:t>▼</w:t>
+      </w:r>
+    </w:p>
+    <w:p>
+      <w:pPr>
+        <w:spacing w:after="0" w:line="240" w:lineRule="auto"/>
+        <w:rPr>
+          <w:noProof/>
+          <w:sz w:val="32"/>
+          <w:szCs w:val="32"/>
+        </w:rPr>
+      </w:pPr>
+      <w:r>
+        <w:rPr>
+          <w:noProof/>
+          <w:sz w:val="32"/>
+          <w:szCs w:val="32"/>
+        </w:rPr>
+        <w:t>Smart Loader</w:t>
+      </w:r>
+    </w:p>
+    <w:p>
+      <w:pPr>
+        <w:spacing w:after="0" w:line="240" w:lineRule="auto"/>
+        <w:rPr>
+          <w:noProof/>
+          <w:sz w:val="32"/>
+          <w:szCs w:val="32"/>
+        </w:rPr>
+      </w:pPr>
+      <w:r>
+        <w:rPr>
+          <w:noProof/>
+          <w:sz w:val="32"/>
+          <w:szCs w:val="32"/>
+        </w:rPr>
+        <w:t xml:space="preserve">     │</w:t>
+      </w:r>
+    </w:p>
+    <w:p>
+      <w:pPr>
+        <w:spacing w:after="0" w:line="240" w:lineRule="auto"/>
+        <w:rPr>
+          <w:noProof/>
+          <w:sz w:val="32"/>
+          <w:szCs w:val="32"/>
+        </w:rPr>
+      </w:pPr>
+      <w:r>
+        <w:rPr>
+          <w:noProof/>
+          <w:sz w:val="32"/>
+          <w:szCs w:val="32"/>
+        </w:rPr>
+        <w:t xml:space="preserve">     </w:t>
+      </w:r>
+      <w:r>
+        <w:rPr>
+          <w:rFonts w:ascii="Arial" w:hAnsi="Arial" w:cs="Arial"/>
+          <w:noProof/>
+          <w:sz w:val="32"/>
+          <w:szCs w:val="32"/>
+        </w:rPr>
+        <w:t>▼</w:t>
+      </w:r>
+    </w:p>
+    <w:p>
+      <w:pPr>
+        <w:spacing w:after="0" w:line="240" w:lineRule="auto"/>
+        <w:rPr>
+          <w:noProof/>
+          <w:sz w:val="32"/>
+          <w:szCs w:val="32"/>
+        </w:rPr>
+      </w:pPr>
+      <w:r>
+        <w:rPr>
+          <w:noProof/>
+          <w:sz w:val="32"/>
+          <w:szCs w:val="32"/>
+        </w:rPr>
+        <w:t>BatteryDataset</w:t>
+      </w:r>
+    </w:p>
+    <w:p>
+      <w:pPr>
+        <w:spacing w:after="0" w:line="240" w:lineRule="auto"/>
+        <w:rPr>
+          <w:noProof/>
+          <w:sz w:val="32"/>
+          <w:szCs w:val="32"/>
+        </w:rPr>
+      </w:pPr>
+      <w:r>
+        <w:rPr>
+          <w:noProof/>
+          <w:sz w:val="32"/>
+          <w:szCs w:val="32"/>
+        </w:rPr>
+        <w:t xml:space="preserve">     │</w:t>
+      </w:r>
+    </w:p>
+    <w:p>
+      <w:pPr>
+        <w:spacing w:after="0" w:line="240" w:lineRule="auto"/>
+        <w:rPr>
+          <w:noProof/>
+          <w:sz w:val="32"/>
+          <w:szCs w:val="32"/>
+        </w:rPr>
+      </w:pPr>
+      <w:r>
+        <w:rPr>
+          <w:noProof/>
+          <w:sz w:val="32"/>
+          <w:szCs w:val="32"/>
+        </w:rPr>
+        <w:t xml:space="preserve">     </w:t>
+      </w:r>
+      <w:r>
+        <w:rPr>
+          <w:rFonts w:ascii="Arial" w:hAnsi="Arial" w:cs="Arial"/>
+          <w:noProof/>
+          <w:sz w:val="32"/>
+          <w:szCs w:val="32"/>
+        </w:rPr>
+        <w:t>▼</w:t>
+      </w:r>
+    </w:p>
+    <w:p>
+      <w:pPr>
+        <w:spacing w:after="0" w:line="240" w:lineRule="auto"/>
+        <w:rPr>
+          <w:noProof/>
+          <w:sz w:val="32"/>
+          <w:szCs w:val="32"/>
+        </w:rPr>
+      </w:pPr>
+      <w:r>
+        <w:rPr>
+          <w:noProof/>
+          <w:sz w:val="32"/>
+          <w:szCs w:val="32"/>
+        </w:rPr>
+        <w:t>ForecastPipeline</w:t>
+      </w:r>
+    </w:p>
+    <w:p>
+      <w:pPr>
+        <w:spacing w:after="0" w:line="240" w:lineRule="auto"/>
+        <w:rPr>
+          <w:noProof/>
+          <w:sz w:val="32"/>
+          <w:szCs w:val="32"/>
+        </w:rPr>
+      </w:pPr>
+      <w:r>
+        <w:rPr>
+          <w:noProof/>
+          <w:sz w:val="32"/>
+          <w:szCs w:val="32"/>
+        </w:rPr>
+        <w:t xml:space="preserve">     │</w:t>
+      </w:r>
+    </w:p>
+    <w:p>
+      <w:pPr>
+        <w:spacing w:after="0" w:line="240" w:lineRule="auto"/>
+        <w:rPr>
+          <w:noProof/>
+          <w:sz w:val="32"/>
+          <w:szCs w:val="32"/>
+        </w:rPr>
+      </w:pPr>
+      <w:r>
+        <w:rPr>
+          <w:noProof/>
+          <w:sz w:val="32"/>
+          <w:szCs w:val="32"/>
+        </w:rPr>
+        <w:t xml:space="preserve">     </w:t>
+      </w:r>
+      <w:r>
+        <w:rPr>
+          <w:rFonts w:ascii="Arial" w:hAnsi="Arial" w:cs="Arial"/>
+          <w:noProof/>
+          <w:sz w:val="32"/>
+          <w:szCs w:val="32"/>
+        </w:rPr>
+        <w:t>▼</w:t>
+      </w:r>
+    </w:p>
+    <w:p>
+      <w:pPr>
+        <w:spacing w:after="0" w:line="240" w:lineRule="auto"/>
+        <w:rPr>
+          <w:noProof/>
+          <w:sz w:val="32"/>
+          <w:szCs w:val="32"/>
+        </w:rPr>
+      </w:pPr>
+      <w:r>
+        <w:rPr>
+          <w:noProof/>
+          <w:sz w:val="32"/>
+          <w:szCs w:val="32"/>
+        </w:rPr>
+        <w:t>ForecastModel</w:t>
+      </w:r>
+    </w:p>
+    <w:p>
+      <w:pPr>
+        <w:spacing w:after="0" w:line="240" w:lineRule="auto"/>
+        <w:rPr>
+          <w:noProof/>
+          <w:sz w:val="32"/>
+          <w:szCs w:val="32"/>
+        </w:rPr>
+      </w:pPr>
+      <w:r>
+        <w:rPr>
+          <w:noProof/>
+          <w:sz w:val="32"/>
+          <w:szCs w:val="32"/>
+        </w:rPr>
+        <w:t xml:space="preserve">     │</w:t>
+      </w:r>
+    </w:p>
+    <w:p>
+      <w:pPr>
+        <w:spacing w:after="0" w:line="240" w:lineRule="auto"/>
+        <w:rPr>
+          <w:noProof/>
+          <w:sz w:val="32"/>
+          <w:szCs w:val="32"/>
+        </w:rPr>
+      </w:pPr>
+      <w:r>
+        <w:rPr>
+          <w:noProof/>
+          <w:sz w:val="32"/>
+          <w:szCs w:val="32"/>
+        </w:rPr>
+        <w:t xml:space="preserve">     </w:t>
+      </w:r>
+      <w:r>
+        <w:rPr>
+          <w:rFonts w:ascii="Arial" w:hAnsi="Arial" w:cs="Arial"/>
+          <w:noProof/>
+          <w:sz w:val="32"/>
+          <w:szCs w:val="32"/>
+        </w:rPr>
+        <w:t>▼</w:t>
+      </w:r>
+    </w:p>
+    <w:p>
+      <w:pPr>
+        <w:spacing w:after="0" w:line="240" w:lineRule="auto"/>
+        <w:rPr>
+          <w:noProof/>
+          <w:sz w:val="32"/>
+          <w:szCs w:val="32"/>
+        </w:rPr>
+      </w:pPr>
+      <w:r>
+        <w:rPr>
+          <w:noProof/>
+          <w:sz w:val="32"/>
+          <w:szCs w:val="32"/>
+        </w:rPr>
+        <w:t>ForecastResult</w:t>
+      </w:r>
+    </w:p>
+    <w:p>
+      <w:pPr>
+        <w:spacing w:after="0" w:line="240" w:lineRule="auto"/>
+        <w:rPr>
+          <w:noProof/>
+          <w:sz w:val="32"/>
+          <w:szCs w:val="32"/>
+        </w:rPr>
+      </w:pPr>
+      <w:r>
+        <w:rPr>
+          <w:noProof/>
+          <w:sz w:val="32"/>
+          <w:szCs w:val="32"/>
+        </w:rPr>
+        <w:t xml:space="preserve">     │</w:t>
+      </w:r>
+    </w:p>
+    <w:p>
+      <w:pPr>
+        <w:spacing w:after="0" w:line="240" w:lineRule="auto"/>
+        <w:rPr>
+          <w:noProof/>
+          <w:sz w:val="32"/>
+          <w:szCs w:val="32"/>
+        </w:rPr>
+      </w:pPr>
+      <w:r>
+        <w:rPr>
+          <w:noProof/>
+          <w:sz w:val="32"/>
+          <w:szCs w:val="32"/>
+        </w:rPr>
+        <w:t xml:space="preserve">     </w:t>
+      </w:r>
+      <w:r>
+        <w:rPr>
+          <w:rFonts w:ascii="Arial" w:hAnsi="Arial" w:cs="Arial"/>
+          <w:noProof/>
+          <w:sz w:val="32"/>
+          <w:szCs w:val="32"/>
+        </w:rPr>
+        <w:t>▼</w:t>
+      </w:r>
+    </w:p>
+    <w:p>
+      <w:pPr>
+        <w:spacing w:after="0" w:line="240" w:lineRule="auto"/>
+        <w:rPr>
+          <w:noProof/>
+          <w:sz w:val="32"/>
+          <w:szCs w:val="32"/>
+        </w:rPr>
+      </w:pPr>
+      <w:r>
+        <w:rPr>
+          <w:noProof/>
+          <w:sz w:val="32"/>
+          <w:szCs w:val="32"/>
+        </w:rPr>
+        <w:t>ForecastPlot</w:t>
+      </w:r>
+    </w:p>
+    <w:p>
+      <w:pPr>
+        <w:spacing w:after="0" w:line="240" w:lineRule="auto"/>
+        <w:rPr>
+          <w:noProof/>
+          <w:sz w:val="32"/>
+          <w:szCs w:val="32"/>
+        </w:rPr>
+      </w:pPr>
+      <w:r>
+        <w:rPr>
+          <w:noProof/>
+          <w:sz w:val="32"/>
+          <w:szCs w:val="32"/>
+        </w:rPr>
+        <w:t xml:space="preserve">     │</w:t>
+      </w:r>
+    </w:p>
+    <w:p>
+      <w:pPr>
+        <w:spacing w:after="0" w:line="240" w:lineRule="auto"/>
+        <w:rPr>
+          <w:noProof/>
+          <w:sz w:val="32"/>
+          <w:szCs w:val="32"/>
+        </w:rPr>
+      </w:pPr>
+      <w:r>
+        <w:rPr>
+          <w:noProof/>
+          <w:sz w:val="32"/>
+          <w:szCs w:val="32"/>
+        </w:rPr>
+        <w:t xml:space="preserve">     </w:t>
+      </w:r>
+      <w:r>
+        <w:rPr>
+          <w:rFonts w:ascii="Arial" w:hAnsi="Arial" w:cs="Arial"/>
+          <w:noProof/>
+          <w:sz w:val="32"/>
+          <w:szCs w:val="32"/>
+        </w:rPr>
+        <w:t>▼</w:t>
+      </w:r>
+    </w:p>
+    <w:p>
+      <w:pPr>
+        <w:spacing w:after="0" w:line="240" w:lineRule="auto"/>
+        <w:rPr>
+          <w:noProof/>
+          <w:sz w:val="32"/>
+          <w:szCs w:val="32"/>
+        </w:rPr>
+      </w:pPr>
+      <w:r>
+        <w:rPr>
+          <w:noProof/>
+          <w:sz w:val="32"/>
+          <w:szCs w:val="32"/>
+        </w:rPr>
+        <w:t>ExperimentResult</w:t>
+      </w:r>
+    </w:p>
+    <w:p>
+      <w:pPr>
+        <w:spacing w:after="0" w:line="240" w:lineRule="auto"/>
+        <w:rPr>
+          <w:noProof/>
+          <w:sz w:val="32"/>
+          <w:szCs w:val="32"/>
+        </w:rPr>
+      </w:pPr>
+      <w:r>
+        <w:rPr>
+          <w:noProof/>
+          <w:sz w:val="32"/>
+          <w:szCs w:val="32"/>
+        </w:rPr>
+        <w:t xml:space="preserve">     │</w:t>
+      </w:r>
+    </w:p>
+    <w:p>
+      <w:pPr>
+        <w:spacing w:after="0" w:line="240" w:lineRule="auto"/>
+        <w:rPr>
+          <w:noProof/>
+          <w:sz w:val="32"/>
+          <w:szCs w:val="32"/>
+        </w:rPr>
+      </w:pPr>
+      <w:r>
+        <w:rPr>
+          <w:noProof/>
+          <w:sz w:val="32"/>
+          <w:szCs w:val="32"/>
+        </w:rPr>
+        <w:t xml:space="preserve">     </w:t>
+      </w:r>
+      <w:r>
+        <w:rPr>
+          <w:rFonts w:ascii="MS Gothic" w:eastAsia="MS Gothic" w:hAnsi="MS Gothic" w:cs="MS Gothic" w:hint="eastAsia"/>
+          <w:noProof/>
+          <w:sz w:val="32"/>
+          <w:szCs w:val="32"/>
+        </w:rPr>
+        <w:t>├</w:t>
+      </w:r>
+      <w:r>
+        <w:rPr>
+          <w:rFonts w:ascii="Calibri" w:hAnsi="Calibri" w:cs="Calibri"/>
+          <w:noProof/>
+          <w:sz w:val="32"/>
+          <w:szCs w:val="32"/>
+        </w:rPr>
+        <w:t>──</w:t>
+      </w:r>
+      <w:r>
+        <w:rPr>
+          <w:noProof/>
+          <w:sz w:val="32"/>
+          <w:szCs w:val="32"/>
+        </w:rPr>
+        <w:t xml:space="preserve"> PNG</w:t>
+      </w:r>
+    </w:p>
+    <w:p>
+      <w:pPr>
+        <w:spacing w:after="0" w:line="240" w:lineRule="auto"/>
+        <w:rPr>
+          <w:noProof/>
+          <w:sz w:val="32"/>
+          <w:szCs w:val="32"/>
+        </w:rPr>
+      </w:pPr>
+      <w:r>
+        <w:rPr>
+          <w:noProof/>
+          <w:sz w:val="32"/>
+          <w:szCs w:val="32"/>
+        </w:rPr>
+        <w:t xml:space="preserve">     </w:t>
+      </w:r>
+      <w:r>
+        <w:rPr>
+          <w:rFonts w:ascii="MS Gothic" w:eastAsia="MS Gothic" w:hAnsi="MS Gothic" w:cs="MS Gothic" w:hint="eastAsia"/>
+          <w:noProof/>
+          <w:sz w:val="32"/>
+          <w:szCs w:val="32"/>
+        </w:rPr>
+        <w:t>├</w:t>
+      </w:r>
+      <w:r>
+        <w:rPr>
+          <w:rFonts w:ascii="Calibri" w:hAnsi="Calibri" w:cs="Calibri"/>
+          <w:noProof/>
+          <w:sz w:val="32"/>
+          <w:szCs w:val="32"/>
+        </w:rPr>
+        <w:t>──</w:t>
+      </w:r>
+      <w:r>
+        <w:rPr>
+          <w:noProof/>
+          <w:sz w:val="32"/>
+          <w:szCs w:val="32"/>
+        </w:rPr>
+        <w:t xml:space="preserve"> JSON</w:t>
+      </w:r>
+    </w:p>
+    <w:p>
+      <w:pPr>
+        <w:spacing w:after="0" w:line="240" w:lineRule="auto"/>
+        <w:rPr>
+          <w:noProof/>
+          <w:sz w:val="32"/>
+          <w:szCs w:val="32"/>
+        </w:rPr>
+      </w:pPr>
+      <w:r>
+        <w:rPr>
+          <w:noProof/>
+          <w:sz w:val="32"/>
+          <w:szCs w:val="32"/>
+        </w:rPr>
+        <w:t xml:space="preserve">     └── TXT</w:t>
+      </w:r>
+    </w:p>
+    <w:p>
+      <w:pPr>
+        <w:spacing w:after="0" w:line="240" w:lineRule="auto"/>
+        <w:rPr>
+          <w:noProof/>
+          <w:sz w:val="32"/>
+          <w:szCs w:val="32"/>
+        </w:rPr>
+      </w:pPr>
+    </w:p>
+    <w:p>
+      <w:pPr>
+        <w:rPr>
+          <w:noProof/>
+          <w:sz w:val="32"/>
+          <w:szCs w:val="32"/>
+        </w:rPr>
+      </w:pPr>
+      <w:r>
+        <w:rPr>
+          <w:noProof/>
+          <w:sz w:val="32"/>
+          <w:szCs w:val="32"/>
+        </w:rPr>
+        <w:br w:type="page"/>
+      </w:r>
+    </w:p>
+    <w:p>
+      <w:pPr>
+        <w:spacing w:after="0" w:line="240" w:lineRule="auto"/>
+        <w:rPr>
+          <w:b/>
+          <w:bCs/>
+          <w:noProof/>
+          <w:sz w:val="40"/>
+          <w:szCs w:val="40"/>
           <w:u w:val="single"/>
         </w:rPr>
-        <w:t>:</w:t>
-      </w:r>
-    </w:p>
-    <w:p>
-      <w:pPr>
-        <w:spacing w:after="0" w:line="240" w:lineRule="auto"/>
-        <w:rPr>
-          <w:noProof/>
-          <w:sz w:val="32"/>
-          <w:szCs w:val="32"/>
-        </w:rPr>
-      </w:pPr>
-    </w:p>
-    <w:p>
-      <w:pPr>
-        <w:spacing w:after="0" w:line="240" w:lineRule="auto"/>
-        <w:rPr>
-          <w:noProof/>
-          <w:sz w:val="32"/>
-          <w:szCs w:val="32"/>
-        </w:rPr>
-      </w:pPr>
-      <w:r>
-        <w:rPr>
-          <w:noProof/>
-          <w:sz w:val="32"/>
-          <w:szCs w:val="32"/>
-        </w:rPr>
-        <w:t>Raw Dataset</w:t>
-      </w:r>
-    </w:p>
-    <w:p>
-      <w:pPr>
-        <w:spacing w:after="0" w:line="240" w:lineRule="auto"/>
-        <w:rPr>
-          <w:noProof/>
-          <w:sz w:val="32"/>
-          <w:szCs w:val="32"/>
-        </w:rPr>
-      </w:pPr>
-      <w:r>
-        <w:rPr>
-          <w:noProof/>
-          <w:sz w:val="32"/>
-          <w:szCs w:val="32"/>
-        </w:rPr>
-        <w:t xml:space="preserve">     │</w:t>
-      </w:r>
-    </w:p>
-    <w:p>
-      <w:pPr>
-        <w:spacing w:after="0" w:line="240" w:lineRule="auto"/>
-        <w:rPr>
-          <w:noProof/>
-          <w:sz w:val="32"/>
-          <w:szCs w:val="32"/>
-        </w:rPr>
-      </w:pPr>
-      <w:r>
-        <w:rPr>
-          <w:noProof/>
-          <w:sz w:val="32"/>
-          <w:szCs w:val="32"/>
-        </w:rPr>
-        <w:t xml:space="preserve">     </w:t>
-      </w:r>
-      <w:r>
-        <w:rPr>
-          <w:rFonts w:ascii="Arial" w:hAnsi="Arial" w:cs="Arial"/>
-          <w:noProof/>
-          <w:sz w:val="32"/>
-          <w:szCs w:val="32"/>
-        </w:rPr>
-        <w:t>▼</w:t>
-      </w:r>
-    </w:p>
-    <w:p>
-      <w:pPr>
-        <w:spacing w:after="0" w:line="240" w:lineRule="auto"/>
-        <w:rPr>
-          <w:noProof/>
-          <w:sz w:val="32"/>
-          <w:szCs w:val="32"/>
-        </w:rPr>
-      </w:pPr>
-      <w:r>
-        <w:rPr>
-          <w:noProof/>
-          <w:sz w:val="32"/>
-          <w:szCs w:val="32"/>
-        </w:rPr>
-        <w:t>Smart Loader</w:t>
-      </w:r>
-    </w:p>
-    <w:p>
-      <w:pPr>
-        <w:spacing w:after="0" w:line="240" w:lineRule="auto"/>
-        <w:rPr>
-          <w:noProof/>
-          <w:sz w:val="32"/>
-          <w:szCs w:val="32"/>
-        </w:rPr>
-      </w:pPr>
-      <w:r>
-        <w:rPr>
-          <w:noProof/>
-          <w:sz w:val="32"/>
-          <w:szCs w:val="32"/>
-        </w:rPr>
-        <w:t xml:space="preserve">     │</w:t>
-      </w:r>
-    </w:p>
-    <w:p>
-      <w:pPr>
-        <w:spacing w:after="0" w:line="240" w:lineRule="auto"/>
-        <w:rPr>
-          <w:noProof/>
-          <w:sz w:val="32"/>
-          <w:szCs w:val="32"/>
-        </w:rPr>
-      </w:pPr>
-      <w:r>
-        <w:rPr>
-          <w:noProof/>
-          <w:sz w:val="32"/>
-          <w:szCs w:val="32"/>
-        </w:rPr>
-        <w:t xml:space="preserve">     </w:t>
-      </w:r>
-      <w:r>
-        <w:rPr>
-          <w:rFonts w:ascii="Arial" w:hAnsi="Arial" w:cs="Arial"/>
-          <w:noProof/>
-          <w:sz w:val="32"/>
-          <w:szCs w:val="32"/>
-        </w:rPr>
-        <w:t>▼</w:t>
-      </w:r>
-    </w:p>
-    <w:p>
-      <w:pPr>
-        <w:spacing w:after="0" w:line="240" w:lineRule="auto"/>
-        <w:rPr>
-          <w:noProof/>
-          <w:sz w:val="32"/>
-          <w:szCs w:val="32"/>
-        </w:rPr>
-      </w:pPr>
-      <w:r>
-        <w:rPr>
-          <w:noProof/>
-          <w:sz w:val="32"/>
-          <w:szCs w:val="32"/>
-        </w:rPr>
-        <w:t>BatteryDataset</w:t>
-      </w:r>
-    </w:p>
-    <w:p>
-      <w:pPr>
-        <w:spacing w:after="0" w:line="240" w:lineRule="auto"/>
-        <w:rPr>
-          <w:noProof/>
-          <w:sz w:val="32"/>
-          <w:szCs w:val="32"/>
-        </w:rPr>
-      </w:pPr>
-      <w:r>
-        <w:rPr>
-          <w:noProof/>
-          <w:sz w:val="32"/>
-          <w:szCs w:val="32"/>
-        </w:rPr>
-        <w:t xml:space="preserve">     │</w:t>
-      </w:r>
-    </w:p>
-    <w:p>
-      <w:pPr>
-        <w:spacing w:after="0" w:line="240" w:lineRule="auto"/>
-        <w:rPr>
-          <w:noProof/>
-          <w:sz w:val="32"/>
-          <w:szCs w:val="32"/>
-        </w:rPr>
-      </w:pPr>
-      <w:r>
-        <w:rPr>
-          <w:noProof/>
-          <w:sz w:val="32"/>
-          <w:szCs w:val="32"/>
-        </w:rPr>
-        <w:t xml:space="preserve">     </w:t>
-      </w:r>
-      <w:r>
-        <w:rPr>
-          <w:rFonts w:ascii="Arial" w:hAnsi="Arial" w:cs="Arial"/>
-          <w:noProof/>
-          <w:sz w:val="32"/>
-          <w:szCs w:val="32"/>
-        </w:rPr>
-        <w:t>▼</w:t>
-      </w:r>
-    </w:p>
-    <w:p>
-      <w:pPr>
-        <w:spacing w:after="0" w:line="240" w:lineRule="auto"/>
-        <w:rPr>
-          <w:noProof/>
-          <w:sz w:val="32"/>
-          <w:szCs w:val="32"/>
-        </w:rPr>
-      </w:pPr>
-      <w:r>
-        <w:rPr>
-          <w:noProof/>
-          <w:sz w:val="32"/>
-          <w:szCs w:val="32"/>
-        </w:rPr>
-        <w:t>ForecastPipeline</w:t>
-      </w:r>
-    </w:p>
-    <w:p>
-      <w:pPr>
-        <w:spacing w:after="0" w:line="240" w:lineRule="auto"/>
-        <w:rPr>
-          <w:noProof/>
-          <w:sz w:val="32"/>
-          <w:szCs w:val="32"/>
-        </w:rPr>
-      </w:pPr>
-      <w:r>
-        <w:rPr>
-          <w:noProof/>
-          <w:sz w:val="32"/>
-          <w:szCs w:val="32"/>
-        </w:rPr>
-        <w:t xml:space="preserve">     │</w:t>
-      </w:r>
-    </w:p>
-    <w:p>
-      <w:pPr>
-        <w:spacing w:after="0" w:line="240" w:lineRule="auto"/>
-        <w:rPr>
-          <w:noProof/>
-          <w:sz w:val="32"/>
-          <w:szCs w:val="32"/>
-        </w:rPr>
-      </w:pPr>
-      <w:r>
-        <w:rPr>
-          <w:noProof/>
-          <w:sz w:val="32"/>
-          <w:szCs w:val="32"/>
-        </w:rPr>
-        <w:t xml:space="preserve">     </w:t>
-      </w:r>
-      <w:r>
-        <w:rPr>
-          <w:rFonts w:ascii="Arial" w:hAnsi="Arial" w:cs="Arial"/>
-          <w:noProof/>
-          <w:sz w:val="32"/>
-          <w:szCs w:val="32"/>
-        </w:rPr>
-        <w:t>▼</w:t>
-      </w:r>
-    </w:p>
-    <w:p>
-      <w:pPr>
-        <w:spacing w:after="0" w:line="240" w:lineRule="auto"/>
-        <w:rPr>
-          <w:noProof/>
-          <w:sz w:val="32"/>
-          <w:szCs w:val="32"/>
-        </w:rPr>
-      </w:pPr>
-      <w:r>
-        <w:rPr>
-          <w:noProof/>
-          <w:sz w:val="32"/>
-          <w:szCs w:val="32"/>
-        </w:rPr>
-        <w:t>ForecastModel</w:t>
-      </w:r>
-    </w:p>
-    <w:p>
-      <w:pPr>
-        <w:spacing w:after="0" w:line="240" w:lineRule="auto"/>
-        <w:rPr>
-          <w:noProof/>
-          <w:sz w:val="32"/>
-          <w:szCs w:val="32"/>
-        </w:rPr>
-      </w:pPr>
-      <w:r>
-        <w:rPr>
-          <w:noProof/>
-          <w:sz w:val="32"/>
-          <w:szCs w:val="32"/>
-        </w:rPr>
-        <w:t xml:space="preserve">     │</w:t>
-      </w:r>
-    </w:p>
-    <w:p>
-      <w:pPr>
-        <w:spacing w:after="0" w:line="240" w:lineRule="auto"/>
-        <w:rPr>
-          <w:noProof/>
-          <w:sz w:val="32"/>
-          <w:szCs w:val="32"/>
-        </w:rPr>
-      </w:pPr>
-      <w:r>
-        <w:rPr>
-          <w:noProof/>
-          <w:sz w:val="32"/>
-          <w:szCs w:val="32"/>
-        </w:rPr>
-        <w:t xml:space="preserve">     </w:t>
-      </w:r>
-      <w:r>
-        <w:rPr>
-          <w:rFonts w:ascii="Arial" w:hAnsi="Arial" w:cs="Arial"/>
-          <w:noProof/>
-          <w:sz w:val="32"/>
-          <w:szCs w:val="32"/>
-        </w:rPr>
-        <w:t>▼</w:t>
-      </w:r>
-    </w:p>
-    <w:p>
-      <w:pPr>
-        <w:spacing w:after="0" w:line="240" w:lineRule="auto"/>
-        <w:rPr>
-          <w:noProof/>
-          <w:sz w:val="32"/>
-          <w:szCs w:val="32"/>
-        </w:rPr>
-      </w:pPr>
-      <w:r>
-        <w:rPr>
-          <w:noProof/>
-          <w:sz w:val="32"/>
-          <w:szCs w:val="32"/>
-        </w:rPr>
-        <w:t>ForecastResult</w:t>
-      </w:r>
-    </w:p>
-    <w:p>
-      <w:pPr>
-        <w:spacing w:after="0" w:line="240" w:lineRule="auto"/>
-        <w:rPr>
-          <w:noProof/>
-          <w:sz w:val="32"/>
-          <w:szCs w:val="32"/>
-        </w:rPr>
-      </w:pPr>
-      <w:r>
-        <w:rPr>
-          <w:noProof/>
-          <w:sz w:val="32"/>
-          <w:szCs w:val="32"/>
-        </w:rPr>
-        <w:t xml:space="preserve">     │</w:t>
-      </w:r>
-    </w:p>
-    <w:p>
-      <w:pPr>
-        <w:spacing w:after="0" w:line="240" w:lineRule="auto"/>
-        <w:rPr>
-          <w:noProof/>
-          <w:sz w:val="32"/>
-          <w:szCs w:val="32"/>
-        </w:rPr>
-      </w:pPr>
-      <w:r>
-        <w:rPr>
-          <w:noProof/>
-          <w:sz w:val="32"/>
-          <w:szCs w:val="32"/>
-        </w:rPr>
-        <w:t xml:space="preserve">     </w:t>
-      </w:r>
-      <w:r>
-        <w:rPr>
-          <w:rFonts w:ascii="Arial" w:hAnsi="Arial" w:cs="Arial"/>
-          <w:noProof/>
-          <w:sz w:val="32"/>
-          <w:szCs w:val="32"/>
-        </w:rPr>
-        <w:t>▼</w:t>
-      </w:r>
-    </w:p>
-    <w:p>
-      <w:pPr>
-        <w:spacing w:after="0" w:line="240" w:lineRule="auto"/>
-        <w:rPr>
-          <w:noProof/>
-          <w:sz w:val="32"/>
-          <w:szCs w:val="32"/>
-        </w:rPr>
-      </w:pPr>
-      <w:r>
-        <w:rPr>
-          <w:noProof/>
-          <w:sz w:val="32"/>
-          <w:szCs w:val="32"/>
-        </w:rPr>
-        <w:t>ForecastPlot</w:t>
-      </w:r>
-    </w:p>
-    <w:p>
-      <w:pPr>
-        <w:spacing w:after="0" w:line="240" w:lineRule="auto"/>
-        <w:rPr>
-          <w:noProof/>
-          <w:sz w:val="32"/>
-          <w:szCs w:val="32"/>
-        </w:rPr>
-      </w:pPr>
-      <w:r>
-        <w:rPr>
-          <w:noProof/>
-          <w:sz w:val="32"/>
-          <w:szCs w:val="32"/>
-        </w:rPr>
-        <w:t xml:space="preserve">     │</w:t>
-      </w:r>
-    </w:p>
-    <w:p>
-      <w:pPr>
-        <w:spacing w:after="0" w:line="240" w:lineRule="auto"/>
-        <w:rPr>
-          <w:noProof/>
-          <w:sz w:val="32"/>
-          <w:szCs w:val="32"/>
-        </w:rPr>
-      </w:pPr>
-      <w:r>
-        <w:rPr>
-          <w:noProof/>
-          <w:sz w:val="32"/>
-          <w:szCs w:val="32"/>
-        </w:rPr>
-        <w:t xml:space="preserve">     </w:t>
-      </w:r>
-      <w:r>
-        <w:rPr>
-          <w:rFonts w:ascii="Arial" w:hAnsi="Arial" w:cs="Arial"/>
-          <w:noProof/>
-          <w:sz w:val="32"/>
-          <w:szCs w:val="32"/>
-        </w:rPr>
-        <w:t>▼</w:t>
-      </w:r>
-    </w:p>
-    <w:p>
-      <w:pPr>
-        <w:spacing w:after="0" w:line="240" w:lineRule="auto"/>
-        <w:rPr>
-          <w:noProof/>
-          <w:sz w:val="32"/>
-          <w:szCs w:val="32"/>
-        </w:rPr>
-      </w:pPr>
-      <w:r>
-        <w:rPr>
-          <w:noProof/>
-          <w:sz w:val="32"/>
-          <w:szCs w:val="32"/>
-        </w:rPr>
-        <w:t>ExperimentResult</w:t>
-      </w:r>
-    </w:p>
-    <w:p>
-      <w:pPr>
-        <w:spacing w:after="0" w:line="240" w:lineRule="auto"/>
-        <w:rPr>
-          <w:noProof/>
-          <w:sz w:val="32"/>
-          <w:szCs w:val="32"/>
-        </w:rPr>
-      </w:pPr>
-      <w:r>
-        <w:rPr>
-          <w:noProof/>
-          <w:sz w:val="32"/>
-          <w:szCs w:val="32"/>
-        </w:rPr>
-        <w:t xml:space="preserve">     │</w:t>
-      </w:r>
-    </w:p>
-    <w:p>
-      <w:pPr>
-        <w:spacing w:after="0" w:line="240" w:lineRule="auto"/>
-        <w:rPr>
-          <w:noProof/>
-          <w:sz w:val="32"/>
-          <w:szCs w:val="32"/>
-        </w:rPr>
-      </w:pPr>
-      <w:r>
-        <w:rPr>
-          <w:noProof/>
-          <w:sz w:val="32"/>
-          <w:szCs w:val="32"/>
-        </w:rPr>
-        <w:t xml:space="preserve">     </w:t>
-      </w:r>
-      <w:r>
-        <w:rPr>
-          <w:rFonts w:ascii="MS Gothic" w:eastAsia="MS Gothic" w:hAnsi="MS Gothic" w:cs="MS Gothic" w:hint="eastAsia"/>
-          <w:noProof/>
-          <w:sz w:val="32"/>
-          <w:szCs w:val="32"/>
-        </w:rPr>
-        <w:t>├</w:t>
-      </w:r>
-      <w:r>
-        <w:rPr>
-          <w:rFonts w:ascii="Calibri" w:hAnsi="Calibri" w:cs="Calibri"/>
-          <w:noProof/>
-          <w:sz w:val="32"/>
-          <w:szCs w:val="32"/>
-        </w:rPr>
-        <w:t>──</w:t>
-      </w:r>
-      <w:r>
-        <w:rPr>
-          <w:noProof/>
-          <w:sz w:val="32"/>
-          <w:szCs w:val="32"/>
-        </w:rPr>
-        <w:t xml:space="preserve"> PNG</w:t>
-      </w:r>
-    </w:p>
-    <w:p>
-      <w:pPr>
-        <w:spacing w:after="0" w:line="240" w:lineRule="auto"/>
-        <w:rPr>
-          <w:noProof/>
-          <w:sz w:val="32"/>
-          <w:szCs w:val="32"/>
-        </w:rPr>
-      </w:pPr>
-      <w:r>
-        <w:rPr>
-          <w:noProof/>
-          <w:sz w:val="32"/>
-          <w:szCs w:val="32"/>
-        </w:rPr>
-        <w:t xml:space="preserve">     </w:t>
-      </w:r>
-      <w:r>
-        <w:rPr>
-          <w:rFonts w:ascii="MS Gothic" w:eastAsia="MS Gothic" w:hAnsi="MS Gothic" w:cs="MS Gothic" w:hint="eastAsia"/>
-          <w:noProof/>
-          <w:sz w:val="32"/>
-          <w:szCs w:val="32"/>
-        </w:rPr>
-        <w:t>├</w:t>
-      </w:r>
-      <w:r>
-        <w:rPr>
-          <w:rFonts w:ascii="Calibri" w:hAnsi="Calibri" w:cs="Calibri"/>
-          <w:noProof/>
-          <w:sz w:val="32"/>
-          <w:szCs w:val="32"/>
-        </w:rPr>
-        <w:t>──</w:t>
-      </w:r>
-      <w:r>
-        <w:rPr>
-          <w:noProof/>
-          <w:sz w:val="32"/>
-          <w:szCs w:val="32"/>
-        </w:rPr>
-        <w:t xml:space="preserve"> JSON</w:t>
-      </w:r>
-    </w:p>
-    <w:p>
-      <w:pPr>
-        <w:spacing w:after="0" w:line="240" w:lineRule="auto"/>
-        <w:rPr>
-          <w:noProof/>
-          <w:sz w:val="32"/>
-          <w:szCs w:val="32"/>
-        </w:rPr>
-      </w:pPr>
-      <w:r>
-        <w:rPr>
-          <w:noProof/>
-          <w:sz w:val="32"/>
-          <w:szCs w:val="32"/>
-        </w:rPr>
-        <w:t xml:space="preserve">     └── TXT</w:t>
+      </w:pPr>
+      <w:r>
+        <w:rPr>
+          <w:b/>
+          <w:bCs/>
+          <w:noProof/>
+          <w:sz w:val="40"/>
+          <w:szCs w:val="40"/>
+          <w:u w:val="single"/>
+        </w:rPr>
+        <w:lastRenderedPageBreak/>
+        <w:t>Sprint 5 – Commit 2:</w:t>
+      </w:r>
+    </w:p>
+    <w:p>
+      <w:pPr>
+        <w:spacing w:after="0" w:line="240" w:lineRule="auto"/>
+        <w:rPr>
+          <w:noProof/>
+          <w:sz w:val="32"/>
+          <w:szCs w:val="32"/>
+        </w:rPr>
+      </w:pPr>
+    </w:p>
+    <w:p>
+      <w:pPr>
+        <w:spacing w:after="0" w:line="240" w:lineRule="auto"/>
+        <w:rPr>
+          <w:noProof/>
+          <w:sz w:val="32"/>
+          <w:szCs w:val="32"/>
+          <w:lang w:val="tr-TR"/>
+        </w:rPr>
+      </w:pPr>
+      <w:r>
+        <w:rPr>
+          <w:noProof/>
+          <w:sz w:val="32"/>
+          <w:szCs w:val="32"/>
+          <w:lang w:val="tr-TR"/>
+        </w:rPr>
+        <w:t xml:space="preserve">  </w:t>
+      </w:r>
+      <w:r>
+        <w:rPr>
+          <w:rFonts w:ascii="Segoe UI Emoji" w:hAnsi="Segoe UI Emoji" w:cs="Segoe UI Emoji"/>
+          <w:noProof/>
+          <w:sz w:val="32"/>
+          <w:szCs w:val="32"/>
+          <w:lang w:val="tr-TR"/>
+        </w:rPr>
+        <w:t>✅</w:t>
+      </w:r>
+      <w:r>
+        <w:rPr>
+          <w:noProof/>
+          <w:sz w:val="32"/>
+          <w:szCs w:val="32"/>
+          <w:lang w:val="tr-TR"/>
+        </w:rPr>
+        <w:t xml:space="preserve"> Experiment dataclass </w:t>
+      </w:r>
+    </w:p>
+    <w:p>
+      <w:pPr>
+        <w:spacing w:after="0" w:line="240" w:lineRule="auto"/>
+        <w:rPr>
+          <w:noProof/>
+          <w:sz w:val="32"/>
+          <w:szCs w:val="32"/>
+          <w:lang w:val="tr-TR"/>
+        </w:rPr>
+      </w:pPr>
+      <w:r>
+        <w:rPr>
+          <w:noProof/>
+          <w:sz w:val="32"/>
+          <w:szCs w:val="32"/>
+          <w:lang w:val="tr-TR"/>
+        </w:rPr>
+        <w:t xml:space="preserve">  </w:t>
+      </w:r>
+      <w:r>
+        <w:rPr>
+          <w:rFonts w:ascii="Segoe UI Emoji" w:hAnsi="Segoe UI Emoji" w:cs="Segoe UI Emoji"/>
+          <w:noProof/>
+          <w:sz w:val="32"/>
+          <w:szCs w:val="32"/>
+          <w:lang w:val="tr-TR"/>
+        </w:rPr>
+        <w:t>✅</w:t>
+      </w:r>
+      <w:r>
+        <w:rPr>
+          <w:noProof/>
+          <w:sz w:val="32"/>
+          <w:szCs w:val="32"/>
+          <w:lang w:val="tr-TR"/>
+        </w:rPr>
+        <w:t xml:space="preserve"> ExperimentRegistry </w:t>
+      </w:r>
+    </w:p>
+    <w:p>
+      <w:pPr>
+        <w:spacing w:after="0" w:line="240" w:lineRule="auto"/>
+        <w:rPr>
+          <w:noProof/>
+          <w:sz w:val="32"/>
+          <w:szCs w:val="32"/>
+          <w:lang w:val="tr-TR"/>
+        </w:rPr>
+      </w:pPr>
+      <w:r>
+        <w:rPr>
+          <w:noProof/>
+          <w:sz w:val="32"/>
+          <w:szCs w:val="32"/>
+          <w:lang w:val="tr-TR"/>
+        </w:rPr>
+        <w:t xml:space="preserve">  </w:t>
+      </w:r>
+      <w:r>
+        <w:rPr>
+          <w:rFonts w:ascii="Segoe UI Emoji" w:hAnsi="Segoe UI Emoji" w:cs="Segoe UI Emoji"/>
+          <w:noProof/>
+          <w:sz w:val="32"/>
+          <w:szCs w:val="32"/>
+          <w:lang w:val="tr-TR"/>
+        </w:rPr>
+        <w:t>✅</w:t>
+      </w:r>
+      <w:r>
+        <w:rPr>
+          <w:noProof/>
+          <w:sz w:val="32"/>
+          <w:szCs w:val="32"/>
+          <w:lang w:val="tr-TR"/>
+        </w:rPr>
+        <w:t xml:space="preserve"> Automatic experiment IDs </w:t>
+      </w:r>
+    </w:p>
+    <w:p>
+      <w:pPr>
+        <w:spacing w:after="0" w:line="240" w:lineRule="auto"/>
+        <w:rPr>
+          <w:noProof/>
+          <w:sz w:val="32"/>
+          <w:szCs w:val="32"/>
+          <w:lang w:val="tr-TR"/>
+        </w:rPr>
+      </w:pPr>
+      <w:r>
+        <w:rPr>
+          <w:noProof/>
+          <w:sz w:val="32"/>
+          <w:szCs w:val="32"/>
+          <w:lang w:val="tr-TR"/>
+        </w:rPr>
+        <w:t xml:space="preserve">  </w:t>
+      </w:r>
+      <w:r>
+        <w:rPr>
+          <w:rFonts w:ascii="Segoe UI Emoji" w:hAnsi="Segoe UI Emoji" w:cs="Segoe UI Emoji"/>
+          <w:noProof/>
+          <w:sz w:val="32"/>
+          <w:szCs w:val="32"/>
+          <w:lang w:val="tr-TR"/>
+        </w:rPr>
+        <w:t>✅</w:t>
+      </w:r>
+      <w:r>
+        <w:rPr>
+          <w:noProof/>
+          <w:sz w:val="32"/>
+          <w:szCs w:val="32"/>
+          <w:lang w:val="tr-TR"/>
+        </w:rPr>
+        <w:t xml:space="preserve"> JSON serialization </w:t>
+      </w:r>
+    </w:p>
+    <w:p>
+      <w:pPr>
+        <w:spacing w:after="0" w:line="240" w:lineRule="auto"/>
+        <w:rPr>
+          <w:noProof/>
+          <w:sz w:val="32"/>
+          <w:szCs w:val="32"/>
+          <w:lang w:val="tr-TR"/>
+        </w:rPr>
+      </w:pPr>
+      <w:r>
+        <w:rPr>
+          <w:noProof/>
+          <w:sz w:val="32"/>
+          <w:szCs w:val="32"/>
+          <w:lang w:val="tr-TR"/>
+        </w:rPr>
+        <w:t xml:space="preserve">  </w:t>
+      </w:r>
+      <w:r>
+        <w:rPr>
+          <w:rFonts w:ascii="Segoe UI Emoji" w:hAnsi="Segoe UI Emoji" w:cs="Segoe UI Emoji"/>
+          <w:noProof/>
+          <w:sz w:val="32"/>
+          <w:szCs w:val="32"/>
+          <w:lang w:val="tr-TR"/>
+        </w:rPr>
+        <w:t>✅</w:t>
+      </w:r>
+      <w:r>
+        <w:rPr>
+          <w:noProof/>
+          <w:sz w:val="32"/>
+          <w:szCs w:val="32"/>
+          <w:lang w:val="tr-TR"/>
+        </w:rPr>
+        <w:t xml:space="preserve"> Persistent history.json </w:t>
+      </w:r>
+    </w:p>
+    <w:p>
+      <w:pPr>
+        <w:spacing w:after="0" w:line="240" w:lineRule="auto"/>
+        <w:rPr>
+          <w:noProof/>
+          <w:sz w:val="32"/>
+          <w:szCs w:val="32"/>
+          <w:lang w:val="tr-TR"/>
+        </w:rPr>
+      </w:pPr>
+      <w:r>
+        <w:rPr>
+          <w:noProof/>
+          <w:sz w:val="32"/>
+          <w:szCs w:val="32"/>
+          <w:lang w:val="tr-TR"/>
+        </w:rPr>
+        <w:t xml:space="preserve">  </w:t>
+      </w:r>
+      <w:r>
+        <w:rPr>
+          <w:rFonts w:ascii="Segoe UI Emoji" w:hAnsi="Segoe UI Emoji" w:cs="Segoe UI Emoji"/>
+          <w:noProof/>
+          <w:sz w:val="32"/>
+          <w:szCs w:val="32"/>
+          <w:lang w:val="tr-TR"/>
+        </w:rPr>
+        <w:t>✅</w:t>
+      </w:r>
+      <w:r>
+        <w:rPr>
+          <w:noProof/>
+          <w:sz w:val="32"/>
+          <w:szCs w:val="32"/>
+          <w:lang w:val="tr-TR"/>
+        </w:rPr>
+        <w:t xml:space="preserve"> Unit tests </w:t>
+      </w:r>
+    </w:p>
+    <w:p>
+      <w:pPr>
+        <w:spacing w:after="0" w:line="240" w:lineRule="auto"/>
+        <w:rPr>
+          <w:noProof/>
+          <w:sz w:val="32"/>
+          <w:szCs w:val="32"/>
+        </w:rPr>
+      </w:pPr>
+      <w:r>
+        <w:rPr>
+          <w:noProof/>
+          <w:sz w:val="32"/>
+          <w:szCs w:val="32"/>
+          <w:lang w:val="tr-TR"/>
+        </w:rPr>
+        <w:t xml:space="preserve">  </w:t>
+      </w:r>
+      <w:r>
+        <w:rPr>
+          <w:rFonts w:ascii="Segoe UI Emoji" w:hAnsi="Segoe UI Emoji" w:cs="Segoe UI Emoji"/>
+          <w:noProof/>
+          <w:sz w:val="32"/>
+          <w:szCs w:val="32"/>
+          <w:lang w:val="tr-TR"/>
+        </w:rPr>
+        <w:t>✅</w:t>
+      </w:r>
+      <w:r>
+        <w:rPr>
+          <w:noProof/>
+          <w:sz w:val="32"/>
+          <w:szCs w:val="32"/>
+          <w:lang w:val="tr-TR"/>
+        </w:rPr>
+        <w:t xml:space="preserve"> Object-oriented registration API</w:t>
       </w:r>
     </w:p>
     <w:sectPr>

</xml_diff>

<commit_message>
Sprint 5 Commit 2: Complete first end-to-end ARIMA demonstration
</commit_message>
<xml_diff>
--- a/docs/development_flow.docx
+++ b/docs/development_flow.docx
@@ -11213,15 +11213,16 @@
           <w:noProof/>
           <w:sz w:val="32"/>
           <w:szCs w:val="32"/>
-        </w:rPr>
-      </w:pPr>
-      <w:r>
-        <w:rPr>
-          <w:noProof/>
-          <w:sz w:val="32"/>
-          <w:szCs w:val="32"/>
           <w:lang w:val="tr-TR"/>
         </w:rPr>
+      </w:pPr>
+      <w:r>
+        <w:rPr>
+          <w:noProof/>
+          <w:sz w:val="32"/>
+          <w:szCs w:val="32"/>
+          <w:lang w:val="tr-TR"/>
+        </w:rPr>
         <w:t xml:space="preserve">  </w:t>
       </w:r>
       <w:r>
@@ -11243,6 +11244,2941 @@
         </w:rPr>
         <w:t xml:space="preserve"> Object-oriented registration API</w:t>
       </w:r>
+    </w:p>
+    <w:p>
+      <w:pPr>
+        <w:spacing w:after="0" w:line="240" w:lineRule="auto"/>
+        <w:rPr>
+          <w:noProof/>
+          <w:sz w:val="32"/>
+          <w:szCs w:val="32"/>
+          <w:lang w:val="tr-TR"/>
+        </w:rPr>
+      </w:pPr>
+    </w:p>
+    <w:p>
+      <w:pPr>
+        <w:spacing w:after="0" w:line="240" w:lineRule="auto"/>
+        <w:rPr>
+          <w:noProof/>
+          <w:sz w:val="32"/>
+          <w:szCs w:val="32"/>
+          <w:lang w:val="tr-TR"/>
+        </w:rPr>
+      </w:pPr>
+    </w:p>
+    <w:p>
+      <w:pPr>
+        <w:rPr>
+          <w:noProof/>
+          <w:sz w:val="32"/>
+          <w:szCs w:val="32"/>
+          <w:lang w:val="tr-TR"/>
+        </w:rPr>
+      </w:pPr>
+      <w:r>
+        <w:rPr>
+          <w:noProof/>
+          <w:sz w:val="32"/>
+          <w:szCs w:val="32"/>
+          <w:lang w:val="tr-TR"/>
+        </w:rPr>
+        <w:br w:type="page"/>
+      </w:r>
+    </w:p>
+    <w:p>
+      <w:pPr>
+        <w:spacing w:after="0" w:line="240" w:lineRule="auto"/>
+        <w:rPr>
+          <w:b/>
+          <w:bCs/>
+          <w:noProof/>
+          <w:sz w:val="40"/>
+          <w:szCs w:val="40"/>
+          <w:u w:val="single"/>
+        </w:rPr>
+      </w:pPr>
+      <w:r>
+        <w:rPr>
+          <w:b/>
+          <w:bCs/>
+          <w:noProof/>
+          <w:sz w:val="40"/>
+          <w:szCs w:val="40"/>
+          <w:u w:val="single"/>
+        </w:rPr>
+        <w:lastRenderedPageBreak/>
+        <w:t>Sprint 5 – Commit 3:</w:t>
+      </w:r>
+    </w:p>
+    <w:p>
+      <w:pPr>
+        <w:spacing w:after="0" w:line="240" w:lineRule="auto"/>
+        <w:rPr>
+          <w:noProof/>
+          <w:sz w:val="32"/>
+          <w:szCs w:val="32"/>
+        </w:rPr>
+      </w:pPr>
+    </w:p>
+    <w:p>
+      <w:pPr>
+        <w:spacing w:after="0" w:line="240" w:lineRule="auto"/>
+        <w:rPr>
+          <w:noProof/>
+          <w:sz w:val="32"/>
+          <w:szCs w:val="32"/>
+        </w:rPr>
+      </w:pPr>
+      <w:r>
+        <w:rPr>
+          <w:noProof/>
+          <w:sz w:val="32"/>
+          <w:szCs w:val="32"/>
+        </w:rPr>
+        <w:t>Real Battery CSV</w:t>
+      </w:r>
+    </w:p>
+    <w:p>
+      <w:pPr>
+        <w:spacing w:after="0" w:line="240" w:lineRule="auto"/>
+        <w:rPr>
+          <w:noProof/>
+          <w:sz w:val="32"/>
+          <w:szCs w:val="32"/>
+        </w:rPr>
+      </w:pPr>
+      <w:r>
+        <w:rPr>
+          <w:noProof/>
+          <w:sz w:val="32"/>
+          <w:szCs w:val="32"/>
+        </w:rPr>
+        <w:t xml:space="preserve">        │</w:t>
+      </w:r>
+    </w:p>
+    <w:p>
+      <w:pPr>
+        <w:spacing w:after="0" w:line="240" w:lineRule="auto"/>
+        <w:rPr>
+          <w:noProof/>
+          <w:sz w:val="32"/>
+          <w:szCs w:val="32"/>
+        </w:rPr>
+      </w:pPr>
+      <w:r>
+        <w:rPr>
+          <w:noProof/>
+          <w:sz w:val="32"/>
+          <w:szCs w:val="32"/>
+        </w:rPr>
+        <w:t xml:space="preserve">        </w:t>
+      </w:r>
+      <w:r>
+        <w:rPr>
+          <w:rFonts w:ascii="Arial" w:hAnsi="Arial" w:cs="Arial"/>
+          <w:noProof/>
+          <w:sz w:val="32"/>
+          <w:szCs w:val="32"/>
+        </w:rPr>
+        <w:t>▼</w:t>
+      </w:r>
+    </w:p>
+    <w:p>
+      <w:pPr>
+        <w:spacing w:after="0" w:line="240" w:lineRule="auto"/>
+        <w:rPr>
+          <w:noProof/>
+          <w:sz w:val="32"/>
+          <w:szCs w:val="32"/>
+        </w:rPr>
+      </w:pPr>
+      <w:r>
+        <w:rPr>
+          <w:noProof/>
+          <w:sz w:val="32"/>
+          <w:szCs w:val="32"/>
+        </w:rPr>
+        <w:t>SmartDatasetLoader</w:t>
+      </w:r>
+    </w:p>
+    <w:p>
+      <w:pPr>
+        <w:spacing w:after="0" w:line="240" w:lineRule="auto"/>
+        <w:rPr>
+          <w:noProof/>
+          <w:sz w:val="32"/>
+          <w:szCs w:val="32"/>
+        </w:rPr>
+      </w:pPr>
+      <w:r>
+        <w:rPr>
+          <w:noProof/>
+          <w:sz w:val="32"/>
+          <w:szCs w:val="32"/>
+        </w:rPr>
+        <w:t xml:space="preserve">        │</w:t>
+      </w:r>
+    </w:p>
+    <w:p>
+      <w:pPr>
+        <w:spacing w:after="0" w:line="240" w:lineRule="auto"/>
+        <w:rPr>
+          <w:noProof/>
+          <w:sz w:val="32"/>
+          <w:szCs w:val="32"/>
+        </w:rPr>
+      </w:pPr>
+      <w:r>
+        <w:rPr>
+          <w:noProof/>
+          <w:sz w:val="32"/>
+          <w:szCs w:val="32"/>
+        </w:rPr>
+        <w:t xml:space="preserve">        </w:t>
+      </w:r>
+      <w:r>
+        <w:rPr>
+          <w:rFonts w:ascii="Arial" w:hAnsi="Arial" w:cs="Arial"/>
+          <w:noProof/>
+          <w:sz w:val="32"/>
+          <w:szCs w:val="32"/>
+        </w:rPr>
+        <w:t>▼</w:t>
+      </w:r>
+    </w:p>
+    <w:p>
+      <w:pPr>
+        <w:spacing w:after="0" w:line="240" w:lineRule="auto"/>
+        <w:rPr>
+          <w:noProof/>
+          <w:sz w:val="32"/>
+          <w:szCs w:val="32"/>
+        </w:rPr>
+      </w:pPr>
+      <w:r>
+        <w:rPr>
+          <w:noProof/>
+          <w:sz w:val="32"/>
+          <w:szCs w:val="32"/>
+        </w:rPr>
+        <w:t>BatteryDataset</w:t>
+      </w:r>
+    </w:p>
+    <w:p>
+      <w:pPr>
+        <w:spacing w:after="0" w:line="240" w:lineRule="auto"/>
+        <w:rPr>
+          <w:noProof/>
+          <w:sz w:val="32"/>
+          <w:szCs w:val="32"/>
+        </w:rPr>
+      </w:pPr>
+      <w:r>
+        <w:rPr>
+          <w:noProof/>
+          <w:sz w:val="32"/>
+          <w:szCs w:val="32"/>
+        </w:rPr>
+        <w:t xml:space="preserve">        │</w:t>
+      </w:r>
+    </w:p>
+    <w:p>
+      <w:pPr>
+        <w:spacing w:after="0" w:line="240" w:lineRule="auto"/>
+        <w:rPr>
+          <w:noProof/>
+          <w:sz w:val="32"/>
+          <w:szCs w:val="32"/>
+        </w:rPr>
+      </w:pPr>
+      <w:r>
+        <w:rPr>
+          <w:noProof/>
+          <w:sz w:val="32"/>
+          <w:szCs w:val="32"/>
+        </w:rPr>
+        <w:t xml:space="preserve">        </w:t>
+      </w:r>
+      <w:r>
+        <w:rPr>
+          <w:rFonts w:ascii="Arial" w:hAnsi="Arial" w:cs="Arial"/>
+          <w:noProof/>
+          <w:sz w:val="32"/>
+          <w:szCs w:val="32"/>
+        </w:rPr>
+        <w:t>▼</w:t>
+      </w:r>
+    </w:p>
+    <w:p>
+      <w:pPr>
+        <w:spacing w:after="0" w:line="240" w:lineRule="auto"/>
+        <w:rPr>
+          <w:noProof/>
+          <w:sz w:val="32"/>
+          <w:szCs w:val="32"/>
+        </w:rPr>
+      </w:pPr>
+      <w:r>
+        <w:rPr>
+          <w:noProof/>
+          <w:sz w:val="32"/>
+          <w:szCs w:val="32"/>
+        </w:rPr>
+        <w:t>ARIMAForecaster</w:t>
+      </w:r>
+    </w:p>
+    <w:p>
+      <w:pPr>
+        <w:spacing w:after="0" w:line="240" w:lineRule="auto"/>
+        <w:rPr>
+          <w:noProof/>
+          <w:sz w:val="32"/>
+          <w:szCs w:val="32"/>
+        </w:rPr>
+      </w:pPr>
+      <w:r>
+        <w:rPr>
+          <w:noProof/>
+          <w:sz w:val="32"/>
+          <w:szCs w:val="32"/>
+        </w:rPr>
+        <w:t xml:space="preserve">        │</w:t>
+      </w:r>
+    </w:p>
+    <w:p>
+      <w:pPr>
+        <w:spacing w:after="0" w:line="240" w:lineRule="auto"/>
+        <w:rPr>
+          <w:noProof/>
+          <w:sz w:val="32"/>
+          <w:szCs w:val="32"/>
+        </w:rPr>
+      </w:pPr>
+      <w:r>
+        <w:rPr>
+          <w:noProof/>
+          <w:sz w:val="32"/>
+          <w:szCs w:val="32"/>
+        </w:rPr>
+        <w:t xml:space="preserve">        </w:t>
+      </w:r>
+      <w:r>
+        <w:rPr>
+          <w:rFonts w:ascii="Arial" w:hAnsi="Arial" w:cs="Arial"/>
+          <w:noProof/>
+          <w:sz w:val="32"/>
+          <w:szCs w:val="32"/>
+        </w:rPr>
+        <w:t>▼</w:t>
+      </w:r>
+    </w:p>
+    <w:p>
+      <w:pPr>
+        <w:spacing w:after="0" w:line="240" w:lineRule="auto"/>
+        <w:rPr>
+          <w:noProof/>
+          <w:sz w:val="32"/>
+          <w:szCs w:val="32"/>
+        </w:rPr>
+      </w:pPr>
+      <w:r>
+        <w:rPr>
+          <w:noProof/>
+          <w:sz w:val="32"/>
+          <w:szCs w:val="32"/>
+        </w:rPr>
+        <w:t>ForecastResult</w:t>
+      </w:r>
+    </w:p>
+    <w:p>
+      <w:pPr>
+        <w:spacing w:after="0" w:line="240" w:lineRule="auto"/>
+        <w:rPr>
+          <w:noProof/>
+          <w:sz w:val="32"/>
+          <w:szCs w:val="32"/>
+        </w:rPr>
+      </w:pPr>
+      <w:r>
+        <w:rPr>
+          <w:noProof/>
+          <w:sz w:val="32"/>
+          <w:szCs w:val="32"/>
+        </w:rPr>
+        <w:t xml:space="preserve">        │</w:t>
+      </w:r>
+    </w:p>
+    <w:p>
+      <w:pPr>
+        <w:spacing w:after="0" w:line="240" w:lineRule="auto"/>
+        <w:rPr>
+          <w:noProof/>
+          <w:sz w:val="32"/>
+          <w:szCs w:val="32"/>
+        </w:rPr>
+      </w:pPr>
+      <w:r>
+        <w:rPr>
+          <w:noProof/>
+          <w:sz w:val="32"/>
+          <w:szCs w:val="32"/>
+        </w:rPr>
+        <w:t xml:space="preserve">        </w:t>
+      </w:r>
+      <w:r>
+        <w:rPr>
+          <w:rFonts w:ascii="Arial" w:hAnsi="Arial" w:cs="Arial"/>
+          <w:noProof/>
+          <w:sz w:val="32"/>
+          <w:szCs w:val="32"/>
+        </w:rPr>
+        <w:t>▼</w:t>
+      </w:r>
+    </w:p>
+    <w:p>
+      <w:pPr>
+        <w:spacing w:after="0" w:line="240" w:lineRule="auto"/>
+        <w:rPr>
+          <w:noProof/>
+          <w:sz w:val="32"/>
+          <w:szCs w:val="32"/>
+        </w:rPr>
+      </w:pPr>
+      <w:r>
+        <w:rPr>
+          <w:noProof/>
+          <w:sz w:val="32"/>
+          <w:szCs w:val="32"/>
+        </w:rPr>
+        <w:t>ForecastPlot</w:t>
+      </w:r>
+    </w:p>
+    <w:p>
+      <w:pPr>
+        <w:spacing w:after="0" w:line="240" w:lineRule="auto"/>
+        <w:rPr>
+          <w:noProof/>
+          <w:sz w:val="32"/>
+          <w:szCs w:val="32"/>
+        </w:rPr>
+      </w:pPr>
+      <w:r>
+        <w:rPr>
+          <w:noProof/>
+          <w:sz w:val="32"/>
+          <w:szCs w:val="32"/>
+        </w:rPr>
+        <w:t xml:space="preserve">        │</w:t>
+      </w:r>
+    </w:p>
+    <w:p>
+      <w:pPr>
+        <w:spacing w:after="0" w:line="240" w:lineRule="auto"/>
+        <w:rPr>
+          <w:noProof/>
+          <w:sz w:val="32"/>
+          <w:szCs w:val="32"/>
+        </w:rPr>
+      </w:pPr>
+      <w:r>
+        <w:rPr>
+          <w:noProof/>
+          <w:sz w:val="32"/>
+          <w:szCs w:val="32"/>
+        </w:rPr>
+        <w:t xml:space="preserve">        </w:t>
+      </w:r>
+      <w:r>
+        <w:rPr>
+          <w:rFonts w:ascii="Arial" w:hAnsi="Arial" w:cs="Arial"/>
+          <w:noProof/>
+          <w:sz w:val="32"/>
+          <w:szCs w:val="32"/>
+        </w:rPr>
+        <w:t>▼</w:t>
+      </w:r>
+    </w:p>
+    <w:p>
+      <w:pPr>
+        <w:spacing w:after="0" w:line="240" w:lineRule="auto"/>
+        <w:rPr>
+          <w:noProof/>
+          <w:sz w:val="32"/>
+          <w:szCs w:val="32"/>
+        </w:rPr>
+      </w:pPr>
+      <w:r>
+        <w:rPr>
+          <w:noProof/>
+          <w:sz w:val="32"/>
+          <w:szCs w:val="32"/>
+        </w:rPr>
+        <w:t>Experiment</w:t>
+      </w:r>
+    </w:p>
+    <w:p>
+      <w:pPr>
+        <w:spacing w:after="0" w:line="240" w:lineRule="auto"/>
+        <w:rPr>
+          <w:noProof/>
+          <w:sz w:val="32"/>
+          <w:szCs w:val="32"/>
+        </w:rPr>
+      </w:pPr>
+      <w:r>
+        <w:rPr>
+          <w:noProof/>
+          <w:sz w:val="32"/>
+          <w:szCs w:val="32"/>
+        </w:rPr>
+        <w:t xml:space="preserve">        │</w:t>
+      </w:r>
+    </w:p>
+    <w:p>
+      <w:pPr>
+        <w:spacing w:after="0" w:line="240" w:lineRule="auto"/>
+        <w:rPr>
+          <w:noProof/>
+          <w:sz w:val="32"/>
+          <w:szCs w:val="32"/>
+        </w:rPr>
+      </w:pPr>
+      <w:r>
+        <w:rPr>
+          <w:noProof/>
+          <w:sz w:val="32"/>
+          <w:szCs w:val="32"/>
+        </w:rPr>
+        <w:t xml:space="preserve">        </w:t>
+      </w:r>
+      <w:r>
+        <w:rPr>
+          <w:rFonts w:ascii="Arial" w:hAnsi="Arial" w:cs="Arial"/>
+          <w:noProof/>
+          <w:sz w:val="32"/>
+          <w:szCs w:val="32"/>
+        </w:rPr>
+        <w:t>▼</w:t>
+      </w:r>
+    </w:p>
+    <w:p>
+      <w:pPr>
+        <w:spacing w:after="0" w:line="240" w:lineRule="auto"/>
+        <w:rPr>
+          <w:noProof/>
+          <w:sz w:val="32"/>
+          <w:szCs w:val="32"/>
+        </w:rPr>
+      </w:pPr>
+      <w:r>
+        <w:rPr>
+          <w:noProof/>
+          <w:sz w:val="32"/>
+          <w:szCs w:val="32"/>
+        </w:rPr>
+        <w:t>ExperimentRegistry</w:t>
+      </w:r>
+    </w:p>
+    <w:p>
+      <w:pPr>
+        <w:spacing w:after="0" w:line="240" w:lineRule="auto"/>
+        <w:rPr>
+          <w:noProof/>
+          <w:sz w:val="32"/>
+          <w:szCs w:val="32"/>
+        </w:rPr>
+      </w:pPr>
+      <w:r>
+        <w:rPr>
+          <w:noProof/>
+          <w:sz w:val="32"/>
+          <w:szCs w:val="32"/>
+        </w:rPr>
+        <w:t xml:space="preserve">        │</w:t>
+      </w:r>
+    </w:p>
+    <w:p>
+      <w:pPr>
+        <w:spacing w:after="0" w:line="240" w:lineRule="auto"/>
+        <w:rPr>
+          <w:noProof/>
+          <w:sz w:val="32"/>
+          <w:szCs w:val="32"/>
+        </w:rPr>
+      </w:pPr>
+      <w:r>
+        <w:rPr>
+          <w:noProof/>
+          <w:sz w:val="32"/>
+          <w:szCs w:val="32"/>
+        </w:rPr>
+        <w:t xml:space="preserve">        </w:t>
+      </w:r>
+      <w:r>
+        <w:rPr>
+          <w:rFonts w:ascii="Arial" w:hAnsi="Arial" w:cs="Arial"/>
+          <w:noProof/>
+          <w:sz w:val="32"/>
+          <w:szCs w:val="32"/>
+        </w:rPr>
+        <w:t>▼</w:t>
+      </w:r>
+    </w:p>
+    <w:p>
+      <w:pPr>
+        <w:spacing w:after="0" w:line="240" w:lineRule="auto"/>
+        <w:rPr>
+          <w:noProof/>
+          <w:sz w:val="32"/>
+          <w:szCs w:val="32"/>
+        </w:rPr>
+      </w:pPr>
+      <w:r>
+        <w:rPr>
+          <w:noProof/>
+          <w:sz w:val="32"/>
+          <w:szCs w:val="32"/>
+        </w:rPr>
+        <w:t>PNG + JSON + TXT + history.json</w:t>
+      </w:r>
+    </w:p>
+    <w:p>
+      <w:pPr>
+        <w:spacing w:after="0" w:line="240" w:lineRule="auto"/>
+        <w:rPr>
+          <w:noProof/>
+          <w:sz w:val="32"/>
+          <w:szCs w:val="32"/>
+        </w:rPr>
+      </w:pPr>
+    </w:p>
+    <w:p>
+      <w:pPr>
+        <w:rPr>
+          <w:noProof/>
+          <w:sz w:val="32"/>
+          <w:szCs w:val="32"/>
+        </w:rPr>
+      </w:pPr>
+      <w:r>
+        <w:rPr>
+          <w:noProof/>
+          <w:sz w:val="32"/>
+          <w:szCs w:val="32"/>
+        </w:rPr>
+        <w:br w:type="page"/>
+      </w:r>
+    </w:p>
+    <w:p>
+      <w:pPr>
+        <w:spacing w:after="0" w:line="240" w:lineRule="auto"/>
+        <w:rPr>
+          <w:b/>
+          <w:bCs/>
+          <w:noProof/>
+          <w:sz w:val="40"/>
+          <w:szCs w:val="40"/>
+          <w:u w:val="single"/>
+        </w:rPr>
+      </w:pPr>
+      <w:r>
+        <w:rPr>
+          <w:b/>
+          <w:bCs/>
+          <w:noProof/>
+          <w:sz w:val="40"/>
+          <w:szCs w:val="40"/>
+          <w:u w:val="single"/>
+        </w:rPr>
+        <w:lastRenderedPageBreak/>
+        <w:t>Complete Structure:</w:t>
+      </w:r>
+    </w:p>
+    <w:p>
+      <w:pPr>
+        <w:spacing w:after="0" w:line="240" w:lineRule="auto"/>
+        <w:rPr>
+          <w:b/>
+          <w:bCs/>
+          <w:noProof/>
+          <w:sz w:val="40"/>
+          <w:szCs w:val="40"/>
+          <w:u w:val="single"/>
+        </w:rPr>
+      </w:pPr>
+    </w:p>
+    <w:p>
+      <w:pPr>
+        <w:spacing w:after="0" w:line="240" w:lineRule="auto"/>
+        <w:jc w:val="center"/>
+        <w:rPr>
+          <w:b/>
+          <w:bCs/>
+          <w:noProof/>
+          <w:sz w:val="24"/>
+          <w:szCs w:val="24"/>
+        </w:rPr>
+      </w:pPr>
+      <w:r>
+        <w:rPr>
+          <w:b/>
+          <w:bCs/>
+          <w:noProof/>
+          <w:sz w:val="24"/>
+          <w:szCs w:val="24"/>
+        </w:rPr>
+        <w:t>Configuration</w:t>
+      </w:r>
+    </w:p>
+    <w:p>
+      <w:pPr>
+        <w:spacing w:after="0" w:line="240" w:lineRule="auto"/>
+        <w:jc w:val="center"/>
+        <w:rPr>
+          <w:b/>
+          <w:bCs/>
+          <w:noProof/>
+          <w:sz w:val="24"/>
+          <w:szCs w:val="24"/>
+        </w:rPr>
+      </w:pPr>
+    </w:p>
+    <w:p>
+      <w:pPr>
+        <w:spacing w:after="0" w:line="240" w:lineRule="auto"/>
+        <w:jc w:val="center"/>
+        <w:rPr>
+          <w:b/>
+          <w:bCs/>
+          <w:noProof/>
+          <w:sz w:val="24"/>
+          <w:szCs w:val="24"/>
+        </w:rPr>
+      </w:pPr>
+      <w:r>
+        <w:rPr>
+          <w:b/>
+          <w:bCs/>
+          <w:noProof/>
+          <w:sz w:val="24"/>
+          <w:szCs w:val="24"/>
+        </w:rPr>
+        <w:t>↓</w:t>
+      </w:r>
+    </w:p>
+    <w:p>
+      <w:pPr>
+        <w:spacing w:after="0" w:line="240" w:lineRule="auto"/>
+        <w:jc w:val="center"/>
+        <w:rPr>
+          <w:b/>
+          <w:bCs/>
+          <w:noProof/>
+          <w:sz w:val="24"/>
+          <w:szCs w:val="24"/>
+        </w:rPr>
+      </w:pPr>
+    </w:p>
+    <w:p>
+      <w:pPr>
+        <w:spacing w:after="0" w:line="240" w:lineRule="auto"/>
+        <w:jc w:val="center"/>
+        <w:rPr>
+          <w:b/>
+          <w:bCs/>
+          <w:noProof/>
+          <w:sz w:val="24"/>
+          <w:szCs w:val="24"/>
+        </w:rPr>
+      </w:pPr>
+      <w:r>
+        <w:rPr>
+          <w:b/>
+          <w:bCs/>
+          <w:noProof/>
+          <w:sz w:val="24"/>
+          <w:szCs w:val="24"/>
+        </w:rPr>
+        <w:t>Banner</w:t>
+      </w:r>
+    </w:p>
+    <w:p>
+      <w:pPr>
+        <w:spacing w:after="0" w:line="240" w:lineRule="auto"/>
+        <w:jc w:val="center"/>
+        <w:rPr>
+          <w:b/>
+          <w:bCs/>
+          <w:noProof/>
+          <w:sz w:val="24"/>
+          <w:szCs w:val="24"/>
+        </w:rPr>
+      </w:pPr>
+    </w:p>
+    <w:p>
+      <w:pPr>
+        <w:spacing w:after="0" w:line="240" w:lineRule="auto"/>
+        <w:jc w:val="center"/>
+        <w:rPr>
+          <w:b/>
+          <w:bCs/>
+          <w:noProof/>
+          <w:sz w:val="24"/>
+          <w:szCs w:val="24"/>
+        </w:rPr>
+      </w:pPr>
+      <w:r>
+        <w:rPr>
+          <w:b/>
+          <w:bCs/>
+          <w:noProof/>
+          <w:sz w:val="24"/>
+          <w:szCs w:val="24"/>
+        </w:rPr>
+        <w:t>↓</w:t>
+      </w:r>
+    </w:p>
+    <w:p>
+      <w:pPr>
+        <w:spacing w:after="0" w:line="240" w:lineRule="auto"/>
+        <w:jc w:val="center"/>
+        <w:rPr>
+          <w:b/>
+          <w:bCs/>
+          <w:noProof/>
+          <w:sz w:val="24"/>
+          <w:szCs w:val="24"/>
+        </w:rPr>
+      </w:pPr>
+    </w:p>
+    <w:p>
+      <w:pPr>
+        <w:spacing w:after="0" w:line="240" w:lineRule="auto"/>
+        <w:jc w:val="center"/>
+        <w:rPr>
+          <w:b/>
+          <w:bCs/>
+          <w:noProof/>
+          <w:sz w:val="24"/>
+          <w:szCs w:val="24"/>
+        </w:rPr>
+      </w:pPr>
+      <w:r>
+        <w:rPr>
+          <w:b/>
+          <w:bCs/>
+          <w:noProof/>
+          <w:sz w:val="24"/>
+          <w:szCs w:val="24"/>
+        </w:rPr>
+        <w:t>Start timer</w:t>
+      </w:r>
+    </w:p>
+    <w:p>
+      <w:pPr>
+        <w:spacing w:after="0" w:line="240" w:lineRule="auto"/>
+        <w:jc w:val="center"/>
+        <w:rPr>
+          <w:b/>
+          <w:bCs/>
+          <w:noProof/>
+          <w:sz w:val="24"/>
+          <w:szCs w:val="24"/>
+        </w:rPr>
+      </w:pPr>
+    </w:p>
+    <w:p>
+      <w:pPr>
+        <w:spacing w:after="0" w:line="240" w:lineRule="auto"/>
+        <w:jc w:val="center"/>
+        <w:rPr>
+          <w:b/>
+          <w:bCs/>
+          <w:noProof/>
+          <w:sz w:val="24"/>
+          <w:szCs w:val="24"/>
+        </w:rPr>
+      </w:pPr>
+      <w:r>
+        <w:rPr>
+          <w:b/>
+          <w:bCs/>
+          <w:noProof/>
+          <w:sz w:val="24"/>
+          <w:szCs w:val="24"/>
+        </w:rPr>
+        <w:t>↓</w:t>
+      </w:r>
+    </w:p>
+    <w:p>
+      <w:pPr>
+        <w:spacing w:after="0" w:line="240" w:lineRule="auto"/>
+        <w:jc w:val="center"/>
+        <w:rPr>
+          <w:b/>
+          <w:bCs/>
+          <w:noProof/>
+          <w:sz w:val="24"/>
+          <w:szCs w:val="24"/>
+        </w:rPr>
+      </w:pPr>
+    </w:p>
+    <w:p>
+      <w:pPr>
+        <w:spacing w:after="0" w:line="240" w:lineRule="auto"/>
+        <w:jc w:val="center"/>
+        <w:rPr>
+          <w:b/>
+          <w:bCs/>
+          <w:noProof/>
+          <w:sz w:val="24"/>
+          <w:szCs w:val="24"/>
+        </w:rPr>
+      </w:pPr>
+      <w:r>
+        <w:rPr>
+          <w:b/>
+          <w:bCs/>
+          <w:noProof/>
+          <w:sz w:val="24"/>
+          <w:szCs w:val="24"/>
+        </w:rPr>
+        <w:t>Load dataset</w:t>
+      </w:r>
+    </w:p>
+    <w:p>
+      <w:pPr>
+        <w:spacing w:after="0" w:line="240" w:lineRule="auto"/>
+        <w:jc w:val="center"/>
+        <w:rPr>
+          <w:b/>
+          <w:bCs/>
+          <w:noProof/>
+          <w:sz w:val="24"/>
+          <w:szCs w:val="24"/>
+        </w:rPr>
+      </w:pPr>
+    </w:p>
+    <w:p>
+      <w:pPr>
+        <w:spacing w:after="0" w:line="240" w:lineRule="auto"/>
+        <w:jc w:val="center"/>
+        <w:rPr>
+          <w:b/>
+          <w:bCs/>
+          <w:noProof/>
+          <w:sz w:val="24"/>
+          <w:szCs w:val="24"/>
+        </w:rPr>
+      </w:pPr>
+      <w:r>
+        <w:rPr>
+          <w:b/>
+          <w:bCs/>
+          <w:noProof/>
+          <w:sz w:val="24"/>
+          <w:szCs w:val="24"/>
+        </w:rPr>
+        <w:t>↓</w:t>
+      </w:r>
+    </w:p>
+    <w:p>
+      <w:pPr>
+        <w:spacing w:after="0" w:line="240" w:lineRule="auto"/>
+        <w:jc w:val="center"/>
+        <w:rPr>
+          <w:b/>
+          <w:bCs/>
+          <w:noProof/>
+          <w:sz w:val="24"/>
+          <w:szCs w:val="24"/>
+        </w:rPr>
+      </w:pPr>
+    </w:p>
+    <w:p>
+      <w:pPr>
+        <w:spacing w:after="0" w:line="240" w:lineRule="auto"/>
+        <w:jc w:val="center"/>
+        <w:rPr>
+          <w:b/>
+          <w:bCs/>
+          <w:noProof/>
+          <w:sz w:val="24"/>
+          <w:szCs w:val="24"/>
+        </w:rPr>
+      </w:pPr>
+      <w:r>
+        <w:rPr>
+          <w:b/>
+          <w:bCs/>
+          <w:noProof/>
+          <w:sz w:val="24"/>
+          <w:szCs w:val="24"/>
+        </w:rPr>
+        <w:t>Dataset summary</w:t>
+      </w:r>
+    </w:p>
+    <w:p>
+      <w:pPr>
+        <w:spacing w:after="0" w:line="240" w:lineRule="auto"/>
+        <w:jc w:val="center"/>
+        <w:rPr>
+          <w:b/>
+          <w:bCs/>
+          <w:noProof/>
+          <w:sz w:val="24"/>
+          <w:szCs w:val="24"/>
+        </w:rPr>
+      </w:pPr>
+    </w:p>
+    <w:p>
+      <w:pPr>
+        <w:spacing w:after="0" w:line="240" w:lineRule="auto"/>
+        <w:jc w:val="center"/>
+        <w:rPr>
+          <w:b/>
+          <w:bCs/>
+          <w:noProof/>
+          <w:sz w:val="24"/>
+          <w:szCs w:val="24"/>
+        </w:rPr>
+      </w:pPr>
+      <w:r>
+        <w:rPr>
+          <w:b/>
+          <w:bCs/>
+          <w:noProof/>
+          <w:sz w:val="24"/>
+          <w:szCs w:val="24"/>
+        </w:rPr>
+        <w:t>↓</w:t>
+      </w:r>
+    </w:p>
+    <w:p>
+      <w:pPr>
+        <w:spacing w:after="0" w:line="240" w:lineRule="auto"/>
+        <w:jc w:val="center"/>
+        <w:rPr>
+          <w:b/>
+          <w:bCs/>
+          <w:noProof/>
+          <w:sz w:val="24"/>
+          <w:szCs w:val="24"/>
+        </w:rPr>
+      </w:pPr>
+    </w:p>
+    <w:p>
+      <w:pPr>
+        <w:spacing w:after="0" w:line="240" w:lineRule="auto"/>
+        <w:jc w:val="center"/>
+        <w:rPr>
+          <w:b/>
+          <w:bCs/>
+          <w:noProof/>
+          <w:sz w:val="24"/>
+          <w:szCs w:val="24"/>
+        </w:rPr>
+      </w:pPr>
+      <w:r>
+        <w:rPr>
+          <w:b/>
+          <w:bCs/>
+          <w:noProof/>
+          <w:sz w:val="24"/>
+          <w:szCs w:val="24"/>
+        </w:rPr>
+        <w:t>Forecast</w:t>
+      </w:r>
+    </w:p>
+    <w:p>
+      <w:pPr>
+        <w:spacing w:after="0" w:line="240" w:lineRule="auto"/>
+        <w:jc w:val="center"/>
+        <w:rPr>
+          <w:b/>
+          <w:bCs/>
+          <w:noProof/>
+          <w:sz w:val="24"/>
+          <w:szCs w:val="24"/>
+        </w:rPr>
+      </w:pPr>
+    </w:p>
+    <w:p>
+      <w:pPr>
+        <w:spacing w:after="0" w:line="240" w:lineRule="auto"/>
+        <w:jc w:val="center"/>
+        <w:rPr>
+          <w:b/>
+          <w:bCs/>
+          <w:noProof/>
+          <w:sz w:val="24"/>
+          <w:szCs w:val="24"/>
+        </w:rPr>
+      </w:pPr>
+      <w:r>
+        <w:rPr>
+          <w:b/>
+          <w:bCs/>
+          <w:noProof/>
+          <w:sz w:val="24"/>
+          <w:szCs w:val="24"/>
+        </w:rPr>
+        <w:t>↓</w:t>
+      </w:r>
+    </w:p>
+    <w:p>
+      <w:pPr>
+        <w:spacing w:after="0" w:line="240" w:lineRule="auto"/>
+        <w:jc w:val="center"/>
+        <w:rPr>
+          <w:b/>
+          <w:bCs/>
+          <w:noProof/>
+          <w:sz w:val="24"/>
+          <w:szCs w:val="24"/>
+        </w:rPr>
+      </w:pPr>
+    </w:p>
+    <w:p>
+      <w:pPr>
+        <w:spacing w:after="0" w:line="240" w:lineRule="auto"/>
+        <w:jc w:val="center"/>
+        <w:rPr>
+          <w:b/>
+          <w:bCs/>
+          <w:noProof/>
+          <w:sz w:val="24"/>
+          <w:szCs w:val="24"/>
+        </w:rPr>
+      </w:pPr>
+      <w:r>
+        <w:rPr>
+          <w:b/>
+          <w:bCs/>
+          <w:noProof/>
+          <w:sz w:val="24"/>
+          <w:szCs w:val="24"/>
+        </w:rPr>
+        <w:t>Plot</w:t>
+      </w:r>
+    </w:p>
+    <w:p>
+      <w:pPr>
+        <w:spacing w:after="0" w:line="240" w:lineRule="auto"/>
+        <w:jc w:val="center"/>
+        <w:rPr>
+          <w:b/>
+          <w:bCs/>
+          <w:noProof/>
+          <w:sz w:val="24"/>
+          <w:szCs w:val="24"/>
+        </w:rPr>
+      </w:pPr>
+    </w:p>
+    <w:p>
+      <w:pPr>
+        <w:spacing w:after="0" w:line="240" w:lineRule="auto"/>
+        <w:jc w:val="center"/>
+        <w:rPr>
+          <w:b/>
+          <w:bCs/>
+          <w:noProof/>
+          <w:sz w:val="24"/>
+          <w:szCs w:val="24"/>
+        </w:rPr>
+      </w:pPr>
+      <w:r>
+        <w:rPr>
+          <w:b/>
+          <w:bCs/>
+          <w:noProof/>
+          <w:sz w:val="24"/>
+          <w:szCs w:val="24"/>
+        </w:rPr>
+        <w:t>↓</w:t>
+      </w:r>
+    </w:p>
+    <w:p>
+      <w:pPr>
+        <w:spacing w:after="0" w:line="240" w:lineRule="auto"/>
+        <w:jc w:val="center"/>
+        <w:rPr>
+          <w:b/>
+          <w:bCs/>
+          <w:noProof/>
+          <w:sz w:val="24"/>
+          <w:szCs w:val="24"/>
+        </w:rPr>
+      </w:pPr>
+    </w:p>
+    <w:p>
+      <w:pPr>
+        <w:spacing w:after="0" w:line="240" w:lineRule="auto"/>
+        <w:jc w:val="center"/>
+        <w:rPr>
+          <w:b/>
+          <w:bCs/>
+          <w:noProof/>
+          <w:sz w:val="24"/>
+          <w:szCs w:val="24"/>
+        </w:rPr>
+      </w:pPr>
+      <w:r>
+        <w:rPr>
+          <w:b/>
+          <w:bCs/>
+          <w:noProof/>
+          <w:sz w:val="24"/>
+          <w:szCs w:val="24"/>
+        </w:rPr>
+        <w:t>Save artifacts</w:t>
+      </w:r>
+    </w:p>
+    <w:p>
+      <w:pPr>
+        <w:spacing w:after="0" w:line="240" w:lineRule="auto"/>
+        <w:jc w:val="center"/>
+        <w:rPr>
+          <w:b/>
+          <w:bCs/>
+          <w:noProof/>
+          <w:sz w:val="24"/>
+          <w:szCs w:val="24"/>
+        </w:rPr>
+      </w:pPr>
+    </w:p>
+    <w:p>
+      <w:pPr>
+        <w:spacing w:after="0" w:line="240" w:lineRule="auto"/>
+        <w:jc w:val="center"/>
+        <w:rPr>
+          <w:b/>
+          <w:bCs/>
+          <w:noProof/>
+          <w:sz w:val="24"/>
+          <w:szCs w:val="24"/>
+        </w:rPr>
+      </w:pPr>
+      <w:r>
+        <w:rPr>
+          <w:b/>
+          <w:bCs/>
+          <w:noProof/>
+          <w:sz w:val="24"/>
+          <w:szCs w:val="24"/>
+        </w:rPr>
+        <w:t>↓</w:t>
+      </w:r>
+    </w:p>
+    <w:p>
+      <w:pPr>
+        <w:spacing w:after="0" w:line="240" w:lineRule="auto"/>
+        <w:jc w:val="center"/>
+        <w:rPr>
+          <w:b/>
+          <w:bCs/>
+          <w:noProof/>
+          <w:sz w:val="24"/>
+          <w:szCs w:val="24"/>
+        </w:rPr>
+      </w:pPr>
+    </w:p>
+    <w:p>
+      <w:pPr>
+        <w:spacing w:after="0" w:line="240" w:lineRule="auto"/>
+        <w:jc w:val="center"/>
+        <w:rPr>
+          <w:b/>
+          <w:bCs/>
+          <w:noProof/>
+          <w:sz w:val="24"/>
+          <w:szCs w:val="24"/>
+        </w:rPr>
+      </w:pPr>
+      <w:r>
+        <w:rPr>
+          <w:b/>
+          <w:bCs/>
+          <w:noProof/>
+          <w:sz w:val="24"/>
+          <w:szCs w:val="24"/>
+        </w:rPr>
+        <w:t>Register experiment</w:t>
+      </w:r>
+    </w:p>
+    <w:p>
+      <w:pPr>
+        <w:spacing w:after="0" w:line="240" w:lineRule="auto"/>
+        <w:jc w:val="center"/>
+        <w:rPr>
+          <w:b/>
+          <w:bCs/>
+          <w:noProof/>
+          <w:sz w:val="24"/>
+          <w:szCs w:val="24"/>
+        </w:rPr>
+      </w:pPr>
+    </w:p>
+    <w:p>
+      <w:pPr>
+        <w:spacing w:after="0" w:line="240" w:lineRule="auto"/>
+        <w:jc w:val="center"/>
+        <w:rPr>
+          <w:b/>
+          <w:bCs/>
+          <w:noProof/>
+          <w:sz w:val="24"/>
+          <w:szCs w:val="24"/>
+        </w:rPr>
+      </w:pPr>
+      <w:r>
+        <w:rPr>
+          <w:b/>
+          <w:bCs/>
+          <w:noProof/>
+          <w:sz w:val="24"/>
+          <w:szCs w:val="24"/>
+        </w:rPr>
+        <w:t>↓</w:t>
+      </w:r>
+    </w:p>
+    <w:p>
+      <w:pPr>
+        <w:spacing w:after="0" w:line="240" w:lineRule="auto"/>
+        <w:jc w:val="center"/>
+        <w:rPr>
+          <w:b/>
+          <w:bCs/>
+          <w:noProof/>
+          <w:sz w:val="24"/>
+          <w:szCs w:val="24"/>
+        </w:rPr>
+      </w:pPr>
+    </w:p>
+    <w:p>
+      <w:pPr>
+        <w:spacing w:after="0" w:line="240" w:lineRule="auto"/>
+        <w:jc w:val="center"/>
+        <w:rPr>
+          <w:b/>
+          <w:bCs/>
+          <w:noProof/>
+          <w:sz w:val="24"/>
+          <w:szCs w:val="24"/>
+        </w:rPr>
+      </w:pPr>
+      <w:r>
+        <w:rPr>
+          <w:b/>
+          <w:bCs/>
+          <w:noProof/>
+          <w:sz w:val="24"/>
+          <w:szCs w:val="24"/>
+        </w:rPr>
+        <w:t>Experiment summary</w:t>
+      </w:r>
+    </w:p>
+    <w:p>
+      <w:pPr>
+        <w:spacing w:after="0" w:line="240" w:lineRule="auto"/>
+        <w:jc w:val="center"/>
+        <w:rPr>
+          <w:b/>
+          <w:bCs/>
+          <w:noProof/>
+          <w:sz w:val="24"/>
+          <w:szCs w:val="24"/>
+        </w:rPr>
+      </w:pPr>
+    </w:p>
+    <w:p>
+      <w:pPr>
+        <w:spacing w:after="0" w:line="240" w:lineRule="auto"/>
+        <w:jc w:val="center"/>
+        <w:rPr>
+          <w:b/>
+          <w:bCs/>
+          <w:noProof/>
+          <w:sz w:val="24"/>
+          <w:szCs w:val="24"/>
+        </w:rPr>
+      </w:pPr>
+      <w:r>
+        <w:rPr>
+          <w:b/>
+          <w:bCs/>
+          <w:noProof/>
+          <w:sz w:val="24"/>
+          <w:szCs w:val="24"/>
+        </w:rPr>
+        <w:t>↓</w:t>
+      </w:r>
+    </w:p>
+    <w:p>
+      <w:pPr>
+        <w:spacing w:after="0" w:line="240" w:lineRule="auto"/>
+        <w:jc w:val="center"/>
+        <w:rPr>
+          <w:b/>
+          <w:bCs/>
+          <w:noProof/>
+          <w:sz w:val="24"/>
+          <w:szCs w:val="24"/>
+        </w:rPr>
+      </w:pPr>
+    </w:p>
+    <w:p>
+      <w:pPr>
+        <w:spacing w:after="0" w:line="240" w:lineRule="auto"/>
+        <w:jc w:val="center"/>
+        <w:rPr>
+          <w:b/>
+          <w:bCs/>
+          <w:noProof/>
+          <w:sz w:val="24"/>
+          <w:szCs w:val="24"/>
+        </w:rPr>
+      </w:pPr>
+      <w:r>
+        <w:rPr>
+          <w:b/>
+          <w:bCs/>
+          <w:noProof/>
+          <w:sz w:val="24"/>
+          <w:szCs w:val="24"/>
+        </w:rPr>
+        <w:t>Footer</w:t>
+      </w:r>
+    </w:p>
+    <w:p>
+      <w:pPr>
+        <w:spacing w:after="0" w:line="240" w:lineRule="auto"/>
+        <w:jc w:val="center"/>
+        <w:rPr>
+          <w:b/>
+          <w:bCs/>
+          <w:noProof/>
+          <w:sz w:val="24"/>
+          <w:szCs w:val="24"/>
+        </w:rPr>
+      </w:pPr>
+    </w:p>
+    <w:p>
+      <w:pPr>
+        <w:rPr>
+          <w:b/>
+          <w:bCs/>
+          <w:noProof/>
+          <w:sz w:val="24"/>
+          <w:szCs w:val="24"/>
+        </w:rPr>
+      </w:pPr>
+      <w:r>
+        <w:rPr>
+          <w:b/>
+          <w:bCs/>
+          <w:noProof/>
+          <w:sz w:val="24"/>
+          <w:szCs w:val="24"/>
+        </w:rPr>
+        <w:br w:type="page"/>
+      </w:r>
+    </w:p>
+    <w:p>
+      <w:pPr>
+        <w:spacing w:after="0" w:line="240" w:lineRule="auto"/>
+        <w:rPr>
+          <w:b/>
+          <w:bCs/>
+          <w:noProof/>
+          <w:sz w:val="40"/>
+          <w:szCs w:val="40"/>
+          <w:u w:val="single"/>
+        </w:rPr>
+      </w:pPr>
+      <w:r>
+        <w:rPr>
+          <w:b/>
+          <w:bCs/>
+          <w:noProof/>
+          <w:sz w:val="40"/>
+          <w:szCs w:val="40"/>
+          <w:u w:val="single"/>
+        </w:rPr>
+        <w:lastRenderedPageBreak/>
+        <w:t>Architecture:</w:t>
+      </w:r>
+    </w:p>
+    <w:p>
+      <w:pPr>
+        <w:spacing w:after="0" w:line="240" w:lineRule="auto"/>
+        <w:jc w:val="center"/>
+        <w:rPr>
+          <w:b/>
+          <w:bCs/>
+          <w:noProof/>
+          <w:sz w:val="24"/>
+          <w:szCs w:val="24"/>
+        </w:rPr>
+      </w:pPr>
+    </w:p>
+    <w:p>
+      <w:pPr>
+        <w:spacing w:after="0" w:line="240" w:lineRule="auto"/>
+        <w:jc w:val="center"/>
+        <w:rPr>
+          <w:b/>
+          <w:bCs/>
+          <w:noProof/>
+          <w:sz w:val="24"/>
+          <w:szCs w:val="24"/>
+        </w:rPr>
+      </w:pPr>
+    </w:p>
+    <w:p>
+      <w:pPr>
+        <w:spacing w:after="0" w:line="240" w:lineRule="auto"/>
+        <w:jc w:val="center"/>
+        <w:rPr>
+          <w:b/>
+          <w:bCs/>
+          <w:noProof/>
+          <w:sz w:val="24"/>
+          <w:szCs w:val="24"/>
+        </w:rPr>
+      </w:pPr>
+    </w:p>
+    <w:p>
+      <w:pPr>
+        <w:spacing w:after="0" w:line="240" w:lineRule="auto"/>
+        <w:jc w:val="center"/>
+        <w:rPr>
+          <w:b/>
+          <w:bCs/>
+          <w:noProof/>
+          <w:sz w:val="24"/>
+          <w:szCs w:val="24"/>
+        </w:rPr>
+      </w:pPr>
+      <w:r>
+        <w:rPr>
+          <w:b/>
+          <w:bCs/>
+          <w:noProof/>
+          <w:sz w:val="24"/>
+          <w:szCs w:val="24"/>
+        </w:rPr>
+        <w:t xml:space="preserve">         ZenerEstimation</w:t>
+      </w:r>
+    </w:p>
+    <w:p>
+      <w:pPr>
+        <w:spacing w:after="0" w:line="240" w:lineRule="auto"/>
+        <w:jc w:val="center"/>
+        <w:rPr>
+          <w:b/>
+          <w:bCs/>
+          <w:noProof/>
+          <w:sz w:val="24"/>
+          <w:szCs w:val="24"/>
+        </w:rPr>
+      </w:pPr>
+      <w:r>
+        <w:rPr>
+          <w:b/>
+          <w:bCs/>
+          <w:noProof/>
+          <w:sz w:val="24"/>
+          <w:szCs w:val="24"/>
+        </w:rPr>
+        <w:t xml:space="preserve"> │</w:t>
+      </w:r>
+    </w:p>
+    <w:p>
+      <w:pPr>
+        <w:spacing w:after="0" w:line="240" w:lineRule="auto"/>
+        <w:jc w:val="center"/>
+        <w:rPr>
+          <w:b/>
+          <w:bCs/>
+          <w:noProof/>
+          <w:sz w:val="24"/>
+          <w:szCs w:val="24"/>
+        </w:rPr>
+      </w:pPr>
+      <w:r>
+        <w:rPr>
+          <w:b/>
+          <w:bCs/>
+          <w:noProof/>
+          <w:sz w:val="24"/>
+          <w:szCs w:val="24"/>
+        </w:rPr>
+        <w:t xml:space="preserve"> ┌─────────────────────────</w:t>
+      </w:r>
+      <w:r>
+        <w:rPr>
+          <w:rFonts w:ascii="MS Gothic" w:eastAsia="MS Gothic" w:hAnsi="MS Gothic" w:cs="MS Gothic" w:hint="eastAsia"/>
+          <w:b/>
+          <w:bCs/>
+          <w:noProof/>
+          <w:sz w:val="24"/>
+          <w:szCs w:val="24"/>
+        </w:rPr>
+        <w:t>┼</w:t>
+      </w:r>
+      <w:r>
+        <w:rPr>
+          <w:rFonts w:ascii="Calibri" w:hAnsi="Calibri" w:cs="Calibri"/>
+          <w:b/>
+          <w:bCs/>
+          <w:noProof/>
+          <w:sz w:val="24"/>
+          <w:szCs w:val="24"/>
+        </w:rPr>
+        <w:t>─────────────────────────┐</w:t>
+      </w:r>
+    </w:p>
+    <w:p>
+      <w:pPr>
+        <w:spacing w:after="0" w:line="240" w:lineRule="auto"/>
+        <w:rPr>
+          <w:b/>
+          <w:bCs/>
+          <w:noProof/>
+          <w:sz w:val="24"/>
+          <w:szCs w:val="24"/>
+        </w:rPr>
+      </w:pPr>
+      <w:r>
+        <w:rPr>
+          <w:b/>
+          <w:bCs/>
+          <w:noProof/>
+          <w:sz w:val="24"/>
+          <w:szCs w:val="24"/>
+        </w:rPr>
+        <w:t xml:space="preserve">                        </w:t>
+      </w:r>
+      <w:r>
+        <w:rPr>
+          <w:b/>
+          <w:bCs/>
+          <w:noProof/>
+          <w:sz w:val="24"/>
+          <w:szCs w:val="24"/>
+        </w:rPr>
+        <w:t xml:space="preserve">│                         </w:t>
+      </w:r>
+      <w:r>
+        <w:rPr>
+          <w:b/>
+          <w:bCs/>
+          <w:noProof/>
+          <w:sz w:val="24"/>
+          <w:szCs w:val="24"/>
+        </w:rPr>
+        <w:t xml:space="preserve">                                </w:t>
+      </w:r>
+      <w:r>
+        <w:rPr>
+          <w:b/>
+          <w:bCs/>
+          <w:noProof/>
+          <w:sz w:val="24"/>
+          <w:szCs w:val="24"/>
+        </w:rPr>
+        <w:t xml:space="preserve">│                         </w:t>
+      </w:r>
+      <w:r>
+        <w:rPr>
+          <w:b/>
+          <w:bCs/>
+          <w:noProof/>
+          <w:sz w:val="24"/>
+          <w:szCs w:val="24"/>
+        </w:rPr>
+        <w:t xml:space="preserve">                               </w:t>
+      </w:r>
+      <w:r>
+        <w:rPr>
+          <w:b/>
+          <w:bCs/>
+          <w:noProof/>
+          <w:sz w:val="24"/>
+          <w:szCs w:val="24"/>
+        </w:rPr>
+        <w:t>│</w:t>
+      </w:r>
+    </w:p>
+    <w:p>
+      <w:pPr>
+        <w:spacing w:after="0" w:line="240" w:lineRule="auto"/>
+        <w:rPr>
+          <w:b/>
+          <w:bCs/>
+          <w:noProof/>
+          <w:sz w:val="24"/>
+          <w:szCs w:val="24"/>
+        </w:rPr>
+      </w:pPr>
+      <w:r>
+        <w:rPr>
+          <w:b/>
+          <w:bCs/>
+          <w:noProof/>
+          <w:sz w:val="24"/>
+          <w:szCs w:val="24"/>
+        </w:rPr>
+        <w:t xml:space="preserve">                       </w:t>
+      </w:r>
+      <w:r>
+        <w:rPr>
+          <w:rFonts w:ascii="Arial" w:hAnsi="Arial" w:cs="Arial"/>
+          <w:b/>
+          <w:bCs/>
+          <w:noProof/>
+          <w:sz w:val="24"/>
+          <w:szCs w:val="24"/>
+        </w:rPr>
+        <w:t>▼</w:t>
+      </w:r>
+      <w:r>
+        <w:rPr>
+          <w:b/>
+          <w:bCs/>
+          <w:noProof/>
+          <w:sz w:val="24"/>
+          <w:szCs w:val="24"/>
+        </w:rPr>
+        <w:t xml:space="preserve">                         </w:t>
+      </w:r>
+      <w:r>
+        <w:rPr>
+          <w:b/>
+          <w:bCs/>
+          <w:noProof/>
+          <w:sz w:val="24"/>
+          <w:szCs w:val="24"/>
+        </w:rPr>
+        <w:t xml:space="preserve">                              </w:t>
+      </w:r>
+      <w:r>
+        <w:rPr>
+          <w:rFonts w:ascii="Arial" w:hAnsi="Arial" w:cs="Arial"/>
+          <w:b/>
+          <w:bCs/>
+          <w:noProof/>
+          <w:sz w:val="24"/>
+          <w:szCs w:val="24"/>
+        </w:rPr>
+        <w:t>▼</w:t>
+      </w:r>
+      <w:r>
+        <w:rPr>
+          <w:b/>
+          <w:bCs/>
+          <w:noProof/>
+          <w:sz w:val="24"/>
+          <w:szCs w:val="24"/>
+        </w:rPr>
+        <w:t xml:space="preserve">                         </w:t>
+      </w:r>
+      <w:r>
+        <w:rPr>
+          <w:b/>
+          <w:bCs/>
+          <w:noProof/>
+          <w:sz w:val="24"/>
+          <w:szCs w:val="24"/>
+        </w:rPr>
+        <w:t xml:space="preserve">                             </w:t>
+      </w:r>
+      <w:r>
+        <w:rPr>
+          <w:rFonts w:ascii="Arial" w:hAnsi="Arial" w:cs="Arial"/>
+          <w:b/>
+          <w:bCs/>
+          <w:noProof/>
+          <w:sz w:val="24"/>
+          <w:szCs w:val="24"/>
+        </w:rPr>
+        <w:t>▼</w:t>
+      </w:r>
+    </w:p>
+    <w:p>
+      <w:pPr>
+        <w:spacing w:after="0" w:line="240" w:lineRule="auto"/>
+        <w:rPr>
+          <w:b/>
+          <w:bCs/>
+          <w:noProof/>
+          <w:sz w:val="24"/>
+          <w:szCs w:val="24"/>
+        </w:rPr>
+      </w:pPr>
+      <w:r>
+        <w:rPr>
+          <w:b/>
+          <w:bCs/>
+          <w:noProof/>
+          <w:sz w:val="24"/>
+          <w:szCs w:val="24"/>
+        </w:rPr>
+        <w:t xml:space="preserve">                </w:t>
+      </w:r>
+      <w:r>
+        <w:rPr>
+          <w:b/>
+          <w:bCs/>
+          <w:noProof/>
+          <w:sz w:val="24"/>
+          <w:szCs w:val="24"/>
+        </w:rPr>
+        <w:t xml:space="preserve">Data Layer          </w:t>
+      </w:r>
+      <w:r>
+        <w:rPr>
+          <w:b/>
+          <w:bCs/>
+          <w:noProof/>
+          <w:sz w:val="24"/>
+          <w:szCs w:val="24"/>
+        </w:rPr>
+        <w:t xml:space="preserve">                       </w:t>
+      </w:r>
+      <w:r>
+        <w:rPr>
+          <w:b/>
+          <w:bCs/>
+          <w:noProof/>
+          <w:sz w:val="24"/>
+          <w:szCs w:val="24"/>
+        </w:rPr>
+        <w:t xml:space="preserve">Forecast Layer         </w:t>
+      </w:r>
+      <w:r>
+        <w:rPr>
+          <w:b/>
+          <w:bCs/>
+          <w:noProof/>
+          <w:sz w:val="24"/>
+          <w:szCs w:val="24"/>
+        </w:rPr>
+        <w:t xml:space="preserve">                 </w:t>
+      </w:r>
+      <w:r>
+        <w:rPr>
+          <w:b/>
+          <w:bCs/>
+          <w:noProof/>
+          <w:sz w:val="24"/>
+          <w:szCs w:val="24"/>
+        </w:rPr>
+        <w:t>Experiment Layer</w:t>
+      </w:r>
+    </w:p>
+    <w:p>
+      <w:pPr>
+        <w:spacing w:after="0" w:line="240" w:lineRule="auto"/>
+        <w:rPr>
+          <w:b/>
+          <w:bCs/>
+          <w:noProof/>
+          <w:sz w:val="24"/>
+          <w:szCs w:val="24"/>
+        </w:rPr>
+      </w:pPr>
+      <w:r>
+        <w:rPr>
+          <w:b/>
+          <w:bCs/>
+          <w:noProof/>
+          <w:sz w:val="24"/>
+          <w:szCs w:val="24"/>
+        </w:rPr>
+        <w:t xml:space="preserve">                        </w:t>
+      </w:r>
+      <w:r>
+        <w:rPr>
+          <w:b/>
+          <w:bCs/>
+          <w:noProof/>
+          <w:sz w:val="24"/>
+          <w:szCs w:val="24"/>
+        </w:rPr>
+        <w:t xml:space="preserve">│                         </w:t>
+      </w:r>
+      <w:r>
+        <w:rPr>
+          <w:b/>
+          <w:bCs/>
+          <w:noProof/>
+          <w:sz w:val="24"/>
+          <w:szCs w:val="24"/>
+        </w:rPr>
+        <w:t xml:space="preserve">                                </w:t>
+      </w:r>
+      <w:r>
+        <w:rPr>
+          <w:b/>
+          <w:bCs/>
+          <w:noProof/>
+          <w:sz w:val="24"/>
+          <w:szCs w:val="24"/>
+        </w:rPr>
+        <w:t xml:space="preserve">│                         </w:t>
+      </w:r>
+      <w:r>
+        <w:rPr>
+          <w:b/>
+          <w:bCs/>
+          <w:noProof/>
+          <w:sz w:val="24"/>
+          <w:szCs w:val="24"/>
+        </w:rPr>
+        <w:t xml:space="preserve">                               </w:t>
+      </w:r>
+      <w:r>
+        <w:rPr>
+          <w:b/>
+          <w:bCs/>
+          <w:noProof/>
+          <w:sz w:val="24"/>
+          <w:szCs w:val="24"/>
+        </w:rPr>
+        <w:t>│</w:t>
+      </w:r>
+    </w:p>
+    <w:p>
+      <w:pPr>
+        <w:spacing w:after="0" w:line="240" w:lineRule="auto"/>
+        <w:rPr>
+          <w:b/>
+          <w:bCs/>
+          <w:noProof/>
+          <w:sz w:val="24"/>
+          <w:szCs w:val="24"/>
+        </w:rPr>
+      </w:pPr>
+      <w:r>
+        <w:rPr>
+          <w:b/>
+          <w:bCs/>
+          <w:noProof/>
+          <w:sz w:val="24"/>
+          <w:szCs w:val="24"/>
+        </w:rPr>
+        <w:t xml:space="preserve">            </w:t>
+      </w:r>
+      <w:r>
+        <w:rPr>
+          <w:b/>
+          <w:bCs/>
+          <w:noProof/>
+          <w:sz w:val="24"/>
+          <w:szCs w:val="24"/>
+        </w:rPr>
+        <w:t xml:space="preserve">BatteryDataset      </w:t>
+      </w:r>
+      <w:r>
+        <w:rPr>
+          <w:b/>
+          <w:bCs/>
+          <w:noProof/>
+          <w:sz w:val="24"/>
+          <w:szCs w:val="24"/>
+        </w:rPr>
+        <w:t xml:space="preserve">                       </w:t>
+      </w:r>
+      <w:r>
+        <w:rPr>
+          <w:b/>
+          <w:bCs/>
+          <w:noProof/>
+          <w:sz w:val="24"/>
+          <w:szCs w:val="24"/>
+        </w:rPr>
+        <w:t xml:space="preserve">ForecastPipeline       </w:t>
+      </w:r>
+      <w:r>
+        <w:rPr>
+          <w:b/>
+          <w:bCs/>
+          <w:noProof/>
+          <w:sz w:val="24"/>
+          <w:szCs w:val="24"/>
+        </w:rPr>
+        <w:t xml:space="preserve">                         </w:t>
+      </w:r>
+      <w:r>
+        <w:rPr>
+          <w:b/>
+          <w:bCs/>
+          <w:noProof/>
+          <w:sz w:val="24"/>
+          <w:szCs w:val="24"/>
+        </w:rPr>
+        <w:t>Experiment</w:t>
+      </w:r>
+    </w:p>
+    <w:p>
+      <w:pPr>
+        <w:spacing w:after="0" w:line="240" w:lineRule="auto"/>
+        <w:rPr>
+          <w:b/>
+          <w:bCs/>
+          <w:noProof/>
+          <w:sz w:val="24"/>
+          <w:szCs w:val="24"/>
+        </w:rPr>
+      </w:pPr>
+      <w:r>
+        <w:rPr>
+          <w:b/>
+          <w:bCs/>
+          <w:noProof/>
+          <w:sz w:val="24"/>
+          <w:szCs w:val="24"/>
+        </w:rPr>
+        <w:t xml:space="preserve">              </w:t>
+      </w:r>
+      <w:r>
+        <w:rPr>
+          <w:b/>
+          <w:bCs/>
+          <w:noProof/>
+          <w:sz w:val="24"/>
+          <w:szCs w:val="24"/>
+        </w:rPr>
+        <w:t xml:space="preserve">SmartLoader         </w:t>
+      </w:r>
+      <w:r>
+        <w:rPr>
+          <w:b/>
+          <w:bCs/>
+          <w:noProof/>
+          <w:sz w:val="24"/>
+          <w:szCs w:val="24"/>
+        </w:rPr>
+        <w:t xml:space="preserve">                    </w:t>
+      </w:r>
+      <w:r>
+        <w:rPr>
+          <w:b/>
+          <w:bCs/>
+          <w:noProof/>
+          <w:sz w:val="24"/>
+          <w:szCs w:val="24"/>
+        </w:rPr>
+        <w:t xml:space="preserve">BaseForecastModel      </w:t>
+      </w:r>
+      <w:r>
+        <w:rPr>
+          <w:b/>
+          <w:bCs/>
+          <w:noProof/>
+          <w:sz w:val="24"/>
+          <w:szCs w:val="24"/>
+        </w:rPr>
+        <w:t xml:space="preserve">               </w:t>
+      </w:r>
+      <w:r>
+        <w:rPr>
+          <w:b/>
+          <w:bCs/>
+          <w:noProof/>
+          <w:sz w:val="24"/>
+          <w:szCs w:val="24"/>
+        </w:rPr>
+        <w:t>ExperimentRegistry</w:t>
+      </w:r>
+    </w:p>
+    <w:p>
+      <w:pPr>
+        <w:spacing w:after="0" w:line="240" w:lineRule="auto"/>
+        <w:rPr>
+          <w:b/>
+          <w:bCs/>
+          <w:noProof/>
+          <w:sz w:val="24"/>
+          <w:szCs w:val="24"/>
+        </w:rPr>
+      </w:pPr>
+      <w:r>
+        <w:rPr>
+          <w:b/>
+          <w:bCs/>
+          <w:noProof/>
+          <w:sz w:val="24"/>
+          <w:szCs w:val="24"/>
+        </w:rPr>
+        <w:t xml:space="preserve">                </w:t>
+      </w:r>
+      <w:r>
+        <w:rPr>
+          <w:b/>
+          <w:bCs/>
+          <w:noProof/>
+          <w:sz w:val="24"/>
+          <w:szCs w:val="24"/>
+        </w:rPr>
+        <w:t xml:space="preserve">Validation          </w:t>
+      </w:r>
+      <w:r>
+        <w:rPr>
+          <w:b/>
+          <w:bCs/>
+          <w:noProof/>
+          <w:sz w:val="24"/>
+          <w:szCs w:val="24"/>
+        </w:rPr>
+        <w:t xml:space="preserve">                                 </w:t>
+      </w:r>
+      <w:r>
+        <w:rPr>
+          <w:b/>
+          <w:bCs/>
+          <w:noProof/>
+          <w:sz w:val="24"/>
+          <w:szCs w:val="24"/>
+        </w:rPr>
+        <w:t xml:space="preserve">ARIMA                  </w:t>
+      </w:r>
+      <w:r>
+        <w:rPr>
+          <w:b/>
+          <w:bCs/>
+          <w:noProof/>
+          <w:sz w:val="24"/>
+          <w:szCs w:val="24"/>
+        </w:rPr>
+        <w:t xml:space="preserve">                          </w:t>
+      </w:r>
+      <w:r>
+        <w:rPr>
+          <w:b/>
+          <w:bCs/>
+          <w:noProof/>
+          <w:sz w:val="24"/>
+          <w:szCs w:val="24"/>
+        </w:rPr>
+        <w:t>Results</w:t>
+      </w:r>
+    </w:p>
+    <w:p>
+      <w:pPr>
+        <w:spacing w:after="0" w:line="240" w:lineRule="auto"/>
+        <w:rPr>
+          <w:b/>
+          <w:bCs/>
+          <w:noProof/>
+          <w:sz w:val="24"/>
+          <w:szCs w:val="24"/>
+        </w:rPr>
+      </w:pPr>
+      <w:r>
+        <w:rPr>
+          <w:b/>
+          <w:bCs/>
+          <w:noProof/>
+          <w:sz w:val="24"/>
+          <w:szCs w:val="24"/>
+        </w:rPr>
+        <w:t xml:space="preserve">                 </w:t>
+      </w:r>
+      <w:r>
+        <w:rPr>
+          <w:b/>
+          <w:bCs/>
+          <w:noProof/>
+          <w:sz w:val="24"/>
+          <w:szCs w:val="24"/>
+        </w:rPr>
+        <w:t xml:space="preserve">Cleaning            </w:t>
+      </w:r>
+      <w:r>
+        <w:rPr>
+          <w:b/>
+          <w:bCs/>
+          <w:noProof/>
+          <w:sz w:val="24"/>
+          <w:szCs w:val="24"/>
+        </w:rPr>
+        <w:t xml:space="preserve">                          </w:t>
+      </w:r>
+      <w:r>
+        <w:rPr>
+          <w:b/>
+          <w:bCs/>
+          <w:noProof/>
+          <w:sz w:val="24"/>
+          <w:szCs w:val="24"/>
+        </w:rPr>
+        <w:t>ForecastResult</w:t>
+      </w:r>
+    </w:p>
+    <w:p>
+      <w:pPr>
+        <w:spacing w:after="0" w:line="240" w:lineRule="auto"/>
+        <w:rPr>
+          <w:b/>
+          <w:bCs/>
+          <w:noProof/>
+          <w:sz w:val="24"/>
+          <w:szCs w:val="24"/>
+        </w:rPr>
+      </w:pPr>
+    </w:p>
+    <w:p>
+      <w:pPr>
+        <w:spacing w:after="0" w:line="240" w:lineRule="auto"/>
+        <w:rPr>
+          <w:b/>
+          <w:bCs/>
+          <w:noProof/>
+          <w:sz w:val="24"/>
+          <w:szCs w:val="24"/>
+        </w:rPr>
+      </w:pPr>
+    </w:p>
+    <w:p>
+      <w:pPr>
+        <w:spacing w:after="0" w:line="240" w:lineRule="auto"/>
+        <w:jc w:val="center"/>
+        <w:rPr>
+          <w:b/>
+          <w:bCs/>
+          <w:noProof/>
+          <w:sz w:val="24"/>
+          <w:szCs w:val="24"/>
+        </w:rPr>
+      </w:pPr>
+    </w:p>
+    <w:p>
+      <w:pPr>
+        <w:spacing w:after="0" w:line="240" w:lineRule="auto"/>
+        <w:jc w:val="center"/>
+        <w:rPr>
+          <w:b/>
+          <w:bCs/>
+          <w:noProof/>
+          <w:sz w:val="36"/>
+          <w:szCs w:val="36"/>
+          <w:u w:val="single"/>
+        </w:rPr>
+      </w:pPr>
+      <w:r>
+        <w:rPr>
+          <w:b/>
+          <w:bCs/>
+          <w:noProof/>
+          <w:sz w:val="24"/>
+          <w:szCs w:val="24"/>
+        </w:rPr>
+        <w:t xml:space="preserve">                   </w:t>
+      </w:r>
+      <w:r>
+        <w:rPr>
+          <w:b/>
+          <w:bCs/>
+          <w:noProof/>
+          <w:sz w:val="36"/>
+          <w:szCs w:val="36"/>
+          <w:u w:val="single"/>
+        </w:rPr>
+        <w:t>ZenerEstimation Framework</w:t>
+      </w:r>
+    </w:p>
+    <w:p>
+      <w:pPr>
+        <w:spacing w:after="0" w:line="240" w:lineRule="auto"/>
+        <w:jc w:val="center"/>
+        <w:rPr>
+          <w:b/>
+          <w:bCs/>
+          <w:noProof/>
+          <w:sz w:val="24"/>
+          <w:szCs w:val="24"/>
+        </w:rPr>
+      </w:pPr>
+    </w:p>
+    <w:p>
+      <w:pPr>
+        <w:spacing w:after="0" w:line="240" w:lineRule="auto"/>
+        <w:jc w:val="center"/>
+        <w:rPr>
+          <w:b/>
+          <w:bCs/>
+          <w:noProof/>
+          <w:sz w:val="24"/>
+          <w:szCs w:val="24"/>
+        </w:rPr>
+      </w:pPr>
+      <w:r>
+        <w:rPr>
+          <w:b/>
+          <w:bCs/>
+          <w:noProof/>
+          <w:sz w:val="24"/>
+          <w:szCs w:val="24"/>
+        </w:rPr>
+        <w:t xml:space="preserve">        CSV Dataset</w:t>
+      </w:r>
+    </w:p>
+    <w:p>
+      <w:pPr>
+        <w:spacing w:after="0" w:line="240" w:lineRule="auto"/>
+        <w:jc w:val="center"/>
+        <w:rPr>
+          <w:b/>
+          <w:bCs/>
+          <w:noProof/>
+          <w:sz w:val="24"/>
+          <w:szCs w:val="24"/>
+        </w:rPr>
+      </w:pPr>
+      <w:r>
+        <w:rPr>
+          <w:b/>
+          <w:bCs/>
+          <w:noProof/>
+          <w:sz w:val="24"/>
+          <w:szCs w:val="24"/>
+        </w:rPr>
+        <w:t xml:space="preserve">             │</w:t>
+      </w:r>
+    </w:p>
+    <w:p>
+      <w:pPr>
+        <w:spacing w:after="0" w:line="240" w:lineRule="auto"/>
+        <w:jc w:val="center"/>
+        <w:rPr>
+          <w:b/>
+          <w:bCs/>
+          <w:noProof/>
+          <w:sz w:val="24"/>
+          <w:szCs w:val="24"/>
+        </w:rPr>
+      </w:pPr>
+      <w:r>
+        <w:rPr>
+          <w:b/>
+          <w:bCs/>
+          <w:noProof/>
+          <w:sz w:val="24"/>
+          <w:szCs w:val="24"/>
+        </w:rPr>
+        <w:t xml:space="preserve">             </w:t>
+      </w:r>
+      <w:r>
+        <w:rPr>
+          <w:rFonts w:ascii="Arial" w:hAnsi="Arial" w:cs="Arial"/>
+          <w:b/>
+          <w:bCs/>
+          <w:noProof/>
+          <w:sz w:val="24"/>
+          <w:szCs w:val="24"/>
+        </w:rPr>
+        <w:t>▼</w:t>
+      </w:r>
+    </w:p>
+    <w:p>
+      <w:pPr>
+        <w:spacing w:after="0" w:line="240" w:lineRule="auto"/>
+        <w:jc w:val="center"/>
+        <w:rPr>
+          <w:b/>
+          <w:bCs/>
+          <w:noProof/>
+          <w:sz w:val="24"/>
+          <w:szCs w:val="24"/>
+        </w:rPr>
+      </w:pPr>
+      <w:r>
+        <w:rPr>
+          <w:b/>
+          <w:bCs/>
+          <w:noProof/>
+          <w:sz w:val="24"/>
+          <w:szCs w:val="24"/>
+        </w:rPr>
+        <w:t xml:space="preserve">    SmartDatasetLoader</w:t>
+      </w:r>
+    </w:p>
+    <w:p>
+      <w:pPr>
+        <w:spacing w:after="0" w:line="240" w:lineRule="auto"/>
+        <w:jc w:val="center"/>
+        <w:rPr>
+          <w:b/>
+          <w:bCs/>
+          <w:noProof/>
+          <w:sz w:val="24"/>
+          <w:szCs w:val="24"/>
+        </w:rPr>
+      </w:pPr>
+      <w:r>
+        <w:rPr>
+          <w:b/>
+          <w:bCs/>
+          <w:noProof/>
+          <w:sz w:val="24"/>
+          <w:szCs w:val="24"/>
+        </w:rPr>
+        <w:t xml:space="preserve">             │</w:t>
+      </w:r>
+    </w:p>
+    <w:p>
+      <w:pPr>
+        <w:spacing w:after="0" w:line="240" w:lineRule="auto"/>
+        <w:jc w:val="center"/>
+        <w:rPr>
+          <w:b/>
+          <w:bCs/>
+          <w:noProof/>
+          <w:sz w:val="24"/>
+          <w:szCs w:val="24"/>
+        </w:rPr>
+      </w:pPr>
+      <w:r>
+        <w:rPr>
+          <w:b/>
+          <w:bCs/>
+          <w:noProof/>
+          <w:sz w:val="24"/>
+          <w:szCs w:val="24"/>
+        </w:rPr>
+        <w:t xml:space="preserve">             </w:t>
+      </w:r>
+      <w:r>
+        <w:rPr>
+          <w:rFonts w:ascii="Arial" w:hAnsi="Arial" w:cs="Arial"/>
+          <w:b/>
+          <w:bCs/>
+          <w:noProof/>
+          <w:sz w:val="24"/>
+          <w:szCs w:val="24"/>
+        </w:rPr>
+        <w:t>▼</w:t>
+      </w:r>
+    </w:p>
+    <w:p>
+      <w:pPr>
+        <w:spacing w:after="0" w:line="240" w:lineRule="auto"/>
+        <w:jc w:val="center"/>
+        <w:rPr>
+          <w:b/>
+          <w:bCs/>
+          <w:noProof/>
+          <w:sz w:val="24"/>
+          <w:szCs w:val="24"/>
+        </w:rPr>
+      </w:pPr>
+      <w:r>
+        <w:rPr>
+          <w:b/>
+          <w:bCs/>
+          <w:noProof/>
+          <w:sz w:val="24"/>
+          <w:szCs w:val="24"/>
+        </w:rPr>
+        <w:t xml:space="preserve">      BatteryDataset</w:t>
+      </w:r>
+    </w:p>
+    <w:p>
+      <w:pPr>
+        <w:spacing w:after="0" w:line="240" w:lineRule="auto"/>
+        <w:jc w:val="center"/>
+        <w:rPr>
+          <w:b/>
+          <w:bCs/>
+          <w:noProof/>
+          <w:sz w:val="24"/>
+          <w:szCs w:val="24"/>
+        </w:rPr>
+      </w:pPr>
+      <w:r>
+        <w:rPr>
+          <w:b/>
+          <w:bCs/>
+          <w:noProof/>
+          <w:sz w:val="24"/>
+          <w:szCs w:val="24"/>
+        </w:rPr>
+        <w:t xml:space="preserve">             │</w:t>
+      </w:r>
+    </w:p>
+    <w:p>
+      <w:pPr>
+        <w:spacing w:after="0" w:line="240" w:lineRule="auto"/>
+        <w:jc w:val="center"/>
+        <w:rPr>
+          <w:b/>
+          <w:bCs/>
+          <w:noProof/>
+          <w:sz w:val="24"/>
+          <w:szCs w:val="24"/>
+        </w:rPr>
+      </w:pPr>
+      <w:r>
+        <w:rPr>
+          <w:b/>
+          <w:bCs/>
+          <w:noProof/>
+          <w:sz w:val="24"/>
+          <w:szCs w:val="24"/>
+        </w:rPr>
+        <w:t xml:space="preserve">             </w:t>
+      </w:r>
+      <w:r>
+        <w:rPr>
+          <w:rFonts w:ascii="Arial" w:hAnsi="Arial" w:cs="Arial"/>
+          <w:b/>
+          <w:bCs/>
+          <w:noProof/>
+          <w:sz w:val="24"/>
+          <w:szCs w:val="24"/>
+        </w:rPr>
+        <w:t>▼</w:t>
+      </w:r>
+    </w:p>
+    <w:p>
+      <w:pPr>
+        <w:spacing w:after="0" w:line="240" w:lineRule="auto"/>
+        <w:jc w:val="center"/>
+        <w:rPr>
+          <w:b/>
+          <w:bCs/>
+          <w:noProof/>
+          <w:sz w:val="24"/>
+          <w:szCs w:val="24"/>
+        </w:rPr>
+      </w:pPr>
+      <w:r>
+        <w:rPr>
+          <w:b/>
+          <w:bCs/>
+          <w:noProof/>
+          <w:sz w:val="24"/>
+          <w:szCs w:val="24"/>
+        </w:rPr>
+        <w:t xml:space="preserve">     ARIMAForecaster</w:t>
+      </w:r>
+    </w:p>
+    <w:p>
+      <w:pPr>
+        <w:spacing w:after="0" w:line="240" w:lineRule="auto"/>
+        <w:jc w:val="center"/>
+        <w:rPr>
+          <w:b/>
+          <w:bCs/>
+          <w:noProof/>
+          <w:sz w:val="24"/>
+          <w:szCs w:val="24"/>
+        </w:rPr>
+      </w:pPr>
+      <w:r>
+        <w:rPr>
+          <w:b/>
+          <w:bCs/>
+          <w:noProof/>
+          <w:sz w:val="24"/>
+          <w:szCs w:val="24"/>
+        </w:rPr>
+        <w:t xml:space="preserve">             │</w:t>
+      </w:r>
+    </w:p>
+    <w:p>
+      <w:pPr>
+        <w:spacing w:after="0" w:line="240" w:lineRule="auto"/>
+        <w:jc w:val="center"/>
+        <w:rPr>
+          <w:b/>
+          <w:bCs/>
+          <w:noProof/>
+          <w:sz w:val="24"/>
+          <w:szCs w:val="24"/>
+        </w:rPr>
+      </w:pPr>
+      <w:r>
+        <w:rPr>
+          <w:b/>
+          <w:bCs/>
+          <w:noProof/>
+          <w:sz w:val="24"/>
+          <w:szCs w:val="24"/>
+        </w:rPr>
+        <w:t xml:space="preserve">             </w:t>
+      </w:r>
+      <w:r>
+        <w:rPr>
+          <w:rFonts w:ascii="Arial" w:hAnsi="Arial" w:cs="Arial"/>
+          <w:b/>
+          <w:bCs/>
+          <w:noProof/>
+          <w:sz w:val="24"/>
+          <w:szCs w:val="24"/>
+        </w:rPr>
+        <w:t>▼</w:t>
+      </w:r>
+    </w:p>
+    <w:p>
+      <w:pPr>
+        <w:spacing w:after="0" w:line="240" w:lineRule="auto"/>
+        <w:jc w:val="center"/>
+        <w:rPr>
+          <w:b/>
+          <w:bCs/>
+          <w:noProof/>
+          <w:sz w:val="24"/>
+          <w:szCs w:val="24"/>
+        </w:rPr>
+      </w:pPr>
+      <w:r>
+        <w:rPr>
+          <w:b/>
+          <w:bCs/>
+          <w:noProof/>
+          <w:sz w:val="24"/>
+          <w:szCs w:val="24"/>
+        </w:rPr>
+        <w:t xml:space="preserve">     ForecastResult</w:t>
+      </w:r>
+    </w:p>
+    <w:p>
+      <w:pPr>
+        <w:spacing w:after="0" w:line="240" w:lineRule="auto"/>
+        <w:jc w:val="center"/>
+        <w:rPr>
+          <w:b/>
+          <w:bCs/>
+          <w:noProof/>
+          <w:sz w:val="24"/>
+          <w:szCs w:val="24"/>
+        </w:rPr>
+      </w:pPr>
+      <w:r>
+        <w:rPr>
+          <w:b/>
+          <w:bCs/>
+          <w:noProof/>
+          <w:sz w:val="24"/>
+          <w:szCs w:val="24"/>
+        </w:rPr>
+        <w:t xml:space="preserve">             │</w:t>
+      </w:r>
+    </w:p>
+    <w:p>
+      <w:pPr>
+        <w:spacing w:after="0" w:line="240" w:lineRule="auto"/>
+        <w:jc w:val="center"/>
+        <w:rPr>
+          <w:b/>
+          <w:bCs/>
+          <w:noProof/>
+          <w:sz w:val="24"/>
+          <w:szCs w:val="24"/>
+        </w:rPr>
+      </w:pPr>
+      <w:r>
+        <w:rPr>
+          <w:b/>
+          <w:bCs/>
+          <w:noProof/>
+          <w:sz w:val="24"/>
+          <w:szCs w:val="24"/>
+        </w:rPr>
+        <w:t xml:space="preserve">             </w:t>
+      </w:r>
+      <w:r>
+        <w:rPr>
+          <w:rFonts w:ascii="Arial" w:hAnsi="Arial" w:cs="Arial"/>
+          <w:b/>
+          <w:bCs/>
+          <w:noProof/>
+          <w:sz w:val="24"/>
+          <w:szCs w:val="24"/>
+        </w:rPr>
+        <w:t>▼</w:t>
+      </w:r>
+    </w:p>
+    <w:p>
+      <w:pPr>
+        <w:spacing w:after="0" w:line="240" w:lineRule="auto"/>
+        <w:jc w:val="center"/>
+        <w:rPr>
+          <w:b/>
+          <w:bCs/>
+          <w:noProof/>
+          <w:sz w:val="24"/>
+          <w:szCs w:val="24"/>
+        </w:rPr>
+      </w:pPr>
+      <w:r>
+        <w:rPr>
+          <w:b/>
+          <w:bCs/>
+          <w:noProof/>
+          <w:sz w:val="24"/>
+          <w:szCs w:val="24"/>
+        </w:rPr>
+        <w:t xml:space="preserve">      ForecastPlot</w:t>
+      </w:r>
+    </w:p>
+    <w:p>
+      <w:pPr>
+        <w:spacing w:after="0" w:line="240" w:lineRule="auto"/>
+        <w:jc w:val="center"/>
+        <w:rPr>
+          <w:b/>
+          <w:bCs/>
+          <w:noProof/>
+          <w:sz w:val="24"/>
+          <w:szCs w:val="24"/>
+        </w:rPr>
+      </w:pPr>
+      <w:r>
+        <w:rPr>
+          <w:b/>
+          <w:bCs/>
+          <w:noProof/>
+          <w:sz w:val="24"/>
+          <w:szCs w:val="24"/>
+        </w:rPr>
+        <w:t xml:space="preserve">             │</w:t>
+      </w:r>
+    </w:p>
+    <w:p>
+      <w:pPr>
+        <w:spacing w:after="0" w:line="240" w:lineRule="auto"/>
+        <w:jc w:val="center"/>
+        <w:rPr>
+          <w:b/>
+          <w:bCs/>
+          <w:noProof/>
+          <w:sz w:val="24"/>
+          <w:szCs w:val="24"/>
+        </w:rPr>
+      </w:pPr>
+      <w:r>
+        <w:rPr>
+          <w:b/>
+          <w:bCs/>
+          <w:noProof/>
+          <w:sz w:val="24"/>
+          <w:szCs w:val="24"/>
+        </w:rPr>
+        <w:t xml:space="preserve">             </w:t>
+      </w:r>
+      <w:r>
+        <w:rPr>
+          <w:rFonts w:ascii="Arial" w:hAnsi="Arial" w:cs="Arial"/>
+          <w:b/>
+          <w:bCs/>
+          <w:noProof/>
+          <w:sz w:val="24"/>
+          <w:szCs w:val="24"/>
+        </w:rPr>
+        <w:t>▼</w:t>
+      </w:r>
+    </w:p>
+    <w:p>
+      <w:pPr>
+        <w:spacing w:after="0" w:line="240" w:lineRule="auto"/>
+        <w:jc w:val="center"/>
+        <w:rPr>
+          <w:b/>
+          <w:bCs/>
+          <w:noProof/>
+          <w:sz w:val="24"/>
+          <w:szCs w:val="24"/>
+        </w:rPr>
+      </w:pPr>
+      <w:r>
+        <w:rPr>
+          <w:b/>
+          <w:bCs/>
+          <w:noProof/>
+          <w:sz w:val="24"/>
+          <w:szCs w:val="24"/>
+        </w:rPr>
+        <w:t xml:space="preserve">      PNG + JSON + Report</w:t>
+      </w:r>
+    </w:p>
+    <w:p>
+      <w:pPr>
+        <w:spacing w:after="0" w:line="240" w:lineRule="auto"/>
+        <w:jc w:val="center"/>
+        <w:rPr>
+          <w:b/>
+          <w:bCs/>
+          <w:noProof/>
+          <w:sz w:val="24"/>
+          <w:szCs w:val="24"/>
+        </w:rPr>
+      </w:pPr>
+      <w:r>
+        <w:rPr>
+          <w:b/>
+          <w:bCs/>
+          <w:noProof/>
+          <w:sz w:val="24"/>
+          <w:szCs w:val="24"/>
+        </w:rPr>
+        <w:t xml:space="preserve">             │</w:t>
+      </w:r>
+    </w:p>
+    <w:p>
+      <w:pPr>
+        <w:spacing w:after="0" w:line="240" w:lineRule="auto"/>
+        <w:jc w:val="center"/>
+        <w:rPr>
+          <w:b/>
+          <w:bCs/>
+          <w:noProof/>
+          <w:sz w:val="24"/>
+          <w:szCs w:val="24"/>
+        </w:rPr>
+      </w:pPr>
+      <w:r>
+        <w:rPr>
+          <w:b/>
+          <w:bCs/>
+          <w:noProof/>
+          <w:sz w:val="24"/>
+          <w:szCs w:val="24"/>
+        </w:rPr>
+        <w:t xml:space="preserve">             </w:t>
+      </w:r>
+      <w:r>
+        <w:rPr>
+          <w:rFonts w:ascii="Arial" w:hAnsi="Arial" w:cs="Arial"/>
+          <w:b/>
+          <w:bCs/>
+          <w:noProof/>
+          <w:sz w:val="24"/>
+          <w:szCs w:val="24"/>
+        </w:rPr>
+        <w:t>▼</w:t>
+      </w:r>
+    </w:p>
+    <w:p>
+      <w:pPr>
+        <w:spacing w:after="0" w:line="240" w:lineRule="auto"/>
+        <w:jc w:val="center"/>
+        <w:rPr>
+          <w:b/>
+          <w:bCs/>
+          <w:noProof/>
+          <w:sz w:val="24"/>
+          <w:szCs w:val="24"/>
+        </w:rPr>
+      </w:pPr>
+      <w:r>
+        <w:rPr>
+          <w:b/>
+          <w:bCs/>
+          <w:noProof/>
+          <w:sz w:val="24"/>
+          <w:szCs w:val="24"/>
+        </w:rPr>
+        <w:t xml:space="preserve">    ExperimentRegistry</w:t>
+      </w:r>
+    </w:p>
+    <w:p>
+      <w:pPr>
+        <w:spacing w:after="0" w:line="240" w:lineRule="auto"/>
+        <w:jc w:val="center"/>
+        <w:rPr>
+          <w:b/>
+          <w:bCs/>
+          <w:noProof/>
+          <w:sz w:val="24"/>
+          <w:szCs w:val="24"/>
+        </w:rPr>
+      </w:pPr>
+      <w:r>
+        <w:rPr>
+          <w:b/>
+          <w:bCs/>
+          <w:noProof/>
+          <w:sz w:val="24"/>
+          <w:szCs w:val="24"/>
+        </w:rPr>
+        <w:t xml:space="preserve">             │</w:t>
+      </w:r>
+    </w:p>
+    <w:p>
+      <w:pPr>
+        <w:spacing w:after="0" w:line="240" w:lineRule="auto"/>
+        <w:jc w:val="center"/>
+        <w:rPr>
+          <w:b/>
+          <w:bCs/>
+          <w:noProof/>
+          <w:sz w:val="24"/>
+          <w:szCs w:val="24"/>
+        </w:rPr>
+      </w:pPr>
+      <w:r>
+        <w:rPr>
+          <w:b/>
+          <w:bCs/>
+          <w:noProof/>
+          <w:sz w:val="24"/>
+          <w:szCs w:val="24"/>
+        </w:rPr>
+        <w:t xml:space="preserve">             </w:t>
+      </w:r>
+      <w:r>
+        <w:rPr>
+          <w:rFonts w:ascii="Arial" w:hAnsi="Arial" w:cs="Arial"/>
+          <w:b/>
+          <w:bCs/>
+          <w:noProof/>
+          <w:sz w:val="24"/>
+          <w:szCs w:val="24"/>
+        </w:rPr>
+        <w:t>▼</w:t>
+      </w:r>
+    </w:p>
+    <w:p>
+      <w:pPr>
+        <w:spacing w:after="0" w:line="240" w:lineRule="auto"/>
+        <w:jc w:val="center"/>
+        <w:rPr>
+          <w:b/>
+          <w:bCs/>
+          <w:noProof/>
+          <w:sz w:val="24"/>
+          <w:szCs w:val="24"/>
+        </w:rPr>
+      </w:pPr>
+      <w:r>
+        <w:rPr>
+          <w:b/>
+          <w:bCs/>
+          <w:noProof/>
+          <w:sz w:val="24"/>
+          <w:szCs w:val="24"/>
+        </w:rPr>
+        <w:t xml:space="preserve">      history.json</w:t>
+      </w:r>
+    </w:p>
+    <w:p>
+      <w:pPr>
+        <w:spacing w:after="0" w:line="240" w:lineRule="auto"/>
+        <w:jc w:val="center"/>
+        <w:rPr>
+          <w:b/>
+          <w:bCs/>
+          <w:noProof/>
+          <w:sz w:val="24"/>
+          <w:szCs w:val="24"/>
+        </w:rPr>
+      </w:pPr>
     </w:p>
     <w:sectPr>
       <w:pgSz w:w="11906" w:h="16838"/>
@@ -12715,6 +15651,7 @@
   <w:style w:type="character" w:default="1" w:styleId="VarsaylanParagrafYazTipi">
     <w:name w:val="Default Paragraph Font"/>
     <w:uiPriority w:val="1"/>
+    <w:semiHidden/>
     <w:unhideWhenUsed/>
   </w:style>
   <w:style w:type="table" w:default="1" w:styleId="NormalTablo">

</xml_diff>

<commit_message>
Sprint 5: Finalize ARIMA visualization and experiment workflow
</commit_message>
<xml_diff>
--- a/docs/development_flow.docx
+++ b/docs/development_flow.docx
@@ -14169,11 +14169,931 @@
     </w:p>
     <w:p>
       <w:pPr>
+        <w:rPr>
+          <w:b/>
+          <w:bCs/>
+          <w:noProof/>
+          <w:sz w:val="24"/>
+          <w:szCs w:val="24"/>
+        </w:rPr>
+      </w:pPr>
+      <w:r>
+        <w:rPr>
+          <w:b/>
+          <w:bCs/>
+          <w:noProof/>
+          <w:sz w:val="24"/>
+          <w:szCs w:val="24"/>
+        </w:rPr>
+        <w:br w:type="page"/>
+      </w:r>
+    </w:p>
+    <w:p>
+      <w:pPr>
         <w:spacing w:after="0" w:line="240" w:lineRule="auto"/>
         <w:jc w:val="center"/>
         <w:rPr>
           <w:b/>
           <w:bCs/>
+          <w:noProof/>
+          <w:sz w:val="24"/>
+          <w:szCs w:val="24"/>
+        </w:rPr>
+      </w:pPr>
+    </w:p>
+    <w:p>
+      <w:pPr>
+        <w:spacing w:after="0" w:line="240" w:lineRule="auto"/>
+        <w:rPr>
+          <w:b/>
+          <w:bCs/>
+          <w:noProof/>
+          <w:sz w:val="32"/>
+          <w:szCs w:val="32"/>
+          <w:u w:val="single"/>
+        </w:rPr>
+      </w:pPr>
+      <w:r>
+        <w:rPr>
+          <w:b/>
+          <w:bCs/>
+          <w:noProof/>
+          <w:sz w:val="32"/>
+          <w:szCs w:val="32"/>
+          <w:u w:val="single"/>
+        </w:rPr>
+        <w:t>Completed Sprint 5</w:t>
+      </w:r>
+      <w:r>
+        <w:rPr>
+          <w:b/>
+          <w:bCs/>
+          <w:noProof/>
+          <w:sz w:val="32"/>
+          <w:szCs w:val="32"/>
+          <w:u w:val="single"/>
+        </w:rPr>
+        <w:t>:</w:t>
+      </w:r>
+    </w:p>
+    <w:p>
+      <w:pPr>
+        <w:spacing w:after="0" w:line="240" w:lineRule="auto"/>
+        <w:rPr>
+          <w:b/>
+          <w:bCs/>
+          <w:noProof/>
+          <w:sz w:val="24"/>
+          <w:szCs w:val="24"/>
+        </w:rPr>
+      </w:pPr>
+    </w:p>
+    <w:p>
+      <w:pPr>
+        <w:spacing w:after="0" w:line="240" w:lineRule="auto"/>
+        <w:rPr>
+          <w:noProof/>
+          <w:sz w:val="24"/>
+          <w:szCs w:val="24"/>
+        </w:rPr>
+      </w:pPr>
+      <w:r>
+        <w:rPr>
+          <w:noProof/>
+          <w:sz w:val="24"/>
+          <w:szCs w:val="24"/>
+        </w:rPr>
+        <w:t>Highlights</w:t>
+      </w:r>
+    </w:p>
+    <w:p>
+      <w:pPr>
+        <w:spacing w:after="0" w:line="240" w:lineRule="auto"/>
+        <w:rPr>
+          <w:noProof/>
+          <w:sz w:val="24"/>
+          <w:szCs w:val="24"/>
+        </w:rPr>
+      </w:pPr>
+    </w:p>
+    <w:p>
+      <w:pPr>
+        <w:spacing w:after="0" w:line="240" w:lineRule="auto"/>
+        <w:rPr>
+          <w:noProof/>
+          <w:sz w:val="24"/>
+          <w:szCs w:val="24"/>
+        </w:rPr>
+      </w:pPr>
+      <w:r>
+        <w:rPr>
+          <w:noProof/>
+          <w:sz w:val="24"/>
+          <w:szCs w:val="24"/>
+        </w:rPr>
+        <w:t>• Completed the first end-to-end forecasting demonstration.</w:t>
+      </w:r>
+    </w:p>
+    <w:p>
+      <w:pPr>
+        <w:spacing w:after="0" w:line="240" w:lineRule="auto"/>
+        <w:rPr>
+          <w:noProof/>
+          <w:sz w:val="24"/>
+          <w:szCs w:val="24"/>
+        </w:rPr>
+      </w:pPr>
+      <w:r>
+        <w:rPr>
+          <w:noProof/>
+          <w:sz w:val="24"/>
+          <w:szCs w:val="24"/>
+        </w:rPr>
+        <w:t>• Implemented ARIMAForecaster integration.</w:t>
+      </w:r>
+    </w:p>
+    <w:p>
+      <w:pPr>
+        <w:spacing w:after="0" w:line="240" w:lineRule="auto"/>
+        <w:rPr>
+          <w:noProof/>
+          <w:sz w:val="24"/>
+          <w:szCs w:val="24"/>
+        </w:rPr>
+      </w:pPr>
+      <w:r>
+        <w:rPr>
+          <w:noProof/>
+          <w:sz w:val="24"/>
+          <w:szCs w:val="24"/>
+        </w:rPr>
+        <w:t>• Introduced ForecastResult support for optional fitted values.</w:t>
+      </w:r>
+    </w:p>
+    <w:p>
+      <w:pPr>
+        <w:spacing w:after="0" w:line="240" w:lineRule="auto"/>
+        <w:rPr>
+          <w:noProof/>
+          <w:sz w:val="24"/>
+          <w:szCs w:val="24"/>
+        </w:rPr>
+      </w:pPr>
+      <w:r>
+        <w:rPr>
+          <w:noProof/>
+          <w:sz w:val="24"/>
+          <w:szCs w:val="24"/>
+        </w:rPr>
+        <w:t>• Enhanced ForecastPlot to visualize measured data, fitted model values and future forecasts.</w:t>
+      </w:r>
+    </w:p>
+    <w:p>
+      <w:pPr>
+        <w:spacing w:after="0" w:line="240" w:lineRule="auto"/>
+        <w:rPr>
+          <w:noProof/>
+          <w:sz w:val="24"/>
+          <w:szCs w:val="24"/>
+        </w:rPr>
+      </w:pPr>
+      <w:r>
+        <w:rPr>
+          <w:noProof/>
+          <w:sz w:val="24"/>
+          <w:szCs w:val="24"/>
+        </w:rPr>
+        <w:t>• Improved experiment artifact generation.</w:t>
+      </w:r>
+    </w:p>
+    <w:p>
+      <w:pPr>
+        <w:spacing w:after="0" w:line="240" w:lineRule="auto"/>
+        <w:rPr>
+          <w:noProof/>
+          <w:sz w:val="24"/>
+          <w:szCs w:val="24"/>
+        </w:rPr>
+      </w:pPr>
+      <w:r>
+        <w:rPr>
+          <w:noProof/>
+          <w:sz w:val="24"/>
+          <w:szCs w:val="24"/>
+        </w:rPr>
+        <w:t>• Added experiment registration and execution history.</w:t>
+      </w:r>
+    </w:p>
+    <w:p>
+      <w:pPr>
+        <w:spacing w:after="0" w:line="240" w:lineRule="auto"/>
+        <w:rPr>
+          <w:noProof/>
+          <w:sz w:val="24"/>
+          <w:szCs w:val="24"/>
+        </w:rPr>
+      </w:pPr>
+      <w:r>
+        <w:rPr>
+          <w:noProof/>
+          <w:sz w:val="24"/>
+          <w:szCs w:val="24"/>
+        </w:rPr>
+        <w:t>• Improved console output and dataset summary.</w:t>
+      </w:r>
+    </w:p>
+    <w:p>
+      <w:pPr>
+        <w:spacing w:after="0" w:line="240" w:lineRule="auto"/>
+        <w:rPr>
+          <w:noProof/>
+          <w:sz w:val="24"/>
+          <w:szCs w:val="24"/>
+        </w:rPr>
+      </w:pPr>
+      <w:r>
+        <w:rPr>
+          <w:noProof/>
+          <w:sz w:val="24"/>
+          <w:szCs w:val="24"/>
+        </w:rPr>
+        <w:t>• Refined demonstration workflow and framework architecture.</w:t>
+      </w:r>
+    </w:p>
+    <w:p>
+      <w:pPr>
+        <w:spacing w:after="0" w:line="240" w:lineRule="auto"/>
+        <w:rPr>
+          <w:noProof/>
+          <w:sz w:val="24"/>
+          <w:szCs w:val="24"/>
+        </w:rPr>
+      </w:pPr>
+      <w:r>
+        <w:rPr>
+          <w:noProof/>
+          <w:sz w:val="24"/>
+          <w:szCs w:val="24"/>
+        </w:rPr>
+        <w:t>• Verified framework stability with the complete pytest suite.</w:t>
+      </w:r>
+    </w:p>
+    <w:p>
+      <w:pPr>
+        <w:spacing w:after="0" w:line="240" w:lineRule="auto"/>
+        <w:rPr>
+          <w:noProof/>
+          <w:sz w:val="24"/>
+          <w:szCs w:val="24"/>
+        </w:rPr>
+      </w:pPr>
+    </w:p>
+    <w:p>
+      <w:pPr>
+        <w:spacing w:after="0" w:line="240" w:lineRule="auto"/>
+        <w:rPr>
+          <w:noProof/>
+          <w:sz w:val="24"/>
+          <w:szCs w:val="24"/>
+        </w:rPr>
+      </w:pPr>
+      <w:r>
+        <w:rPr>
+          <w:noProof/>
+          <w:sz w:val="24"/>
+          <w:szCs w:val="24"/>
+        </w:rPr>
+        <w:t>This establishes the first production-quality forecasting workflow and serves as the reference implementation for future forecasting models (Kalman, ETS, LSTM and GRU).</w:t>
+      </w:r>
+    </w:p>
+    <w:p>
+      <w:pPr>
+        <w:spacing w:after="0" w:line="240" w:lineRule="auto"/>
+        <w:rPr>
+          <w:noProof/>
+          <w:sz w:val="24"/>
+          <w:szCs w:val="24"/>
+        </w:rPr>
+      </w:pPr>
+    </w:p>
+    <w:p>
+      <w:pPr>
+        <w:spacing w:after="0" w:line="240" w:lineRule="auto"/>
+        <w:rPr>
+          <w:noProof/>
+          <w:sz w:val="24"/>
+          <w:szCs w:val="24"/>
+        </w:rPr>
+      </w:pPr>
+    </w:p>
+    <w:p>
+      <w:pPr>
+        <w:spacing w:after="0" w:line="240" w:lineRule="auto"/>
+        <w:rPr>
+          <w:b/>
+          <w:bCs/>
+          <w:noProof/>
+          <w:sz w:val="32"/>
+          <w:szCs w:val="32"/>
+          <w:u w:val="single"/>
+          <w:lang w:val="tr-TR"/>
+        </w:rPr>
+      </w:pPr>
+      <w:r>
+        <w:rPr>
+          <w:b/>
+          <w:bCs/>
+          <w:noProof/>
+          <w:sz w:val="32"/>
+          <w:szCs w:val="32"/>
+          <w:u w:val="single"/>
+          <w:lang w:val="tr-TR"/>
+        </w:rPr>
+        <w:t>Sprint 6:</w:t>
+      </w:r>
+    </w:p>
+    <w:p>
+      <w:pPr>
+        <w:spacing w:after="0" w:line="240" w:lineRule="auto"/>
+        <w:rPr>
+          <w:noProof/>
+          <w:sz w:val="24"/>
+          <w:szCs w:val="24"/>
+        </w:rPr>
+      </w:pPr>
+    </w:p>
+    <w:p>
+      <w:pPr>
+        <w:spacing w:after="0" w:line="240" w:lineRule="auto"/>
+        <w:rPr>
+          <w:b/>
+          <w:bCs/>
+          <w:noProof/>
+          <w:sz w:val="24"/>
+          <w:szCs w:val="24"/>
+          <w:lang w:val="tr-TR"/>
+        </w:rPr>
+      </w:pPr>
+      <w:r>
+        <w:rPr>
+          <w:b/>
+          <w:bCs/>
+          <w:noProof/>
+          <w:sz w:val="24"/>
+          <w:szCs w:val="24"/>
+          <w:lang w:val="tr-TR"/>
+        </w:rPr>
+        <w:t>Commit 1</w:t>
+      </w:r>
+    </w:p>
+    <w:p>
+      <w:pPr>
+        <w:spacing w:after="0" w:line="240" w:lineRule="auto"/>
+        <w:rPr>
+          <w:noProof/>
+          <w:sz w:val="24"/>
+          <w:szCs w:val="24"/>
+          <w:lang w:val="tr-TR"/>
+        </w:rPr>
+      </w:pPr>
+      <w:r>
+        <w:rPr>
+          <w:b/>
+          <w:bCs/>
+          <w:noProof/>
+          <w:sz w:val="24"/>
+          <w:szCs w:val="24"/>
+          <w:lang w:val="tr-TR"/>
+        </w:rPr>
+        <w:t>Model-aware reporting</w:t>
+      </w:r>
+    </w:p>
+    <w:p>
+      <w:pPr>
+        <w:numPr>
+          <w:ilvl w:val="0"/>
+          <w:numId w:val="7"/>
+        </w:numPr>
+        <w:spacing w:after="0" w:line="240" w:lineRule="auto"/>
+        <w:rPr>
+          <w:noProof/>
+          <w:sz w:val="24"/>
+          <w:szCs w:val="24"/>
+          <w:lang w:val="tr-TR"/>
+        </w:rPr>
+      </w:pPr>
+      <w:r>
+        <w:rPr>
+          <w:noProof/>
+          <w:sz w:val="24"/>
+          <w:szCs w:val="24"/>
+          <w:lang w:val="tr-TR"/>
+        </w:rPr>
+        <w:t xml:space="preserve">generic report sections </w:t>
+      </w:r>
+    </w:p>
+    <w:p>
+      <w:pPr>
+        <w:numPr>
+          <w:ilvl w:val="0"/>
+          <w:numId w:val="7"/>
+        </w:numPr>
+        <w:spacing w:after="0" w:line="240" w:lineRule="auto"/>
+        <w:rPr>
+          <w:noProof/>
+          <w:sz w:val="24"/>
+          <w:szCs w:val="24"/>
+          <w:lang w:val="tr-TR"/>
+        </w:rPr>
+      </w:pPr>
+      <w:r>
+        <w:rPr>
+          <w:noProof/>
+          <w:sz w:val="24"/>
+          <w:szCs w:val="24"/>
+          <w:lang w:val="tr-TR"/>
+        </w:rPr>
+        <w:t xml:space="preserve">ARIMA metadata </w:t>
+      </w:r>
+    </w:p>
+    <w:p>
+      <w:pPr>
+        <w:numPr>
+          <w:ilvl w:val="0"/>
+          <w:numId w:val="7"/>
+        </w:numPr>
+        <w:spacing w:after="0" w:line="240" w:lineRule="auto"/>
+        <w:rPr>
+          <w:noProof/>
+          <w:sz w:val="24"/>
+          <w:szCs w:val="24"/>
+          <w:lang w:val="tr-TR"/>
+        </w:rPr>
+      </w:pPr>
+      <w:r>
+        <w:rPr>
+          <w:noProof/>
+          <w:sz w:val="24"/>
+          <w:szCs w:val="24"/>
+          <w:lang w:val="tr-TR"/>
+        </w:rPr>
+        <w:t xml:space="preserve">report templates </w:t>
+      </w:r>
+    </w:p>
+    <w:p>
+      <w:pPr>
+        <w:spacing w:after="0" w:line="240" w:lineRule="auto"/>
+        <w:rPr>
+          <w:b/>
+          <w:bCs/>
+          <w:noProof/>
+          <w:sz w:val="24"/>
+          <w:szCs w:val="24"/>
+          <w:lang w:val="tr-TR"/>
+        </w:rPr>
+      </w:pPr>
+      <w:r>
+        <w:rPr>
+          <w:b/>
+          <w:bCs/>
+          <w:noProof/>
+          <w:sz w:val="24"/>
+          <w:szCs w:val="24"/>
+          <w:lang w:val="tr-TR"/>
+        </w:rPr>
+        <w:t>Commit 2</w:t>
+      </w:r>
+    </w:p>
+    <w:p>
+      <w:pPr>
+        <w:spacing w:after="0" w:line="240" w:lineRule="auto"/>
+        <w:rPr>
+          <w:noProof/>
+          <w:sz w:val="24"/>
+          <w:szCs w:val="24"/>
+          <w:lang w:val="tr-TR"/>
+        </w:rPr>
+      </w:pPr>
+      <w:r>
+        <w:rPr>
+          <w:b/>
+          <w:bCs/>
+          <w:noProof/>
+          <w:sz w:val="24"/>
+          <w:szCs w:val="24"/>
+          <w:lang w:val="tr-TR"/>
+        </w:rPr>
+        <w:t>Adaptive Kalman Forecaster</w:t>
+      </w:r>
+    </w:p>
+    <w:p>
+      <w:pPr>
+        <w:numPr>
+          <w:ilvl w:val="0"/>
+          <w:numId w:val="8"/>
+        </w:numPr>
+        <w:spacing w:after="0" w:line="240" w:lineRule="auto"/>
+        <w:rPr>
+          <w:noProof/>
+          <w:sz w:val="24"/>
+          <w:szCs w:val="24"/>
+          <w:lang w:val="tr-TR"/>
+        </w:rPr>
+      </w:pPr>
+      <w:r>
+        <w:rPr>
+          <w:noProof/>
+          <w:sz w:val="24"/>
+          <w:szCs w:val="24"/>
+          <w:lang w:val="tr-TR"/>
+        </w:rPr>
+        <w:t xml:space="preserve">state model </w:t>
+      </w:r>
+    </w:p>
+    <w:p>
+      <w:pPr>
+        <w:numPr>
+          <w:ilvl w:val="0"/>
+          <w:numId w:val="8"/>
+        </w:numPr>
+        <w:spacing w:after="0" w:line="240" w:lineRule="auto"/>
+        <w:rPr>
+          <w:noProof/>
+          <w:sz w:val="24"/>
+          <w:szCs w:val="24"/>
+          <w:lang w:val="tr-TR"/>
+        </w:rPr>
+      </w:pPr>
+      <w:r>
+        <w:rPr>
+          <w:noProof/>
+          <w:sz w:val="24"/>
+          <w:szCs w:val="24"/>
+          <w:lang w:val="tr-TR"/>
+        </w:rPr>
+        <w:t xml:space="preserve">prediction </w:t>
+      </w:r>
+    </w:p>
+    <w:p>
+      <w:pPr>
+        <w:numPr>
+          <w:ilvl w:val="0"/>
+          <w:numId w:val="8"/>
+        </w:numPr>
+        <w:spacing w:after="0" w:line="240" w:lineRule="auto"/>
+        <w:rPr>
+          <w:noProof/>
+          <w:sz w:val="24"/>
+          <w:szCs w:val="24"/>
+          <w:lang w:val="tr-TR"/>
+        </w:rPr>
+      </w:pPr>
+      <w:r>
+        <w:rPr>
+          <w:noProof/>
+          <w:sz w:val="24"/>
+          <w:szCs w:val="24"/>
+          <w:lang w:val="tr-TR"/>
+        </w:rPr>
+        <w:t xml:space="preserve">update </w:t>
+      </w:r>
+    </w:p>
+    <w:p>
+      <w:pPr>
+        <w:numPr>
+          <w:ilvl w:val="0"/>
+          <w:numId w:val="8"/>
+        </w:numPr>
+        <w:spacing w:after="0" w:line="240" w:lineRule="auto"/>
+        <w:rPr>
+          <w:noProof/>
+          <w:sz w:val="24"/>
+          <w:szCs w:val="24"/>
+          <w:lang w:val="tr-TR"/>
+        </w:rPr>
+      </w:pPr>
+      <w:r>
+        <w:rPr>
+          <w:noProof/>
+          <w:sz w:val="24"/>
+          <w:szCs w:val="24"/>
+          <w:lang w:val="tr-TR"/>
+        </w:rPr>
+        <w:t xml:space="preserve">forecasting API </w:t>
+      </w:r>
+    </w:p>
+    <w:p>
+      <w:pPr>
+        <w:spacing w:after="0" w:line="240" w:lineRule="auto"/>
+        <w:rPr>
+          <w:b/>
+          <w:bCs/>
+          <w:noProof/>
+          <w:sz w:val="24"/>
+          <w:szCs w:val="24"/>
+          <w:lang w:val="tr-TR"/>
+        </w:rPr>
+      </w:pPr>
+      <w:r>
+        <w:rPr>
+          <w:b/>
+          <w:bCs/>
+          <w:noProof/>
+          <w:sz w:val="24"/>
+          <w:szCs w:val="24"/>
+          <w:lang w:val="tr-TR"/>
+        </w:rPr>
+        <w:t>Commit 3</w:t>
+      </w:r>
+    </w:p>
+    <w:p>
+      <w:pPr>
+        <w:spacing w:after="0" w:line="240" w:lineRule="auto"/>
+        <w:rPr>
+          <w:noProof/>
+          <w:sz w:val="24"/>
+          <w:szCs w:val="24"/>
+          <w:lang w:val="tr-TR"/>
+        </w:rPr>
+      </w:pPr>
+      <w:r>
+        <w:rPr>
+          <w:b/>
+          <w:bCs/>
+          <w:noProof/>
+          <w:sz w:val="24"/>
+          <w:szCs w:val="24"/>
+          <w:lang w:val="tr-TR"/>
+        </w:rPr>
+        <w:t>Kalman Demonstration</w:t>
+      </w:r>
+    </w:p>
+    <w:p>
+      <w:pPr>
+        <w:numPr>
+          <w:ilvl w:val="0"/>
+          <w:numId w:val="9"/>
+        </w:numPr>
+        <w:spacing w:after="0" w:line="240" w:lineRule="auto"/>
+        <w:rPr>
+          <w:noProof/>
+          <w:sz w:val="24"/>
+          <w:szCs w:val="24"/>
+          <w:lang w:val="tr-TR"/>
+        </w:rPr>
+      </w:pPr>
+      <w:r>
+        <w:rPr>
+          <w:noProof/>
+          <w:sz w:val="24"/>
+          <w:szCs w:val="24"/>
+          <w:lang w:val="tr-TR"/>
+        </w:rPr>
+        <w:t xml:space="preserve">console output </w:t>
+      </w:r>
+    </w:p>
+    <w:p>
+      <w:pPr>
+        <w:numPr>
+          <w:ilvl w:val="0"/>
+          <w:numId w:val="9"/>
+        </w:numPr>
+        <w:spacing w:after="0" w:line="240" w:lineRule="auto"/>
+        <w:rPr>
+          <w:noProof/>
+          <w:sz w:val="24"/>
+          <w:szCs w:val="24"/>
+          <w:lang w:val="tr-TR"/>
+        </w:rPr>
+      </w:pPr>
+      <w:r>
+        <w:rPr>
+          <w:noProof/>
+          <w:sz w:val="24"/>
+          <w:szCs w:val="24"/>
+          <w:lang w:val="tr-TR"/>
+        </w:rPr>
+        <w:t xml:space="preserve">plotting </w:t>
+      </w:r>
+    </w:p>
+    <w:p>
+      <w:pPr>
+        <w:numPr>
+          <w:ilvl w:val="0"/>
+          <w:numId w:val="9"/>
+        </w:numPr>
+        <w:spacing w:after="0" w:line="240" w:lineRule="auto"/>
+        <w:rPr>
+          <w:noProof/>
+          <w:sz w:val="24"/>
+          <w:szCs w:val="24"/>
+          <w:lang w:val="tr-TR"/>
+        </w:rPr>
+      </w:pPr>
+      <w:r>
+        <w:rPr>
+          <w:noProof/>
+          <w:sz w:val="24"/>
+          <w:szCs w:val="24"/>
+          <w:lang w:val="tr-TR"/>
+        </w:rPr>
+        <w:t xml:space="preserve">experiment registry </w:t>
+      </w:r>
+    </w:p>
+    <w:p>
+      <w:pPr>
+        <w:numPr>
+          <w:ilvl w:val="0"/>
+          <w:numId w:val="9"/>
+        </w:numPr>
+        <w:spacing w:after="0" w:line="240" w:lineRule="auto"/>
+        <w:rPr>
+          <w:noProof/>
+          <w:sz w:val="24"/>
+          <w:szCs w:val="24"/>
+          <w:lang w:val="tr-TR"/>
+        </w:rPr>
+      </w:pPr>
+      <w:r>
+        <w:rPr>
+          <w:noProof/>
+          <w:sz w:val="24"/>
+          <w:szCs w:val="24"/>
+          <w:lang w:val="tr-TR"/>
+        </w:rPr>
+        <w:t xml:space="preserve">report generation </w:t>
+      </w:r>
+    </w:p>
+    <w:p>
+      <w:pPr>
+        <w:spacing w:after="0" w:line="240" w:lineRule="auto"/>
+        <w:rPr>
+          <w:b/>
+          <w:bCs/>
+          <w:noProof/>
+          <w:sz w:val="24"/>
+          <w:szCs w:val="24"/>
+          <w:lang w:val="tr-TR"/>
+        </w:rPr>
+      </w:pPr>
+      <w:r>
+        <w:rPr>
+          <w:b/>
+          <w:bCs/>
+          <w:noProof/>
+          <w:sz w:val="24"/>
+          <w:szCs w:val="24"/>
+          <w:lang w:val="tr-TR"/>
+        </w:rPr>
+        <w:t>Commit 4</w:t>
+      </w:r>
+    </w:p>
+    <w:p>
+      <w:pPr>
+        <w:spacing w:after="0" w:line="240" w:lineRule="auto"/>
+        <w:rPr>
+          <w:noProof/>
+          <w:sz w:val="24"/>
+          <w:szCs w:val="24"/>
+          <w:lang w:val="tr-TR"/>
+        </w:rPr>
+      </w:pPr>
+      <w:r>
+        <w:rPr>
+          <w:b/>
+          <w:bCs/>
+          <w:noProof/>
+          <w:sz w:val="24"/>
+          <w:szCs w:val="24"/>
+          <w:lang w:val="tr-TR"/>
+        </w:rPr>
+        <w:t>Benchmark Framework</w:t>
+      </w:r>
+    </w:p>
+    <w:p>
+      <w:pPr>
+        <w:numPr>
+          <w:ilvl w:val="0"/>
+          <w:numId w:val="10"/>
+        </w:numPr>
+        <w:spacing w:after="0" w:line="240" w:lineRule="auto"/>
+        <w:rPr>
+          <w:noProof/>
+          <w:sz w:val="24"/>
+          <w:szCs w:val="24"/>
+          <w:lang w:val="tr-TR"/>
+        </w:rPr>
+      </w:pPr>
+      <w:r>
+        <w:rPr>
+          <w:noProof/>
+          <w:sz w:val="24"/>
+          <w:szCs w:val="24"/>
+          <w:lang w:val="tr-TR"/>
+        </w:rPr>
+        <w:t xml:space="preserve">compare ARIMA vs Kalman </w:t>
+      </w:r>
+    </w:p>
+    <w:p>
+      <w:pPr>
+        <w:numPr>
+          <w:ilvl w:val="0"/>
+          <w:numId w:val="10"/>
+        </w:numPr>
+        <w:spacing w:after="0" w:line="240" w:lineRule="auto"/>
+        <w:rPr>
+          <w:noProof/>
+          <w:sz w:val="24"/>
+          <w:szCs w:val="24"/>
+          <w:lang w:val="tr-TR"/>
+        </w:rPr>
+      </w:pPr>
+      <w:r>
+        <w:rPr>
+          <w:noProof/>
+          <w:sz w:val="24"/>
+          <w:szCs w:val="24"/>
+          <w:lang w:val="tr-TR"/>
+        </w:rPr>
+        <w:t xml:space="preserve">RMSE </w:t>
+      </w:r>
+    </w:p>
+    <w:p>
+      <w:pPr>
+        <w:numPr>
+          <w:ilvl w:val="0"/>
+          <w:numId w:val="10"/>
+        </w:numPr>
+        <w:spacing w:after="0" w:line="240" w:lineRule="auto"/>
+        <w:rPr>
+          <w:noProof/>
+          <w:sz w:val="24"/>
+          <w:szCs w:val="24"/>
+          <w:lang w:val="tr-TR"/>
+        </w:rPr>
+      </w:pPr>
+      <w:r>
+        <w:rPr>
+          <w:noProof/>
+          <w:sz w:val="24"/>
+          <w:szCs w:val="24"/>
+          <w:lang w:val="tr-TR"/>
+        </w:rPr>
+        <w:t xml:space="preserve">MAE </w:t>
+      </w:r>
+    </w:p>
+    <w:p>
+      <w:pPr>
+        <w:numPr>
+          <w:ilvl w:val="0"/>
+          <w:numId w:val="10"/>
+        </w:numPr>
+        <w:spacing w:after="0" w:line="240" w:lineRule="auto"/>
+        <w:rPr>
+          <w:noProof/>
+          <w:sz w:val="24"/>
+          <w:szCs w:val="24"/>
+          <w:lang w:val="tr-TR"/>
+        </w:rPr>
+      </w:pPr>
+      <w:r>
+        <w:rPr>
+          <w:noProof/>
+          <w:sz w:val="24"/>
+          <w:szCs w:val="24"/>
+          <w:lang w:val="tr-TR"/>
+        </w:rPr>
+        <w:t xml:space="preserve">execution time </w:t>
+      </w:r>
+    </w:p>
+    <w:p>
+      <w:pPr>
+        <w:numPr>
+          <w:ilvl w:val="0"/>
+          <w:numId w:val="10"/>
+        </w:numPr>
+        <w:spacing w:after="0" w:line="240" w:lineRule="auto"/>
+        <w:rPr>
+          <w:noProof/>
+          <w:sz w:val="24"/>
+          <w:szCs w:val="24"/>
+          <w:lang w:val="tr-TR"/>
+        </w:rPr>
+      </w:pPr>
+      <w:r>
+        <w:rPr>
+          <w:noProof/>
+          <w:sz w:val="24"/>
+          <w:szCs w:val="24"/>
+          <w:lang w:val="tr-TR"/>
+        </w:rPr>
+        <w:t xml:space="preserve">experiment summary </w:t>
+      </w:r>
+    </w:p>
+    <w:p>
+      <w:pPr>
+        <w:spacing w:after="0" w:line="240" w:lineRule="auto"/>
+        <w:rPr>
           <w:noProof/>
           <w:sz w:val="24"/>
           <w:szCs w:val="24"/>
@@ -14193,9 +15113,9 @@
 <file path=word/numbering.xml><?xml version="1.0" encoding="utf-8"?>
 <w:numbering xmlns:wpc="http://schemas.microsoft.com/office/word/2010/wordprocessingCanvas" xmlns:cx="http://schemas.microsoft.com/office/drawing/2014/chartex" xmlns:cx1="http://schemas.microsoft.com/office/drawing/2015/9/8/chartex" xmlns:cx2="http://schemas.microsoft.com/office/drawing/2015/10/21/chartex" xmlns:cx3="http://schemas.microsoft.com/office/drawing/2016/5/9/chartex" xmlns:cx4="http://schemas.microsoft.com/office/drawing/2016/5/10/chartex" xmlns:cx5="http://schemas.microsoft.com/office/drawing/2016/5/11/chartex" xmlns:cx6="http://schemas.microsoft.com/office/drawing/2016/5/12/chartex" xmlns:cx7="http://schemas.microsoft.com/office/drawing/2016/5/13/chartex" xmlns:cx8="http://schemas.microsoft.com/office/drawing/2016/5/14/chartex" xmlns:mc="http://schemas.openxmlformats.org/markup-compatibility/2006" xmlns:aink="http://schemas.microsoft.com/office/drawing/2016/ink" xmlns:am3d="http://schemas.microsoft.com/office/drawing/2017/model3d" xmlns:o="urn:schemas-microsoft-com:office:office" xmlns:oel="http://schemas.microsoft.com/office/2019/extlst" xmlns:r="http://schemas.openxmlformats.org/officeDocument/2006/relationships" xmlns:m="http://schemas.openxmlformats.org/officeDocument/2006/math" xmlns:v="urn:schemas-microsoft-com:vml" xmlns:wp14="http://schemas.microsoft.com/office/word/2010/wordprocessingDrawing" xmlns:wp="http://schemas.openxmlformats.org/drawingml/2006/wordprocessingDrawing" xmlns:w10="urn:schemas-microsoft-com:office:word" xmlns:w="http://schemas.openxmlformats.org/wordprocessingml/2006/main" xmlns:w14="http://schemas.microsoft.com/office/word/2010/wordml" xmlns:w15="http://schemas.microsoft.com/office/word/2012/wordml" xmlns:w16cex="http://schemas.microsoft.com/office/word/2018/wordml/cex" xmlns:w16cid="http://schemas.microsoft.com/office/word/2016/wordml/cid" xmlns:w16="http://schemas.microsoft.com/office/word/2018/wordml" xmlns:w16du="http://schemas.microsoft.com/office/word/2023/wordml/word16du" xmlns:w16sdtdh="http://schemas.microsoft.com/office/word/2020/wordml/sdtdatahash" xmlns:w16sdtfl="http://schemas.microsoft.com/office/word/2024/wordml/sdtformatlock" xmlns:w16se="http://schemas.microsoft.com/office/word/2015/wordml/symex" xmlns:wpg="http://schemas.microsoft.com/office/word/2010/wordprocessingGroup" xmlns:wpi="http://schemas.microsoft.com/office/word/2010/wordprocessingInk" xmlns:wne="http://schemas.microsoft.com/office/word/2006/wordml" xmlns:wps="http://schemas.microsoft.com/office/word/2010/wordprocessingShape" mc:Ignorable="w14 w15 w16se w16cid w16 w16cex w16sdtdh w16sdtfl w16du wp14">
   <w:abstractNum w:abstractNumId="0" w15:restartNumberingAfterBreak="0">
-    <w:nsid w:val="18C72CDA"/>
+    <w:nsid w:val="01B652AA"/>
     <w:multiLevelType w:val="multilevel"/>
-    <w:tmpl w:val="B7EE9C34"/>
+    <w:tmpl w:val="1012BF34"/>
     <w:lvl w:ilvl="0">
       <w:start w:val="1"/>
       <w:numFmt w:val="bullet"/>
@@ -14342,98 +15262,9 @@
     </w:lvl>
   </w:abstractNum>
   <w:abstractNum w:abstractNumId="1" w15:restartNumberingAfterBreak="0">
-    <w:nsid w:val="321D4140"/>
-    <w:multiLevelType w:val="hybridMultilevel"/>
-    <w:tmpl w:val="3E7CA19E"/>
-    <w:lvl w:ilvl="0" w:tplc="041F000F">
-      <w:start w:val="1"/>
-      <w:numFmt w:val="decimal"/>
-      <w:lvlText w:val="%1."/>
-      <w:lvlJc w:val="left"/>
-      <w:pPr>
-        <w:ind w:left="720" w:hanging="360"/>
-      </w:pPr>
-      <w:rPr>
-        <w:rFonts w:hint="default"/>
-      </w:rPr>
-    </w:lvl>
-    <w:lvl w:ilvl="1" w:tplc="041F0019" w:tentative="1">
-      <w:start w:val="1"/>
-      <w:numFmt w:val="lowerLetter"/>
-      <w:lvlText w:val="%2."/>
-      <w:lvlJc w:val="left"/>
-      <w:pPr>
-        <w:ind w:left="1440" w:hanging="360"/>
-      </w:pPr>
-    </w:lvl>
-    <w:lvl w:ilvl="2" w:tplc="041F001B" w:tentative="1">
-      <w:start w:val="1"/>
-      <w:numFmt w:val="lowerRoman"/>
-      <w:lvlText w:val="%3."/>
-      <w:lvlJc w:val="right"/>
-      <w:pPr>
-        <w:ind w:left="2160" w:hanging="180"/>
-      </w:pPr>
-    </w:lvl>
-    <w:lvl w:ilvl="3" w:tplc="041F000F" w:tentative="1">
-      <w:start w:val="1"/>
-      <w:numFmt w:val="decimal"/>
-      <w:lvlText w:val="%4."/>
-      <w:lvlJc w:val="left"/>
-      <w:pPr>
-        <w:ind w:left="2880" w:hanging="360"/>
-      </w:pPr>
-    </w:lvl>
-    <w:lvl w:ilvl="4" w:tplc="041F0019" w:tentative="1">
-      <w:start w:val="1"/>
-      <w:numFmt w:val="lowerLetter"/>
-      <w:lvlText w:val="%5."/>
-      <w:lvlJc w:val="left"/>
-      <w:pPr>
-        <w:ind w:left="3600" w:hanging="360"/>
-      </w:pPr>
-    </w:lvl>
-    <w:lvl w:ilvl="5" w:tplc="041F001B" w:tentative="1">
-      <w:start w:val="1"/>
-      <w:numFmt w:val="lowerRoman"/>
-      <w:lvlText w:val="%6."/>
-      <w:lvlJc w:val="right"/>
-      <w:pPr>
-        <w:ind w:left="4320" w:hanging="180"/>
-      </w:pPr>
-    </w:lvl>
-    <w:lvl w:ilvl="6" w:tplc="041F000F" w:tentative="1">
-      <w:start w:val="1"/>
-      <w:numFmt w:val="decimal"/>
-      <w:lvlText w:val="%7."/>
-      <w:lvlJc w:val="left"/>
-      <w:pPr>
-        <w:ind w:left="5040" w:hanging="360"/>
-      </w:pPr>
-    </w:lvl>
-    <w:lvl w:ilvl="7" w:tplc="041F0019" w:tentative="1">
-      <w:start w:val="1"/>
-      <w:numFmt w:val="lowerLetter"/>
-      <w:lvlText w:val="%8."/>
-      <w:lvlJc w:val="left"/>
-      <w:pPr>
-        <w:ind w:left="5760" w:hanging="360"/>
-      </w:pPr>
-    </w:lvl>
-    <w:lvl w:ilvl="8" w:tplc="041F001B" w:tentative="1">
-      <w:start w:val="1"/>
-      <w:numFmt w:val="lowerRoman"/>
-      <w:lvlText w:val="%9."/>
-      <w:lvlJc w:val="right"/>
-      <w:pPr>
-        <w:ind w:left="6480" w:hanging="180"/>
-      </w:pPr>
-    </w:lvl>
-  </w:abstractNum>
-  <w:abstractNum w:abstractNumId="2" w15:restartNumberingAfterBreak="0">
-    <w:nsid w:val="36354E43"/>
+    <w:nsid w:val="18C72CDA"/>
     <w:multiLevelType w:val="multilevel"/>
-    <w:tmpl w:val="3AF2AC0C"/>
+    <w:tmpl w:val="B7EE9C34"/>
     <w:lvl w:ilvl="0">
       <w:start w:val="1"/>
       <w:numFmt w:val="bullet"/>
@@ -14579,10 +15410,10 @@
       </w:rPr>
     </w:lvl>
   </w:abstractNum>
-  <w:abstractNum w:abstractNumId="3" w15:restartNumberingAfterBreak="0">
-    <w:nsid w:val="44D72C93"/>
+  <w:abstractNum w:abstractNumId="2" w15:restartNumberingAfterBreak="0">
+    <w:nsid w:val="2BB9033D"/>
     <w:multiLevelType w:val="multilevel"/>
-    <w:tmpl w:val="64604668"/>
+    <w:tmpl w:val="DD0CA684"/>
     <w:lvl w:ilvl="0">
       <w:start w:val="1"/>
       <w:numFmt w:val="bullet"/>
@@ -14728,10 +15559,99 @@
       </w:rPr>
     </w:lvl>
   </w:abstractNum>
+  <w:abstractNum w:abstractNumId="3" w15:restartNumberingAfterBreak="0">
+    <w:nsid w:val="321D4140"/>
+    <w:multiLevelType w:val="hybridMultilevel"/>
+    <w:tmpl w:val="3E7CA19E"/>
+    <w:lvl w:ilvl="0" w:tplc="041F000F">
+      <w:start w:val="1"/>
+      <w:numFmt w:val="decimal"/>
+      <w:lvlText w:val="%1."/>
+      <w:lvlJc w:val="left"/>
+      <w:pPr>
+        <w:ind w:left="720" w:hanging="360"/>
+      </w:pPr>
+      <w:rPr>
+        <w:rFonts w:hint="default"/>
+      </w:rPr>
+    </w:lvl>
+    <w:lvl w:ilvl="1" w:tplc="041F0019" w:tentative="1">
+      <w:start w:val="1"/>
+      <w:numFmt w:val="lowerLetter"/>
+      <w:lvlText w:val="%2."/>
+      <w:lvlJc w:val="left"/>
+      <w:pPr>
+        <w:ind w:left="1440" w:hanging="360"/>
+      </w:pPr>
+    </w:lvl>
+    <w:lvl w:ilvl="2" w:tplc="041F001B" w:tentative="1">
+      <w:start w:val="1"/>
+      <w:numFmt w:val="lowerRoman"/>
+      <w:lvlText w:val="%3."/>
+      <w:lvlJc w:val="right"/>
+      <w:pPr>
+        <w:ind w:left="2160" w:hanging="180"/>
+      </w:pPr>
+    </w:lvl>
+    <w:lvl w:ilvl="3" w:tplc="041F000F" w:tentative="1">
+      <w:start w:val="1"/>
+      <w:numFmt w:val="decimal"/>
+      <w:lvlText w:val="%4."/>
+      <w:lvlJc w:val="left"/>
+      <w:pPr>
+        <w:ind w:left="2880" w:hanging="360"/>
+      </w:pPr>
+    </w:lvl>
+    <w:lvl w:ilvl="4" w:tplc="041F0019" w:tentative="1">
+      <w:start w:val="1"/>
+      <w:numFmt w:val="lowerLetter"/>
+      <w:lvlText w:val="%5."/>
+      <w:lvlJc w:val="left"/>
+      <w:pPr>
+        <w:ind w:left="3600" w:hanging="360"/>
+      </w:pPr>
+    </w:lvl>
+    <w:lvl w:ilvl="5" w:tplc="041F001B" w:tentative="1">
+      <w:start w:val="1"/>
+      <w:numFmt w:val="lowerRoman"/>
+      <w:lvlText w:val="%6."/>
+      <w:lvlJc w:val="right"/>
+      <w:pPr>
+        <w:ind w:left="4320" w:hanging="180"/>
+      </w:pPr>
+    </w:lvl>
+    <w:lvl w:ilvl="6" w:tplc="041F000F" w:tentative="1">
+      <w:start w:val="1"/>
+      <w:numFmt w:val="decimal"/>
+      <w:lvlText w:val="%7."/>
+      <w:lvlJc w:val="left"/>
+      <w:pPr>
+        <w:ind w:left="5040" w:hanging="360"/>
+      </w:pPr>
+    </w:lvl>
+    <w:lvl w:ilvl="7" w:tplc="041F0019" w:tentative="1">
+      <w:start w:val="1"/>
+      <w:numFmt w:val="lowerLetter"/>
+      <w:lvlText w:val="%8."/>
+      <w:lvlJc w:val="left"/>
+      <w:pPr>
+        <w:ind w:left="5760" w:hanging="360"/>
+      </w:pPr>
+    </w:lvl>
+    <w:lvl w:ilvl="8" w:tplc="041F001B" w:tentative="1">
+      <w:start w:val="1"/>
+      <w:numFmt w:val="lowerRoman"/>
+      <w:lvlText w:val="%9."/>
+      <w:lvlJc w:val="right"/>
+      <w:pPr>
+        <w:ind w:left="6480" w:hanging="180"/>
+      </w:pPr>
+    </w:lvl>
+  </w:abstractNum>
   <w:abstractNum w:abstractNumId="4" w15:restartNumberingAfterBreak="0">
-    <w:nsid w:val="63050202"/>
+    <w:nsid w:val="36354E43"/>
     <w:multiLevelType w:val="multilevel"/>
-    <w:tmpl w:val="8D1E2ABC"/>
+    <w:tmpl w:val="3AF2AC0C"/>
     <w:lvl w:ilvl="0">
       <w:start w:val="1"/>
       <w:numFmt w:val="bullet"/>
@@ -14878,9 +15798,9 @@
     </w:lvl>
   </w:abstractNum>
   <w:abstractNum w:abstractNumId="5" w15:restartNumberingAfterBreak="0">
-    <w:nsid w:val="6B0579E7"/>
+    <w:nsid w:val="44D72C93"/>
     <w:multiLevelType w:val="multilevel"/>
-    <w:tmpl w:val="A8DA2166"/>
+    <w:tmpl w:val="64604668"/>
     <w:lvl w:ilvl="0">
       <w:start w:val="1"/>
       <w:numFmt w:val="bullet"/>
@@ -15026,22 +15946,630 @@
       </w:rPr>
     </w:lvl>
   </w:abstractNum>
+  <w:abstractNum w:abstractNumId="6" w15:restartNumberingAfterBreak="0">
+    <w:nsid w:val="63050202"/>
+    <w:multiLevelType w:val="multilevel"/>
+    <w:tmpl w:val="8D1E2ABC"/>
+    <w:lvl w:ilvl="0">
+      <w:start w:val="1"/>
+      <w:numFmt w:val="bullet"/>
+      <w:lvlText w:val=""/>
+      <w:lvlJc w:val="left"/>
+      <w:pPr>
+        <w:tabs>
+          <w:tab w:val="num" w:pos="720"/>
+        </w:tabs>
+        <w:ind w:left="720" w:hanging="360"/>
+      </w:pPr>
+      <w:rPr>
+        <w:rFonts w:ascii="Symbol" w:hAnsi="Symbol" w:hint="default"/>
+        <w:sz w:val="20"/>
+      </w:rPr>
+    </w:lvl>
+    <w:lvl w:ilvl="1" w:tentative="1">
+      <w:start w:val="1"/>
+      <w:numFmt w:val="bullet"/>
+      <w:lvlText w:val="o"/>
+      <w:lvlJc w:val="left"/>
+      <w:pPr>
+        <w:tabs>
+          <w:tab w:val="num" w:pos="1440"/>
+        </w:tabs>
+        <w:ind w:left="1440" w:hanging="360"/>
+      </w:pPr>
+      <w:rPr>
+        <w:rFonts w:ascii="Courier New" w:hAnsi="Courier New" w:hint="default"/>
+        <w:sz w:val="20"/>
+      </w:rPr>
+    </w:lvl>
+    <w:lvl w:ilvl="2" w:tentative="1">
+      <w:start w:val="1"/>
+      <w:numFmt w:val="bullet"/>
+      <w:lvlText w:val=""/>
+      <w:lvlJc w:val="left"/>
+      <w:pPr>
+        <w:tabs>
+          <w:tab w:val="num" w:pos="2160"/>
+        </w:tabs>
+        <w:ind w:left="2160" w:hanging="360"/>
+      </w:pPr>
+      <w:rPr>
+        <w:rFonts w:ascii="Wingdings" w:hAnsi="Wingdings" w:hint="default"/>
+        <w:sz w:val="20"/>
+      </w:rPr>
+    </w:lvl>
+    <w:lvl w:ilvl="3" w:tentative="1">
+      <w:start w:val="1"/>
+      <w:numFmt w:val="bullet"/>
+      <w:lvlText w:val=""/>
+      <w:lvlJc w:val="left"/>
+      <w:pPr>
+        <w:tabs>
+          <w:tab w:val="num" w:pos="2880"/>
+        </w:tabs>
+        <w:ind w:left="2880" w:hanging="360"/>
+      </w:pPr>
+      <w:rPr>
+        <w:rFonts w:ascii="Wingdings" w:hAnsi="Wingdings" w:hint="default"/>
+        <w:sz w:val="20"/>
+      </w:rPr>
+    </w:lvl>
+    <w:lvl w:ilvl="4" w:tentative="1">
+      <w:start w:val="1"/>
+      <w:numFmt w:val="bullet"/>
+      <w:lvlText w:val=""/>
+      <w:lvlJc w:val="left"/>
+      <w:pPr>
+        <w:tabs>
+          <w:tab w:val="num" w:pos="3600"/>
+        </w:tabs>
+        <w:ind w:left="3600" w:hanging="360"/>
+      </w:pPr>
+      <w:rPr>
+        <w:rFonts w:ascii="Wingdings" w:hAnsi="Wingdings" w:hint="default"/>
+        <w:sz w:val="20"/>
+      </w:rPr>
+    </w:lvl>
+    <w:lvl w:ilvl="5" w:tentative="1">
+      <w:start w:val="1"/>
+      <w:numFmt w:val="bullet"/>
+      <w:lvlText w:val=""/>
+      <w:lvlJc w:val="left"/>
+      <w:pPr>
+        <w:tabs>
+          <w:tab w:val="num" w:pos="4320"/>
+        </w:tabs>
+        <w:ind w:left="4320" w:hanging="360"/>
+      </w:pPr>
+      <w:rPr>
+        <w:rFonts w:ascii="Wingdings" w:hAnsi="Wingdings" w:hint="default"/>
+        <w:sz w:val="20"/>
+      </w:rPr>
+    </w:lvl>
+    <w:lvl w:ilvl="6" w:tentative="1">
+      <w:start w:val="1"/>
+      <w:numFmt w:val="bullet"/>
+      <w:lvlText w:val=""/>
+      <w:lvlJc w:val="left"/>
+      <w:pPr>
+        <w:tabs>
+          <w:tab w:val="num" w:pos="5040"/>
+        </w:tabs>
+        <w:ind w:left="5040" w:hanging="360"/>
+      </w:pPr>
+      <w:rPr>
+        <w:rFonts w:ascii="Wingdings" w:hAnsi="Wingdings" w:hint="default"/>
+        <w:sz w:val="20"/>
+      </w:rPr>
+    </w:lvl>
+    <w:lvl w:ilvl="7" w:tentative="1">
+      <w:start w:val="1"/>
+      <w:numFmt w:val="bullet"/>
+      <w:lvlText w:val=""/>
+      <w:lvlJc w:val="left"/>
+      <w:pPr>
+        <w:tabs>
+          <w:tab w:val="num" w:pos="5760"/>
+        </w:tabs>
+        <w:ind w:left="5760" w:hanging="360"/>
+      </w:pPr>
+      <w:rPr>
+        <w:rFonts w:ascii="Wingdings" w:hAnsi="Wingdings" w:hint="default"/>
+        <w:sz w:val="20"/>
+      </w:rPr>
+    </w:lvl>
+    <w:lvl w:ilvl="8" w:tentative="1">
+      <w:start w:val="1"/>
+      <w:numFmt w:val="bullet"/>
+      <w:lvlText w:val=""/>
+      <w:lvlJc w:val="left"/>
+      <w:pPr>
+        <w:tabs>
+          <w:tab w:val="num" w:pos="6480"/>
+        </w:tabs>
+        <w:ind w:left="6480" w:hanging="360"/>
+      </w:pPr>
+      <w:rPr>
+        <w:rFonts w:ascii="Wingdings" w:hAnsi="Wingdings" w:hint="default"/>
+        <w:sz w:val="20"/>
+      </w:rPr>
+    </w:lvl>
+  </w:abstractNum>
+  <w:abstractNum w:abstractNumId="7" w15:restartNumberingAfterBreak="0">
+    <w:nsid w:val="6B0579E7"/>
+    <w:multiLevelType w:val="multilevel"/>
+    <w:tmpl w:val="A8DA2166"/>
+    <w:lvl w:ilvl="0">
+      <w:start w:val="1"/>
+      <w:numFmt w:val="bullet"/>
+      <w:lvlText w:val=""/>
+      <w:lvlJc w:val="left"/>
+      <w:pPr>
+        <w:tabs>
+          <w:tab w:val="num" w:pos="720"/>
+        </w:tabs>
+        <w:ind w:left="720" w:hanging="360"/>
+      </w:pPr>
+      <w:rPr>
+        <w:rFonts w:ascii="Symbol" w:hAnsi="Symbol" w:hint="default"/>
+        <w:sz w:val="20"/>
+      </w:rPr>
+    </w:lvl>
+    <w:lvl w:ilvl="1" w:tentative="1">
+      <w:start w:val="1"/>
+      <w:numFmt w:val="bullet"/>
+      <w:lvlText w:val="o"/>
+      <w:lvlJc w:val="left"/>
+      <w:pPr>
+        <w:tabs>
+          <w:tab w:val="num" w:pos="1440"/>
+        </w:tabs>
+        <w:ind w:left="1440" w:hanging="360"/>
+      </w:pPr>
+      <w:rPr>
+        <w:rFonts w:ascii="Courier New" w:hAnsi="Courier New" w:hint="default"/>
+        <w:sz w:val="20"/>
+      </w:rPr>
+    </w:lvl>
+    <w:lvl w:ilvl="2" w:tentative="1">
+      <w:start w:val="1"/>
+      <w:numFmt w:val="bullet"/>
+      <w:lvlText w:val=""/>
+      <w:lvlJc w:val="left"/>
+      <w:pPr>
+        <w:tabs>
+          <w:tab w:val="num" w:pos="2160"/>
+        </w:tabs>
+        <w:ind w:left="2160" w:hanging="360"/>
+      </w:pPr>
+      <w:rPr>
+        <w:rFonts w:ascii="Wingdings" w:hAnsi="Wingdings" w:hint="default"/>
+        <w:sz w:val="20"/>
+      </w:rPr>
+    </w:lvl>
+    <w:lvl w:ilvl="3" w:tentative="1">
+      <w:start w:val="1"/>
+      <w:numFmt w:val="bullet"/>
+      <w:lvlText w:val=""/>
+      <w:lvlJc w:val="left"/>
+      <w:pPr>
+        <w:tabs>
+          <w:tab w:val="num" w:pos="2880"/>
+        </w:tabs>
+        <w:ind w:left="2880" w:hanging="360"/>
+      </w:pPr>
+      <w:rPr>
+        <w:rFonts w:ascii="Wingdings" w:hAnsi="Wingdings" w:hint="default"/>
+        <w:sz w:val="20"/>
+      </w:rPr>
+    </w:lvl>
+    <w:lvl w:ilvl="4" w:tentative="1">
+      <w:start w:val="1"/>
+      <w:numFmt w:val="bullet"/>
+      <w:lvlText w:val=""/>
+      <w:lvlJc w:val="left"/>
+      <w:pPr>
+        <w:tabs>
+          <w:tab w:val="num" w:pos="3600"/>
+        </w:tabs>
+        <w:ind w:left="3600" w:hanging="360"/>
+      </w:pPr>
+      <w:rPr>
+        <w:rFonts w:ascii="Wingdings" w:hAnsi="Wingdings" w:hint="default"/>
+        <w:sz w:val="20"/>
+      </w:rPr>
+    </w:lvl>
+    <w:lvl w:ilvl="5" w:tentative="1">
+      <w:start w:val="1"/>
+      <w:numFmt w:val="bullet"/>
+      <w:lvlText w:val=""/>
+      <w:lvlJc w:val="left"/>
+      <w:pPr>
+        <w:tabs>
+          <w:tab w:val="num" w:pos="4320"/>
+        </w:tabs>
+        <w:ind w:left="4320" w:hanging="360"/>
+      </w:pPr>
+      <w:rPr>
+        <w:rFonts w:ascii="Wingdings" w:hAnsi="Wingdings" w:hint="default"/>
+        <w:sz w:val="20"/>
+      </w:rPr>
+    </w:lvl>
+    <w:lvl w:ilvl="6" w:tentative="1">
+      <w:start w:val="1"/>
+      <w:numFmt w:val="bullet"/>
+      <w:lvlText w:val=""/>
+      <w:lvlJc w:val="left"/>
+      <w:pPr>
+        <w:tabs>
+          <w:tab w:val="num" w:pos="5040"/>
+        </w:tabs>
+        <w:ind w:left="5040" w:hanging="360"/>
+      </w:pPr>
+      <w:rPr>
+        <w:rFonts w:ascii="Wingdings" w:hAnsi="Wingdings" w:hint="default"/>
+        <w:sz w:val="20"/>
+      </w:rPr>
+    </w:lvl>
+    <w:lvl w:ilvl="7" w:tentative="1">
+      <w:start w:val="1"/>
+      <w:numFmt w:val="bullet"/>
+      <w:lvlText w:val=""/>
+      <w:lvlJc w:val="left"/>
+      <w:pPr>
+        <w:tabs>
+          <w:tab w:val="num" w:pos="5760"/>
+        </w:tabs>
+        <w:ind w:left="5760" w:hanging="360"/>
+      </w:pPr>
+      <w:rPr>
+        <w:rFonts w:ascii="Wingdings" w:hAnsi="Wingdings" w:hint="default"/>
+        <w:sz w:val="20"/>
+      </w:rPr>
+    </w:lvl>
+    <w:lvl w:ilvl="8" w:tentative="1">
+      <w:start w:val="1"/>
+      <w:numFmt w:val="bullet"/>
+      <w:lvlText w:val=""/>
+      <w:lvlJc w:val="left"/>
+      <w:pPr>
+        <w:tabs>
+          <w:tab w:val="num" w:pos="6480"/>
+        </w:tabs>
+        <w:ind w:left="6480" w:hanging="360"/>
+      </w:pPr>
+      <w:rPr>
+        <w:rFonts w:ascii="Wingdings" w:hAnsi="Wingdings" w:hint="default"/>
+        <w:sz w:val="20"/>
+      </w:rPr>
+    </w:lvl>
+  </w:abstractNum>
+  <w:abstractNum w:abstractNumId="8" w15:restartNumberingAfterBreak="0">
+    <w:nsid w:val="78733247"/>
+    <w:multiLevelType w:val="multilevel"/>
+    <w:tmpl w:val="18361A16"/>
+    <w:lvl w:ilvl="0">
+      <w:start w:val="1"/>
+      <w:numFmt w:val="bullet"/>
+      <w:lvlText w:val=""/>
+      <w:lvlJc w:val="left"/>
+      <w:pPr>
+        <w:tabs>
+          <w:tab w:val="num" w:pos="720"/>
+        </w:tabs>
+        <w:ind w:left="720" w:hanging="360"/>
+      </w:pPr>
+      <w:rPr>
+        <w:rFonts w:ascii="Symbol" w:hAnsi="Symbol" w:hint="default"/>
+        <w:sz w:val="20"/>
+      </w:rPr>
+    </w:lvl>
+    <w:lvl w:ilvl="1" w:tentative="1">
+      <w:start w:val="1"/>
+      <w:numFmt w:val="bullet"/>
+      <w:lvlText w:val="o"/>
+      <w:lvlJc w:val="left"/>
+      <w:pPr>
+        <w:tabs>
+          <w:tab w:val="num" w:pos="1440"/>
+        </w:tabs>
+        <w:ind w:left="1440" w:hanging="360"/>
+      </w:pPr>
+      <w:rPr>
+        <w:rFonts w:ascii="Courier New" w:hAnsi="Courier New" w:hint="default"/>
+        <w:sz w:val="20"/>
+      </w:rPr>
+    </w:lvl>
+    <w:lvl w:ilvl="2" w:tentative="1">
+      <w:start w:val="1"/>
+      <w:numFmt w:val="bullet"/>
+      <w:lvlText w:val=""/>
+      <w:lvlJc w:val="left"/>
+      <w:pPr>
+        <w:tabs>
+          <w:tab w:val="num" w:pos="2160"/>
+        </w:tabs>
+        <w:ind w:left="2160" w:hanging="360"/>
+      </w:pPr>
+      <w:rPr>
+        <w:rFonts w:ascii="Wingdings" w:hAnsi="Wingdings" w:hint="default"/>
+        <w:sz w:val="20"/>
+      </w:rPr>
+    </w:lvl>
+    <w:lvl w:ilvl="3" w:tentative="1">
+      <w:start w:val="1"/>
+      <w:numFmt w:val="bullet"/>
+      <w:lvlText w:val=""/>
+      <w:lvlJc w:val="left"/>
+      <w:pPr>
+        <w:tabs>
+          <w:tab w:val="num" w:pos="2880"/>
+        </w:tabs>
+        <w:ind w:left="2880" w:hanging="360"/>
+      </w:pPr>
+      <w:rPr>
+        <w:rFonts w:ascii="Wingdings" w:hAnsi="Wingdings" w:hint="default"/>
+        <w:sz w:val="20"/>
+      </w:rPr>
+    </w:lvl>
+    <w:lvl w:ilvl="4" w:tentative="1">
+      <w:start w:val="1"/>
+      <w:numFmt w:val="bullet"/>
+      <w:lvlText w:val=""/>
+      <w:lvlJc w:val="left"/>
+      <w:pPr>
+        <w:tabs>
+          <w:tab w:val="num" w:pos="3600"/>
+        </w:tabs>
+        <w:ind w:left="3600" w:hanging="360"/>
+      </w:pPr>
+      <w:rPr>
+        <w:rFonts w:ascii="Wingdings" w:hAnsi="Wingdings" w:hint="default"/>
+        <w:sz w:val="20"/>
+      </w:rPr>
+    </w:lvl>
+    <w:lvl w:ilvl="5" w:tentative="1">
+      <w:start w:val="1"/>
+      <w:numFmt w:val="bullet"/>
+      <w:lvlText w:val=""/>
+      <w:lvlJc w:val="left"/>
+      <w:pPr>
+        <w:tabs>
+          <w:tab w:val="num" w:pos="4320"/>
+        </w:tabs>
+        <w:ind w:left="4320" w:hanging="360"/>
+      </w:pPr>
+      <w:rPr>
+        <w:rFonts w:ascii="Wingdings" w:hAnsi="Wingdings" w:hint="default"/>
+        <w:sz w:val="20"/>
+      </w:rPr>
+    </w:lvl>
+    <w:lvl w:ilvl="6" w:tentative="1">
+      <w:start w:val="1"/>
+      <w:numFmt w:val="bullet"/>
+      <w:lvlText w:val=""/>
+      <w:lvlJc w:val="left"/>
+      <w:pPr>
+        <w:tabs>
+          <w:tab w:val="num" w:pos="5040"/>
+        </w:tabs>
+        <w:ind w:left="5040" w:hanging="360"/>
+      </w:pPr>
+      <w:rPr>
+        <w:rFonts w:ascii="Wingdings" w:hAnsi="Wingdings" w:hint="default"/>
+        <w:sz w:val="20"/>
+      </w:rPr>
+    </w:lvl>
+    <w:lvl w:ilvl="7" w:tentative="1">
+      <w:start w:val="1"/>
+      <w:numFmt w:val="bullet"/>
+      <w:lvlText w:val=""/>
+      <w:lvlJc w:val="left"/>
+      <w:pPr>
+        <w:tabs>
+          <w:tab w:val="num" w:pos="5760"/>
+        </w:tabs>
+        <w:ind w:left="5760" w:hanging="360"/>
+      </w:pPr>
+      <w:rPr>
+        <w:rFonts w:ascii="Wingdings" w:hAnsi="Wingdings" w:hint="default"/>
+        <w:sz w:val="20"/>
+      </w:rPr>
+    </w:lvl>
+    <w:lvl w:ilvl="8" w:tentative="1">
+      <w:start w:val="1"/>
+      <w:numFmt w:val="bullet"/>
+      <w:lvlText w:val=""/>
+      <w:lvlJc w:val="left"/>
+      <w:pPr>
+        <w:tabs>
+          <w:tab w:val="num" w:pos="6480"/>
+        </w:tabs>
+        <w:ind w:left="6480" w:hanging="360"/>
+      </w:pPr>
+      <w:rPr>
+        <w:rFonts w:ascii="Wingdings" w:hAnsi="Wingdings" w:hint="default"/>
+        <w:sz w:val="20"/>
+      </w:rPr>
+    </w:lvl>
+  </w:abstractNum>
+  <w:abstractNum w:abstractNumId="9" w15:restartNumberingAfterBreak="0">
+    <w:nsid w:val="78940C2D"/>
+    <w:multiLevelType w:val="multilevel"/>
+    <w:tmpl w:val="7A36FD2E"/>
+    <w:lvl w:ilvl="0">
+      <w:start w:val="1"/>
+      <w:numFmt w:val="bullet"/>
+      <w:lvlText w:val=""/>
+      <w:lvlJc w:val="left"/>
+      <w:pPr>
+        <w:tabs>
+          <w:tab w:val="num" w:pos="720"/>
+        </w:tabs>
+        <w:ind w:left="720" w:hanging="360"/>
+      </w:pPr>
+      <w:rPr>
+        <w:rFonts w:ascii="Symbol" w:hAnsi="Symbol" w:hint="default"/>
+        <w:sz w:val="20"/>
+      </w:rPr>
+    </w:lvl>
+    <w:lvl w:ilvl="1" w:tentative="1">
+      <w:start w:val="1"/>
+      <w:numFmt w:val="bullet"/>
+      <w:lvlText w:val="o"/>
+      <w:lvlJc w:val="left"/>
+      <w:pPr>
+        <w:tabs>
+          <w:tab w:val="num" w:pos="1440"/>
+        </w:tabs>
+        <w:ind w:left="1440" w:hanging="360"/>
+      </w:pPr>
+      <w:rPr>
+        <w:rFonts w:ascii="Courier New" w:hAnsi="Courier New" w:hint="default"/>
+        <w:sz w:val="20"/>
+      </w:rPr>
+    </w:lvl>
+    <w:lvl w:ilvl="2" w:tentative="1">
+      <w:start w:val="1"/>
+      <w:numFmt w:val="bullet"/>
+      <w:lvlText w:val=""/>
+      <w:lvlJc w:val="left"/>
+      <w:pPr>
+        <w:tabs>
+          <w:tab w:val="num" w:pos="2160"/>
+        </w:tabs>
+        <w:ind w:left="2160" w:hanging="360"/>
+      </w:pPr>
+      <w:rPr>
+        <w:rFonts w:ascii="Wingdings" w:hAnsi="Wingdings" w:hint="default"/>
+        <w:sz w:val="20"/>
+      </w:rPr>
+    </w:lvl>
+    <w:lvl w:ilvl="3" w:tentative="1">
+      <w:start w:val="1"/>
+      <w:numFmt w:val="bullet"/>
+      <w:lvlText w:val=""/>
+      <w:lvlJc w:val="left"/>
+      <w:pPr>
+        <w:tabs>
+          <w:tab w:val="num" w:pos="2880"/>
+        </w:tabs>
+        <w:ind w:left="2880" w:hanging="360"/>
+      </w:pPr>
+      <w:rPr>
+        <w:rFonts w:ascii="Wingdings" w:hAnsi="Wingdings" w:hint="default"/>
+        <w:sz w:val="20"/>
+      </w:rPr>
+    </w:lvl>
+    <w:lvl w:ilvl="4" w:tentative="1">
+      <w:start w:val="1"/>
+      <w:numFmt w:val="bullet"/>
+      <w:lvlText w:val=""/>
+      <w:lvlJc w:val="left"/>
+      <w:pPr>
+        <w:tabs>
+          <w:tab w:val="num" w:pos="3600"/>
+        </w:tabs>
+        <w:ind w:left="3600" w:hanging="360"/>
+      </w:pPr>
+      <w:rPr>
+        <w:rFonts w:ascii="Wingdings" w:hAnsi="Wingdings" w:hint="default"/>
+        <w:sz w:val="20"/>
+      </w:rPr>
+    </w:lvl>
+    <w:lvl w:ilvl="5" w:tentative="1">
+      <w:start w:val="1"/>
+      <w:numFmt w:val="bullet"/>
+      <w:lvlText w:val=""/>
+      <w:lvlJc w:val="left"/>
+      <w:pPr>
+        <w:tabs>
+          <w:tab w:val="num" w:pos="4320"/>
+        </w:tabs>
+        <w:ind w:left="4320" w:hanging="360"/>
+      </w:pPr>
+      <w:rPr>
+        <w:rFonts w:ascii="Wingdings" w:hAnsi="Wingdings" w:hint="default"/>
+        <w:sz w:val="20"/>
+      </w:rPr>
+    </w:lvl>
+    <w:lvl w:ilvl="6" w:tentative="1">
+      <w:start w:val="1"/>
+      <w:numFmt w:val="bullet"/>
+      <w:lvlText w:val=""/>
+      <w:lvlJc w:val="left"/>
+      <w:pPr>
+        <w:tabs>
+          <w:tab w:val="num" w:pos="5040"/>
+        </w:tabs>
+        <w:ind w:left="5040" w:hanging="360"/>
+      </w:pPr>
+      <w:rPr>
+        <w:rFonts w:ascii="Wingdings" w:hAnsi="Wingdings" w:hint="default"/>
+        <w:sz w:val="20"/>
+      </w:rPr>
+    </w:lvl>
+    <w:lvl w:ilvl="7" w:tentative="1">
+      <w:start w:val="1"/>
+      <w:numFmt w:val="bullet"/>
+      <w:lvlText w:val=""/>
+      <w:lvlJc w:val="left"/>
+      <w:pPr>
+        <w:tabs>
+          <w:tab w:val="num" w:pos="5760"/>
+        </w:tabs>
+        <w:ind w:left="5760" w:hanging="360"/>
+      </w:pPr>
+      <w:rPr>
+        <w:rFonts w:ascii="Wingdings" w:hAnsi="Wingdings" w:hint="default"/>
+        <w:sz w:val="20"/>
+      </w:rPr>
+    </w:lvl>
+    <w:lvl w:ilvl="8" w:tentative="1">
+      <w:start w:val="1"/>
+      <w:numFmt w:val="bullet"/>
+      <w:lvlText w:val=""/>
+      <w:lvlJc w:val="left"/>
+      <w:pPr>
+        <w:tabs>
+          <w:tab w:val="num" w:pos="6480"/>
+        </w:tabs>
+        <w:ind w:left="6480" w:hanging="360"/>
+      </w:pPr>
+      <w:rPr>
+        <w:rFonts w:ascii="Wingdings" w:hAnsi="Wingdings" w:hint="default"/>
+        <w:sz w:val="20"/>
+      </w:rPr>
+    </w:lvl>
+  </w:abstractNum>
   <w:num w:numId="1" w16cid:durableId="320813693">
+    <w:abstractNumId w:val="1"/>
+  </w:num>
+  <w:num w:numId="2" w16cid:durableId="680281116">
+    <w:abstractNumId w:val="3"/>
+  </w:num>
+  <w:num w:numId="3" w16cid:durableId="1288438365">
+    <w:abstractNumId w:val="5"/>
+  </w:num>
+  <w:num w:numId="4" w16cid:durableId="1155562159">
+    <w:abstractNumId w:val="7"/>
+  </w:num>
+  <w:num w:numId="5" w16cid:durableId="1958020517">
+    <w:abstractNumId w:val="6"/>
+  </w:num>
+  <w:num w:numId="6" w16cid:durableId="1596940668">
+    <w:abstractNumId w:val="4"/>
+  </w:num>
+  <w:num w:numId="7" w16cid:durableId="1579166471">
     <w:abstractNumId w:val="0"/>
   </w:num>
-  <w:num w:numId="2" w16cid:durableId="680281116">
-    <w:abstractNumId w:val="1"/>
+  <w:num w:numId="8" w16cid:durableId="753748469">
+    <w:abstractNumId w:val="9"/>
   </w:num>
-  <w:num w:numId="3" w16cid:durableId="1288438365">
-    <w:abstractNumId w:val="3"/>
+  <w:num w:numId="9" w16cid:durableId="604701249">
+    <w:abstractNumId w:val="8"/>
   </w:num>
-  <w:num w:numId="4" w16cid:durableId="1155562159">
-    <w:abstractNumId w:val="5"/>
-  </w:num>
-  <w:num w:numId="5" w16cid:durableId="1958020517">
-    <w:abstractNumId w:val="4"/>
-  </w:num>
-  <w:num w:numId="6" w16cid:durableId="1596940668">
+  <w:num w:numId="10" w16cid:durableId="1503279606">
     <w:abstractNumId w:val="2"/>
   </w:num>
 </w:numbering>
@@ -15651,7 +17179,6 @@
   <w:style w:type="character" w:default="1" w:styleId="VarsaylanParagrafYazTipi">
     <w:name w:val="Default Paragraph Font"/>
     <w:uiPriority w:val="1"/>
-    <w:semiHidden/>
     <w:unhideWhenUsed/>
   </w:style>
   <w:style w:type="table" w:default="1" w:styleId="NormalTablo">

</xml_diff>

<commit_message>
Sprint 6 - Commit 3 : Kalman Metadata extended
</commit_message>
<xml_diff>
--- a/docs/development_flow.docx
+++ b/docs/development_flow.docx
@@ -14222,18 +14222,7 @@
           <w:szCs w:val="32"/>
           <w:u w:val="single"/>
         </w:rPr>
-        <w:t>Completed Sprint 5</w:t>
-      </w:r>
-      <w:r>
-        <w:rPr>
-          <w:b/>
-          <w:bCs/>
-          <w:noProof/>
-          <w:sz w:val="32"/>
-          <w:szCs w:val="32"/>
-          <w:u w:val="single"/>
-        </w:rPr>
-        <w:t>:</w:t>
+        <w:t>Completed Sprint 5:</w:t>
       </w:r>
     </w:p>
     <w:p>
@@ -15089,6 +15078,233 @@
         </w:rPr>
         <w:t xml:space="preserve">experiment summary </w:t>
       </w:r>
+    </w:p>
+    <w:p>
+      <w:pPr>
+        <w:rPr>
+          <w:noProof/>
+          <w:sz w:val="24"/>
+          <w:szCs w:val="24"/>
+          <w:lang w:val="tr-TR"/>
+        </w:rPr>
+      </w:pPr>
+      <w:r>
+        <w:rPr>
+          <w:noProof/>
+          <w:sz w:val="24"/>
+          <w:szCs w:val="24"/>
+          <w:lang w:val="tr-TR"/>
+        </w:rPr>
+        <w:br w:type="page"/>
+      </w:r>
+    </w:p>
+    <w:p>
+      <w:pPr>
+        <w:spacing w:after="0" w:line="240" w:lineRule="auto"/>
+        <w:ind w:left="720"/>
+        <w:rPr>
+          <w:noProof/>
+          <w:sz w:val="24"/>
+          <w:szCs w:val="24"/>
+          <w:lang w:val="tr-TR"/>
+        </w:rPr>
+      </w:pPr>
+    </w:p>
+    <w:p>
+      <w:pPr>
+        <w:spacing w:after="0" w:line="240" w:lineRule="auto"/>
+        <w:ind w:left="720"/>
+        <w:rPr>
+          <w:noProof/>
+          <w:sz w:val="24"/>
+          <w:szCs w:val="24"/>
+          <w:lang w:val="tr-TR"/>
+        </w:rPr>
+      </w:pPr>
+    </w:p>
+    <w:p>
+      <w:pPr>
+        <w:spacing w:after="0" w:line="240" w:lineRule="auto"/>
+        <w:rPr>
+          <w:b/>
+          <w:bCs/>
+          <w:noProof/>
+          <w:sz w:val="32"/>
+          <w:szCs w:val="32"/>
+          <w:u w:val="single"/>
+        </w:rPr>
+      </w:pPr>
+      <w:r>
+        <w:rPr>
+          <w:b/>
+          <w:bCs/>
+          <w:noProof/>
+          <w:sz w:val="32"/>
+          <w:szCs w:val="32"/>
+          <w:u w:val="single"/>
+        </w:rPr>
+        <w:t>Kalman script:</w:t>
+      </w:r>
+    </w:p>
+    <w:p>
+      <w:pPr>
+        <w:spacing w:after="0" w:line="240" w:lineRule="auto"/>
+        <w:rPr>
+          <w:noProof/>
+          <w:sz w:val="24"/>
+          <w:szCs w:val="24"/>
+        </w:rPr>
+      </w:pPr>
+    </w:p>
+    <w:p>
+      <w:pPr>
+        <w:spacing w:after="0" w:line="240" w:lineRule="auto"/>
+        <w:rPr>
+          <w:noProof/>
+          <w:sz w:val="24"/>
+          <w:szCs w:val="24"/>
+          <w:lang w:val="tr-TR"/>
+        </w:rPr>
+      </w:pPr>
+      <w:r>
+        <w:rPr>
+          <w:noProof/>
+          <w:sz w:val="24"/>
+          <w:szCs w:val="24"/>
+          <w:lang w:val="tr-TR"/>
+        </w:rPr>
+        <w:t>The main architectural changes are:</w:t>
+      </w:r>
+    </w:p>
+    <w:p>
+      <w:pPr>
+        <w:numPr>
+          <w:ilvl w:val="0"/>
+          <w:numId w:val="11"/>
+        </w:numPr>
+        <w:spacing w:after="0" w:line="240" w:lineRule="auto"/>
+        <w:rPr>
+          <w:noProof/>
+          <w:sz w:val="24"/>
+          <w:szCs w:val="24"/>
+          <w:lang w:val="tr-TR"/>
+        </w:rPr>
+      </w:pPr>
+      <w:r>
+        <w:rPr>
+          <w:noProof/>
+          <w:sz w:val="24"/>
+          <w:szCs w:val="24"/>
+          <w:lang w:val="tr-TR"/>
+        </w:rPr>
+        <w:t xml:space="preserve">adaptive_kalman_filter() → fit() </w:t>
+      </w:r>
+    </w:p>
+    <w:p>
+      <w:pPr>
+        <w:numPr>
+          <w:ilvl w:val="0"/>
+          <w:numId w:val="11"/>
+        </w:numPr>
+        <w:spacing w:after="0" w:line="240" w:lineRule="auto"/>
+        <w:rPr>
+          <w:noProof/>
+          <w:sz w:val="24"/>
+          <w:szCs w:val="24"/>
+          <w:lang w:val="tr-TR"/>
+        </w:rPr>
+      </w:pPr>
+      <w:r>
+        <w:rPr>
+          <w:noProof/>
+          <w:sz w:val="24"/>
+          <w:szCs w:val="24"/>
+          <w:lang w:val="tr-TR"/>
+        </w:rPr>
+        <w:t xml:space="preserve">adaptive_kalman_forecast() → predict() </w:t>
+      </w:r>
+    </w:p>
+    <w:p>
+      <w:pPr>
+        <w:numPr>
+          <w:ilvl w:val="0"/>
+          <w:numId w:val="11"/>
+        </w:numPr>
+        <w:spacing w:after="0" w:line="240" w:lineRule="auto"/>
+        <w:rPr>
+          <w:noProof/>
+          <w:sz w:val="24"/>
+          <w:szCs w:val="24"/>
+          <w:lang w:val="tr-TR"/>
+        </w:rPr>
+      </w:pPr>
+      <w:r>
+        <w:rPr>
+          <w:noProof/>
+          <w:sz w:val="24"/>
+          <w:szCs w:val="24"/>
+          <w:lang w:val="tr-TR"/>
+        </w:rPr>
+        <w:t xml:space="preserve">kalman_bias_correction() → integrated into fit() </w:t>
+      </w:r>
+    </w:p>
+    <w:p>
+      <w:pPr>
+        <w:numPr>
+          <w:ilvl w:val="0"/>
+          <w:numId w:val="11"/>
+        </w:numPr>
+        <w:spacing w:after="0" w:line="240" w:lineRule="auto"/>
+        <w:rPr>
+          <w:noProof/>
+          <w:sz w:val="24"/>
+          <w:szCs w:val="24"/>
+          <w:lang w:val="tr-TR"/>
+        </w:rPr>
+      </w:pPr>
+      <w:r>
+        <w:rPr>
+          <w:noProof/>
+          <w:sz w:val="24"/>
+          <w:szCs w:val="24"/>
+          <w:lang w:val="tr-TR"/>
+        </w:rPr>
+        <w:t xml:space="preserve">estimate_kalman_noise() → integrated into fit() </w:t>
+      </w:r>
+    </w:p>
+    <w:p>
+      <w:pPr>
+        <w:numPr>
+          <w:ilvl w:val="0"/>
+          <w:numId w:val="11"/>
+        </w:numPr>
+        <w:spacing w:after="0" w:line="240" w:lineRule="auto"/>
+        <w:rPr>
+          <w:noProof/>
+          <w:sz w:val="24"/>
+          <w:szCs w:val="24"/>
+          <w:lang w:val="tr-TR"/>
+        </w:rPr>
+      </w:pPr>
+      <w:r>
+        <w:rPr>
+          <w:noProof/>
+          <w:sz w:val="24"/>
+          <w:szCs w:val="24"/>
+          <w:lang w:val="tr-TR"/>
+        </w:rPr>
+        <w:t>returns a ForecastResult, just like ARIMAForecaster</w:t>
+      </w:r>
+    </w:p>
+    <w:p>
+      <w:pPr>
+        <w:spacing w:after="0" w:line="240" w:lineRule="auto"/>
+        <w:rPr>
+          <w:noProof/>
+          <w:sz w:val="24"/>
+          <w:szCs w:val="24"/>
+        </w:rPr>
+      </w:pPr>
     </w:p>
     <w:p>
       <w:pPr>
@@ -15798,9 +16014,9 @@
     </w:lvl>
   </w:abstractNum>
   <w:abstractNum w:abstractNumId="5" w15:restartNumberingAfterBreak="0">
-    <w:nsid w:val="44D72C93"/>
+    <w:nsid w:val="3D733783"/>
     <w:multiLevelType w:val="multilevel"/>
-    <w:tmpl w:val="64604668"/>
+    <w:tmpl w:val="A6383A0C"/>
     <w:lvl w:ilvl="0">
       <w:start w:val="1"/>
       <w:numFmt w:val="bullet"/>
@@ -15947,9 +16163,9 @@
     </w:lvl>
   </w:abstractNum>
   <w:abstractNum w:abstractNumId="6" w15:restartNumberingAfterBreak="0">
-    <w:nsid w:val="63050202"/>
+    <w:nsid w:val="44D72C93"/>
     <w:multiLevelType w:val="multilevel"/>
-    <w:tmpl w:val="8D1E2ABC"/>
+    <w:tmpl w:val="64604668"/>
     <w:lvl w:ilvl="0">
       <w:start w:val="1"/>
       <w:numFmt w:val="bullet"/>
@@ -16096,9 +16312,9 @@
     </w:lvl>
   </w:abstractNum>
   <w:abstractNum w:abstractNumId="7" w15:restartNumberingAfterBreak="0">
-    <w:nsid w:val="6B0579E7"/>
+    <w:nsid w:val="63050202"/>
     <w:multiLevelType w:val="multilevel"/>
-    <w:tmpl w:val="A8DA2166"/>
+    <w:tmpl w:val="8D1E2ABC"/>
     <w:lvl w:ilvl="0">
       <w:start w:val="1"/>
       <w:numFmt w:val="bullet"/>
@@ -16245,9 +16461,9 @@
     </w:lvl>
   </w:abstractNum>
   <w:abstractNum w:abstractNumId="8" w15:restartNumberingAfterBreak="0">
-    <w:nsid w:val="78733247"/>
+    <w:nsid w:val="6B0579E7"/>
     <w:multiLevelType w:val="multilevel"/>
-    <w:tmpl w:val="18361A16"/>
+    <w:tmpl w:val="A8DA2166"/>
     <w:lvl w:ilvl="0">
       <w:start w:val="1"/>
       <w:numFmt w:val="bullet"/>
@@ -16394,6 +16610,155 @@
     </w:lvl>
   </w:abstractNum>
   <w:abstractNum w:abstractNumId="9" w15:restartNumberingAfterBreak="0">
+    <w:nsid w:val="78733247"/>
+    <w:multiLevelType w:val="multilevel"/>
+    <w:tmpl w:val="18361A16"/>
+    <w:lvl w:ilvl="0">
+      <w:start w:val="1"/>
+      <w:numFmt w:val="bullet"/>
+      <w:lvlText w:val=""/>
+      <w:lvlJc w:val="left"/>
+      <w:pPr>
+        <w:tabs>
+          <w:tab w:val="num" w:pos="720"/>
+        </w:tabs>
+        <w:ind w:left="720" w:hanging="360"/>
+      </w:pPr>
+      <w:rPr>
+        <w:rFonts w:ascii="Symbol" w:hAnsi="Symbol" w:hint="default"/>
+        <w:sz w:val="20"/>
+      </w:rPr>
+    </w:lvl>
+    <w:lvl w:ilvl="1" w:tentative="1">
+      <w:start w:val="1"/>
+      <w:numFmt w:val="bullet"/>
+      <w:lvlText w:val="o"/>
+      <w:lvlJc w:val="left"/>
+      <w:pPr>
+        <w:tabs>
+          <w:tab w:val="num" w:pos="1440"/>
+        </w:tabs>
+        <w:ind w:left="1440" w:hanging="360"/>
+      </w:pPr>
+      <w:rPr>
+        <w:rFonts w:ascii="Courier New" w:hAnsi="Courier New" w:hint="default"/>
+        <w:sz w:val="20"/>
+      </w:rPr>
+    </w:lvl>
+    <w:lvl w:ilvl="2" w:tentative="1">
+      <w:start w:val="1"/>
+      <w:numFmt w:val="bullet"/>
+      <w:lvlText w:val=""/>
+      <w:lvlJc w:val="left"/>
+      <w:pPr>
+        <w:tabs>
+          <w:tab w:val="num" w:pos="2160"/>
+        </w:tabs>
+        <w:ind w:left="2160" w:hanging="360"/>
+      </w:pPr>
+      <w:rPr>
+        <w:rFonts w:ascii="Wingdings" w:hAnsi="Wingdings" w:hint="default"/>
+        <w:sz w:val="20"/>
+      </w:rPr>
+    </w:lvl>
+    <w:lvl w:ilvl="3" w:tentative="1">
+      <w:start w:val="1"/>
+      <w:numFmt w:val="bullet"/>
+      <w:lvlText w:val=""/>
+      <w:lvlJc w:val="left"/>
+      <w:pPr>
+        <w:tabs>
+          <w:tab w:val="num" w:pos="2880"/>
+        </w:tabs>
+        <w:ind w:left="2880" w:hanging="360"/>
+      </w:pPr>
+      <w:rPr>
+        <w:rFonts w:ascii="Wingdings" w:hAnsi="Wingdings" w:hint="default"/>
+        <w:sz w:val="20"/>
+      </w:rPr>
+    </w:lvl>
+    <w:lvl w:ilvl="4" w:tentative="1">
+      <w:start w:val="1"/>
+      <w:numFmt w:val="bullet"/>
+      <w:lvlText w:val=""/>
+      <w:lvlJc w:val="left"/>
+      <w:pPr>
+        <w:tabs>
+          <w:tab w:val="num" w:pos="3600"/>
+        </w:tabs>
+        <w:ind w:left="3600" w:hanging="360"/>
+      </w:pPr>
+      <w:rPr>
+        <w:rFonts w:ascii="Wingdings" w:hAnsi="Wingdings" w:hint="default"/>
+        <w:sz w:val="20"/>
+      </w:rPr>
+    </w:lvl>
+    <w:lvl w:ilvl="5" w:tentative="1">
+      <w:start w:val="1"/>
+      <w:numFmt w:val="bullet"/>
+      <w:lvlText w:val=""/>
+      <w:lvlJc w:val="left"/>
+      <w:pPr>
+        <w:tabs>
+          <w:tab w:val="num" w:pos="4320"/>
+        </w:tabs>
+        <w:ind w:left="4320" w:hanging="360"/>
+      </w:pPr>
+      <w:rPr>
+        <w:rFonts w:ascii="Wingdings" w:hAnsi="Wingdings" w:hint="default"/>
+        <w:sz w:val="20"/>
+      </w:rPr>
+    </w:lvl>
+    <w:lvl w:ilvl="6" w:tentative="1">
+      <w:start w:val="1"/>
+      <w:numFmt w:val="bullet"/>
+      <w:lvlText w:val=""/>
+      <w:lvlJc w:val="left"/>
+      <w:pPr>
+        <w:tabs>
+          <w:tab w:val="num" w:pos="5040"/>
+        </w:tabs>
+        <w:ind w:left="5040" w:hanging="360"/>
+      </w:pPr>
+      <w:rPr>
+        <w:rFonts w:ascii="Wingdings" w:hAnsi="Wingdings" w:hint="default"/>
+        <w:sz w:val="20"/>
+      </w:rPr>
+    </w:lvl>
+    <w:lvl w:ilvl="7" w:tentative="1">
+      <w:start w:val="1"/>
+      <w:numFmt w:val="bullet"/>
+      <w:lvlText w:val=""/>
+      <w:lvlJc w:val="left"/>
+      <w:pPr>
+        <w:tabs>
+          <w:tab w:val="num" w:pos="5760"/>
+        </w:tabs>
+        <w:ind w:left="5760" w:hanging="360"/>
+      </w:pPr>
+      <w:rPr>
+        <w:rFonts w:ascii="Wingdings" w:hAnsi="Wingdings" w:hint="default"/>
+        <w:sz w:val="20"/>
+      </w:rPr>
+    </w:lvl>
+    <w:lvl w:ilvl="8" w:tentative="1">
+      <w:start w:val="1"/>
+      <w:numFmt w:val="bullet"/>
+      <w:lvlText w:val=""/>
+      <w:lvlJc w:val="left"/>
+      <w:pPr>
+        <w:tabs>
+          <w:tab w:val="num" w:pos="6480"/>
+        </w:tabs>
+        <w:ind w:left="6480" w:hanging="360"/>
+      </w:pPr>
+      <w:rPr>
+        <w:rFonts w:ascii="Wingdings" w:hAnsi="Wingdings" w:hint="default"/>
+        <w:sz w:val="20"/>
+      </w:rPr>
+    </w:lvl>
+  </w:abstractNum>
+  <w:abstractNum w:abstractNumId="10" w15:restartNumberingAfterBreak="0">
     <w:nsid w:val="78940C2D"/>
     <w:multiLevelType w:val="multilevel"/>
     <w:tmpl w:val="7A36FD2E"/>
@@ -16549,13 +16914,13 @@
     <w:abstractNumId w:val="3"/>
   </w:num>
   <w:num w:numId="3" w16cid:durableId="1288438365">
-    <w:abstractNumId w:val="5"/>
+    <w:abstractNumId w:val="6"/>
   </w:num>
   <w:num w:numId="4" w16cid:durableId="1155562159">
-    <w:abstractNumId w:val="7"/>
+    <w:abstractNumId w:val="8"/>
   </w:num>
   <w:num w:numId="5" w16cid:durableId="1958020517">
-    <w:abstractNumId w:val="6"/>
+    <w:abstractNumId w:val="7"/>
   </w:num>
   <w:num w:numId="6" w16cid:durableId="1596940668">
     <w:abstractNumId w:val="4"/>
@@ -16564,13 +16929,16 @@
     <w:abstractNumId w:val="0"/>
   </w:num>
   <w:num w:numId="8" w16cid:durableId="753748469">
-    <w:abstractNumId w:val="9"/>
+    <w:abstractNumId w:val="10"/>
   </w:num>
   <w:num w:numId="9" w16cid:durableId="604701249">
-    <w:abstractNumId w:val="8"/>
+    <w:abstractNumId w:val="9"/>
   </w:num>
   <w:num w:numId="10" w16cid:durableId="1503279606">
     <w:abstractNumId w:val="2"/>
+  </w:num>
+  <w:num w:numId="11" w16cid:durableId="785000340">
+    <w:abstractNumId w:val="5"/>
   </w:num>
 </w:numbering>
 </file>

</xml_diff>

<commit_message>
Sprint 7 - Commit 2 : Generic Monte Carlo RUL engine
</commit_message>
<xml_diff>
--- a/docs/development_flow.docx
+++ b/docs/development_flow.docx
@@ -15295,6 +15295,302 @@
         </w:rPr>
         <w:t>returns a ForecastResult, just like ARIMAForecaster</w:t>
       </w:r>
+    </w:p>
+    <w:p>
+      <w:pPr>
+        <w:spacing w:after="0" w:line="240" w:lineRule="auto"/>
+        <w:rPr>
+          <w:noProof/>
+          <w:sz w:val="24"/>
+          <w:szCs w:val="24"/>
+        </w:rPr>
+      </w:pPr>
+    </w:p>
+    <w:p>
+      <w:pPr>
+        <w:spacing w:after="0" w:line="240" w:lineRule="auto"/>
+        <w:rPr>
+          <w:noProof/>
+          <w:sz w:val="24"/>
+          <w:szCs w:val="24"/>
+        </w:rPr>
+      </w:pPr>
+    </w:p>
+    <w:p>
+      <w:pPr>
+        <w:spacing w:after="0" w:line="240" w:lineRule="auto"/>
+        <w:jc w:val="center"/>
+        <w:rPr>
+          <w:b/>
+          <w:bCs/>
+          <w:noProof/>
+          <w:sz w:val="32"/>
+          <w:szCs w:val="32"/>
+          <w:u w:val="single"/>
+        </w:rPr>
+      </w:pPr>
+      <w:r>
+        <w:rPr>
+          <w:b/>
+          <w:bCs/>
+          <w:noProof/>
+          <w:sz w:val="32"/>
+          <w:szCs w:val="32"/>
+          <w:u w:val="single"/>
+        </w:rPr>
+        <w:t>Monte Carlo engine</w:t>
+      </w:r>
+      <w:r>
+        <w:rPr>
+          <w:b/>
+          <w:bCs/>
+          <w:noProof/>
+          <w:sz w:val="32"/>
+          <w:szCs w:val="32"/>
+          <w:u w:val="single"/>
+        </w:rPr>
+        <w:t>:</w:t>
+      </w:r>
+    </w:p>
+    <w:p>
+      <w:pPr>
+        <w:spacing w:after="0" w:line="240" w:lineRule="auto"/>
+        <w:jc w:val="center"/>
+        <w:rPr>
+          <w:noProof/>
+          <w:sz w:val="24"/>
+          <w:szCs w:val="24"/>
+        </w:rPr>
+      </w:pPr>
+    </w:p>
+    <w:p>
+      <w:pPr>
+        <w:spacing w:after="0" w:line="240" w:lineRule="auto"/>
+        <w:jc w:val="center"/>
+        <w:rPr>
+          <w:noProof/>
+          <w:sz w:val="24"/>
+          <w:szCs w:val="24"/>
+        </w:rPr>
+      </w:pPr>
+      <w:r>
+        <w:rPr>
+          <w:noProof/>
+          <w:sz w:val="24"/>
+          <w:szCs w:val="24"/>
+        </w:rPr>
+        <w:t>Current Value</w:t>
+      </w:r>
+    </w:p>
+    <w:p>
+      <w:pPr>
+        <w:spacing w:after="0" w:line="240" w:lineRule="auto"/>
+        <w:jc w:val="center"/>
+        <w:rPr>
+          <w:noProof/>
+          <w:sz w:val="24"/>
+          <w:szCs w:val="24"/>
+        </w:rPr>
+      </w:pPr>
+      <w:r>
+        <w:rPr>
+          <w:noProof/>
+          <w:sz w:val="24"/>
+          <w:szCs w:val="24"/>
+        </w:rPr>
+        <w:t>↓</w:t>
+      </w:r>
+    </w:p>
+    <w:p>
+      <w:pPr>
+        <w:spacing w:after="0" w:line="240" w:lineRule="auto"/>
+        <w:jc w:val="center"/>
+        <w:rPr>
+          <w:noProof/>
+          <w:sz w:val="24"/>
+          <w:szCs w:val="24"/>
+        </w:rPr>
+      </w:pPr>
+      <w:r>
+        <w:rPr>
+          <w:noProof/>
+          <w:sz w:val="24"/>
+          <w:szCs w:val="24"/>
+        </w:rPr>
+        <w:t>Current Drift</w:t>
+      </w:r>
+    </w:p>
+    <w:p>
+      <w:pPr>
+        <w:spacing w:after="0" w:line="240" w:lineRule="auto"/>
+        <w:jc w:val="center"/>
+        <w:rPr>
+          <w:noProof/>
+          <w:sz w:val="24"/>
+          <w:szCs w:val="24"/>
+        </w:rPr>
+      </w:pPr>
+      <w:r>
+        <w:rPr>
+          <w:noProof/>
+          <w:sz w:val="24"/>
+          <w:szCs w:val="24"/>
+        </w:rPr>
+        <w:t>↓</w:t>
+      </w:r>
+    </w:p>
+    <w:p>
+      <w:pPr>
+        <w:spacing w:after="0" w:line="240" w:lineRule="auto"/>
+        <w:jc w:val="center"/>
+        <w:rPr>
+          <w:noProof/>
+          <w:sz w:val="24"/>
+          <w:szCs w:val="24"/>
+        </w:rPr>
+      </w:pPr>
+      <w:r>
+        <w:rPr>
+          <w:noProof/>
+          <w:sz w:val="24"/>
+          <w:szCs w:val="24"/>
+        </w:rPr>
+        <w:t>Noise</w:t>
+      </w:r>
+    </w:p>
+    <w:p>
+      <w:pPr>
+        <w:spacing w:after="0" w:line="240" w:lineRule="auto"/>
+        <w:jc w:val="center"/>
+        <w:rPr>
+          <w:noProof/>
+          <w:sz w:val="24"/>
+          <w:szCs w:val="24"/>
+        </w:rPr>
+      </w:pPr>
+      <w:r>
+        <w:rPr>
+          <w:noProof/>
+          <w:sz w:val="24"/>
+          <w:szCs w:val="24"/>
+        </w:rPr>
+        <w:t>↓</w:t>
+      </w:r>
+    </w:p>
+    <w:p>
+      <w:pPr>
+        <w:spacing w:after="0" w:line="240" w:lineRule="auto"/>
+        <w:jc w:val="center"/>
+        <w:rPr>
+          <w:noProof/>
+          <w:sz w:val="24"/>
+          <w:szCs w:val="24"/>
+        </w:rPr>
+      </w:pPr>
+      <w:r>
+        <w:rPr>
+          <w:noProof/>
+          <w:sz w:val="24"/>
+          <w:szCs w:val="24"/>
+        </w:rPr>
+        <w:t>Threshold</w:t>
+      </w:r>
+    </w:p>
+    <w:p>
+      <w:pPr>
+        <w:spacing w:after="0" w:line="240" w:lineRule="auto"/>
+        <w:jc w:val="center"/>
+        <w:rPr>
+          <w:noProof/>
+          <w:sz w:val="24"/>
+          <w:szCs w:val="24"/>
+        </w:rPr>
+      </w:pPr>
+      <w:r>
+        <w:rPr>
+          <w:noProof/>
+          <w:sz w:val="24"/>
+          <w:szCs w:val="24"/>
+        </w:rPr>
+        <w:t>↓</w:t>
+      </w:r>
+    </w:p>
+    <w:p>
+      <w:pPr>
+        <w:spacing w:after="0" w:line="240" w:lineRule="auto"/>
+        <w:jc w:val="center"/>
+        <w:rPr>
+          <w:noProof/>
+          <w:sz w:val="24"/>
+          <w:szCs w:val="24"/>
+        </w:rPr>
+      </w:pPr>
+      <w:r>
+        <w:rPr>
+          <w:noProof/>
+          <w:sz w:val="24"/>
+          <w:szCs w:val="24"/>
+        </w:rPr>
+        <w:t>Monte Carlo</w:t>
+      </w:r>
+    </w:p>
+    <w:p>
+      <w:pPr>
+        <w:spacing w:after="0" w:line="240" w:lineRule="auto"/>
+        <w:jc w:val="center"/>
+        <w:rPr>
+          <w:noProof/>
+          <w:sz w:val="24"/>
+          <w:szCs w:val="24"/>
+        </w:rPr>
+      </w:pPr>
+      <w:r>
+        <w:rPr>
+          <w:noProof/>
+          <w:sz w:val="24"/>
+          <w:szCs w:val="24"/>
+        </w:rPr>
+        <w:t>↓</w:t>
+      </w:r>
+    </w:p>
+    <w:p>
+      <w:pPr>
+        <w:spacing w:after="0" w:line="240" w:lineRule="auto"/>
+        <w:jc w:val="center"/>
+        <w:rPr>
+          <w:noProof/>
+          <w:sz w:val="24"/>
+          <w:szCs w:val="24"/>
+        </w:rPr>
+      </w:pPr>
+      <w:r>
+        <w:rPr>
+          <w:noProof/>
+          <w:sz w:val="24"/>
+          <w:szCs w:val="24"/>
+        </w:rPr>
+        <w:t>PrognosticResult</w:t>
+      </w:r>
+    </w:p>
+    <w:p>
+      <w:pPr>
+        <w:spacing w:after="0" w:line="240" w:lineRule="auto"/>
+        <w:rPr>
+          <w:noProof/>
+          <w:sz w:val="24"/>
+          <w:szCs w:val="24"/>
+        </w:rPr>
+      </w:pPr>
+    </w:p>
+    <w:p>
+      <w:pPr>
+        <w:spacing w:after="0" w:line="240" w:lineRule="auto"/>
+        <w:rPr>
+          <w:noProof/>
+          <w:sz w:val="24"/>
+          <w:szCs w:val="24"/>
+        </w:rPr>
+      </w:pPr>
     </w:p>
     <w:p>
       <w:pPr>

</xml_diff>

<commit_message>
Sprint 7 - Commit 3: Complete RUL workflow
</commit_message>
<xml_diff>
--- a/docs/development_flow.docx
+++ b/docs/development_flow.docx
@@ -15338,9 +15338,263 @@
           <w:szCs w:val="32"/>
           <w:u w:val="single"/>
         </w:rPr>
-        <w:t>Monte Carlo engine</w:t>
-      </w:r>
-      <w:r>
+        <w:t>Monte Carlo engine:</w:t>
+      </w:r>
+    </w:p>
+    <w:p>
+      <w:pPr>
+        <w:spacing w:after="0" w:line="240" w:lineRule="auto"/>
+        <w:jc w:val="center"/>
+        <w:rPr>
+          <w:noProof/>
+          <w:sz w:val="24"/>
+          <w:szCs w:val="24"/>
+        </w:rPr>
+      </w:pPr>
+    </w:p>
+    <w:p>
+      <w:pPr>
+        <w:spacing w:after="0" w:line="240" w:lineRule="auto"/>
+        <w:jc w:val="center"/>
+        <w:rPr>
+          <w:noProof/>
+          <w:sz w:val="24"/>
+          <w:szCs w:val="24"/>
+        </w:rPr>
+      </w:pPr>
+      <w:r>
+        <w:rPr>
+          <w:noProof/>
+          <w:sz w:val="24"/>
+          <w:szCs w:val="24"/>
+        </w:rPr>
+        <w:t>Current Value</w:t>
+      </w:r>
+    </w:p>
+    <w:p>
+      <w:pPr>
+        <w:spacing w:after="0" w:line="240" w:lineRule="auto"/>
+        <w:jc w:val="center"/>
+        <w:rPr>
+          <w:noProof/>
+          <w:sz w:val="24"/>
+          <w:szCs w:val="24"/>
+        </w:rPr>
+      </w:pPr>
+      <w:r>
+        <w:rPr>
+          <w:noProof/>
+          <w:sz w:val="24"/>
+          <w:szCs w:val="24"/>
+        </w:rPr>
+        <w:t>↓</w:t>
+      </w:r>
+    </w:p>
+    <w:p>
+      <w:pPr>
+        <w:spacing w:after="0" w:line="240" w:lineRule="auto"/>
+        <w:jc w:val="center"/>
+        <w:rPr>
+          <w:noProof/>
+          <w:sz w:val="24"/>
+          <w:szCs w:val="24"/>
+        </w:rPr>
+      </w:pPr>
+      <w:r>
+        <w:rPr>
+          <w:noProof/>
+          <w:sz w:val="24"/>
+          <w:szCs w:val="24"/>
+        </w:rPr>
+        <w:t>Current Drift</w:t>
+      </w:r>
+    </w:p>
+    <w:p>
+      <w:pPr>
+        <w:spacing w:after="0" w:line="240" w:lineRule="auto"/>
+        <w:jc w:val="center"/>
+        <w:rPr>
+          <w:noProof/>
+          <w:sz w:val="24"/>
+          <w:szCs w:val="24"/>
+        </w:rPr>
+      </w:pPr>
+      <w:r>
+        <w:rPr>
+          <w:noProof/>
+          <w:sz w:val="24"/>
+          <w:szCs w:val="24"/>
+        </w:rPr>
+        <w:t>↓</w:t>
+      </w:r>
+    </w:p>
+    <w:p>
+      <w:pPr>
+        <w:spacing w:after="0" w:line="240" w:lineRule="auto"/>
+        <w:jc w:val="center"/>
+        <w:rPr>
+          <w:noProof/>
+          <w:sz w:val="24"/>
+          <w:szCs w:val="24"/>
+        </w:rPr>
+      </w:pPr>
+      <w:r>
+        <w:rPr>
+          <w:noProof/>
+          <w:sz w:val="24"/>
+          <w:szCs w:val="24"/>
+        </w:rPr>
+        <w:t>Noise</w:t>
+      </w:r>
+    </w:p>
+    <w:p>
+      <w:pPr>
+        <w:spacing w:after="0" w:line="240" w:lineRule="auto"/>
+        <w:jc w:val="center"/>
+        <w:rPr>
+          <w:noProof/>
+          <w:sz w:val="24"/>
+          <w:szCs w:val="24"/>
+        </w:rPr>
+      </w:pPr>
+      <w:r>
+        <w:rPr>
+          <w:noProof/>
+          <w:sz w:val="24"/>
+          <w:szCs w:val="24"/>
+        </w:rPr>
+        <w:t>↓</w:t>
+      </w:r>
+    </w:p>
+    <w:p>
+      <w:pPr>
+        <w:spacing w:after="0" w:line="240" w:lineRule="auto"/>
+        <w:jc w:val="center"/>
+        <w:rPr>
+          <w:noProof/>
+          <w:sz w:val="24"/>
+          <w:szCs w:val="24"/>
+        </w:rPr>
+      </w:pPr>
+      <w:r>
+        <w:rPr>
+          <w:noProof/>
+          <w:sz w:val="24"/>
+          <w:szCs w:val="24"/>
+        </w:rPr>
+        <w:t>Threshold</w:t>
+      </w:r>
+    </w:p>
+    <w:p>
+      <w:pPr>
+        <w:spacing w:after="0" w:line="240" w:lineRule="auto"/>
+        <w:jc w:val="center"/>
+        <w:rPr>
+          <w:noProof/>
+          <w:sz w:val="24"/>
+          <w:szCs w:val="24"/>
+        </w:rPr>
+      </w:pPr>
+      <w:r>
+        <w:rPr>
+          <w:noProof/>
+          <w:sz w:val="24"/>
+          <w:szCs w:val="24"/>
+        </w:rPr>
+        <w:t>↓</w:t>
+      </w:r>
+    </w:p>
+    <w:p>
+      <w:pPr>
+        <w:spacing w:after="0" w:line="240" w:lineRule="auto"/>
+        <w:jc w:val="center"/>
+        <w:rPr>
+          <w:noProof/>
+          <w:sz w:val="24"/>
+          <w:szCs w:val="24"/>
+        </w:rPr>
+      </w:pPr>
+      <w:r>
+        <w:rPr>
+          <w:noProof/>
+          <w:sz w:val="24"/>
+          <w:szCs w:val="24"/>
+        </w:rPr>
+        <w:t>Monte Carlo</w:t>
+      </w:r>
+    </w:p>
+    <w:p>
+      <w:pPr>
+        <w:spacing w:after="0" w:line="240" w:lineRule="auto"/>
+        <w:jc w:val="center"/>
+        <w:rPr>
+          <w:noProof/>
+          <w:sz w:val="24"/>
+          <w:szCs w:val="24"/>
+        </w:rPr>
+      </w:pPr>
+      <w:r>
+        <w:rPr>
+          <w:noProof/>
+          <w:sz w:val="24"/>
+          <w:szCs w:val="24"/>
+        </w:rPr>
+        <w:t>↓</w:t>
+      </w:r>
+    </w:p>
+    <w:p>
+      <w:pPr>
+        <w:spacing w:after="0" w:line="240" w:lineRule="auto"/>
+        <w:jc w:val="center"/>
+        <w:rPr>
+          <w:noProof/>
+          <w:sz w:val="24"/>
+          <w:szCs w:val="24"/>
+        </w:rPr>
+      </w:pPr>
+      <w:r>
+        <w:rPr>
+          <w:noProof/>
+          <w:sz w:val="24"/>
+          <w:szCs w:val="24"/>
+        </w:rPr>
+        <w:t>PrognosticResult</w:t>
+      </w:r>
+    </w:p>
+    <w:p>
+      <w:pPr>
+        <w:spacing w:after="0" w:line="240" w:lineRule="auto"/>
+        <w:rPr>
+          <w:noProof/>
+          <w:sz w:val="24"/>
+          <w:szCs w:val="24"/>
+        </w:rPr>
+      </w:pPr>
+    </w:p>
+    <w:p>
+      <w:pPr>
+        <w:spacing w:after="0" w:line="240" w:lineRule="auto"/>
+        <w:rPr>
+          <w:noProof/>
+          <w:sz w:val="24"/>
+          <w:szCs w:val="24"/>
+        </w:rPr>
+      </w:pPr>
+    </w:p>
+    <w:p>
+      <w:pPr>
+        <w:spacing w:after="0" w:line="240" w:lineRule="auto"/>
+        <w:rPr>
+          <w:noProof/>
+          <w:sz w:val="24"/>
+          <w:szCs w:val="24"/>
+        </w:rPr>
+      </w:pPr>
+    </w:p>
+    <w:p>
+      <w:pPr>
+        <w:spacing w:after="0" w:line="240" w:lineRule="auto"/>
+        <w:jc w:val="center"/>
         <w:rPr>
           <w:b/>
           <w:bCs/>
@@ -15349,6 +15603,60 @@
           <w:szCs w:val="32"/>
           <w:u w:val="single"/>
         </w:rPr>
+      </w:pPr>
+      <w:r>
+        <w:rPr>
+          <w:b/>
+          <w:bCs/>
+          <w:noProof/>
+          <w:sz w:val="32"/>
+          <w:szCs w:val="32"/>
+          <w:u w:val="single"/>
+        </w:rPr>
+        <w:t>P</w:t>
+      </w:r>
+      <w:r>
+        <w:rPr>
+          <w:b/>
+          <w:bCs/>
+          <w:noProof/>
+          <w:sz w:val="32"/>
+          <w:szCs w:val="32"/>
+          <w:u w:val="single"/>
+        </w:rPr>
+        <w:t xml:space="preserve">rognostics </w:t>
+      </w:r>
+      <w:r>
+        <w:rPr>
+          <w:b/>
+          <w:bCs/>
+          <w:noProof/>
+          <w:sz w:val="32"/>
+          <w:szCs w:val="32"/>
+          <w:u w:val="single"/>
+        </w:rPr>
+        <w:t>P</w:t>
+      </w:r>
+      <w:r>
+        <w:rPr>
+          <w:b/>
+          <w:bCs/>
+          <w:noProof/>
+          <w:sz w:val="32"/>
+          <w:szCs w:val="32"/>
+          <w:u w:val="single"/>
+        </w:rPr>
+        <w:t>ackage</w:t>
+      </w:r>
+      <w:r>
+        <w:rPr>
+          <w:b/>
+          <w:bCs/>
+          <w:noProof/>
+          <w:sz w:val="32"/>
+          <w:szCs w:val="32"/>
+          <w:u w:val="single"/>
+        </w:rPr>
         <w:t>:</w:t>
       </w:r>
     </w:p>
@@ -15379,7 +15687,7 @@
           <w:sz w:val="24"/>
           <w:szCs w:val="24"/>
         </w:rPr>
-        <w:t>Current Value</w:t>
+        <w:t>Data</w:t>
       </w:r>
     </w:p>
     <w:p>
@@ -15398,7 +15706,7 @@
           <w:sz w:val="24"/>
           <w:szCs w:val="24"/>
         </w:rPr>
-        <w:t>↓</w:t>
+        <w:t>│</w:t>
       </w:r>
     </w:p>
     <w:p>
@@ -15413,11 +15721,12 @@
       </w:pPr>
       <w:r>
         <w:rPr>
-          <w:noProof/>
-          <w:sz w:val="24"/>
-          <w:szCs w:val="24"/>
-        </w:rPr>
-        <w:t>Current Drift</w:t>
+          <w:rFonts w:ascii="Arial" w:hAnsi="Arial" w:cs="Arial"/>
+          <w:noProof/>
+          <w:sz w:val="24"/>
+          <w:szCs w:val="24"/>
+        </w:rPr>
+        <w:t>▼</w:t>
       </w:r>
     </w:p>
     <w:p>
@@ -15436,7 +15745,7 @@
           <w:sz w:val="24"/>
           <w:szCs w:val="24"/>
         </w:rPr>
-        <w:t>↓</w:t>
+        <w:t>Forecasting</w:t>
       </w:r>
     </w:p>
     <w:p>
@@ -15455,7 +15764,7 @@
           <w:sz w:val="24"/>
           <w:szCs w:val="24"/>
         </w:rPr>
-        <w:t>Noise</w:t>
+        <w:t>│</w:t>
       </w:r>
     </w:p>
     <w:p>
@@ -15470,11 +15779,12 @@
       </w:pPr>
       <w:r>
         <w:rPr>
-          <w:noProof/>
-          <w:sz w:val="24"/>
-          <w:szCs w:val="24"/>
-        </w:rPr>
-        <w:t>↓</w:t>
+          <w:rFonts w:ascii="Arial" w:hAnsi="Arial" w:cs="Arial"/>
+          <w:noProof/>
+          <w:sz w:val="24"/>
+          <w:szCs w:val="24"/>
+        </w:rPr>
+        <w:t>▼</w:t>
       </w:r>
     </w:p>
     <w:p>
@@ -15493,7 +15803,44 @@
           <w:sz w:val="24"/>
           <w:szCs w:val="24"/>
         </w:rPr>
-        <w:t>Threshold</w:t>
+        <w:t>Prognostics</w:t>
+      </w:r>
+    </w:p>
+    <w:p>
+      <w:pPr>
+        <w:spacing w:after="0" w:line="240" w:lineRule="auto"/>
+        <w:rPr>
+          <w:noProof/>
+          <w:sz w:val="24"/>
+          <w:szCs w:val="24"/>
+        </w:rPr>
+      </w:pPr>
+    </w:p>
+    <w:p>
+      <w:pPr>
+        <w:spacing w:after="0" w:line="240" w:lineRule="auto"/>
+        <w:rPr>
+          <w:noProof/>
+          <w:sz w:val="24"/>
+          <w:szCs w:val="24"/>
+        </w:rPr>
+      </w:pPr>
+    </w:p>
+    <w:p>
+      <w:pPr>
+        <w:rPr>
+          <w:noProof/>
+          <w:sz w:val="24"/>
+          <w:szCs w:val="24"/>
+        </w:rPr>
+      </w:pPr>
+      <w:r>
+        <w:rPr>
+          <w:noProof/>
+          <w:sz w:val="24"/>
+          <w:szCs w:val="24"/>
+        </w:rPr>
+        <w:br w:type="page"/>
       </w:r>
     </w:p>
     <w:p>
@@ -15501,18 +15848,25 @@
         <w:spacing w:after="0" w:line="240" w:lineRule="auto"/>
         <w:jc w:val="center"/>
         <w:rPr>
-          <w:noProof/>
-          <w:sz w:val="24"/>
-          <w:szCs w:val="24"/>
-        </w:rPr>
-      </w:pPr>
-      <w:r>
-        <w:rPr>
-          <w:noProof/>
-          <w:sz w:val="24"/>
-          <w:szCs w:val="24"/>
-        </w:rPr>
-        <w:t>↓</w:t>
+          <w:b/>
+          <w:bCs/>
+          <w:noProof/>
+          <w:sz w:val="32"/>
+          <w:szCs w:val="32"/>
+          <w:u w:val="single"/>
+        </w:rPr>
+      </w:pPr>
+      <w:r>
+        <w:rPr>
+          <w:b/>
+          <w:bCs/>
+          <w:noProof/>
+          <w:sz w:val="32"/>
+          <w:szCs w:val="32"/>
+          <w:u w:val="single"/>
+        </w:rPr>
+        <w:lastRenderedPageBreak/>
+        <w:t>Architecture of PrognosticsResult:</w:t>
       </w:r>
     </w:p>
     <w:p>
@@ -15525,14 +15879,6 @@
           <w:szCs w:val="24"/>
         </w:rPr>
       </w:pPr>
-      <w:r>
-        <w:rPr>
-          <w:noProof/>
-          <w:sz w:val="24"/>
-          <w:szCs w:val="24"/>
-        </w:rPr>
-        <w:t>Monte Carlo</w:t>
-      </w:r>
     </w:p>
     <w:p>
       <w:pPr>
@@ -15550,7 +15896,7 @@
           <w:sz w:val="24"/>
           <w:szCs w:val="24"/>
         </w:rPr>
-        <w:t>↓</w:t>
+        <w:t>Forecasting</w:t>
       </w:r>
     </w:p>
     <w:p>
@@ -15569,7 +15915,181 @@
           <w:sz w:val="24"/>
           <w:szCs w:val="24"/>
         </w:rPr>
+        <w:t xml:space="preserve">    ↓</w:t>
+      </w:r>
+    </w:p>
+    <w:p>
+      <w:pPr>
+        <w:spacing w:after="0" w:line="240" w:lineRule="auto"/>
+        <w:jc w:val="center"/>
+        <w:rPr>
+          <w:noProof/>
+          <w:sz w:val="24"/>
+          <w:szCs w:val="24"/>
+        </w:rPr>
+      </w:pPr>
+      <w:r>
+        <w:rPr>
+          <w:noProof/>
+          <w:sz w:val="24"/>
+          <w:szCs w:val="24"/>
+        </w:rPr>
+        <w:t>ForecastResult</w:t>
+      </w:r>
+    </w:p>
+    <w:p>
+      <w:pPr>
+        <w:spacing w:after="0" w:line="240" w:lineRule="auto"/>
+        <w:jc w:val="center"/>
+        <w:rPr>
+          <w:noProof/>
+          <w:sz w:val="24"/>
+          <w:szCs w:val="24"/>
+        </w:rPr>
+      </w:pPr>
+    </w:p>
+    <w:p>
+      <w:pPr>
+        <w:spacing w:after="0" w:line="240" w:lineRule="auto"/>
+        <w:jc w:val="center"/>
+        <w:rPr>
+          <w:noProof/>
+          <w:sz w:val="24"/>
+          <w:szCs w:val="24"/>
+        </w:rPr>
+      </w:pPr>
+      <w:r>
+        <w:rPr>
+          <w:noProof/>
+          <w:sz w:val="24"/>
+          <w:szCs w:val="24"/>
+        </w:rPr>
+        <w:t>Prognostics</w:t>
+      </w:r>
+    </w:p>
+    <w:p>
+      <w:pPr>
+        <w:spacing w:after="0" w:line="240" w:lineRule="auto"/>
+        <w:jc w:val="center"/>
+        <w:rPr>
+          <w:noProof/>
+          <w:sz w:val="24"/>
+          <w:szCs w:val="24"/>
+        </w:rPr>
+      </w:pPr>
+      <w:r>
+        <w:rPr>
+          <w:noProof/>
+          <w:sz w:val="24"/>
+          <w:szCs w:val="24"/>
+        </w:rPr>
+        <w:t xml:space="preserve">    ↓</w:t>
+      </w:r>
+    </w:p>
+    <w:p>
+      <w:pPr>
+        <w:spacing w:after="0" w:line="240" w:lineRule="auto"/>
+        <w:jc w:val="center"/>
+        <w:rPr>
+          <w:noProof/>
+          <w:sz w:val="24"/>
+          <w:szCs w:val="24"/>
+        </w:rPr>
+      </w:pPr>
+      <w:r>
+        <w:rPr>
+          <w:noProof/>
+          <w:sz w:val="24"/>
+          <w:szCs w:val="24"/>
+        </w:rPr>
+        <w:t>ThresholdEstimator</w:t>
+      </w:r>
+    </w:p>
+    <w:p>
+      <w:pPr>
+        <w:spacing w:after="0" w:line="240" w:lineRule="auto"/>
+        <w:jc w:val="center"/>
+        <w:rPr>
+          <w:noProof/>
+          <w:sz w:val="24"/>
+          <w:szCs w:val="24"/>
+        </w:rPr>
+      </w:pPr>
+      <w:r>
+        <w:rPr>
+          <w:noProof/>
+          <w:sz w:val="24"/>
+          <w:szCs w:val="24"/>
+        </w:rPr>
+        <w:t>MonteCarloRUL</w:t>
+      </w:r>
+    </w:p>
+    <w:p>
+      <w:pPr>
+        <w:spacing w:after="0" w:line="240" w:lineRule="auto"/>
+        <w:jc w:val="center"/>
+        <w:rPr>
+          <w:noProof/>
+          <w:sz w:val="24"/>
+          <w:szCs w:val="24"/>
+        </w:rPr>
+      </w:pPr>
+      <w:r>
+        <w:rPr>
+          <w:noProof/>
+          <w:sz w:val="24"/>
+          <w:szCs w:val="24"/>
+        </w:rPr>
+        <w:t>RULAnalyzer</w:t>
+      </w:r>
+    </w:p>
+    <w:p>
+      <w:pPr>
+        <w:spacing w:after="0" w:line="240" w:lineRule="auto"/>
+        <w:jc w:val="center"/>
+        <w:rPr>
+          <w:noProof/>
+          <w:sz w:val="24"/>
+          <w:szCs w:val="24"/>
+        </w:rPr>
+      </w:pPr>
+      <w:r>
+        <w:rPr>
+          <w:noProof/>
+          <w:sz w:val="24"/>
+          <w:szCs w:val="24"/>
+        </w:rPr>
         <w:t>PrognosticResult</w:t>
+      </w:r>
+    </w:p>
+    <w:p>
+      <w:pPr>
+        <w:spacing w:after="0" w:line="240" w:lineRule="auto"/>
+        <w:jc w:val="center"/>
+        <w:rPr>
+          <w:noProof/>
+          <w:sz w:val="24"/>
+          <w:szCs w:val="24"/>
+        </w:rPr>
+      </w:pPr>
+    </w:p>
+    <w:p>
+      <w:pPr>
+        <w:spacing w:after="0" w:line="240" w:lineRule="auto"/>
+        <w:jc w:val="center"/>
+        <w:rPr>
+          <w:noProof/>
+          <w:sz w:val="24"/>
+          <w:szCs w:val="24"/>
+        </w:rPr>
+      </w:pPr>
+      <w:r>
+        <w:rPr>
+          <w:noProof/>
+          <w:sz w:val="24"/>
+          <w:szCs w:val="24"/>
+        </w:rPr>
+        <w:t>Examples</w:t>
       </w:r>
     </w:p>
     <w:p>

</xml_diff>